<commit_message>
Potential cuts (removal of BSTM)
</commit_message>
<xml_diff>
--- a/Re_introducing_the_PSTM.docx
+++ b/Re_introducing_the_PSTM.docx
@@ -794,25 +794,121 @@
         <w:t xml:space="preserve"> </w:t>
       </w:r>
       <w:r>
+        <w:t xml:space="preserve">the</w:t>
+      </w:r>
+      <w:r>
+        <w:t xml:space="preserve"> </w:t>
+      </w:r>
+      <w:r>
+        <w:t xml:space="preserve">R</w:t>
+      </w:r>
+      <w:r>
+        <w:t xml:space="preserve"> </w:t>
+      </w:r>
+      <w:r>
+        <w:t xml:space="preserve">package</w:t>
+      </w:r>
+      <w:r>
+        <w:t xml:space="preserve"> </w:t>
+      </w:r>
+      <w:r>
+        <w:t xml:space="preserve">STM,</w:t>
+      </w:r>
+      <w:r>
+        <w:t xml:space="preserve"> </w:t>
+      </w:r>
+      <w:r>
+        <w:t xml:space="preserve">which</w:t>
+      </w:r>
+      <w:r>
+        <w:t xml:space="preserve"> </w:t>
+      </w:r>
+      <w:r>
+        <w:t xml:space="preserve">makes</w:t>
+      </w:r>
+      <w:r>
+        <w:t xml:space="preserve"> </w:t>
+      </w:r>
+      <w:r>
+        <w:t xml:space="preserve">it</w:t>
+      </w:r>
+      <w:r>
+        <w:t xml:space="preserve"> </w:t>
+      </w:r>
+      <w:r>
+        <w:t xml:space="preserve">trivial</w:t>
+      </w:r>
+      <w:r>
+        <w:t xml:space="preserve"> </w:t>
+      </w:r>
+      <w:r>
+        <w:t xml:space="preserve">to</w:t>
+      </w:r>
+      <w:r>
+        <w:t xml:space="preserve"> </w:t>
+      </w:r>
+      <w:r>
+        <w:t xml:space="preserve">apply</w:t>
+      </w:r>
+      <w:r>
+        <w:t xml:space="preserve"> </w:t>
+      </w:r>
+      <w:r>
+        <w:t xml:space="preserve">the</w:t>
+      </w:r>
+      <w:r>
+        <w:t xml:space="preserve"> </w:t>
+      </w:r>
+      <w:r>
+        <w:t xml:space="preserve">PSTM</w:t>
+      </w:r>
+      <w:r>
+        <w:t xml:space="preserve"> </w:t>
+      </w:r>
+      <w:r>
+        <w:t xml:space="preserve">to</w:t>
+      </w:r>
+      <w:r>
+        <w:t xml:space="preserve"> </w:t>
+      </w:r>
+      <w:r>
+        <w:t xml:space="preserve">new</w:t>
+      </w:r>
+      <w:r>
+        <w:t xml:space="preserve"> </w:t>
+      </w:r>
+      <w:r>
+        <w:t xml:space="preserve">data</w:t>
+      </w:r>
+      <w:r>
+        <w:t xml:space="preserve"> </w:t>
+      </w:r>
+      <w:r>
+        <w:t xml:space="preserve">using</w:t>
+      </w:r>
+      <w:r>
+        <w:t xml:space="preserve"> </w:t>
+      </w:r>
+      <w:r>
+        <w:t xml:space="preserve">only</w:t>
+      </w:r>
+      <w:r>
+        <w:t xml:space="preserve"> </w:t>
+      </w:r>
+      <w:r>
         <w:t xml:space="preserve">a</w:t>
       </w:r>
       <w:r>
         <w:t xml:space="preserve"> </w:t>
       </w:r>
       <w:r>
-        <w:t xml:space="preserve">fully</w:t>
-      </w:r>
-      <w:r>
-        <w:t xml:space="preserve"> </w:t>
-      </w:r>
-      <w:r>
-        <w:t xml:space="preserve">Bayesian</w:t>
-      </w:r>
-      <w:r>
-        <w:t xml:space="preserve"> </w:t>
-      </w:r>
-      <w:r>
-        <w:t xml:space="preserve">formulation</w:t>
+        <w:t xml:space="preserve">few</w:t>
+      </w:r>
+      <w:r>
+        <w:t xml:space="preserve"> </w:t>
+      </w:r>
+      <w:r>
+        <w:t xml:space="preserve">lines</w:t>
       </w:r>
       <w:r>
         <w:t xml:space="preserve"> </w:t>
@@ -824,37 +920,103 @@
         <w:t xml:space="preserve"> </w:t>
       </w:r>
       <w:r>
+        <w:t xml:space="preserve">R</w:t>
+      </w:r>
+      <w:r>
+        <w:t xml:space="preserve"> </w:t>
+      </w:r>
+      <w:r>
+        <w:t xml:space="preserve">code.</w:t>
+      </w:r>
+      <w:r>
+        <w:t xml:space="preserve"> </w:t>
+      </w:r>
+      <w:r>
+        <w:t xml:space="preserve">We</w:t>
+      </w:r>
+      <w:r>
+        <w:t xml:space="preserve"> </w:t>
+      </w:r>
+      <w:r>
+        <w:t xml:space="preserve">present</w:t>
+      </w:r>
+      <w:r>
+        <w:t xml:space="preserve"> </w:t>
+      </w:r>
+      <w:r>
         <w:t xml:space="preserve">the</w:t>
       </w:r>
       <w:r>
         <w:t xml:space="preserve"> </w:t>
       </w:r>
       <w:r>
+        <w:t xml:space="preserve">first</w:t>
+      </w:r>
+      <w:r>
+        <w:t xml:space="preserve"> </w:t>
+      </w:r>
+      <w:r>
+        <w:t xml:space="preserve">quantitative</w:t>
+      </w:r>
+      <w:r>
+        <w:t xml:space="preserve"> </w:t>
+      </w:r>
+      <w:r>
+        <w:t xml:space="preserve">assessment</w:t>
+      </w:r>
+      <w:r>
+        <w:t xml:space="preserve"> </w:t>
+      </w:r>
+      <w:r>
+        <w:t xml:space="preserve">of</w:t>
+      </w:r>
+      <w:r>
+        <w:t xml:space="preserve"> </w:t>
+      </w:r>
+      <w:r>
+        <w:t xml:space="preserve">the</w:t>
+      </w:r>
+      <w:r>
+        <w:t xml:space="preserve"> </w:t>
+      </w:r>
+      <w:r>
         <w:t xml:space="preserve">PSTM</w:t>
       </w:r>
       <w:r>
         <w:t xml:space="preserve"> </w:t>
       </w:r>
       <w:r>
-        <w:t xml:space="preserve">(the</w:t>
-      </w:r>
-      <w:r>
-        <w:t xml:space="preserve"> </w:t>
-      </w:r>
-      <w:r>
-        <w:t xml:space="preserve">BSTM),</w:t>
-      </w:r>
-      <w:r>
-        <w:t xml:space="preserve"> </w:t>
-      </w:r>
-      <w:r>
-        <w:t xml:space="preserve">along</w:t>
-      </w:r>
-      <w:r>
-        <w:t xml:space="preserve"> </w:t>
-      </w:r>
-      <w:r>
-        <w:t xml:space="preserve">with</w:t>
+        <w:t xml:space="preserve">against</w:t>
+      </w:r>
+      <w:r>
+        <w:t xml:space="preserve"> </w:t>
+      </w:r>
+      <w:r>
+        <w:t xml:space="preserve">human</w:t>
+      </w:r>
+      <w:r>
+        <w:t xml:space="preserve"> </w:t>
+      </w:r>
+      <w:r>
+        <w:t xml:space="preserve">perception.</w:t>
+      </w:r>
+      <w:r>
+        <w:t xml:space="preserve"> </w:t>
+      </w:r>
+      <w:r>
+        <w:t xml:space="preserve">We</w:t>
+      </w:r>
+      <w:r>
+        <w:t xml:space="preserve"> </w:t>
+      </w:r>
+      <w:r>
+        <w:t xml:space="preserve">show</w:t>
+      </w:r>
+      <w:r>
+        <w:t xml:space="preserve"> </w:t>
+      </w:r>
+      <w:r>
+        <w:t xml:space="preserve">that</w:t>
       </w:r>
       <w:r>
         <w:t xml:space="preserve"> </w:t>
@@ -866,241 +1028,7 @@
         <w:t xml:space="preserve"> </w:t>
       </w:r>
       <w:r>
-        <w:t xml:space="preserve">R</w:t>
-      </w:r>
-      <w:r>
-        <w:t xml:space="preserve"> </w:t>
-      </w:r>
-      <w:r>
-        <w:t xml:space="preserve">package</w:t>
-      </w:r>
-      <w:r>
-        <w:t xml:space="preserve"> </w:t>
-      </w:r>
-      <w:r>
-        <w:t xml:space="preserve">STM,</w:t>
-      </w:r>
-      <w:r>
-        <w:t xml:space="preserve"> </w:t>
-      </w:r>
-      <w:r>
-        <w:t xml:space="preserve">which</w:t>
-      </w:r>
-      <w:r>
-        <w:t xml:space="preserve"> </w:t>
-      </w:r>
-      <w:r>
-        <w:t xml:space="preserve">makes</w:t>
-      </w:r>
-      <w:r>
-        <w:t xml:space="preserve"> </w:t>
-      </w:r>
-      <w:r>
-        <w:t xml:space="preserve">it</w:t>
-      </w:r>
-      <w:r>
-        <w:t xml:space="preserve"> </w:t>
-      </w:r>
-      <w:r>
-        <w:t xml:space="preserve">trivial</w:t>
-      </w:r>
-      <w:r>
-        <w:t xml:space="preserve"> </w:t>
-      </w:r>
-      <w:r>
-        <w:t xml:space="preserve">to</w:t>
-      </w:r>
-      <w:r>
-        <w:t xml:space="preserve"> </w:t>
-      </w:r>
-      <w:r>
-        <w:t xml:space="preserve">apply</w:t>
-      </w:r>
-      <w:r>
-        <w:t xml:space="preserve"> </w:t>
-      </w:r>
-      <w:r>
-        <w:t xml:space="preserve">either</w:t>
-      </w:r>
-      <w:r>
-        <w:t xml:space="preserve"> </w:t>
-      </w:r>
-      <w:r>
         <w:t xml:space="preserve">model</w:t>
-      </w:r>
-      <w:r>
-        <w:t xml:space="preserve"> </w:t>
-      </w:r>
-      <w:r>
-        <w:t xml:space="preserve">to</w:t>
-      </w:r>
-      <w:r>
-        <w:t xml:space="preserve"> </w:t>
-      </w:r>
-      <w:r>
-        <w:t xml:space="preserve">new</w:t>
-      </w:r>
-      <w:r>
-        <w:t xml:space="preserve"> </w:t>
-      </w:r>
-      <w:r>
-        <w:t xml:space="preserve">data</w:t>
-      </w:r>
-      <w:r>
-        <w:t xml:space="preserve"> </w:t>
-      </w:r>
-      <w:r>
-        <w:t xml:space="preserve">using</w:t>
-      </w:r>
-      <w:r>
-        <w:t xml:space="preserve"> </w:t>
-      </w:r>
-      <w:r>
-        <w:t xml:space="preserve">only</w:t>
-      </w:r>
-      <w:r>
-        <w:t xml:space="preserve"> </w:t>
-      </w:r>
-      <w:r>
-        <w:t xml:space="preserve">a</w:t>
-      </w:r>
-      <w:r>
-        <w:t xml:space="preserve"> </w:t>
-      </w:r>
-      <w:r>
-        <w:t xml:space="preserve">few</w:t>
-      </w:r>
-      <w:r>
-        <w:t xml:space="preserve"> </w:t>
-      </w:r>
-      <w:r>
-        <w:t xml:space="preserve">lines</w:t>
-      </w:r>
-      <w:r>
-        <w:t xml:space="preserve"> </w:t>
-      </w:r>
-      <w:r>
-        <w:t xml:space="preserve">of</w:t>
-      </w:r>
-      <w:r>
-        <w:t xml:space="preserve"> </w:t>
-      </w:r>
-      <w:r>
-        <w:t xml:space="preserve">R</w:t>
-      </w:r>
-      <w:r>
-        <w:t xml:space="preserve"> </w:t>
-      </w:r>
-      <w:r>
-        <w:t xml:space="preserve">code.</w:t>
-      </w:r>
-      <w:r>
-        <w:t xml:space="preserve"> </w:t>
-      </w:r>
-      <w:r>
-        <w:t xml:space="preserve">We</w:t>
-      </w:r>
-      <w:r>
-        <w:t xml:space="preserve"> </w:t>
-      </w:r>
-      <w:r>
-        <w:t xml:space="preserve">present</w:t>
-      </w:r>
-      <w:r>
-        <w:t xml:space="preserve"> </w:t>
-      </w:r>
-      <w:r>
-        <w:t xml:space="preserve">the</w:t>
-      </w:r>
-      <w:r>
-        <w:t xml:space="preserve"> </w:t>
-      </w:r>
-      <w:r>
-        <w:t xml:space="preserve">first</w:t>
-      </w:r>
-      <w:r>
-        <w:t xml:space="preserve"> </w:t>
-      </w:r>
-      <w:r>
-        <w:t xml:space="preserve">quantitative</w:t>
-      </w:r>
-      <w:r>
-        <w:t xml:space="preserve"> </w:t>
-      </w:r>
-      <w:r>
-        <w:t xml:space="preserve">assessment</w:t>
-      </w:r>
-      <w:r>
-        <w:t xml:space="preserve"> </w:t>
-      </w:r>
-      <w:r>
-        <w:t xml:space="preserve">of</w:t>
-      </w:r>
-      <w:r>
-        <w:t xml:space="preserve"> </w:t>
-      </w:r>
-      <w:r>
-        <w:t xml:space="preserve">the</w:t>
-      </w:r>
-      <w:r>
-        <w:t xml:space="preserve"> </w:t>
-      </w:r>
-      <w:r>
-        <w:t xml:space="preserve">B/PSTM</w:t>
-      </w:r>
-      <w:r>
-        <w:t xml:space="preserve"> </w:t>
-      </w:r>
-      <w:r>
-        <w:t xml:space="preserve">against</w:t>
-      </w:r>
-      <w:r>
-        <w:t xml:space="preserve"> </w:t>
-      </w:r>
-      <w:r>
-        <w:t xml:space="preserve">human</w:t>
-      </w:r>
-      <w:r>
-        <w:t xml:space="preserve"> </w:t>
-      </w:r>
-      <w:r>
-        <w:t xml:space="preserve">perception.</w:t>
-      </w:r>
-      <w:r>
-        <w:t xml:space="preserve"> </w:t>
-      </w:r>
-      <w:r>
-        <w:t xml:space="preserve">We</w:t>
-      </w:r>
-      <w:r>
-        <w:t xml:space="preserve"> </w:t>
-      </w:r>
-      <w:r>
-        <w:t xml:space="preserve">show</w:t>
-      </w:r>
-      <w:r>
-        <w:t xml:space="preserve"> </w:t>
-      </w:r>
-      <w:r>
-        <w:t xml:space="preserve">that</w:t>
-      </w:r>
-      <w:r>
-        <w:t xml:space="preserve"> </w:t>
-      </w:r>
-      <w:r>
-        <w:t xml:space="preserve">the</w:t>
-      </w:r>
-      <w:r>
-        <w:t xml:space="preserve"> </w:t>
-      </w:r>
-      <w:r>
-        <w:t xml:space="preserve">two</w:t>
-      </w:r>
-      <w:r>
-        <w:t xml:space="preserve"> </w:t>
-      </w:r>
-      <w:r>
-        <w:t xml:space="preserve">models</w:t>
       </w:r>
       <w:r>
         <w:t xml:space="preserve"> </w:t>
@@ -1183,156 +1111,6 @@
       </w:r>
       <w:r>
         <w:t xml:space="preserve">normalization.</w:t>
-      </w:r>
-      <w:r>
-        <w:t xml:space="preserve"> </w:t>
-      </w:r>
-      <w:r>
-        <w:t xml:space="preserve">We</w:t>
-      </w:r>
-      <w:r>
-        <w:t xml:space="preserve"> </w:t>
-      </w:r>
-      <w:r>
-        <w:t xml:space="preserve">close</w:t>
-      </w:r>
-      <w:r>
-        <w:t xml:space="preserve"> </w:t>
-      </w:r>
-      <w:r>
-        <w:t xml:space="preserve">by</w:t>
-      </w:r>
-      <w:r>
-        <w:t xml:space="preserve"> </w:t>
-      </w:r>
-      <w:r>
-        <w:t xml:space="preserve">describing</w:t>
-      </w:r>
-      <w:r>
-        <w:t xml:space="preserve"> </w:t>
-      </w:r>
-      <w:r>
-        <w:t xml:space="preserve">how</w:t>
-      </w:r>
-      <w:r>
-        <w:t xml:space="preserve"> </w:t>
-      </w:r>
-      <w:r>
-        <w:t xml:space="preserve">the</w:t>
-      </w:r>
-      <w:r>
-        <w:t xml:space="preserve"> </w:t>
-      </w:r>
-      <w:r>
-        <w:t xml:space="preserve">BSTM</w:t>
-      </w:r>
-      <w:r>
-        <w:t xml:space="preserve"> </w:t>
-      </w:r>
-      <w:r>
-        <w:t xml:space="preserve">facilitates</w:t>
-      </w:r>
-      <w:r>
-        <w:t xml:space="preserve"> </w:t>
-      </w:r>
-      <w:r>
-        <w:t xml:space="preserve">investigation</w:t>
-      </w:r>
-      <w:r>
-        <w:t xml:space="preserve"> </w:t>
-      </w:r>
-      <w:r>
-        <w:t xml:space="preserve">into</w:t>
-      </w:r>
-      <w:r>
-        <w:t xml:space="preserve"> </w:t>
-      </w:r>
-      <w:r>
-        <w:t xml:space="preserve">the</w:t>
-      </w:r>
-      <w:r>
-        <w:t xml:space="preserve"> </w:t>
-      </w:r>
-      <w:r>
-        <w:t xml:space="preserve">connection</w:t>
-      </w:r>
-      <w:r>
-        <w:t xml:space="preserve"> </w:t>
-      </w:r>
-      <w:r>
-        <w:t xml:space="preserve">between</w:t>
-      </w:r>
-      <w:r>
-        <w:t xml:space="preserve"> </w:t>
-      </w:r>
-      <w:r>
-        <w:t xml:space="preserve">speech</w:t>
-      </w:r>
-      <w:r>
-        <w:t xml:space="preserve"> </w:t>
-      </w:r>
-      <w:r>
-        <w:t xml:space="preserve">perception</w:t>
-      </w:r>
-      <w:r>
-        <w:t xml:space="preserve"> </w:t>
-      </w:r>
-      <w:r>
-        <w:t xml:space="preserve">and</w:t>
-      </w:r>
-      <w:r>
-        <w:t xml:space="preserve"> </w:t>
-      </w:r>
-      <w:r>
-        <w:t xml:space="preserve">social</w:t>
-      </w:r>
-      <w:r>
-        <w:t xml:space="preserve"> </w:t>
-      </w:r>
-      <w:r>
-        <w:t xml:space="preserve">inferences,</w:t>
-      </w:r>
-      <w:r>
-        <w:t xml:space="preserve"> </w:t>
-      </w:r>
-      <w:r>
-        <w:t xml:space="preserve">including</w:t>
-      </w:r>
-      <w:r>
-        <w:t xml:space="preserve"> </w:t>
-      </w:r>
-      <w:r>
-        <w:t xml:space="preserve">the</w:t>
-      </w:r>
-      <w:r>
-        <w:t xml:space="preserve"> </w:t>
-      </w:r>
-      <w:r>
-        <w:t xml:space="preserve">estimation</w:t>
-      </w:r>
-      <w:r>
-        <w:t xml:space="preserve"> </w:t>
-      </w:r>
-      <w:r>
-        <w:t xml:space="preserve">of</w:t>
-      </w:r>
-      <w:r>
-        <w:t xml:space="preserve"> </w:t>
-      </w:r>
-      <w:r>
-        <w:t xml:space="preserve">indexical</w:t>
-      </w:r>
-      <w:r>
-        <w:t xml:space="preserve"> </w:t>
-      </w:r>
-      <w:r>
-        <w:t xml:space="preserve">talker</w:t>
-      </w:r>
-      <w:r>
-        <w:t xml:space="preserve"> </w:t>
-      </w:r>
-      <w:r>
-        <w:t xml:space="preserve">characteristics.</w:t>
       </w:r>
     </w:p>
     <w:bookmarkStart w:id="21" w:name="introduction"/>
@@ -1580,7 +1358,16 @@
         <w:t xml:space="preserve">’</w:t>
       </w:r>
       <w:r>
-        <w:t xml:space="preserve">. As of the writing of this article, it had been cited less than 40 times over 17 years. During the same time, there have been 314,000 research articles on vowels. Over 17,000 of these mention vowel formants, vowel identification/categorization/recognition, and/or vowel/formant perception; over 5,000 additionally mention normalization. Among these articles, Lobanov normalization</w:t>
+        <w:t xml:space="preserve">. As of the writing of this article, it had been cited less than 40 times over 17 years. During the same time, there have been 314,000 research articles on vowels.</w:t>
+      </w:r>
+      <w:r>
+        <w:t xml:space="preserve"> </w:t>
+      </w:r>
+      <w:r>
+        <w:t xml:space="preserve"> </w:t>
+      </w:r>
+      <w:r>
+        <w:t xml:space="preserve">Among the articles covering formant normalization, Lobanov normalization</w:t>
       </w:r>
       <w:r>
         <w:t xml:space="preserve"> </w:t>
@@ -1661,32 +1448,16 @@
         <w:t xml:space="preserve"> </w:t>
       </w:r>
       <w:r>
-        <w:t xml:space="preserve">is a technical paper, written by experts for experts. It presents seven different models, without much explanation as to how they are derived, and no code to execute them. We imagine that the model is so underutilized in large parts because nobody knows how to implement it. Here we describe the PSTM and present a more fully Bayesian extension—the</w:t>
-      </w:r>
-      <w:r>
-        <w:t xml:space="preserve"> </w:t>
-      </w:r>
-      <w:r>
-        <w:rPr>
-          <w:i/>
-          <w:iCs/>
-        </w:rPr>
-        <w:t xml:space="preserve">Bayesian Sliding Template Model (BSTM)</w:t>
-      </w:r>
-      <w:r>
-        <w:t xml:space="preserve">—envisioned in</w:t>
-      </w:r>
-      <w:r>
-        <w:t xml:space="preserve"> </w:t>
-      </w:r>
-      <w:r>
-        <w:t xml:space="preserve">Nearey and Assmann (2007)</w:t>
-      </w:r>
-      <w:r>
-        <w:t xml:space="preserve"> </w:t>
-      </w:r>
-      <w:r>
-        <w:t xml:space="preserve">but not previously available. We walk through the logic of these models step by step and provide visualizations of core concepts. Our supplementary information (SI) contains detailed derivations for the most relevant models. To further facilitate adoption of the model by other researchers, we have implemented all models describe here in the R package</w:t>
+        <w:t xml:space="preserve">is a technical paper, written by experts for experts.</w:t>
+      </w:r>
+      <w:r>
+        <w:t xml:space="preserve"> </w:t>
+      </w:r>
+      <w:r>
+        <w:t xml:space="preserve"> </w:t>
+      </w:r>
+      <w:r>
+        <w:t xml:space="preserve">Here we walk through the logic behind the PSTM step by step and provide visualizations of core concepts. Our supplementary information (SI) contains detailed derivations for the most relevant variants of the PSTM. To further facilitate adoption of the model by other researchers, we have implemented all models describe here in the R package</w:t>
       </w:r>
       <w:r>
         <w:t xml:space="preserve"> </w:t>
@@ -1745,7 +1516,7 @@
         <w:pStyle w:val="BodyText"/>
       </w:pPr>
       <w:r>
-        <w:t xml:space="preserve">A second reason as to why the PSTM has not received more attention is that it has not previously been tested against human perception.</w:t>
+        <w:t xml:space="preserve">Second, the PSTM has not previously been tested against human perception.</w:t>
       </w:r>
       <w:r>
         <w:t xml:space="preserve"> </w:t>
@@ -1757,7 +1528,7 @@
         <w:t xml:space="preserve"> </w:t>
       </w:r>
       <w:r>
-        <w:t xml:space="preserve">evaluated the PSTM in terms of its ability to recognize the vowel intended by the talker. However, as we also demonstrate below, a model of human speech perception should be evaluated in terms of its ability to predict</w:t>
+        <w:t xml:space="preserve">evaluated the PSTM in terms of its ability to recognize the vowel intended by the talker. However, models of human speech perception should be evaluated in terms of its ability to predict</w:t>
       </w:r>
       <w:r>
         <w:t xml:space="preserve"> </w:t>
@@ -1776,7 +1547,7 @@
         <w:t xml:space="preserve"> </w:t>
       </w:r>
       <w:r>
-        <w:t xml:space="preserve">(for discussion, see Barreda 2020; Persson, Barreda, and Jaeger 2025)</w:t>
+        <w:t xml:space="preserve">(see also Barreda 2020; Persson, Barreda, and Jaeger 2025)</w:t>
       </w:r>
       <w:r>
         <w:t xml:space="preserve">. While</w:t>
@@ -1791,23 +1562,10 @@
         <w:t xml:space="preserve"> </w:t>
       </w:r>
       <w:r>
-        <w:t xml:space="preserve">also presented initial qualitative comparisons of PSTM’s predictions and listeners’ perception, those comparisons leave open how good a model the PSTM is of human perception. Here, we address this question. We find that the incremental inference procedure proposed for the PSTM explains listeners’ perception very well, and</w:t>
-      </w:r>
-      <w:r>
-        <w:t xml:space="preserve"> </w:t>
-      </w:r>
-      <w:r>
-        <w:rPr>
-          <w:i/>
-          <w:iCs/>
-        </w:rPr>
-        <w:t xml:space="preserve">substantially</w:t>
-      </w:r>
-      <w:r>
-        <w:t xml:space="preserve"> </w:t>
-      </w:r>
-      <w:r>
-        <w:t xml:space="preserve">better than the most frequently used normalization account (Lobanov).</w:t>
+        <w:t xml:space="preserve">presented initial qualitative comparisons of PSTM’s predictions and listeners’ perception, those comparisons leave open how good a model the PSTM is of human perception. Here, we address this question.</w:t>
+      </w:r>
+      <w:r>
+        <w:t xml:space="preserve"> </w:t>
       </w:r>
     </w:p>
     <w:bookmarkEnd w:id="20"/>
@@ -5368,7 +5126,7 @@
       </w:r>
     </w:p>
     <w:bookmarkEnd w:id="32"/>
-    <w:bookmarkStart w:id="62" w:name="sec-methods"/>
+    <w:bookmarkStart w:id="58" w:name="sec-methods"/>
     <w:p>
       <w:pPr>
         <w:pStyle w:val="Heading1"/>
@@ -13341,13 +13099,14 @@
       <w:bookmarkEnd w:id="56"/>
     </w:p>
     <w:bookmarkEnd w:id="57"/>
-    <w:bookmarkStart w:id="61" w:name="the-bayesian-sliding-template-model"/>
+    <w:bookmarkEnd w:id="58"/>
+    <w:bookmarkStart w:id="67" w:name="sec-bootstrap"/>
     <w:p>
       <w:pPr>
-        <w:pStyle w:val="Heading2"/>
+        <w:pStyle w:val="Heading1"/>
       </w:pPr>
       <w:r>
-        <w:t xml:space="preserve">4.6 The Bayesian Sliding Template Model</w:t>
+        <w:t xml:space="preserve">5. Bootstrap Evaluation</w:t>
       </w:r>
     </w:p>
     <w:p>
@@ -13355,1653 +13114,78 @@
         <w:pStyle w:val="FirstParagraph"/>
       </w:pPr>
       <w:r>
-        <w:t xml:space="preserve">The PSTM calculates MAP values of</w:t>
-      </w:r>
-      <w:r>
-        <w:t xml:space="preserve"> </w:t>
-      </w:r>
-      <m:oMath>
-        <m:sSub>
-          <m:e>
-            <m:acc>
-              <m:accPr>
-                <m:chr m:val="̂"/>
-              </m:accPr>
-              <m:e>
-                <m:r>
-                  <m:t>ψ</m:t>
-                </m:r>
-              </m:e>
-            </m:acc>
-          </m:e>
-          <m:sub>
-            <m:r>
-              <m:t>s</m:t>
-            </m:r>
-          </m:sub>
-        </m:sSub>
-      </m:oMath>
-      <w:r>
-        <w:t xml:space="preserve"> </w:t>
-      </w:r>
-      <w:r>
-        <w:t xml:space="preserve">for each vowel, and then uses the largest of these point estimates to categorize the observed formant input (</w:t>
-      </w:r>
-      <w:hyperlink w:anchor="eq-criterion-psi-and-vowel">
-        <w:r>
-          <w:rPr>
-            <w:rStyle w:val="Hyperlink"/>
-          </w:rPr>
-          <w:t xml:space="preserve">Equation 10</w:t>
-        </w:r>
-      </w:hyperlink>
-      <w:r>
-        <w:t xml:space="preserve">).</w:t>
-      </w:r>
-      <w:r>
-        <w:t xml:space="preserve"> </w:t>
-      </w:r>
-      <w:r>
-        <w:t xml:space="preserve">Nearey and Assmann (2007)</w:t>
-      </w:r>
-      <w:r>
-        <w:t xml:space="preserve"> </w:t>
-      </w:r>
-      <w:r>
-        <w:t xml:space="preserve">noted that</w:t>
-      </w:r>
-      <w:r>
-        <w:t xml:space="preserve"> </w:t>
-      </w:r>
-      <w:r>
-        <w:t xml:space="preserve">“</w:t>
-      </w:r>
-      <w:r>
-        <w:t xml:space="preserve">[i]t would also be possible […] to use a fuller Bayesian approach by integrating over the values of</w:t>
-      </w:r>
-      <w:r>
-        <w:t xml:space="preserve"> </w:t>
-      </w:r>
-      <m:oMath>
-        <m:sSub>
-          <m:e>
-            <m:r>
-              <m:t>ψ</m:t>
-            </m:r>
-          </m:e>
-          <m:sub>
-            <m:r>
-              <m:t>s</m:t>
-            </m:r>
-          </m:sub>
-        </m:sSub>
-      </m:oMath>
-      <w:r>
-        <w:t xml:space="preserve">, rather than selecting the maximum. We leave that possibility for future research</w:t>
-      </w:r>
-      <w:r>
-        <w:t xml:space="preserve">”</w:t>
-      </w:r>
-      <w:r>
-        <w:t xml:space="preserve"> </w:t>
-      </w:r>
-      <w:r>
-        <w:t xml:space="preserve">(p. 254). In order to make the methods outlined above more fully Bayesian, we can instead focus on the joint posterior distribution of</w:t>
-      </w:r>
-      <w:r>
-        <w:t xml:space="preserve"> </w:t>
-      </w:r>
-      <m:oMath>
-        <m:sSub>
-          <m:e>
-            <m:r>
-              <m:t>ψ</m:t>
-            </m:r>
-          </m:e>
-          <m:sub>
-            <m:r>
-              <m:t>s</m:t>
-            </m:r>
-          </m:sub>
-        </m:sSub>
-      </m:oMath>
-      <w:r>
-        <w:t xml:space="preserve"> </w:t>
-      </w:r>
-      <w:r>
-        <w:t xml:space="preserve">and the vowel category v:</w:t>
+        <w:t xml:space="preserve">To compare the performance of different implementations of the STM in understanding perceptual vowel normalization, we conduct a bootstrap analysis using data on the perception of US English vowels</w:t>
+      </w:r>
+      <w:r>
+        <w:t xml:space="preserve"> </w:t>
+      </w:r>
+      <w:r>
+        <w:t xml:space="preserve">(Hillenbrand et al. 1995)</w:t>
+      </w:r>
+      <w:r>
+        <w:t xml:space="preserve">. A step-by-step walk-through of the analysis is available as an R Markdown vignette in the OSF repo for this article. As demonstrated in that vignette, the</w:t>
+      </w:r>
+      <w:r>
+        <w:t xml:space="preserve"> </w:t>
+      </w:r>
+      <w:r>
+        <w:rPr>
+          <w:rStyle w:val="VerbatimChar"/>
+        </w:rPr>
+        <w:t xml:space="preserve">STM</w:t>
+      </w:r>
+      <w:r>
+        <w:t xml:space="preserve"> </w:t>
+      </w:r>
+      <w:r>
+        <w:t xml:space="preserve">package allows researchers to conduct the type of analysis we present here on their own data, with just a handful of R commands.</w:t>
       </w:r>
     </w:p>
     <w:p>
       <w:pPr>
         <w:pStyle w:val="BodyText"/>
       </w:pPr>
-      <w:bookmarkStart w:id="58" w:name="eq-BSTM-posterior-joint-psi-and-vowel"/>
-      <m:oMathPara>
-        <m:oMathParaPr>
-          <m:jc m:val="center"/>
-        </m:oMathParaPr>
-        <m:oMath>
-          <m:r>
-            <m:t>P</m:t>
-          </m:r>
-          <m:d>
-            <m:dPr>
-              <m:begChr m:val="("/>
-              <m:endChr m:val=")"/>
-              <m:sepChr m:val=""/>
-              <m:grow/>
-            </m:dPr>
-            <m:e>
-              <m:r>
-                <m:rPr>
-                  <m:nor/>
-                  <m:sty m:val="p"/>
-                </m:rPr>
-                <m:t>v</m:t>
-              </m:r>
-              <m:r>
-                <m:rPr>
-                  <m:sty m:val="p"/>
-                </m:rPr>
-                <m:t>,</m:t>
-              </m:r>
-              <m:sSub>
-                <m:e>
-                  <m:r>
-                    <m:t>ψ</m:t>
-                  </m:r>
-                </m:e>
-                <m:sub>
-                  <m:r>
-                    <m:t>s</m:t>
-                  </m:r>
-                </m:sub>
-              </m:sSub>
-              <m:r>
-                <m:rPr>
-                  <m:sty m:val="p"/>
-                </m:rPr>
-                <m:t>|</m:t>
-              </m:r>
-              <m:acc>
-                <m:accPr>
-                  <m:chr m:val="⃗"/>
-                </m:accPr>
-                <m:e>
-                  <m:r>
-                    <m:t>G</m:t>
-                  </m:r>
-                </m:e>
-              </m:acc>
-            </m:e>
-          </m:d>
-          <m:r>
-            <m:rPr>
-              <m:sty m:val="p"/>
-            </m:rPr>
-            <m:t>=</m:t>
-          </m:r>
-          <m:f>
-            <m:fPr>
-              <m:type m:val="bar"/>
-            </m:fPr>
-            <m:num>
-              <m:r>
-                <m:t>P</m:t>
-              </m:r>
-              <m:d>
-                <m:dPr>
-                  <m:begChr m:val="("/>
-                  <m:endChr m:val=")"/>
-                  <m:sepChr m:val=""/>
-                  <m:grow/>
-                </m:dPr>
-                <m:e>
-                  <m:acc>
-                    <m:accPr>
-                      <m:chr m:val="⃗"/>
-                    </m:accPr>
-                    <m:e>
-                      <m:r>
-                        <m:t>G</m:t>
-                      </m:r>
-                    </m:e>
-                  </m:acc>
-                  <m:r>
-                    <m:rPr>
-                      <m:sty m:val="p"/>
-                    </m:rPr>
-                    <m:t>|</m:t>
-                  </m:r>
-                  <m:r>
-                    <m:rPr>
-                      <m:nor/>
-                      <m:sty m:val="p"/>
-                    </m:rPr>
-                    <m:t>v</m:t>
-                  </m:r>
-                  <m:r>
-                    <m:rPr>
-                      <m:sty m:val="p"/>
-                    </m:rPr>
-                    <m:t>,</m:t>
-                  </m:r>
-                  <m:sSub>
-                    <m:e>
-                      <m:r>
-                        <m:t>ψ</m:t>
-                      </m:r>
-                    </m:e>
-                    <m:sub>
-                      <m:r>
-                        <m:t>s</m:t>
-                      </m:r>
-                    </m:sub>
-                  </m:sSub>
-                </m:e>
-              </m:d>
-              <m:r>
-                <m:rPr>
-                  <m:sty m:val="p"/>
-                </m:rPr>
-                <m:t>⋅</m:t>
-              </m:r>
-              <m:r>
-                <m:t>P</m:t>
-              </m:r>
-              <m:d>
-                <m:dPr>
-                  <m:begChr m:val="("/>
-                  <m:endChr m:val=")"/>
-                  <m:sepChr m:val=""/>
-                  <m:grow/>
-                </m:dPr>
-                <m:e>
-                  <m:sSub>
-                    <m:e>
-                      <m:r>
-                        <m:t>ψ</m:t>
-                      </m:r>
-                    </m:e>
-                    <m:sub>
-                      <m:r>
-                        <m:t>s</m:t>
-                      </m:r>
-                    </m:sub>
-                  </m:sSub>
-                </m:e>
-              </m:d>
-              <m:r>
-                <m:rPr>
-                  <m:sty m:val="p"/>
-                </m:rPr>
-                <m:t>⋅</m:t>
-              </m:r>
-              <m:r>
-                <m:t>P</m:t>
-              </m:r>
-              <m:d>
-                <m:dPr>
-                  <m:begChr m:val="("/>
-                  <m:endChr m:val=")"/>
-                  <m:sepChr m:val=""/>
-                  <m:grow/>
-                </m:dPr>
-                <m:e>
-                  <m:r>
-                    <m:rPr>
-                      <m:nor/>
-                      <m:sty m:val="p"/>
-                    </m:rPr>
-                    <m:t>v</m:t>
-                  </m:r>
-                </m:e>
-              </m:d>
-            </m:num>
-            <m:den>
-              <m:nary>
-                <m:naryPr>
-                  <m:chr m:val="∑"/>
-                  <m:limLoc m:val="undOvr"/>
-                  <m:subHide m:val="off"/>
-                  <m:supHide m:val="off"/>
-                </m:naryPr>
-                <m:sub>
-                  <m:r>
-                    <m:t>i</m:t>
-                  </m:r>
-                  <m:r>
-                    <m:rPr>
-                      <m:sty m:val="p"/>
-                    </m:rPr>
-                    <m:t>=</m:t>
-                  </m:r>
-                  <m:r>
-                    <m:t>i</m:t>
-                  </m:r>
-                </m:sub>
-                <m:sup>
-                  <m:r>
-                    <m:t>V</m:t>
-                  </m:r>
-                </m:sup>
-                <m:e>
-                  <m:r>
-                    <m:rPr>
-                      <m:sty m:val="p"/>
-                    </m:rPr>
-                    <m:t>∫</m:t>
-                  </m:r>
-                </m:e>
-              </m:nary>
-              <m:r>
-                <m:t>P</m:t>
-              </m:r>
-              <m:d>
-                <m:dPr>
-                  <m:begChr m:val="("/>
-                  <m:endChr m:val=")"/>
-                  <m:sepChr m:val=""/>
-                  <m:grow/>
-                </m:dPr>
-                <m:e>
-                  <m:acc>
-                    <m:accPr>
-                      <m:chr m:val="⃗"/>
-                    </m:accPr>
-                    <m:e>
-                      <m:r>
-                        <m:t>G</m:t>
-                      </m:r>
-                    </m:e>
-                  </m:acc>
-                  <m:r>
-                    <m:rPr>
-                      <m:sty m:val="p"/>
-                    </m:rPr>
-                    <m:t>|</m:t>
-                  </m:r>
-                  <m:sSub>
-                    <m:e>
-                      <m:r>
-                        <m:rPr>
-                          <m:nor/>
-                          <m:sty m:val="p"/>
-                        </m:rPr>
-                        <m:t>v</m:t>
-                      </m:r>
-                    </m:e>
-                    <m:sub>
-                      <m:r>
-                        <m:t>i</m:t>
-                      </m:r>
-                    </m:sub>
-                  </m:sSub>
-                  <m:r>
-                    <m:rPr>
-                      <m:sty m:val="p"/>
-                    </m:rPr>
-                    <m:t>,</m:t>
-                  </m:r>
-                  <m:sSub>
-                    <m:e>
-                      <m:r>
-                        <m:t>ψ</m:t>
-                      </m:r>
-                    </m:e>
-                    <m:sub>
-                      <m:r>
-                        <m:t>s</m:t>
-                      </m:r>
-                    </m:sub>
-                  </m:sSub>
-                </m:e>
-              </m:d>
-              <m:r>
-                <m:rPr>
-                  <m:sty m:val="p"/>
-                </m:rPr>
-                <m:t>⋅</m:t>
-              </m:r>
-              <m:r>
-                <m:t>P</m:t>
-              </m:r>
-              <m:d>
-                <m:dPr>
-                  <m:begChr m:val="("/>
-                  <m:endChr m:val=")"/>
-                  <m:sepChr m:val=""/>
-                  <m:grow/>
-                </m:dPr>
-                <m:e>
-                  <m:sSub>
-                    <m:e>
-                      <m:r>
-                        <m:t>ψ</m:t>
-                      </m:r>
-                    </m:e>
-                    <m:sub>
-                      <m:r>
-                        <m:t>s</m:t>
-                      </m:r>
-                    </m:sub>
-                  </m:sSub>
-                </m:e>
-              </m:d>
-              <m:r>
-                <m:rPr>
-                  <m:sty m:val="p"/>
-                </m:rPr>
-                <m:t>⋅</m:t>
-              </m:r>
-              <m:r>
-                <m:t>P</m:t>
-              </m:r>
-              <m:d>
-                <m:dPr>
-                  <m:begChr m:val="("/>
-                  <m:endChr m:val=")"/>
-                  <m:sepChr m:val=""/>
-                  <m:grow/>
-                </m:dPr>
-                <m:e>
-                  <m:sSub>
-                    <m:e>
-                      <m:r>
-                        <m:rPr>
-                          <m:nor/>
-                          <m:sty m:val="p"/>
-                        </m:rPr>
-                        <m:t>v</m:t>
-                      </m:r>
-                    </m:e>
-                    <m:sub>
-                      <m:r>
-                        <m:t>i</m:t>
-                      </m:r>
-                    </m:sub>
-                  </m:sSub>
-                </m:e>
-              </m:d>
-              <m:r>
-                <m:t> </m:t>
-              </m:r>
-              <m:r>
-                <m:t>d</m:t>
-              </m:r>
-              <m:r>
-                <m:t>ψ</m:t>
-              </m:r>
-            </m:den>
-          </m:f>
-          <m:r>
-            <m:t>  </m:t>
-          </m:r>
-          <m:d>
-            <m:dPr>
-              <m:begChr m:val="("/>
-              <m:endChr m:val=")"/>
-              <m:sepChr m:val=""/>
-              <m:grow/>
-            </m:dPr>
-            <m:e>
-              <m:r>
-                <m:t>16</m:t>
-              </m:r>
-            </m:e>
-          </m:d>
-        </m:oMath>
-      </m:oMathPara>
-      <w:bookmarkEnd w:id="58"/>
-    </w:p>
-    <w:p>
-      <w:pPr>
-        <w:pStyle w:val="FirstParagraph"/>
-      </w:pPr>
-      <w:r>
-        <w:t xml:space="preserve">To find the posterior distribution of</w:t>
-      </w:r>
-      <w:r>
-        <w:t xml:space="preserve"> </w:t>
-      </w:r>
-      <m:oMath>
-        <m:sSub>
-          <m:e>
-            <m:r>
-              <m:t>ψ</m:t>
-            </m:r>
-          </m:e>
-          <m:sub>
-            <m:r>
-              <m:t>s</m:t>
-            </m:r>
-          </m:sub>
-        </m:sSub>
-      </m:oMath>
-      <w:r>
-        <w:t xml:space="preserve">, we marginalize over</w:t>
-      </w:r>
-      <w:r>
-        <w:t xml:space="preserve"> </w:t>
-      </w:r>
-      <m:oMath>
-        <m:r>
-          <m:rPr>
-            <m:nor/>
-            <m:sty m:val="p"/>
-          </m:rPr>
-          <m:t>v</m:t>
-        </m:r>
-      </m:oMath>
-      <w:r>
-        <w:t xml:space="preserve">:</w:t>
+      <w:r>
+        <w:t xml:space="preserve">The</w:t>
+      </w:r>
+      <w:r>
+        <w:t xml:space="preserve"> </w:t>
+      </w:r>
+      <w:r>
+        <w:t xml:space="preserve">Hillenbrand et al. (1995)</w:t>
+      </w:r>
+      <w:r>
+        <w:t xml:space="preserve"> </w:t>
+      </w:r>
+      <w:r>
+        <w:t xml:space="preserve">data include acoustic measures from 139 speakers producing one instance of twelve vowels each, including formant measures at multiple time slices. We used formant measurements at 20% and 80% of the vowel duration. This meant each vowel token was represented by a vector of length six, two measurements for each of three formants. We used two time points to parallel the analyses presented in</w:t>
+      </w:r>
+      <w:r>
+        <w:t xml:space="preserve"> </w:t>
+      </w:r>
+      <w:r>
+        <w:t xml:space="preserve">Nearey and Assmann (2007)</w:t>
+      </w:r>
+      <w:r>
+        <w:t xml:space="preserve">, and because formant dynamics are known to affect vowel perception for the dialect recorded in the database</w:t>
+      </w:r>
+      <w:r>
+        <w:t xml:space="preserve"> </w:t>
+      </w:r>
+      <w:r>
+        <w:t xml:space="preserve">(Hillenbrand and Nearey 1999)</w:t>
+      </w:r>
+      <w:r>
+        <w:t xml:space="preserve">. By fitting multivariate normal distributions in this six-dimensional space, we assume that listeners have learned expectations about the (co)variance between formants within and across time points.</w:t>
+      </w:r>
+      <w:r>
+        <w:t xml:space="preserve"> </w:t>
       </w:r>
     </w:p>
     <w:p>
       <w:pPr>
         <w:pStyle w:val="BodyText"/>
       </w:pPr>
-      <w:bookmarkStart w:id="59" w:name="eq-e20bb"/>
-      <m:oMathPara>
-        <m:oMathParaPr>
-          <m:jc m:val="center"/>
-        </m:oMathParaPr>
-        <m:oMath>
-          <m:r>
-            <m:t>P</m:t>
-          </m:r>
-          <m:d>
-            <m:dPr>
-              <m:begChr m:val="("/>
-              <m:endChr m:val=")"/>
-              <m:sepChr m:val=""/>
-              <m:grow/>
-            </m:dPr>
-            <m:e>
-              <m:sSub>
-                <m:e>
-                  <m:r>
-                    <m:t>ψ</m:t>
-                  </m:r>
-                </m:e>
-                <m:sub>
-                  <m:r>
-                    <m:t>s</m:t>
-                  </m:r>
-                </m:sub>
-              </m:sSub>
-              <m:r>
-                <m:rPr>
-                  <m:sty m:val="p"/>
-                </m:rPr>
-                <m:t>|</m:t>
-              </m:r>
-              <m:acc>
-                <m:accPr>
-                  <m:chr m:val="⃗"/>
-                </m:accPr>
-                <m:e>
-                  <m:r>
-                    <m:t>G</m:t>
-                  </m:r>
-                </m:e>
-              </m:acc>
-            </m:e>
-          </m:d>
-          <m:r>
-            <m:rPr>
-              <m:sty m:val="p"/>
-            </m:rPr>
-            <m:t>=</m:t>
-          </m:r>
-          <m:f>
-            <m:fPr>
-              <m:type m:val="bar"/>
-            </m:fPr>
-            <m:num>
-              <m:nary>
-                <m:naryPr>
-                  <m:chr m:val="∑"/>
-                  <m:limLoc m:val="undOvr"/>
-                  <m:subHide m:val="off"/>
-                  <m:supHide m:val="off"/>
-                </m:naryPr>
-                <m:sub>
-                  <m:r>
-                    <m:t>i</m:t>
-                  </m:r>
-                  <m:r>
-                    <m:rPr>
-                      <m:sty m:val="p"/>
-                    </m:rPr>
-                    <m:t>=</m:t>
-                  </m:r>
-                  <m:r>
-                    <m:t>1</m:t>
-                  </m:r>
-                </m:sub>
-                <m:sup>
-                  <m:r>
-                    <m:t>V</m:t>
-                  </m:r>
-                </m:sup>
-                <m:e>
-                  <m:r>
-                    <m:t>P</m:t>
-                  </m:r>
-                </m:e>
-              </m:nary>
-              <m:d>
-                <m:dPr>
-                  <m:begChr m:val="("/>
-                  <m:endChr m:val=")"/>
-                  <m:sepChr m:val=""/>
-                  <m:grow/>
-                </m:dPr>
-                <m:e>
-                  <m:acc>
-                    <m:accPr>
-                      <m:chr m:val="⃗"/>
-                    </m:accPr>
-                    <m:e>
-                      <m:r>
-                        <m:t>G</m:t>
-                      </m:r>
-                    </m:e>
-                  </m:acc>
-                  <m:r>
-                    <m:rPr>
-                      <m:sty m:val="p"/>
-                    </m:rPr>
-                    <m:t>|</m:t>
-                  </m:r>
-                  <m:sSub>
-                    <m:e>
-                      <m:r>
-                        <m:rPr>
-                          <m:nor/>
-                          <m:sty m:val="p"/>
-                        </m:rPr>
-                        <m:t>v</m:t>
-                      </m:r>
-                    </m:e>
-                    <m:sub>
-                      <m:r>
-                        <m:t>i</m:t>
-                      </m:r>
-                    </m:sub>
-                  </m:sSub>
-                  <m:r>
-                    <m:rPr>
-                      <m:sty m:val="p"/>
-                    </m:rPr>
-                    <m:t>,</m:t>
-                  </m:r>
-                  <m:sSub>
-                    <m:e>
-                      <m:r>
-                        <m:t>ψ</m:t>
-                      </m:r>
-                    </m:e>
-                    <m:sub>
-                      <m:r>
-                        <m:t>s</m:t>
-                      </m:r>
-                    </m:sub>
-                  </m:sSub>
-                </m:e>
-              </m:d>
-              <m:r>
-                <m:rPr>
-                  <m:sty m:val="p"/>
-                </m:rPr>
-                <m:t>⋅</m:t>
-              </m:r>
-              <m:r>
-                <m:t>P</m:t>
-              </m:r>
-              <m:d>
-                <m:dPr>
-                  <m:begChr m:val="("/>
-                  <m:endChr m:val=")"/>
-                  <m:sepChr m:val=""/>
-                  <m:grow/>
-                </m:dPr>
-                <m:e>
-                  <m:sSub>
-                    <m:e>
-                      <m:r>
-                        <m:rPr>
-                          <m:nor/>
-                          <m:sty m:val="p"/>
-                        </m:rPr>
-                        <m:t>v</m:t>
-                      </m:r>
-                    </m:e>
-                    <m:sub>
-                      <m:r>
-                        <m:t>i</m:t>
-                      </m:r>
-                    </m:sub>
-                  </m:sSub>
-                </m:e>
-              </m:d>
-              <m:r>
-                <m:rPr>
-                  <m:sty m:val="p"/>
-                </m:rPr>
-                <m:t>⋅</m:t>
-              </m:r>
-              <m:r>
-                <m:t>P</m:t>
-              </m:r>
-              <m:d>
-                <m:dPr>
-                  <m:begChr m:val="("/>
-                  <m:endChr m:val=")"/>
-                  <m:sepChr m:val=""/>
-                  <m:grow/>
-                </m:dPr>
-                <m:e>
-                  <m:sSub>
-                    <m:e>
-                      <m:r>
-                        <m:t>ψ</m:t>
-                      </m:r>
-                    </m:e>
-                    <m:sub>
-                      <m:r>
-                        <m:t>s</m:t>
-                      </m:r>
-                    </m:sub>
-                  </m:sSub>
-                </m:e>
-              </m:d>
-            </m:num>
-            <m:den>
-              <m:nary>
-                <m:naryPr>
-                  <m:chr m:val="∑"/>
-                  <m:limLoc m:val="undOvr"/>
-                  <m:subHide m:val="off"/>
-                  <m:supHide m:val="off"/>
-                </m:naryPr>
-                <m:sub>
-                  <m:r>
-                    <m:t>i</m:t>
-                  </m:r>
-                  <m:r>
-                    <m:rPr>
-                      <m:sty m:val="p"/>
-                    </m:rPr>
-                    <m:t>=</m:t>
-                  </m:r>
-                  <m:r>
-                    <m:t>1</m:t>
-                  </m:r>
-                </m:sub>
-                <m:sup>
-                  <m:r>
-                    <m:t>V</m:t>
-                  </m:r>
-                </m:sup>
-                <m:e>
-                  <m:r>
-                    <m:rPr>
-                      <m:sty m:val="p"/>
-                    </m:rPr>
-                    <m:t>∫</m:t>
-                  </m:r>
-                </m:e>
-              </m:nary>
-              <m:r>
-                <m:t>P</m:t>
-              </m:r>
-              <m:d>
-                <m:dPr>
-                  <m:begChr m:val="("/>
-                  <m:endChr m:val=")"/>
-                  <m:sepChr m:val=""/>
-                  <m:grow/>
-                </m:dPr>
-                <m:e>
-                  <m:acc>
-                    <m:accPr>
-                      <m:chr m:val="⃗"/>
-                    </m:accPr>
-                    <m:e>
-                      <m:r>
-                        <m:t>G</m:t>
-                      </m:r>
-                    </m:e>
-                  </m:acc>
-                  <m:r>
-                    <m:rPr>
-                      <m:sty m:val="p"/>
-                    </m:rPr>
-                    <m:t>|</m:t>
-                  </m:r>
-                  <m:sSub>
-                    <m:e>
-                      <m:r>
-                        <m:rPr>
-                          <m:nor/>
-                          <m:sty m:val="p"/>
-                        </m:rPr>
-                        <m:t>v</m:t>
-                      </m:r>
-                    </m:e>
-                    <m:sub>
-                      <m:r>
-                        <m:t>i</m:t>
-                      </m:r>
-                    </m:sub>
-                  </m:sSub>
-                  <m:r>
-                    <m:rPr>
-                      <m:sty m:val="p"/>
-                    </m:rPr>
-                    <m:t>,</m:t>
-                  </m:r>
-                  <m:sSub>
-                    <m:e>
-                      <m:r>
-                        <m:t>ψ</m:t>
-                      </m:r>
-                    </m:e>
-                    <m:sub>
-                      <m:r>
-                        <m:t>s</m:t>
-                      </m:r>
-                    </m:sub>
-                  </m:sSub>
-                </m:e>
-              </m:d>
-              <m:r>
-                <m:rPr>
-                  <m:sty m:val="p"/>
-                </m:rPr>
-                <m:t>⋅</m:t>
-              </m:r>
-              <m:r>
-                <m:t>P</m:t>
-              </m:r>
-              <m:d>
-                <m:dPr>
-                  <m:begChr m:val="("/>
-                  <m:endChr m:val=")"/>
-                  <m:sepChr m:val=""/>
-                  <m:grow/>
-                </m:dPr>
-                <m:e>
-                  <m:sSub>
-                    <m:e>
-                      <m:r>
-                        <m:t>ψ</m:t>
-                      </m:r>
-                    </m:e>
-                    <m:sub>
-                      <m:r>
-                        <m:t>s</m:t>
-                      </m:r>
-                    </m:sub>
-                  </m:sSub>
-                </m:e>
-              </m:d>
-              <m:r>
-                <m:rPr>
-                  <m:sty m:val="p"/>
-                </m:rPr>
-                <m:t>⋅</m:t>
-              </m:r>
-              <m:r>
-                <m:t>P</m:t>
-              </m:r>
-              <m:d>
-                <m:dPr>
-                  <m:begChr m:val="("/>
-                  <m:endChr m:val=")"/>
-                  <m:sepChr m:val=""/>
-                  <m:grow/>
-                </m:dPr>
-                <m:e>
-                  <m:sSub>
-                    <m:e>
-                      <m:r>
-                        <m:rPr>
-                          <m:nor/>
-                          <m:sty m:val="p"/>
-                        </m:rPr>
-                        <m:t>v</m:t>
-                      </m:r>
-                    </m:e>
-                    <m:sub>
-                      <m:r>
-                        <m:t>i</m:t>
-                      </m:r>
-                    </m:sub>
-                  </m:sSub>
-                </m:e>
-              </m:d>
-              <m:r>
-                <m:t> </m:t>
-              </m:r>
-              <m:r>
-                <m:t>d</m:t>
-              </m:r>
-              <m:r>
-                <m:t>ψ</m:t>
-              </m:r>
-            </m:den>
-          </m:f>
-          <m:r>
-            <m:t>  </m:t>
-          </m:r>
-          <m:d>
-            <m:dPr>
-              <m:begChr m:val="("/>
-              <m:endChr m:val=")"/>
-              <m:sepChr m:val=""/>
-              <m:grow/>
-            </m:dPr>
-            <m:e>
-              <m:r>
-                <m:t>17</m:t>
-              </m:r>
-            </m:e>
-          </m:d>
-        </m:oMath>
-      </m:oMathPara>
-      <w:bookmarkEnd w:id="59"/>
-    </w:p>
-    <w:p>
-      <w:pPr>
-        <w:pStyle w:val="FirstParagraph"/>
-      </w:pPr>
-      <w:r>
-        <w:t xml:space="preserve">To find the posterior probabilities of different vowel categories, we marginalize over</w:t>
-      </w:r>
-      <w:r>
-        <w:t xml:space="preserve"> </w:t>
-      </w:r>
-      <m:oMath>
-        <m:sSub>
-          <m:e>
-            <m:r>
-              <m:t>ψ</m:t>
-            </m:r>
-          </m:e>
-          <m:sub>
-            <m:r>
-              <m:t>s</m:t>
-            </m:r>
-          </m:sub>
-        </m:sSub>
-      </m:oMath>
-      <w:r>
-        <w:t xml:space="preserve">:</w:t>
-      </w:r>
-    </w:p>
-    <w:p>
-      <w:pPr>
-        <w:pStyle w:val="BodyText"/>
-      </w:pPr>
-      <w:bookmarkStart w:id="60" w:name="eq-BSTM-posterior-psi-and-vowel"/>
-      <m:oMathPara>
-        <m:oMathParaPr>
-          <m:jc m:val="center"/>
-        </m:oMathParaPr>
-        <m:oMath>
-          <m:r>
-            <m:t>P</m:t>
-          </m:r>
-          <m:d>
-            <m:dPr>
-              <m:begChr m:val="("/>
-              <m:endChr m:val=")"/>
-              <m:sepChr m:val=""/>
-              <m:grow/>
-            </m:dPr>
-            <m:e>
-              <m:sSub>
-                <m:e>
-                  <m:r>
-                    <m:rPr>
-                      <m:nor/>
-                      <m:sty m:val="p"/>
-                    </m:rPr>
-                    <m:t>v</m:t>
-                  </m:r>
-                </m:e>
-                <m:sub>
-                  <m:r>
-                    <m:t>j</m:t>
-                  </m:r>
-                </m:sub>
-              </m:sSub>
-              <m:r>
-                <m:rPr>
-                  <m:sty m:val="p"/>
-                </m:rPr>
-                <m:t>|</m:t>
-              </m:r>
-              <m:acc>
-                <m:accPr>
-                  <m:chr m:val="⃗"/>
-                </m:accPr>
-                <m:e>
-                  <m:r>
-                    <m:t>G</m:t>
-                  </m:r>
-                </m:e>
-              </m:acc>
-            </m:e>
-          </m:d>
-          <m:r>
-            <m:rPr>
-              <m:sty m:val="p"/>
-            </m:rPr>
-            <m:t>=</m:t>
-          </m:r>
-          <m:f>
-            <m:fPr>
-              <m:type m:val="bar"/>
-            </m:fPr>
-            <m:num>
-              <m:r>
-                <m:rPr>
-                  <m:sty m:val="p"/>
-                </m:rPr>
-                <m:t>∫</m:t>
-              </m:r>
-              <m:r>
-                <m:t>P</m:t>
-              </m:r>
-              <m:d>
-                <m:dPr>
-                  <m:begChr m:val="("/>
-                  <m:endChr m:val=")"/>
-                  <m:sepChr m:val=""/>
-                  <m:grow/>
-                </m:dPr>
-                <m:e>
-                  <m:acc>
-                    <m:accPr>
-                      <m:chr m:val="⃗"/>
-                    </m:accPr>
-                    <m:e>
-                      <m:r>
-                        <m:t>G</m:t>
-                      </m:r>
-                    </m:e>
-                  </m:acc>
-                  <m:r>
-                    <m:rPr>
-                      <m:sty m:val="p"/>
-                    </m:rPr>
-                    <m:t>|</m:t>
-                  </m:r>
-                  <m:sSub>
-                    <m:e>
-                      <m:r>
-                        <m:rPr>
-                          <m:nor/>
-                          <m:sty m:val="p"/>
-                        </m:rPr>
-                        <m:t>v</m:t>
-                      </m:r>
-                    </m:e>
-                    <m:sub>
-                      <m:r>
-                        <m:t>j</m:t>
-                      </m:r>
-                    </m:sub>
-                  </m:sSub>
-                  <m:r>
-                    <m:rPr>
-                      <m:sty m:val="p"/>
-                    </m:rPr>
-                    <m:t>,</m:t>
-                  </m:r>
-                  <m:sSub>
-                    <m:e>
-                      <m:r>
-                        <m:t>ψ</m:t>
-                      </m:r>
-                    </m:e>
-                    <m:sub>
-                      <m:r>
-                        <m:t>s</m:t>
-                      </m:r>
-                    </m:sub>
-                  </m:sSub>
-                </m:e>
-              </m:d>
-              <m:r>
-                <m:rPr>
-                  <m:sty m:val="p"/>
-                </m:rPr>
-                <m:t>⋅</m:t>
-              </m:r>
-              <m:r>
-                <m:t>P</m:t>
-              </m:r>
-              <m:d>
-                <m:dPr>
-                  <m:begChr m:val="("/>
-                  <m:endChr m:val=")"/>
-                  <m:sepChr m:val=""/>
-                  <m:grow/>
-                </m:dPr>
-                <m:e>
-                  <m:sSub>
-                    <m:e>
-                      <m:r>
-                        <m:t>ψ</m:t>
-                      </m:r>
-                    </m:e>
-                    <m:sub>
-                      <m:r>
-                        <m:t>s</m:t>
-                      </m:r>
-                    </m:sub>
-                  </m:sSub>
-                </m:e>
-              </m:d>
-              <m:r>
-                <m:rPr>
-                  <m:sty m:val="p"/>
-                </m:rPr>
-                <m:t>⋅</m:t>
-              </m:r>
-              <m:r>
-                <m:t>P</m:t>
-              </m:r>
-              <m:d>
-                <m:dPr>
-                  <m:begChr m:val="("/>
-                  <m:endChr m:val=")"/>
-                  <m:sepChr m:val=""/>
-                  <m:grow/>
-                </m:dPr>
-                <m:e>
-                  <m:sSub>
-                    <m:e>
-                      <m:r>
-                        <m:rPr>
-                          <m:nor/>
-                          <m:sty m:val="p"/>
-                        </m:rPr>
-                        <m:t>v</m:t>
-                      </m:r>
-                    </m:e>
-                    <m:sub>
-                      <m:r>
-                        <m:t>j</m:t>
-                      </m:r>
-                    </m:sub>
-                  </m:sSub>
-                </m:e>
-              </m:d>
-              <m:r>
-                <m:t> </m:t>
-              </m:r>
-              <m:r>
-                <m:t>d</m:t>
-              </m:r>
-              <m:r>
-                <m:t>ψ</m:t>
-              </m:r>
-            </m:num>
-            <m:den>
-              <m:nary>
-                <m:naryPr>
-                  <m:chr m:val="∑"/>
-                  <m:limLoc m:val="undOvr"/>
-                  <m:subHide m:val="off"/>
-                  <m:supHide m:val="off"/>
-                </m:naryPr>
-                <m:sub>
-                  <m:r>
-                    <m:t>i</m:t>
-                  </m:r>
-                  <m:r>
-                    <m:rPr>
-                      <m:sty m:val="p"/>
-                    </m:rPr>
-                    <m:t>=</m:t>
-                  </m:r>
-                  <m:r>
-                    <m:t>1</m:t>
-                  </m:r>
-                </m:sub>
-                <m:sup>
-                  <m:r>
-                    <m:t>V</m:t>
-                  </m:r>
-                </m:sup>
-                <m:e>
-                  <m:r>
-                    <m:rPr>
-                      <m:sty m:val="p"/>
-                    </m:rPr>
-                    <m:t>∫</m:t>
-                  </m:r>
-                </m:e>
-              </m:nary>
-              <m:r>
-                <m:t>P</m:t>
-              </m:r>
-              <m:d>
-                <m:dPr>
-                  <m:begChr m:val="("/>
-                  <m:endChr m:val=")"/>
-                  <m:sepChr m:val=""/>
-                  <m:grow/>
-                </m:dPr>
-                <m:e>
-                  <m:acc>
-                    <m:accPr>
-                      <m:chr m:val="⃗"/>
-                    </m:accPr>
-                    <m:e>
-                      <m:r>
-                        <m:t>G</m:t>
-                      </m:r>
-                    </m:e>
-                  </m:acc>
-                  <m:r>
-                    <m:rPr>
-                      <m:sty m:val="p"/>
-                    </m:rPr>
-                    <m:t>|</m:t>
-                  </m:r>
-                  <m:sSub>
-                    <m:e>
-                      <m:r>
-                        <m:rPr>
-                          <m:nor/>
-                          <m:sty m:val="p"/>
-                        </m:rPr>
-                        <m:t>v</m:t>
-                      </m:r>
-                    </m:e>
-                    <m:sub>
-                      <m:r>
-                        <m:t>i</m:t>
-                      </m:r>
-                    </m:sub>
-                  </m:sSub>
-                  <m:r>
-                    <m:rPr>
-                      <m:sty m:val="p"/>
-                    </m:rPr>
-                    <m:t>,</m:t>
-                  </m:r>
-                  <m:sSub>
-                    <m:e>
-                      <m:r>
-                        <m:t>ψ</m:t>
-                      </m:r>
-                    </m:e>
-                    <m:sub>
-                      <m:r>
-                        <m:t>s</m:t>
-                      </m:r>
-                    </m:sub>
-                  </m:sSub>
-                </m:e>
-              </m:d>
-              <m:r>
-                <m:rPr>
-                  <m:sty m:val="p"/>
-                </m:rPr>
-                <m:t>⋅</m:t>
-              </m:r>
-              <m:r>
-                <m:t>P</m:t>
-              </m:r>
-              <m:d>
-                <m:dPr>
-                  <m:begChr m:val="("/>
-                  <m:endChr m:val=")"/>
-                  <m:sepChr m:val=""/>
-                  <m:grow/>
-                </m:dPr>
-                <m:e>
-                  <m:sSub>
-                    <m:e>
-                      <m:r>
-                        <m:t>ψ</m:t>
-                      </m:r>
-                    </m:e>
-                    <m:sub>
-                      <m:r>
-                        <m:t>s</m:t>
-                      </m:r>
-                    </m:sub>
-                  </m:sSub>
-                </m:e>
-              </m:d>
-              <m:r>
-                <m:rPr>
-                  <m:sty m:val="p"/>
-                </m:rPr>
-                <m:t>⋅</m:t>
-              </m:r>
-              <m:r>
-                <m:t>P</m:t>
-              </m:r>
-              <m:d>
-                <m:dPr>
-                  <m:begChr m:val="("/>
-                  <m:endChr m:val=")"/>
-                  <m:sepChr m:val=""/>
-                  <m:grow/>
-                </m:dPr>
-                <m:e>
-                  <m:sSub>
-                    <m:e>
-                      <m:r>
-                        <m:rPr>
-                          <m:nor/>
-                          <m:sty m:val="p"/>
-                        </m:rPr>
-                        <m:t>v</m:t>
-                      </m:r>
-                    </m:e>
-                    <m:sub>
-                      <m:r>
-                        <m:t>i</m:t>
-                      </m:r>
-                    </m:sub>
-                  </m:sSub>
-                </m:e>
-              </m:d>
-              <m:r>
-                <m:t> </m:t>
-              </m:r>
-              <m:r>
-                <m:t>d</m:t>
-              </m:r>
-              <m:r>
-                <m:t>ψ</m:t>
-              </m:r>
-            </m:den>
-          </m:f>
-          <m:r>
-            <m:t>  </m:t>
-          </m:r>
-          <m:d>
-            <m:dPr>
-              <m:begChr m:val="("/>
-              <m:endChr m:val=")"/>
-              <m:sepChr m:val=""/>
-              <m:grow/>
-            </m:dPr>
-            <m:e>
-              <m:r>
-                <m:t>18</m:t>
-              </m:r>
-            </m:e>
-          </m:d>
-        </m:oMath>
-      </m:oMathPara>
-      <w:bookmarkEnd w:id="60"/>
-    </w:p>
-    <w:p>
-      <w:pPr>
-        <w:pStyle w:val="FirstParagraph"/>
-      </w:pPr>
-      <w:r>
-        <w:t xml:space="preserve">Compared to focusing on MAP estimates of</w:t>
-      </w:r>
-      <w:r>
-        <w:t xml:space="preserve"> </w:t>
-      </w:r>
-      <m:oMath>
-        <m:sSub>
-          <m:e>
-            <m:r>
-              <m:t>ψ</m:t>
-            </m:r>
-          </m:e>
-          <m:sub>
-            <m:r>
-              <m:t>s</m:t>
-            </m:r>
-          </m:sub>
-        </m:sSub>
-      </m:oMath>
-      <w:r>
-        <w:t xml:space="preserve">, consideration of the posterior distribution in</w:t>
-      </w:r>
-      <w:r>
-        <w:t xml:space="preserve"> </w:t>
-      </w:r>
-      <w:hyperlink w:anchor="eq-BSTM-posterior-joint-psi-and-vowel">
-        <w:r>
-          <w:rPr>
-            <w:rStyle w:val="Hyperlink"/>
-          </w:rPr>
-          <w:t xml:space="preserve">Equation 16</w:t>
-        </w:r>
-      </w:hyperlink>
-      <w:r>
-        <w:t xml:space="preserve"> </w:t>
-      </w:r>
-      <w:r>
-        <w:t xml:space="preserve">takes into account the uncertainty about the</w:t>
-      </w:r>
-      <w:r>
-        <w:t xml:space="preserve"> </w:t>
-      </w:r>
-      <m:oMath>
-        <m:sSub>
-          <m:e>
-            <m:acc>
-              <m:accPr>
-                <m:chr m:val="̂"/>
-              </m:accPr>
-              <m:e>
-                <m:r>
-                  <m:t>ψ</m:t>
-                </m:r>
-              </m:e>
-            </m:acc>
-          </m:e>
-          <m:sub>
-            <m:r>
-              <m:t>s</m:t>
-            </m:r>
-            <m:r>
-              <m:rPr>
-                <m:sty m:val="p"/>
-              </m:rPr>
-              <m:t>,</m:t>
-            </m:r>
-            <m:r>
-              <m:rPr>
-                <m:nor/>
-                <m:sty m:val="p"/>
-              </m:rPr>
-              <m:t>v</m:t>
-            </m:r>
-          </m:sub>
-        </m:sSub>
-      </m:oMath>
-      <w:r>
-        <w:t xml:space="preserve"> </w:t>
-      </w:r>
-      <w:r>
-        <w:t xml:space="preserve">for different vowel categories. This results in a model of vowel perception that is more in line with Bayesian principles, suggesting the name Bayesian Sliding Template Model (BSTM) for this version of the PSTM. By calculating the full posterior distribution of</w:t>
-      </w:r>
-      <w:r>
-        <w:t xml:space="preserve"> </w:t>
-      </w:r>
-      <m:oMath>
-        <m:sSub>
-          <m:e>
-            <m:acc>
-              <m:accPr>
-                <m:chr m:val="̂"/>
-              </m:accPr>
-              <m:e>
-                <m:r>
-                  <m:t>ψ</m:t>
-                </m:r>
-              </m:e>
-            </m:acc>
-          </m:e>
-          <m:sub>
-            <m:r>
-              <m:t>s</m:t>
-            </m:r>
-          </m:sub>
-        </m:sSub>
-      </m:oMath>
-      <w:r>
-        <w:t xml:space="preserve"> </w:t>
-      </w:r>
-      <w:r>
-        <w:t xml:space="preserve">rather than just MAP estimates, the BSTM allows optimal information integration across multiple vowel tokens. This will allow future work to model the iterative estimation and refinement of</w:t>
-      </w:r>
-      <w:r>
-        <w:t xml:space="preserve"> </w:t>
-      </w:r>
-      <m:oMath>
-        <m:sSub>
-          <m:e>
-            <m:acc>
-              <m:accPr>
-                <m:chr m:val="̂"/>
-              </m:accPr>
-              <m:e>
-                <m:r>
-                  <m:t>ψ</m:t>
-                </m:r>
-              </m:e>
-            </m:acc>
-          </m:e>
-          <m:sub>
-            <m:r>
-              <m:t>s</m:t>
-            </m:r>
-          </m:sub>
-        </m:sSub>
-      </m:oMath>
-      <w:r>
-        <w:t xml:space="preserve"> </w:t>
-      </w:r>
-      <w:r>
-        <w:t xml:space="preserve">across vowel observations, something which is not possible with the original PSTM. It is, of course, an empirical question whether</w:t>
-      </w:r>
-      <w:r>
-        <w:t xml:space="preserve"> </w:t>
-      </w:r>
-      <w:r>
-        <w:rPr>
-          <w:i/>
-          <w:iCs/>
-        </w:rPr>
-        <w:t xml:space="preserve">listeners’ behavior</w:t>
-      </w:r>
-      <w:r>
-        <w:t xml:space="preserve"> </w:t>
-      </w:r>
-      <w:r>
-        <w:t xml:space="preserve">is better explained by this more fully Bayesian model—a question to which we turn next.</w:t>
-      </w:r>
-    </w:p>
-    <w:bookmarkEnd w:id="61"/>
-    <w:bookmarkEnd w:id="62"/>
-    <w:bookmarkStart w:id="71" w:name="sec-bootstrap"/>
-    <w:p>
-      <w:pPr>
-        <w:pStyle w:val="Heading1"/>
-      </w:pPr>
-      <w:r>
-        <w:t xml:space="preserve">5. Bootstrap Evaluation</w:t>
-      </w:r>
-    </w:p>
-    <w:p>
-      <w:pPr>
-        <w:pStyle w:val="FirstParagraph"/>
-      </w:pPr>
-      <w:r>
-        <w:t xml:space="preserve">To compare the performance of different implementations of the STM in understanding perceptual vowel normalization, we conduct a bootstrap analysis using data on the perception of US English vowels</w:t>
-      </w:r>
-      <w:r>
-        <w:t xml:space="preserve"> </w:t>
-      </w:r>
-      <w:r>
-        <w:t xml:space="preserve">(Hillenbrand et al. 1995)</w:t>
-      </w:r>
-      <w:r>
-        <w:t xml:space="preserve">. A step-by-step walk-through of the analysis is available as an R Markdown vignette in the OSF repo for this article. As demonstrated in that vignette, the</w:t>
-      </w:r>
-      <w:r>
-        <w:t xml:space="preserve"> </w:t>
-      </w:r>
-      <w:r>
-        <w:rPr>
-          <w:rStyle w:val="VerbatimChar"/>
-        </w:rPr>
-        <w:t xml:space="preserve">STM</w:t>
-      </w:r>
-      <w:r>
-        <w:t xml:space="preserve"> </w:t>
-      </w:r>
-      <w:r>
-        <w:t xml:space="preserve">package allows researchers to conduct the type of analysis we present here on their own data, with just a handful of R commands.</w:t>
-      </w:r>
-    </w:p>
-    <w:p>
-      <w:pPr>
-        <w:pStyle w:val="BodyText"/>
-      </w:pPr>
-      <w:r>
-        <w:t xml:space="preserve">The</w:t>
-      </w:r>
-      <w:r>
-        <w:t xml:space="preserve"> </w:t>
-      </w:r>
-      <w:r>
-        <w:t xml:space="preserve">Hillenbrand et al. (1995)</w:t>
-      </w:r>
-      <w:r>
-        <w:t xml:space="preserve"> </w:t>
-      </w:r>
-      <w:r>
-        <w:t xml:space="preserve">data include acoustic measures from 139 speakers producing one instance of twelve vowels each, including formant measures at multiple time slices. We used formant measurements at 20% and 80% of the vowel duration. This meant each vowel token was represented by a vector of length six, two measurements for each of three formants. We used two time points to parallel the analyses presented in</w:t>
-      </w:r>
-      <w:r>
-        <w:t xml:space="preserve"> </w:t>
-      </w:r>
-      <w:r>
-        <w:t xml:space="preserve">Nearey and Assmann (2007)</w:t>
-      </w:r>
-      <w:r>
-        <w:t xml:space="preserve">, and because formant dynamics are known to affect vowel perception for the dialect recorded in the database</w:t>
-      </w:r>
-      <w:r>
-        <w:t xml:space="preserve"> </w:t>
-      </w:r>
-      <w:r>
-        <w:t xml:space="preserve">(Hillenbrand and Nearey 1999)</w:t>
-      </w:r>
-      <w:r>
-        <w:t xml:space="preserve">. By fitting multivariate normal distributions in this six-dimensional space, we assume that listeners have learned expectations about the (co)variance between formants within and across time points.</w:t>
-      </w:r>
-      <w:r>
-        <w:t xml:space="preserve"> </w:t>
-      </w:r>
-    </w:p>
-    <w:p>
-      <w:pPr>
-        <w:pStyle w:val="BodyText"/>
-      </w:pPr>
       <w:r>
         <w:t xml:space="preserve">The</w:t>
       </w:r>
@@ -15021,7 +13205,7 @@
         <w:rPr>
           <w:rStyle w:val="FootnoteReference"/>
         </w:rPr>
-        <w:footnoteReference w:id="63"/>
+        <w:footnoteReference w:id="59"/>
       </w:r>
       <w:r>
         <w:t xml:space="preserve"> </w:t>
@@ -15064,7 +13248,7 @@
         <w:t xml:space="preserve">) would yield utterly unreliable results for listeners (as we confirm below).</w:t>
       </w:r>
     </w:p>
-    <w:bookmarkStart w:id="65" w:name="approach"/>
+    <w:bookmarkStart w:id="61" w:name="approach"/>
     <w:p>
       <w:pPr>
         <w:pStyle w:val="Heading2"/>
@@ -15399,7 +13583,53 @@
         </w:numPr>
       </w:pPr>
       <w:r>
-        <w:t xml:space="preserve">The **likelihood of the vowel category that the *talker intended to produce** (or, specifically, that the experimenter asked the talker to produce). This metric is closer to what a speech engineer would choose to evaluate normalization methods, as it measures how well the method performs in recognizing the</w:t>
+        <w:t xml:space="preserve">The</w:t>
+      </w:r>
+      <w:r>
+        <w:t xml:space="preserve"> </w:t>
+      </w:r>
+      <w:r>
+        <w:rPr>
+          <w:b/>
+          <w:bCs/>
+        </w:rPr>
+        <w:t xml:space="preserve">likelihood of the vowel category that the</w:t>
+      </w:r>
+      <w:r>
+        <w:rPr>
+          <w:b/>
+          <w:bCs/>
+        </w:rPr>
+        <w:t xml:space="preserve"> </w:t>
+      </w:r>
+      <w:r>
+        <w:rPr>
+          <w:b/>
+          <w:bCs/>
+          <w:i/>
+          <w:iCs/>
+        </w:rPr>
+        <w:t xml:space="preserve">talker</w:t>
+      </w:r>
+      <w:r>
+        <w:rPr>
+          <w:b/>
+          <w:bCs/>
+        </w:rPr>
+        <w:t xml:space="preserve"> </w:t>
+      </w:r>
+      <w:r>
+        <w:rPr>
+          <w:b/>
+          <w:bCs/>
+        </w:rPr>
+        <w:t xml:space="preserve">intended to produce</w:t>
+      </w:r>
+      <w:r>
+        <w:t xml:space="preserve"> </w:t>
+      </w:r>
+      <w:r>
+        <w:t xml:space="preserve">(or, specifically, that the experimenter asked the talker to produce). This metric is closer to what a speech engineer would choose to evaluate normalization methods, as it measures how well the method performs in recognizing the</w:t>
       </w:r>
       <w:r>
         <w:t xml:space="preserve"> </w:t>
@@ -15776,7 +14006,7 @@
         <w:rPr>
           <w:rStyle w:val="FootnoteReference"/>
         </w:rPr>
-        <w:footnoteReference w:id="64"/>
+        <w:footnoteReference w:id="60"/>
       </w:r>
       <w:r>
         <w:t xml:space="preserve"> </w:t>
@@ -16417,123 +14647,20 @@
     </w:p>
     <w:p>
       <w:pPr>
-        <w:pStyle w:val="Compact"/>
-        <w:numPr>
-          <w:ilvl w:val="0"/>
-          <w:numId w:val="1003"/>
-        </w:numPr>
+        <w:pStyle w:val="FirstParagraph"/>
       </w:pPr>
       <w:r>
-        <w:rPr>
-          <w:b/>
-          <w:bCs/>
-        </w:rPr>
-        <w:t xml:space="preserve">Normalization with</w:t>
-      </w:r>
-      <w:r>
-        <w:rPr>
-          <w:b/>
-          <w:bCs/>
-        </w:rPr>
-        <w:t xml:space="preserve"> </w:t>
-      </w:r>
-      <m:oMath>
-        <m:sSub>
-          <m:e>
-            <m:acc>
-              <m:accPr>
-                <m:chr m:val="̂"/>
-              </m:accPr>
-              <m:e>
-                <m:r>
-                  <m:t>ψ</m:t>
-                </m:r>
-              </m:e>
-            </m:acc>
-          </m:e>
-          <m:sub>
-            <m:r>
-              <m:t>s</m:t>
-            </m:r>
-          </m:sub>
-        </m:sSub>
-      </m:oMath>
-      <w:r>
-        <w:rPr>
-          <w:b/>
-          <w:bCs/>
-        </w:rPr>
-        <w:t xml:space="preserve"> </w:t>
-      </w:r>
-      <w:r>
-        <w:rPr>
-          <w:b/>
-          <w:bCs/>
-        </w:rPr>
-        <w:t xml:space="preserve">estimated using</w:t>
-      </w:r>
-      <w:r>
-        <w:rPr>
-          <w:b/>
-          <w:bCs/>
-        </w:rPr>
-        <w:t xml:space="preserve"> </w:t>
-      </w:r>
-      <w:r>
-        <w:rPr>
-          <w:b/>
-          <w:bCs/>
-          <w:i/>
-          <w:iCs/>
-        </w:rPr>
-        <w:t xml:space="preserve">BSTM</w:t>
-      </w:r>
-      <w:r>
-        <w:rPr>
-          <w:b/>
-          <w:bCs/>
-        </w:rPr>
+        <w:t xml:space="preserve"> </w:t>
+      </w:r>
+      <w:r>
+        <w:t xml:space="preserve"> </w:t>
+      </w:r>
+      <w:r>
         <w:t xml:space="preserve"> </w:t>
       </w:r>
     </w:p>
-    <w:p>
-      <w:pPr>
-        <w:pStyle w:val="Compact"/>
-        <w:numPr>
-          <w:ilvl w:val="1"/>
-          <w:numId w:val="1008"/>
-        </w:numPr>
-      </w:pPr>
-      <w:r>
-        <w:t xml:space="preserve">method 2</w:t>
-      </w:r>
-    </w:p>
-    <w:p>
-      <w:pPr>
-        <w:pStyle w:val="Compact"/>
-        <w:numPr>
-          <w:ilvl w:val="1"/>
-          <w:numId w:val="1008"/>
-        </w:numPr>
-      </w:pPr>
-      <w:r>
-        <w:t xml:space="preserve">method 3</w:t>
-      </w:r>
-    </w:p>
-    <w:p>
-      <w:pPr>
-        <w:pStyle w:val="Compact"/>
-        <w:numPr>
-          <w:ilvl w:val="1"/>
-          <w:numId w:val="1008"/>
-        </w:numPr>
-      </w:pPr>
-      <w:r>
-        <w:t xml:space="preserve">method 6</w:t>
-      </w:r>
-    </w:p>
-    <w:bookmarkEnd w:id="65"/>
-    <w:bookmarkStart w:id="70" w:name="results"/>
+    <w:bookmarkEnd w:id="61"/>
+    <w:bookmarkStart w:id="66" w:name="results"/>
     <w:p>
       <w:pPr>
         <w:pStyle w:val="Heading2"/>
@@ -16669,7 +14796,7 @@
       <w:tr>
         <w:tc>
           <w:tcPr/>
-          <w:bookmarkStart w:id="69" w:name="fig-bootboxplot"/>
+          <w:bookmarkStart w:id="65" w:name="fig-bootboxplot"/>
           <w:p>
             <w:pPr>
               <w:pStyle w:val="Compact"/>
@@ -16680,18 +14807,18 @@
                 <wp:inline>
                   <wp:extent cx="5334000" cy="2667000"/>
                   <wp:effectExtent b="0" l="0" r="0" t="0"/>
-                  <wp:docPr descr="" title="" id="67" name="Picture"/>
+                  <wp:docPr descr="" title="" id="63" name="Picture"/>
                   <a:graphic>
                     <a:graphicData uri="http://schemas.openxmlformats.org/drawingml/2006/picture">
                       <pic:pic>
                         <pic:nvPicPr>
-                          <pic:cNvPr descr="Re_introducing_the_PSTM_files/figure-docx/fig-bootboxplot-1.png" id="68" name="Picture"/>
+                          <pic:cNvPr descr="Re_introducing_the_PSTM_files/figure-docx/fig-bootboxplot-1.png" id="64" name="Picture"/>
                           <pic:cNvPicPr>
                             <a:picLocks noChangeArrowheads="1" noChangeAspect="1"/>
                           </pic:cNvPicPr>
                         </pic:nvPicPr>
                         <pic:blipFill>
-                          <a:blip r:embed="rId66"/>
+                          <a:blip r:embed="rId62"/>
                           <a:stretch>
                             <a:fillRect/>
                           </a:stretch>
@@ -16834,7 +14961,7 @@
               <w:t xml:space="preserve">.</w:t>
             </w:r>
           </w:p>
-          <w:bookmarkEnd w:id="69"/>
+          <w:bookmarkEnd w:id="65"/>
         </w:tc>
       </w:tr>
     </w:tbl>
@@ -17136,7 +15263,7 @@
         </m:sSub>
       </m:oMath>
       <w:r>
-        <w:t xml:space="preserve">, and thus cannot directly compare the different methods against that ground truth. We can, however, compare how accurately the incremental P/BSTM methods estimate the</w:t>
+        <w:t xml:space="preserve">, and thus cannot directly compare the different methods against that ground truth. We can, however, compare how accurately the incremental PSTM methods estimate the</w:t>
       </w:r>
       <w:r>
         <w:t xml:space="preserve"> </w:t>
@@ -17252,9 +15379,9 @@
         <w:t xml:space="preserve">estimation compared to methods 2 and 3.</w:t>
       </w:r>
     </w:p>
-    <w:bookmarkEnd w:id="70"/>
-    <w:bookmarkEnd w:id="71"/>
-    <w:bookmarkStart w:id="73" w:name="conclusions-and-future-directions"/>
+    <w:bookmarkEnd w:id="66"/>
+    <w:bookmarkEnd w:id="67"/>
+    <w:bookmarkStart w:id="68" w:name="conclusions-and-future-directions"/>
     <w:p>
       <w:pPr>
         <w:pStyle w:val="Heading1"/>
@@ -17268,16 +15395,7 @@
         <w:pStyle w:val="FirstParagraph"/>
       </w:pPr>
       <w:r>
-        <w:t xml:space="preserve">Almost two decades after its introduction, the PSTM remains the only published fully spelled-out model of incremental formant normalization and vowel perception. By making available the code for this model in the form of an R package, we hope to make the advantages of the PSTM and its extensions more accessible to other researchers. The PSTM’s approach to normalization, uniform scaling, is rooted in principled considerations about the biology of auditory perception in the mammalian brain, validated by cross-species comparisons</w:t>
-      </w:r>
-      <w:r>
-        <w:t xml:space="preserve"> </w:t>
-      </w:r>
-      <w:r>
-        <w:t xml:space="preserve">(reviewed in Barreda 2020)</w:t>
-      </w:r>
-      <w:r>
-        <w:t xml:space="preserve">. The log-mean method of uniform scaling has been consistently found to provide a better fit against listeners’ perception than other influential methods, such as Lobanov normalization</w:t>
+        <w:t xml:space="preserve">Almost two decades after its introduction, the PSTM remains the only published fully spelled-out model of incremental formant normalization and vowel perception. By making available the code for this model in the form of an R package, we hope to make the advantages of the PSTM and its extensions more accessible to other researchers. The PSTM’s approach to normalization, uniform scaling, has been consistently found to provide a better fit against listeners’ perception than other influential methods, such as Lobanov normalization</w:t>
       </w:r>
       <w:r>
         <w:t xml:space="preserve"> </w:t>
@@ -17339,7 +15457,7 @@
         <w:t xml:space="preserve">Hillenbrand et al. (1995)</w:t>
       </w:r>
       <w:r>
-        <w:t xml:space="preserve">. The new BSTM, a more fully Bayesian extension of the PSTM, performed similarly to the original PSTM—both in terms of the ability to capture listeners’ perception of vowels, and in terms of estimating the uniform scaling parameter</w:t>
+        <w:t xml:space="preserve">. In the appendix, we present a more fully Bayesian extension of the PSTM, the BSTM. This model performs similarly to the original PSTM—both in terms of the ability to capture listeners’ perception of vowels, and in terms of estimating the uniform scaling parameter</w:t>
       </w:r>
       <w:r>
         <w:t xml:space="preserve"> </w:t>
@@ -17390,7 +15508,1627 @@
         <w:pStyle w:val="BodyText"/>
       </w:pPr>
       <w:r>
-        <w:t xml:space="preserve">In future work we plan to expand evaluation of the BSTM in three ways. First, here we evaluated</w:t>
+        <w:t xml:space="preserve">The general framework for incremental normalization presented here can be extended to a wide range of other normalization methods. This will allow comparisons between different approaches to incremental formant normalization and beyond. In particular, future work can investigate how incremental normalization can be integrated into modern ASR architectures, to improve the suitability of these architectures as a model of human speech perception. This will also researchers to move beyond normalization of formant point estimates (e.g., F1-F3 at the start and end of the vowel), addressing longstanding concerns that human listeners use a much broader sets of acoustic features when identifying vowels</w:t>
+      </w:r>
+      <w:r>
+        <w:t xml:space="preserve"> </w:t>
+      </w:r>
+      <w:r>
+        <w:t xml:space="preserve">Barreda and Nearey (2012)</w:t>
+      </w:r>
+      <w:r>
+        <w:t xml:space="preserve">.</w:t>
+      </w:r>
+    </w:p>
+    <w:bookmarkEnd w:id="68"/>
+    <w:bookmarkStart w:id="74" w:name="appendix"/>
+    <w:p>
+      <w:pPr>
+        <w:pStyle w:val="Heading1"/>
+      </w:pPr>
+      <w:r>
+        <w:t xml:space="preserve">7. Appendix</w:t>
+      </w:r>
+    </w:p>
+    <w:bookmarkStart w:id="73" w:name="the-bayesian-sliding-template-model"/>
+    <w:p>
+      <w:pPr>
+        <w:pStyle w:val="Heading2"/>
+      </w:pPr>
+      <w:r>
+        <w:t xml:space="preserve">7.1 The Bayesian Sliding Template Model</w:t>
+      </w:r>
+    </w:p>
+    <w:p>
+      <w:pPr>
+        <w:pStyle w:val="FirstParagraph"/>
+      </w:pPr>
+      <w:r>
+        <w:t xml:space="preserve">The PSTM calculates MAP values of</w:t>
+      </w:r>
+      <w:r>
+        <w:t xml:space="preserve"> </w:t>
+      </w:r>
+      <m:oMath>
+        <m:sSub>
+          <m:e>
+            <m:acc>
+              <m:accPr>
+                <m:chr m:val="̂"/>
+              </m:accPr>
+              <m:e>
+                <m:r>
+                  <m:t>ψ</m:t>
+                </m:r>
+              </m:e>
+            </m:acc>
+          </m:e>
+          <m:sub>
+            <m:r>
+              <m:t>s</m:t>
+            </m:r>
+          </m:sub>
+        </m:sSub>
+      </m:oMath>
+      <w:r>
+        <w:t xml:space="preserve"> </w:t>
+      </w:r>
+      <w:r>
+        <w:t xml:space="preserve">for each vowel, and then uses the largest of these point estimates to categorize the observed formant input (</w:t>
+      </w:r>
+      <w:hyperlink w:anchor="eq-criterion-psi-and-vowel">
+        <w:r>
+          <w:rPr>
+            <w:rStyle w:val="Hyperlink"/>
+          </w:rPr>
+          <w:t xml:space="preserve">Equation 10</w:t>
+        </w:r>
+      </w:hyperlink>
+      <w:r>
+        <w:t xml:space="preserve">).</w:t>
+      </w:r>
+      <w:r>
+        <w:t xml:space="preserve"> </w:t>
+      </w:r>
+      <w:r>
+        <w:t xml:space="preserve">Nearey and Assmann (2007)</w:t>
+      </w:r>
+      <w:r>
+        <w:t xml:space="preserve"> </w:t>
+      </w:r>
+      <w:r>
+        <w:t xml:space="preserve">noted that</w:t>
+      </w:r>
+      <w:r>
+        <w:t xml:space="preserve"> </w:t>
+      </w:r>
+      <w:r>
+        <w:t xml:space="preserve">“</w:t>
+      </w:r>
+      <w:r>
+        <w:t xml:space="preserve">[i]t would also be possible […] to use a fuller Bayesian approach by integrating over the values of</w:t>
+      </w:r>
+      <w:r>
+        <w:t xml:space="preserve"> </w:t>
+      </w:r>
+      <m:oMath>
+        <m:sSub>
+          <m:e>
+            <m:r>
+              <m:t>ψ</m:t>
+            </m:r>
+          </m:e>
+          <m:sub>
+            <m:r>
+              <m:t>s</m:t>
+            </m:r>
+          </m:sub>
+        </m:sSub>
+      </m:oMath>
+      <w:r>
+        <w:t xml:space="preserve">, rather than selecting the maximum. We leave that possibility for future research</w:t>
+      </w:r>
+      <w:r>
+        <w:t xml:space="preserve">”</w:t>
+      </w:r>
+      <w:r>
+        <w:t xml:space="preserve"> </w:t>
+      </w:r>
+      <w:r>
+        <w:t xml:space="preserve">(p. 254). In order to make the methods outlined above more fully Bayesian, we can instead focus on the joint posterior distribution of</w:t>
+      </w:r>
+      <w:r>
+        <w:t xml:space="preserve"> </w:t>
+      </w:r>
+      <m:oMath>
+        <m:sSub>
+          <m:e>
+            <m:r>
+              <m:t>ψ</m:t>
+            </m:r>
+          </m:e>
+          <m:sub>
+            <m:r>
+              <m:t>s</m:t>
+            </m:r>
+          </m:sub>
+        </m:sSub>
+      </m:oMath>
+      <w:r>
+        <w:t xml:space="preserve"> </w:t>
+      </w:r>
+      <w:r>
+        <w:t xml:space="preserve">and the vowel category v:</w:t>
+      </w:r>
+    </w:p>
+    <w:p>
+      <w:pPr>
+        <w:pStyle w:val="BodyText"/>
+      </w:pPr>
+      <w:bookmarkStart w:id="69" w:name="eq-BSTM-posterior-joint-psi-and-vowel"/>
+      <m:oMathPara>
+        <m:oMathParaPr>
+          <m:jc m:val="center"/>
+        </m:oMathParaPr>
+        <m:oMath>
+          <m:r>
+            <m:t>P</m:t>
+          </m:r>
+          <m:d>
+            <m:dPr>
+              <m:begChr m:val="("/>
+              <m:endChr m:val=")"/>
+              <m:sepChr m:val=""/>
+              <m:grow/>
+            </m:dPr>
+            <m:e>
+              <m:r>
+                <m:rPr>
+                  <m:nor/>
+                  <m:sty m:val="p"/>
+                </m:rPr>
+                <m:t>v</m:t>
+              </m:r>
+              <m:r>
+                <m:rPr>
+                  <m:sty m:val="p"/>
+                </m:rPr>
+                <m:t>,</m:t>
+              </m:r>
+              <m:sSub>
+                <m:e>
+                  <m:r>
+                    <m:t>ψ</m:t>
+                  </m:r>
+                </m:e>
+                <m:sub>
+                  <m:r>
+                    <m:t>s</m:t>
+                  </m:r>
+                </m:sub>
+              </m:sSub>
+              <m:r>
+                <m:rPr>
+                  <m:sty m:val="p"/>
+                </m:rPr>
+                <m:t>|</m:t>
+              </m:r>
+              <m:acc>
+                <m:accPr>
+                  <m:chr m:val="⃗"/>
+                </m:accPr>
+                <m:e>
+                  <m:r>
+                    <m:t>G</m:t>
+                  </m:r>
+                </m:e>
+              </m:acc>
+            </m:e>
+          </m:d>
+          <m:r>
+            <m:rPr>
+              <m:sty m:val="p"/>
+            </m:rPr>
+            <m:t>=</m:t>
+          </m:r>
+          <m:f>
+            <m:fPr>
+              <m:type m:val="bar"/>
+            </m:fPr>
+            <m:num>
+              <m:r>
+                <m:t>P</m:t>
+              </m:r>
+              <m:d>
+                <m:dPr>
+                  <m:begChr m:val="("/>
+                  <m:endChr m:val=")"/>
+                  <m:sepChr m:val=""/>
+                  <m:grow/>
+                </m:dPr>
+                <m:e>
+                  <m:acc>
+                    <m:accPr>
+                      <m:chr m:val="⃗"/>
+                    </m:accPr>
+                    <m:e>
+                      <m:r>
+                        <m:t>G</m:t>
+                      </m:r>
+                    </m:e>
+                  </m:acc>
+                  <m:r>
+                    <m:rPr>
+                      <m:sty m:val="p"/>
+                    </m:rPr>
+                    <m:t>|</m:t>
+                  </m:r>
+                  <m:r>
+                    <m:rPr>
+                      <m:nor/>
+                      <m:sty m:val="p"/>
+                    </m:rPr>
+                    <m:t>v</m:t>
+                  </m:r>
+                  <m:r>
+                    <m:rPr>
+                      <m:sty m:val="p"/>
+                    </m:rPr>
+                    <m:t>,</m:t>
+                  </m:r>
+                  <m:sSub>
+                    <m:e>
+                      <m:r>
+                        <m:t>ψ</m:t>
+                      </m:r>
+                    </m:e>
+                    <m:sub>
+                      <m:r>
+                        <m:t>s</m:t>
+                      </m:r>
+                    </m:sub>
+                  </m:sSub>
+                </m:e>
+              </m:d>
+              <m:r>
+                <m:rPr>
+                  <m:sty m:val="p"/>
+                </m:rPr>
+                <m:t>⋅</m:t>
+              </m:r>
+              <m:r>
+                <m:t>P</m:t>
+              </m:r>
+              <m:d>
+                <m:dPr>
+                  <m:begChr m:val="("/>
+                  <m:endChr m:val=")"/>
+                  <m:sepChr m:val=""/>
+                  <m:grow/>
+                </m:dPr>
+                <m:e>
+                  <m:sSub>
+                    <m:e>
+                      <m:r>
+                        <m:t>ψ</m:t>
+                      </m:r>
+                    </m:e>
+                    <m:sub>
+                      <m:r>
+                        <m:t>s</m:t>
+                      </m:r>
+                    </m:sub>
+                  </m:sSub>
+                </m:e>
+              </m:d>
+              <m:r>
+                <m:rPr>
+                  <m:sty m:val="p"/>
+                </m:rPr>
+                <m:t>⋅</m:t>
+              </m:r>
+              <m:r>
+                <m:t>P</m:t>
+              </m:r>
+              <m:d>
+                <m:dPr>
+                  <m:begChr m:val="("/>
+                  <m:endChr m:val=")"/>
+                  <m:sepChr m:val=""/>
+                  <m:grow/>
+                </m:dPr>
+                <m:e>
+                  <m:r>
+                    <m:rPr>
+                      <m:nor/>
+                      <m:sty m:val="p"/>
+                    </m:rPr>
+                    <m:t>v</m:t>
+                  </m:r>
+                </m:e>
+              </m:d>
+            </m:num>
+            <m:den>
+              <m:nary>
+                <m:naryPr>
+                  <m:chr m:val="∑"/>
+                  <m:limLoc m:val="undOvr"/>
+                  <m:subHide m:val="off"/>
+                  <m:supHide m:val="off"/>
+                </m:naryPr>
+                <m:sub>
+                  <m:r>
+                    <m:t>i</m:t>
+                  </m:r>
+                  <m:r>
+                    <m:rPr>
+                      <m:sty m:val="p"/>
+                    </m:rPr>
+                    <m:t>=</m:t>
+                  </m:r>
+                  <m:r>
+                    <m:t>i</m:t>
+                  </m:r>
+                </m:sub>
+                <m:sup>
+                  <m:r>
+                    <m:t>V</m:t>
+                  </m:r>
+                </m:sup>
+                <m:e>
+                  <m:r>
+                    <m:rPr>
+                      <m:sty m:val="p"/>
+                    </m:rPr>
+                    <m:t>∫</m:t>
+                  </m:r>
+                </m:e>
+              </m:nary>
+              <m:r>
+                <m:t>P</m:t>
+              </m:r>
+              <m:d>
+                <m:dPr>
+                  <m:begChr m:val="("/>
+                  <m:endChr m:val=")"/>
+                  <m:sepChr m:val=""/>
+                  <m:grow/>
+                </m:dPr>
+                <m:e>
+                  <m:acc>
+                    <m:accPr>
+                      <m:chr m:val="⃗"/>
+                    </m:accPr>
+                    <m:e>
+                      <m:r>
+                        <m:t>G</m:t>
+                      </m:r>
+                    </m:e>
+                  </m:acc>
+                  <m:r>
+                    <m:rPr>
+                      <m:sty m:val="p"/>
+                    </m:rPr>
+                    <m:t>|</m:t>
+                  </m:r>
+                  <m:sSub>
+                    <m:e>
+                      <m:r>
+                        <m:rPr>
+                          <m:nor/>
+                          <m:sty m:val="p"/>
+                        </m:rPr>
+                        <m:t>v</m:t>
+                      </m:r>
+                    </m:e>
+                    <m:sub>
+                      <m:r>
+                        <m:t>i</m:t>
+                      </m:r>
+                    </m:sub>
+                  </m:sSub>
+                  <m:r>
+                    <m:rPr>
+                      <m:sty m:val="p"/>
+                    </m:rPr>
+                    <m:t>,</m:t>
+                  </m:r>
+                  <m:sSub>
+                    <m:e>
+                      <m:r>
+                        <m:t>ψ</m:t>
+                      </m:r>
+                    </m:e>
+                    <m:sub>
+                      <m:r>
+                        <m:t>s</m:t>
+                      </m:r>
+                    </m:sub>
+                  </m:sSub>
+                </m:e>
+              </m:d>
+              <m:r>
+                <m:rPr>
+                  <m:sty m:val="p"/>
+                </m:rPr>
+                <m:t>⋅</m:t>
+              </m:r>
+              <m:r>
+                <m:t>P</m:t>
+              </m:r>
+              <m:d>
+                <m:dPr>
+                  <m:begChr m:val="("/>
+                  <m:endChr m:val=")"/>
+                  <m:sepChr m:val=""/>
+                  <m:grow/>
+                </m:dPr>
+                <m:e>
+                  <m:sSub>
+                    <m:e>
+                      <m:r>
+                        <m:t>ψ</m:t>
+                      </m:r>
+                    </m:e>
+                    <m:sub>
+                      <m:r>
+                        <m:t>s</m:t>
+                      </m:r>
+                    </m:sub>
+                  </m:sSub>
+                </m:e>
+              </m:d>
+              <m:r>
+                <m:rPr>
+                  <m:sty m:val="p"/>
+                </m:rPr>
+                <m:t>⋅</m:t>
+              </m:r>
+              <m:r>
+                <m:t>P</m:t>
+              </m:r>
+              <m:d>
+                <m:dPr>
+                  <m:begChr m:val="("/>
+                  <m:endChr m:val=")"/>
+                  <m:sepChr m:val=""/>
+                  <m:grow/>
+                </m:dPr>
+                <m:e>
+                  <m:sSub>
+                    <m:e>
+                      <m:r>
+                        <m:rPr>
+                          <m:nor/>
+                          <m:sty m:val="p"/>
+                        </m:rPr>
+                        <m:t>v</m:t>
+                      </m:r>
+                    </m:e>
+                    <m:sub>
+                      <m:r>
+                        <m:t>i</m:t>
+                      </m:r>
+                    </m:sub>
+                  </m:sSub>
+                </m:e>
+              </m:d>
+              <m:r>
+                <m:t> </m:t>
+              </m:r>
+              <m:r>
+                <m:t>d</m:t>
+              </m:r>
+              <m:r>
+                <m:t>ψ</m:t>
+              </m:r>
+            </m:den>
+          </m:f>
+          <m:r>
+            <m:t>  </m:t>
+          </m:r>
+          <m:d>
+            <m:dPr>
+              <m:begChr m:val="("/>
+              <m:endChr m:val=")"/>
+              <m:sepChr m:val=""/>
+              <m:grow/>
+            </m:dPr>
+            <m:e>
+              <m:r>
+                <m:t>16</m:t>
+              </m:r>
+            </m:e>
+          </m:d>
+        </m:oMath>
+      </m:oMathPara>
+      <w:bookmarkEnd w:id="69"/>
+    </w:p>
+    <w:p>
+      <w:pPr>
+        <w:pStyle w:val="FirstParagraph"/>
+      </w:pPr>
+      <w:r>
+        <w:t xml:space="preserve">To find the posterior distribution of</w:t>
+      </w:r>
+      <w:r>
+        <w:t xml:space="preserve"> </w:t>
+      </w:r>
+      <m:oMath>
+        <m:sSub>
+          <m:e>
+            <m:r>
+              <m:t>ψ</m:t>
+            </m:r>
+          </m:e>
+          <m:sub>
+            <m:r>
+              <m:t>s</m:t>
+            </m:r>
+          </m:sub>
+        </m:sSub>
+      </m:oMath>
+      <w:r>
+        <w:t xml:space="preserve">, we marginalize over</w:t>
+      </w:r>
+      <w:r>
+        <w:t xml:space="preserve"> </w:t>
+      </w:r>
+      <m:oMath>
+        <m:r>
+          <m:rPr>
+            <m:nor/>
+            <m:sty m:val="p"/>
+          </m:rPr>
+          <m:t>v</m:t>
+        </m:r>
+      </m:oMath>
+      <w:r>
+        <w:t xml:space="preserve">:</w:t>
+      </w:r>
+    </w:p>
+    <w:p>
+      <w:pPr>
+        <w:pStyle w:val="BodyText"/>
+      </w:pPr>
+      <w:bookmarkStart w:id="70" w:name="eq-e20bb"/>
+      <m:oMathPara>
+        <m:oMathParaPr>
+          <m:jc m:val="center"/>
+        </m:oMathParaPr>
+        <m:oMath>
+          <m:r>
+            <m:t>P</m:t>
+          </m:r>
+          <m:d>
+            <m:dPr>
+              <m:begChr m:val="("/>
+              <m:endChr m:val=")"/>
+              <m:sepChr m:val=""/>
+              <m:grow/>
+            </m:dPr>
+            <m:e>
+              <m:sSub>
+                <m:e>
+                  <m:r>
+                    <m:t>ψ</m:t>
+                  </m:r>
+                </m:e>
+                <m:sub>
+                  <m:r>
+                    <m:t>s</m:t>
+                  </m:r>
+                </m:sub>
+              </m:sSub>
+              <m:r>
+                <m:rPr>
+                  <m:sty m:val="p"/>
+                </m:rPr>
+                <m:t>|</m:t>
+              </m:r>
+              <m:acc>
+                <m:accPr>
+                  <m:chr m:val="⃗"/>
+                </m:accPr>
+                <m:e>
+                  <m:r>
+                    <m:t>G</m:t>
+                  </m:r>
+                </m:e>
+              </m:acc>
+            </m:e>
+          </m:d>
+          <m:r>
+            <m:rPr>
+              <m:sty m:val="p"/>
+            </m:rPr>
+            <m:t>=</m:t>
+          </m:r>
+          <m:f>
+            <m:fPr>
+              <m:type m:val="bar"/>
+            </m:fPr>
+            <m:num>
+              <m:nary>
+                <m:naryPr>
+                  <m:chr m:val="∑"/>
+                  <m:limLoc m:val="undOvr"/>
+                  <m:subHide m:val="off"/>
+                  <m:supHide m:val="off"/>
+                </m:naryPr>
+                <m:sub>
+                  <m:r>
+                    <m:t>i</m:t>
+                  </m:r>
+                  <m:r>
+                    <m:rPr>
+                      <m:sty m:val="p"/>
+                    </m:rPr>
+                    <m:t>=</m:t>
+                  </m:r>
+                  <m:r>
+                    <m:t>1</m:t>
+                  </m:r>
+                </m:sub>
+                <m:sup>
+                  <m:r>
+                    <m:t>V</m:t>
+                  </m:r>
+                </m:sup>
+                <m:e>
+                  <m:r>
+                    <m:t>P</m:t>
+                  </m:r>
+                </m:e>
+              </m:nary>
+              <m:d>
+                <m:dPr>
+                  <m:begChr m:val="("/>
+                  <m:endChr m:val=")"/>
+                  <m:sepChr m:val=""/>
+                  <m:grow/>
+                </m:dPr>
+                <m:e>
+                  <m:acc>
+                    <m:accPr>
+                      <m:chr m:val="⃗"/>
+                    </m:accPr>
+                    <m:e>
+                      <m:r>
+                        <m:t>G</m:t>
+                      </m:r>
+                    </m:e>
+                  </m:acc>
+                  <m:r>
+                    <m:rPr>
+                      <m:sty m:val="p"/>
+                    </m:rPr>
+                    <m:t>|</m:t>
+                  </m:r>
+                  <m:sSub>
+                    <m:e>
+                      <m:r>
+                        <m:rPr>
+                          <m:nor/>
+                          <m:sty m:val="p"/>
+                        </m:rPr>
+                        <m:t>v</m:t>
+                      </m:r>
+                    </m:e>
+                    <m:sub>
+                      <m:r>
+                        <m:t>i</m:t>
+                      </m:r>
+                    </m:sub>
+                  </m:sSub>
+                  <m:r>
+                    <m:rPr>
+                      <m:sty m:val="p"/>
+                    </m:rPr>
+                    <m:t>,</m:t>
+                  </m:r>
+                  <m:sSub>
+                    <m:e>
+                      <m:r>
+                        <m:t>ψ</m:t>
+                      </m:r>
+                    </m:e>
+                    <m:sub>
+                      <m:r>
+                        <m:t>s</m:t>
+                      </m:r>
+                    </m:sub>
+                  </m:sSub>
+                </m:e>
+              </m:d>
+              <m:r>
+                <m:rPr>
+                  <m:sty m:val="p"/>
+                </m:rPr>
+                <m:t>⋅</m:t>
+              </m:r>
+              <m:r>
+                <m:t>P</m:t>
+              </m:r>
+              <m:d>
+                <m:dPr>
+                  <m:begChr m:val="("/>
+                  <m:endChr m:val=")"/>
+                  <m:sepChr m:val=""/>
+                  <m:grow/>
+                </m:dPr>
+                <m:e>
+                  <m:sSub>
+                    <m:e>
+                      <m:r>
+                        <m:rPr>
+                          <m:nor/>
+                          <m:sty m:val="p"/>
+                        </m:rPr>
+                        <m:t>v</m:t>
+                      </m:r>
+                    </m:e>
+                    <m:sub>
+                      <m:r>
+                        <m:t>i</m:t>
+                      </m:r>
+                    </m:sub>
+                  </m:sSub>
+                </m:e>
+              </m:d>
+              <m:r>
+                <m:rPr>
+                  <m:sty m:val="p"/>
+                </m:rPr>
+                <m:t>⋅</m:t>
+              </m:r>
+              <m:r>
+                <m:t>P</m:t>
+              </m:r>
+              <m:d>
+                <m:dPr>
+                  <m:begChr m:val="("/>
+                  <m:endChr m:val=")"/>
+                  <m:sepChr m:val=""/>
+                  <m:grow/>
+                </m:dPr>
+                <m:e>
+                  <m:sSub>
+                    <m:e>
+                      <m:r>
+                        <m:t>ψ</m:t>
+                      </m:r>
+                    </m:e>
+                    <m:sub>
+                      <m:r>
+                        <m:t>s</m:t>
+                      </m:r>
+                    </m:sub>
+                  </m:sSub>
+                </m:e>
+              </m:d>
+            </m:num>
+            <m:den>
+              <m:nary>
+                <m:naryPr>
+                  <m:chr m:val="∑"/>
+                  <m:limLoc m:val="undOvr"/>
+                  <m:subHide m:val="off"/>
+                  <m:supHide m:val="off"/>
+                </m:naryPr>
+                <m:sub>
+                  <m:r>
+                    <m:t>i</m:t>
+                  </m:r>
+                  <m:r>
+                    <m:rPr>
+                      <m:sty m:val="p"/>
+                    </m:rPr>
+                    <m:t>=</m:t>
+                  </m:r>
+                  <m:r>
+                    <m:t>1</m:t>
+                  </m:r>
+                </m:sub>
+                <m:sup>
+                  <m:r>
+                    <m:t>V</m:t>
+                  </m:r>
+                </m:sup>
+                <m:e>
+                  <m:r>
+                    <m:rPr>
+                      <m:sty m:val="p"/>
+                    </m:rPr>
+                    <m:t>∫</m:t>
+                  </m:r>
+                </m:e>
+              </m:nary>
+              <m:r>
+                <m:t>P</m:t>
+              </m:r>
+              <m:d>
+                <m:dPr>
+                  <m:begChr m:val="("/>
+                  <m:endChr m:val=")"/>
+                  <m:sepChr m:val=""/>
+                  <m:grow/>
+                </m:dPr>
+                <m:e>
+                  <m:acc>
+                    <m:accPr>
+                      <m:chr m:val="⃗"/>
+                    </m:accPr>
+                    <m:e>
+                      <m:r>
+                        <m:t>G</m:t>
+                      </m:r>
+                    </m:e>
+                  </m:acc>
+                  <m:r>
+                    <m:rPr>
+                      <m:sty m:val="p"/>
+                    </m:rPr>
+                    <m:t>|</m:t>
+                  </m:r>
+                  <m:sSub>
+                    <m:e>
+                      <m:r>
+                        <m:rPr>
+                          <m:nor/>
+                          <m:sty m:val="p"/>
+                        </m:rPr>
+                        <m:t>v</m:t>
+                      </m:r>
+                    </m:e>
+                    <m:sub>
+                      <m:r>
+                        <m:t>i</m:t>
+                      </m:r>
+                    </m:sub>
+                  </m:sSub>
+                  <m:r>
+                    <m:rPr>
+                      <m:sty m:val="p"/>
+                    </m:rPr>
+                    <m:t>,</m:t>
+                  </m:r>
+                  <m:sSub>
+                    <m:e>
+                      <m:r>
+                        <m:t>ψ</m:t>
+                      </m:r>
+                    </m:e>
+                    <m:sub>
+                      <m:r>
+                        <m:t>s</m:t>
+                      </m:r>
+                    </m:sub>
+                  </m:sSub>
+                </m:e>
+              </m:d>
+              <m:r>
+                <m:rPr>
+                  <m:sty m:val="p"/>
+                </m:rPr>
+                <m:t>⋅</m:t>
+              </m:r>
+              <m:r>
+                <m:t>P</m:t>
+              </m:r>
+              <m:d>
+                <m:dPr>
+                  <m:begChr m:val="("/>
+                  <m:endChr m:val=")"/>
+                  <m:sepChr m:val=""/>
+                  <m:grow/>
+                </m:dPr>
+                <m:e>
+                  <m:sSub>
+                    <m:e>
+                      <m:r>
+                        <m:t>ψ</m:t>
+                      </m:r>
+                    </m:e>
+                    <m:sub>
+                      <m:r>
+                        <m:t>s</m:t>
+                      </m:r>
+                    </m:sub>
+                  </m:sSub>
+                </m:e>
+              </m:d>
+              <m:r>
+                <m:rPr>
+                  <m:sty m:val="p"/>
+                </m:rPr>
+                <m:t>⋅</m:t>
+              </m:r>
+              <m:r>
+                <m:t>P</m:t>
+              </m:r>
+              <m:d>
+                <m:dPr>
+                  <m:begChr m:val="("/>
+                  <m:endChr m:val=")"/>
+                  <m:sepChr m:val=""/>
+                  <m:grow/>
+                </m:dPr>
+                <m:e>
+                  <m:sSub>
+                    <m:e>
+                      <m:r>
+                        <m:rPr>
+                          <m:nor/>
+                          <m:sty m:val="p"/>
+                        </m:rPr>
+                        <m:t>v</m:t>
+                      </m:r>
+                    </m:e>
+                    <m:sub>
+                      <m:r>
+                        <m:t>i</m:t>
+                      </m:r>
+                    </m:sub>
+                  </m:sSub>
+                </m:e>
+              </m:d>
+              <m:r>
+                <m:t> </m:t>
+              </m:r>
+              <m:r>
+                <m:t>d</m:t>
+              </m:r>
+              <m:r>
+                <m:t>ψ</m:t>
+              </m:r>
+            </m:den>
+          </m:f>
+          <m:r>
+            <m:t>  </m:t>
+          </m:r>
+          <m:d>
+            <m:dPr>
+              <m:begChr m:val="("/>
+              <m:endChr m:val=")"/>
+              <m:sepChr m:val=""/>
+              <m:grow/>
+            </m:dPr>
+            <m:e>
+              <m:r>
+                <m:t>17</m:t>
+              </m:r>
+            </m:e>
+          </m:d>
+        </m:oMath>
+      </m:oMathPara>
+      <w:bookmarkEnd w:id="70"/>
+    </w:p>
+    <w:p>
+      <w:pPr>
+        <w:pStyle w:val="FirstParagraph"/>
+      </w:pPr>
+      <w:r>
+        <w:t xml:space="preserve">To find the posterior probabilities of different vowel categories, we marginalize over</w:t>
+      </w:r>
+      <w:r>
+        <w:t xml:space="preserve"> </w:t>
+      </w:r>
+      <m:oMath>
+        <m:sSub>
+          <m:e>
+            <m:r>
+              <m:t>ψ</m:t>
+            </m:r>
+          </m:e>
+          <m:sub>
+            <m:r>
+              <m:t>s</m:t>
+            </m:r>
+          </m:sub>
+        </m:sSub>
+      </m:oMath>
+      <w:r>
+        <w:t xml:space="preserve">:</w:t>
+      </w:r>
+    </w:p>
+    <w:p>
+      <w:pPr>
+        <w:pStyle w:val="BodyText"/>
+      </w:pPr>
+      <w:bookmarkStart w:id="71" w:name="eq-BSTM-posterior-psi-and-vowel"/>
+      <m:oMathPara>
+        <m:oMathParaPr>
+          <m:jc m:val="center"/>
+        </m:oMathParaPr>
+        <m:oMath>
+          <m:r>
+            <m:t>P</m:t>
+          </m:r>
+          <m:d>
+            <m:dPr>
+              <m:begChr m:val="("/>
+              <m:endChr m:val=")"/>
+              <m:sepChr m:val=""/>
+              <m:grow/>
+            </m:dPr>
+            <m:e>
+              <m:sSub>
+                <m:e>
+                  <m:r>
+                    <m:rPr>
+                      <m:nor/>
+                      <m:sty m:val="p"/>
+                    </m:rPr>
+                    <m:t>v</m:t>
+                  </m:r>
+                </m:e>
+                <m:sub>
+                  <m:r>
+                    <m:t>j</m:t>
+                  </m:r>
+                </m:sub>
+              </m:sSub>
+              <m:r>
+                <m:rPr>
+                  <m:sty m:val="p"/>
+                </m:rPr>
+                <m:t>|</m:t>
+              </m:r>
+              <m:acc>
+                <m:accPr>
+                  <m:chr m:val="⃗"/>
+                </m:accPr>
+                <m:e>
+                  <m:r>
+                    <m:t>G</m:t>
+                  </m:r>
+                </m:e>
+              </m:acc>
+            </m:e>
+          </m:d>
+          <m:r>
+            <m:rPr>
+              <m:sty m:val="p"/>
+            </m:rPr>
+            <m:t>=</m:t>
+          </m:r>
+          <m:f>
+            <m:fPr>
+              <m:type m:val="bar"/>
+            </m:fPr>
+            <m:num>
+              <m:r>
+                <m:rPr>
+                  <m:sty m:val="p"/>
+                </m:rPr>
+                <m:t>∫</m:t>
+              </m:r>
+              <m:r>
+                <m:t>P</m:t>
+              </m:r>
+              <m:d>
+                <m:dPr>
+                  <m:begChr m:val="("/>
+                  <m:endChr m:val=")"/>
+                  <m:sepChr m:val=""/>
+                  <m:grow/>
+                </m:dPr>
+                <m:e>
+                  <m:acc>
+                    <m:accPr>
+                      <m:chr m:val="⃗"/>
+                    </m:accPr>
+                    <m:e>
+                      <m:r>
+                        <m:t>G</m:t>
+                      </m:r>
+                    </m:e>
+                  </m:acc>
+                  <m:r>
+                    <m:rPr>
+                      <m:sty m:val="p"/>
+                    </m:rPr>
+                    <m:t>|</m:t>
+                  </m:r>
+                  <m:sSub>
+                    <m:e>
+                      <m:r>
+                        <m:rPr>
+                          <m:nor/>
+                          <m:sty m:val="p"/>
+                        </m:rPr>
+                        <m:t>v</m:t>
+                      </m:r>
+                    </m:e>
+                    <m:sub>
+                      <m:r>
+                        <m:t>j</m:t>
+                      </m:r>
+                    </m:sub>
+                  </m:sSub>
+                  <m:r>
+                    <m:rPr>
+                      <m:sty m:val="p"/>
+                    </m:rPr>
+                    <m:t>,</m:t>
+                  </m:r>
+                  <m:sSub>
+                    <m:e>
+                      <m:r>
+                        <m:t>ψ</m:t>
+                      </m:r>
+                    </m:e>
+                    <m:sub>
+                      <m:r>
+                        <m:t>s</m:t>
+                      </m:r>
+                    </m:sub>
+                  </m:sSub>
+                </m:e>
+              </m:d>
+              <m:r>
+                <m:rPr>
+                  <m:sty m:val="p"/>
+                </m:rPr>
+                <m:t>⋅</m:t>
+              </m:r>
+              <m:r>
+                <m:t>P</m:t>
+              </m:r>
+              <m:d>
+                <m:dPr>
+                  <m:begChr m:val="("/>
+                  <m:endChr m:val=")"/>
+                  <m:sepChr m:val=""/>
+                  <m:grow/>
+                </m:dPr>
+                <m:e>
+                  <m:sSub>
+                    <m:e>
+                      <m:r>
+                        <m:t>ψ</m:t>
+                      </m:r>
+                    </m:e>
+                    <m:sub>
+                      <m:r>
+                        <m:t>s</m:t>
+                      </m:r>
+                    </m:sub>
+                  </m:sSub>
+                </m:e>
+              </m:d>
+              <m:r>
+                <m:rPr>
+                  <m:sty m:val="p"/>
+                </m:rPr>
+                <m:t>⋅</m:t>
+              </m:r>
+              <m:r>
+                <m:t>P</m:t>
+              </m:r>
+              <m:d>
+                <m:dPr>
+                  <m:begChr m:val="("/>
+                  <m:endChr m:val=")"/>
+                  <m:sepChr m:val=""/>
+                  <m:grow/>
+                </m:dPr>
+                <m:e>
+                  <m:sSub>
+                    <m:e>
+                      <m:r>
+                        <m:rPr>
+                          <m:nor/>
+                          <m:sty m:val="p"/>
+                        </m:rPr>
+                        <m:t>v</m:t>
+                      </m:r>
+                    </m:e>
+                    <m:sub>
+                      <m:r>
+                        <m:t>j</m:t>
+                      </m:r>
+                    </m:sub>
+                  </m:sSub>
+                </m:e>
+              </m:d>
+              <m:r>
+                <m:t> </m:t>
+              </m:r>
+              <m:r>
+                <m:t>d</m:t>
+              </m:r>
+              <m:r>
+                <m:t>ψ</m:t>
+              </m:r>
+            </m:num>
+            <m:den>
+              <m:nary>
+                <m:naryPr>
+                  <m:chr m:val="∑"/>
+                  <m:limLoc m:val="undOvr"/>
+                  <m:subHide m:val="off"/>
+                  <m:supHide m:val="off"/>
+                </m:naryPr>
+                <m:sub>
+                  <m:r>
+                    <m:t>i</m:t>
+                  </m:r>
+                  <m:r>
+                    <m:rPr>
+                      <m:sty m:val="p"/>
+                    </m:rPr>
+                    <m:t>=</m:t>
+                  </m:r>
+                  <m:r>
+                    <m:t>1</m:t>
+                  </m:r>
+                </m:sub>
+                <m:sup>
+                  <m:r>
+                    <m:t>V</m:t>
+                  </m:r>
+                </m:sup>
+                <m:e>
+                  <m:r>
+                    <m:rPr>
+                      <m:sty m:val="p"/>
+                    </m:rPr>
+                    <m:t>∫</m:t>
+                  </m:r>
+                </m:e>
+              </m:nary>
+              <m:r>
+                <m:t>P</m:t>
+              </m:r>
+              <m:d>
+                <m:dPr>
+                  <m:begChr m:val="("/>
+                  <m:endChr m:val=")"/>
+                  <m:sepChr m:val=""/>
+                  <m:grow/>
+                </m:dPr>
+                <m:e>
+                  <m:acc>
+                    <m:accPr>
+                      <m:chr m:val="⃗"/>
+                    </m:accPr>
+                    <m:e>
+                      <m:r>
+                        <m:t>G</m:t>
+                      </m:r>
+                    </m:e>
+                  </m:acc>
+                  <m:r>
+                    <m:rPr>
+                      <m:sty m:val="p"/>
+                    </m:rPr>
+                    <m:t>|</m:t>
+                  </m:r>
+                  <m:sSub>
+                    <m:e>
+                      <m:r>
+                        <m:rPr>
+                          <m:nor/>
+                          <m:sty m:val="p"/>
+                        </m:rPr>
+                        <m:t>v</m:t>
+                      </m:r>
+                    </m:e>
+                    <m:sub>
+                      <m:r>
+                        <m:t>i</m:t>
+                      </m:r>
+                    </m:sub>
+                  </m:sSub>
+                  <m:r>
+                    <m:rPr>
+                      <m:sty m:val="p"/>
+                    </m:rPr>
+                    <m:t>,</m:t>
+                  </m:r>
+                  <m:sSub>
+                    <m:e>
+                      <m:r>
+                        <m:t>ψ</m:t>
+                      </m:r>
+                    </m:e>
+                    <m:sub>
+                      <m:r>
+                        <m:t>s</m:t>
+                      </m:r>
+                    </m:sub>
+                  </m:sSub>
+                </m:e>
+              </m:d>
+              <m:r>
+                <m:rPr>
+                  <m:sty m:val="p"/>
+                </m:rPr>
+                <m:t>⋅</m:t>
+              </m:r>
+              <m:r>
+                <m:t>P</m:t>
+              </m:r>
+              <m:d>
+                <m:dPr>
+                  <m:begChr m:val="("/>
+                  <m:endChr m:val=")"/>
+                  <m:sepChr m:val=""/>
+                  <m:grow/>
+                </m:dPr>
+                <m:e>
+                  <m:sSub>
+                    <m:e>
+                      <m:r>
+                        <m:t>ψ</m:t>
+                      </m:r>
+                    </m:e>
+                    <m:sub>
+                      <m:r>
+                        <m:t>s</m:t>
+                      </m:r>
+                    </m:sub>
+                  </m:sSub>
+                </m:e>
+              </m:d>
+              <m:r>
+                <m:rPr>
+                  <m:sty m:val="p"/>
+                </m:rPr>
+                <m:t>⋅</m:t>
+              </m:r>
+              <m:r>
+                <m:t>P</m:t>
+              </m:r>
+              <m:d>
+                <m:dPr>
+                  <m:begChr m:val="("/>
+                  <m:endChr m:val=")"/>
+                  <m:sepChr m:val=""/>
+                  <m:grow/>
+                </m:dPr>
+                <m:e>
+                  <m:sSub>
+                    <m:e>
+                      <m:r>
+                        <m:rPr>
+                          <m:nor/>
+                          <m:sty m:val="p"/>
+                        </m:rPr>
+                        <m:t>v</m:t>
+                      </m:r>
+                    </m:e>
+                    <m:sub>
+                      <m:r>
+                        <m:t>i</m:t>
+                      </m:r>
+                    </m:sub>
+                  </m:sSub>
+                </m:e>
+              </m:d>
+              <m:r>
+                <m:t> </m:t>
+              </m:r>
+              <m:r>
+                <m:t>d</m:t>
+              </m:r>
+              <m:r>
+                <m:t>ψ</m:t>
+              </m:r>
+            </m:den>
+          </m:f>
+          <m:r>
+            <m:t>  </m:t>
+          </m:r>
+          <m:d>
+            <m:dPr>
+              <m:begChr m:val="("/>
+              <m:endChr m:val=")"/>
+              <m:sepChr m:val=""/>
+              <m:grow/>
+            </m:dPr>
+            <m:e>
+              <m:r>
+                <m:t>18</m:t>
+              </m:r>
+            </m:e>
+          </m:d>
+        </m:oMath>
+      </m:oMathPara>
+      <w:bookmarkEnd w:id="71"/>
+    </w:p>
+    <w:p>
+      <w:pPr>
+        <w:pStyle w:val="FirstParagraph"/>
+      </w:pPr>
+      <w:r>
+        <w:t xml:space="preserve">Compared to focusing on MAP estimates of</w:t>
+      </w:r>
+      <w:r>
+        <w:t xml:space="preserve"> </w:t>
+      </w:r>
+      <m:oMath>
+        <m:sSub>
+          <m:e>
+            <m:r>
+              <m:t>ψ</m:t>
+            </m:r>
+          </m:e>
+          <m:sub>
+            <m:r>
+              <m:t>s</m:t>
+            </m:r>
+          </m:sub>
+        </m:sSub>
+      </m:oMath>
+      <w:r>
+        <w:t xml:space="preserve">, consideration of the posterior distribution in</w:t>
+      </w:r>
+      <w:r>
+        <w:t xml:space="preserve"> </w:t>
+      </w:r>
+      <w:hyperlink w:anchor="eq-BSTM-posterior-joint-psi-and-vowel">
+        <w:r>
+          <w:rPr>
+            <w:rStyle w:val="Hyperlink"/>
+          </w:rPr>
+          <w:t xml:space="preserve">Equation 16</w:t>
+        </w:r>
+      </w:hyperlink>
+      <w:r>
+        <w:t xml:space="preserve"> </w:t>
+      </w:r>
+      <w:r>
+        <w:t xml:space="preserve">takes into account the uncertainty about the</w:t>
+      </w:r>
+      <w:r>
+        <w:t xml:space="preserve"> </w:t>
+      </w:r>
+      <m:oMath>
+        <m:sSub>
+          <m:e>
+            <m:acc>
+              <m:accPr>
+                <m:chr m:val="̂"/>
+              </m:accPr>
+              <m:e>
+                <m:r>
+                  <m:t>ψ</m:t>
+                </m:r>
+              </m:e>
+            </m:acc>
+          </m:e>
+          <m:sub>
+            <m:r>
+              <m:t>s</m:t>
+            </m:r>
+            <m:r>
+              <m:rPr>
+                <m:sty m:val="p"/>
+              </m:rPr>
+              <m:t>,</m:t>
+            </m:r>
+            <m:r>
+              <m:rPr>
+                <m:nor/>
+                <m:sty m:val="p"/>
+              </m:rPr>
+              <m:t>v</m:t>
+            </m:r>
+          </m:sub>
+        </m:sSub>
+      </m:oMath>
+      <w:r>
+        <w:t xml:space="preserve"> </w:t>
+      </w:r>
+      <w:r>
+        <w:t xml:space="preserve">for different vowel categories. This results in a model of vowel perception that is more in line with Bayesian principles, suggesting the name Bayesian Sliding Template Model (BSTM) for this version of the PSTM. By calculating the full posterior distribution of</w:t>
+      </w:r>
+      <w:r>
+        <w:t xml:space="preserve"> </w:t>
+      </w:r>
+      <m:oMath>
+        <m:sSub>
+          <m:e>
+            <m:acc>
+              <m:accPr>
+                <m:chr m:val="̂"/>
+              </m:accPr>
+              <m:e>
+                <m:r>
+                  <m:t>ψ</m:t>
+                </m:r>
+              </m:e>
+            </m:acc>
+          </m:e>
+          <m:sub>
+            <m:r>
+              <m:t>s</m:t>
+            </m:r>
+          </m:sub>
+        </m:sSub>
+      </m:oMath>
+      <w:r>
+        <w:t xml:space="preserve"> </w:t>
+      </w:r>
+      <w:r>
+        <w:t xml:space="preserve">rather than just MAP estimates, the BSTM allows optimal information integration across multiple vowel tokens. This will allow future work to model the iterative estimation and refinement of</w:t>
+      </w:r>
+      <w:r>
+        <w:t xml:space="preserve"> </w:t>
+      </w:r>
+      <m:oMath>
+        <m:sSub>
+          <m:e>
+            <m:acc>
+              <m:accPr>
+                <m:chr m:val="̂"/>
+              </m:accPr>
+              <m:e>
+                <m:r>
+                  <m:t>ψ</m:t>
+                </m:r>
+              </m:e>
+            </m:acc>
+          </m:e>
+          <m:sub>
+            <m:r>
+              <m:t>s</m:t>
+            </m:r>
+          </m:sub>
+        </m:sSub>
+      </m:oMath>
+      <w:r>
+        <w:t xml:space="preserve"> </w:t>
+      </w:r>
+      <w:r>
+        <w:t xml:space="preserve">across vowel observations, something which is not possible with the original PSTM.</w:t>
+      </w:r>
+    </w:p>
+    <w:p>
+      <w:pPr>
+        <w:pStyle w:val="BodyText"/>
+      </w:pPr>
+      <w:r>
+        <w:t xml:space="preserve">It is, of course, an empirical question whether</w:t>
+      </w:r>
+      <w:r>
+        <w:t xml:space="preserve"> </w:t>
+      </w:r>
+      <w:r>
+        <w:rPr>
+          <w:i/>
+          <w:iCs/>
+        </w:rPr>
+        <w:t xml:space="preserve">listeners’ behavior</w:t>
+      </w:r>
+      <w:r>
+        <w:t xml:space="preserve"> </w:t>
+      </w:r>
+      <w:r>
+        <w:t xml:space="preserve">is better explained by this more fully Bayesian model. For the</w:t>
+      </w:r>
+      <w:r>
+        <w:t xml:space="preserve"> </w:t>
+      </w:r>
+      <w:r>
+        <w:t xml:space="preserve">Hillenbrand et al. (1995)</w:t>
+      </w:r>
+      <w:r>
+        <w:t xml:space="preserve"> </w:t>
+      </w:r>
+      <w:r>
+        <w:t xml:space="preserve">data, the BSTM performs identical to the PSTM.</w:t>
+      </w:r>
+    </w:p>
+    <w:p>
+      <w:pPr>
+        <w:pStyle w:val="BodyText"/>
+      </w:pPr>
+      <w:r>
+        <w:t xml:space="preserve">In future work we plan to expand evaluation of the BSTM in two ways. First, here we evaluated</w:t>
       </w:r>
       <w:r>
         <w:t xml:space="preserve"> </w:t>
@@ -17837,35 +17575,19 @@
       </m:oMathPara>
       <w:bookmarkEnd w:id="72"/>
     </w:p>
-    <w:p>
-      <w:pPr>
-        <w:pStyle w:val="FirstParagraph"/>
-      </w:pPr>
-      <w:r>
-        <w:t xml:space="preserve">Third and finally, the general framework for incremental normalization presented here can be extended to a wide range of other normalization methods. This will allow comparisons between different approaches to incremental formant normalization and beyond. In particular, future work can investigate how incremental normalization can be integrated into modern ASR architectures, to improve the suitability of these architectures as a model of human speech perception. This will also researchers to move beyond normalization of formant point estimates (e.g., F1-F3 at the start and end of the vowel), addressing longstanding concerns that human listeners use a much broader sets of acoustic features when identifying vowels</w:t>
-      </w:r>
-      <w:r>
-        <w:t xml:space="preserve"> </w:t>
-      </w:r>
-      <w:r>
-        <w:t xml:space="preserve">Barreda and Nearey (2012)</w:t>
-      </w:r>
-      <w:r>
-        <w:t xml:space="preserve">.</w:t>
-      </w:r>
-    </w:p>
     <w:bookmarkEnd w:id="73"/>
-    <w:bookmarkStart w:id="116" w:name="references"/>
+    <w:bookmarkEnd w:id="74"/>
+    <w:bookmarkStart w:id="117" w:name="references"/>
     <w:p>
       <w:pPr>
         <w:pStyle w:val="Heading1"/>
       </w:pPr>
       <w:r>
-        <w:t xml:space="preserve">7. References</w:t>
+        <w:t xml:space="preserve">8. References</w:t>
       </w:r>
     </w:p>
-    <w:bookmarkStart w:id="115" w:name="refs"/>
-    <w:bookmarkStart w:id="74" w:name="ref-ak00"/>
+    <w:bookmarkStart w:id="116" w:name="refs"/>
+    <w:bookmarkStart w:id="75" w:name="ref-ak00"/>
     <w:p>
       <w:pPr>
         <w:pStyle w:val="Bibliography"/>
@@ -17896,8 +17618,8 @@
         <w:t xml:space="preserve">108 (4): 1856–66.</w:t>
       </w:r>
     </w:p>
-    <w:bookmarkEnd w:id="74"/>
-    <w:bookmarkStart w:id="75" w:name="ref-barreda2012"/>
+    <w:bookmarkEnd w:id="75"/>
+    <w:bookmarkStart w:id="76" w:name="ref-barreda2012"/>
     <w:p>
       <w:pPr>
         <w:pStyle w:val="Bibliography"/>
@@ -17928,8 +17650,8 @@
         <w:t xml:space="preserve">132 (5): 3453–64.</w:t>
       </w:r>
     </w:p>
-    <w:bookmarkEnd w:id="75"/>
-    <w:bookmarkStart w:id="76" w:name="ref-b_height_2017"/>
+    <w:bookmarkEnd w:id="76"/>
+    <w:bookmarkStart w:id="77" w:name="ref-b_height_2017"/>
     <w:p>
       <w:pPr>
         <w:pStyle w:val="Bibliography"/>
@@ -17960,8 +17682,8 @@
         <w:t xml:space="preserve">141 (6): 4781–92.</w:t>
       </w:r>
     </w:p>
-    <w:bookmarkEnd w:id="76"/>
-    <w:bookmarkStart w:id="77" w:name="ref-b20"/>
+    <w:bookmarkEnd w:id="77"/>
+    <w:bookmarkStart w:id="78" w:name="ref-b20"/>
     <w:p>
       <w:pPr>
         <w:pStyle w:val="Bibliography"/>
@@ -17992,8 +17714,8 @@
         <w:t xml:space="preserve">96 (2).</w:t>
       </w:r>
     </w:p>
-    <w:bookmarkEnd w:id="77"/>
-    <w:bookmarkStart w:id="78" w:name="ref-b21"/>
+    <w:bookmarkEnd w:id="78"/>
+    <w:bookmarkStart w:id="79" w:name="ref-b21"/>
     <w:p>
       <w:pPr>
         <w:pStyle w:val="Bibliography"/>
@@ -18021,8 +17743,8 @@
         <w:t xml:space="preserve">, 1–27.</w:t>
       </w:r>
     </w:p>
-    <w:bookmarkEnd w:id="78"/>
-    <w:bookmarkStart w:id="79" w:name="ref-b_gender_21"/>
+    <w:bookmarkEnd w:id="79"/>
+    <w:bookmarkStart w:id="80" w:name="ref-b_gender_21"/>
     <w:p>
       <w:pPr>
         <w:pStyle w:val="Bibliography"/>
@@ -18053,8 +17775,8 @@
         <w:t xml:space="preserve">150 (5): 3949–63.</w:t>
       </w:r>
     </w:p>
-    <w:bookmarkEnd w:id="79"/>
-    <w:bookmarkStart w:id="81" w:name="ref-b_age_2018"/>
+    <w:bookmarkEnd w:id="80"/>
+    <w:bookmarkStart w:id="82" w:name="ref-b_age_2018"/>
     <w:p>
       <w:pPr>
         <w:pStyle w:val="Bibliography"/>
@@ -18087,7 +17809,7 @@
       <w:r>
         <w:t xml:space="preserve"> </w:t>
       </w:r>
-      <w:hyperlink r:id="rId80">
+      <w:hyperlink r:id="rId81">
         <w:r>
           <w:rPr>
             <w:rStyle w:val="Hyperlink"/>
@@ -18099,8 +17821,8 @@
         <w:t xml:space="preserve">.</w:t>
       </w:r>
     </w:p>
-    <w:bookmarkEnd w:id="81"/>
-    <w:bookmarkStart w:id="82" w:name="ref-bn2012"/>
+    <w:bookmarkEnd w:id="82"/>
+    <w:bookmarkStart w:id="83" w:name="ref-bn2012"/>
     <w:p>
       <w:pPr>
         <w:pStyle w:val="Bibliography"/>
@@ -18131,8 +17853,8 @@
         <w:t xml:space="preserve">131 (1): 466–77.</w:t>
       </w:r>
     </w:p>
-    <w:bookmarkEnd w:id="82"/>
-    <w:bookmarkStart w:id="83" w:name="ref-barreda-nearey2018"/>
+    <w:bookmarkEnd w:id="83"/>
+    <w:bookmarkStart w:id="84" w:name="ref-barreda-nearey2018"/>
     <w:p>
       <w:pPr>
         <w:pStyle w:val="Bibliography"/>
@@ -18163,8 +17885,8 @@
         <w:t xml:space="preserve">144 (1): 500–520.</w:t>
       </w:r>
     </w:p>
-    <w:bookmarkEnd w:id="83"/>
-    <w:bookmarkStart w:id="84" w:name="ref-charlton2012"/>
+    <w:bookmarkEnd w:id="84"/>
+    <w:bookmarkStart w:id="85" w:name="ref-charlton2012"/>
     <w:p>
       <w:pPr>
         <w:pStyle w:val="Bibliography"/>
@@ -18195,8 +17917,8 @@
         <w:t xml:space="preserve">15: 999–1006.</w:t>
       </w:r>
     </w:p>
-    <w:bookmarkEnd w:id="84"/>
-    <w:bookmarkStart w:id="85" w:name="ref-chernyak2024"/>
+    <w:bookmarkEnd w:id="85"/>
+    <w:bookmarkStart w:id="86" w:name="ref-chernyak2024"/>
     <w:p>
       <w:pPr>
         <w:pStyle w:val="Bibliography"/>
@@ -18227,8 +17949,8 @@
         <w:t xml:space="preserve">155 (6): 3915–29.</w:t>
       </w:r>
     </w:p>
-    <w:bookmarkEnd w:id="85"/>
-    <w:bookmarkStart w:id="86" w:name="ref-h2000"/>
+    <w:bookmarkEnd w:id="86"/>
+    <w:bookmarkStart w:id="87" w:name="ref-h2000"/>
     <w:p>
       <w:pPr>
         <w:pStyle w:val="Bibliography"/>
@@ -18259,8 +17981,8 @@
         <w:t xml:space="preserve">108 (6): 3013–22.</w:t>
       </w:r>
     </w:p>
-    <w:bookmarkEnd w:id="86"/>
-    <w:bookmarkStart w:id="88" w:name="ref-h95"/>
+    <w:bookmarkEnd w:id="87"/>
+    <w:bookmarkStart w:id="89" w:name="ref-h95"/>
     <w:p>
       <w:pPr>
         <w:pStyle w:val="Bibliography"/>
@@ -18311,7 +18033,7 @@
       <w:r>
         <w:t xml:space="preserve"> </w:t>
       </w:r>
-      <w:hyperlink r:id="rId87">
+      <w:hyperlink r:id="rId88">
         <w:r>
           <w:rPr>
             <w:rStyle w:val="Hyperlink"/>
@@ -18323,8 +18045,8 @@
         <w:t xml:space="preserve">.</w:t>
       </w:r>
     </w:p>
-    <w:bookmarkEnd w:id="88"/>
-    <w:bookmarkStart w:id="89" w:name="ref-hn99"/>
+    <w:bookmarkEnd w:id="89"/>
+    <w:bookmarkStart w:id="90" w:name="ref-hn99"/>
     <w:p>
       <w:pPr>
         <w:pStyle w:val="Bibliography"/>
@@ -18355,8 +18077,8 @@
         <w:t xml:space="preserve">105 (6): 3509–23.</w:t>
       </w:r>
     </w:p>
-    <w:bookmarkEnd w:id="89"/>
-    <w:bookmarkStart w:id="90" w:name="ref-jin2025"/>
+    <w:bookmarkEnd w:id="90"/>
+    <w:bookmarkStart w:id="91" w:name="ref-jin2025"/>
     <w:p>
       <w:pPr>
         <w:pStyle w:val="Bibliography"/>
@@ -18371,8 +18093,8 @@
         <w:t xml:space="preserve">“Latent Speech Representations Learned Through Self-Supervised Learning Predict Listeners’ Generalization of Adaptation Across Talkers.”</w:t>
       </w:r>
     </w:p>
-    <w:bookmarkEnd w:id="90"/>
-    <w:bookmarkStart w:id="91" w:name="ref-johnson1997"/>
+    <w:bookmarkEnd w:id="91"/>
+    <w:bookmarkStart w:id="92" w:name="ref-johnson1997"/>
     <w:p>
       <w:pPr>
         <w:pStyle w:val="Bibliography"/>
@@ -18406,8 +18128,8 @@
         <w:t xml:space="preserve">, edited by K Johnson and J W Mullennix, 145–46. San Diego: Academic Press.</w:t>
       </w:r>
     </w:p>
-    <w:bookmarkEnd w:id="91"/>
-    <w:bookmarkStart w:id="92" w:name="ref-kim2024"/>
+    <w:bookmarkEnd w:id="92"/>
+    <w:bookmarkStart w:id="93" w:name="ref-kim2024"/>
     <w:p>
       <w:pPr>
         <w:pStyle w:val="Bibliography"/>
@@ -18438,8 +18160,8 @@
         <w:t xml:space="preserve">4 (2).</w:t>
       </w:r>
     </w:p>
-    <w:bookmarkEnd w:id="92"/>
-    <w:bookmarkStart w:id="93" w:name="ref-kleinschmidt-jaeger2015"/>
+    <w:bookmarkEnd w:id="93"/>
+    <w:bookmarkStart w:id="94" w:name="ref-kleinschmidt-jaeger2015"/>
     <w:p>
       <w:pPr>
         <w:pStyle w:val="Bibliography"/>
@@ -18470,8 +18192,8 @@
         <w:t xml:space="preserve">122 (2): 148.</w:t>
       </w:r>
     </w:p>
-    <w:bookmarkEnd w:id="93"/>
-    <w:bookmarkStart w:id="94" w:name="ref-kleinschmidt2018"/>
+    <w:bookmarkEnd w:id="94"/>
+    <w:bookmarkStart w:id="95" w:name="ref-kleinschmidt2018"/>
     <w:p>
       <w:pPr>
         <w:pStyle w:val="Bibliography"/>
@@ -18502,8 +18224,8 @@
         <w:t xml:space="preserve">10 (4): 818–34.</w:t>
       </w:r>
     </w:p>
-    <w:bookmarkEnd w:id="94"/>
-    <w:bookmarkStart w:id="95" w:name="ref-lobanov1971"/>
+    <w:bookmarkEnd w:id="95"/>
+    <w:bookmarkStart w:id="96" w:name="ref-lobanov1971"/>
     <w:p>
       <w:pPr>
         <w:pStyle w:val="Bibliography"/>
@@ -18534,8 +18256,8 @@
         <w:t xml:space="preserve">49 (2B): 606–8.</w:t>
       </w:r>
     </w:p>
-    <w:bookmarkEnd w:id="95"/>
-    <w:bookmarkStart w:id="96" w:name="ref-luce-pisoni1998"/>
+    <w:bookmarkEnd w:id="96"/>
+    <w:bookmarkStart w:id="97" w:name="ref-luce-pisoni1998"/>
     <w:p>
       <w:pPr>
         <w:pStyle w:val="Bibliography"/>
@@ -18566,8 +18288,8 @@
         <w:t xml:space="preserve">19 (1): 1–36.</w:t>
       </w:r>
     </w:p>
-    <w:bookmarkEnd w:id="96"/>
-    <w:bookmarkStart w:id="97" w:name="ref-magnuson-nusbaum2007"/>
+    <w:bookmarkEnd w:id="97"/>
+    <w:bookmarkStart w:id="98" w:name="ref-magnuson-nusbaum2007"/>
     <w:p>
       <w:pPr>
         <w:pStyle w:val="Bibliography"/>
@@ -18598,8 +18320,8 @@
         <w:t xml:space="preserve">33 (2): 391.</w:t>
       </w:r>
     </w:p>
-    <w:bookmarkEnd w:id="97"/>
-    <w:bookmarkStart w:id="98" w:name="ref-massaro-friedman1990"/>
+    <w:bookmarkEnd w:id="98"/>
+    <w:bookmarkStart w:id="99" w:name="ref-massaro-friedman1990"/>
     <w:p>
       <w:pPr>
         <w:pStyle w:val="Bibliography"/>
@@ -18630,8 +18352,8 @@
         <w:t xml:space="preserve">97 (2): 225.</w:t>
       </w:r>
     </w:p>
-    <w:bookmarkEnd w:id="98"/>
-    <w:bookmarkStart w:id="99" w:name="ref-n78"/>
+    <w:bookmarkEnd w:id="99"/>
+    <w:bookmarkStart w:id="100" w:name="ref-n78"/>
     <w:p>
       <w:pPr>
         <w:pStyle w:val="Bibliography"/>
@@ -18653,8 +18375,8 @@
         <w:t xml:space="preserve">. 177. Indiana University Linguistics Club.</w:t>
       </w:r>
     </w:p>
-    <w:bookmarkEnd w:id="99"/>
-    <w:bookmarkStart w:id="100" w:name="ref-NA07"/>
+    <w:bookmarkEnd w:id="100"/>
+    <w:bookmarkStart w:id="101" w:name="ref-NA07"/>
     <w:p>
       <w:pPr>
         <w:pStyle w:val="Bibliography"/>
@@ -18697,8 +18419,8 @@
         <w:t xml:space="preserve">246.</w:t>
       </w:r>
     </w:p>
-    <w:bookmarkEnd w:id="100"/>
-    <w:bookmarkStart w:id="101" w:name="ref-norris-mcqueen2008"/>
+    <w:bookmarkEnd w:id="101"/>
+    <w:bookmarkStart w:id="102" w:name="ref-norris-mcqueen2008"/>
     <w:p>
       <w:pPr>
         <w:pStyle w:val="Bibliography"/>
@@ -18729,8 +18451,8 @@
         <w:t xml:space="preserve">115 (2): 357.</w:t>
       </w:r>
     </w:p>
-    <w:bookmarkEnd w:id="101"/>
-    <w:bookmarkStart w:id="102" w:name="ref-persson2025"/>
+    <w:bookmarkEnd w:id="102"/>
+    <w:bookmarkStart w:id="103" w:name="ref-persson2025"/>
     <w:p>
       <w:pPr>
         <w:pStyle w:val="Bibliography"/>
@@ -18761,8 +18483,8 @@
         <w:t xml:space="preserve">157: 1458–82.</w:t>
       </w:r>
     </w:p>
-    <w:bookmarkEnd w:id="102"/>
-    <w:bookmarkStart w:id="104" w:name="ref-pb52"/>
+    <w:bookmarkEnd w:id="103"/>
+    <w:bookmarkStart w:id="105" w:name="ref-pb52"/>
     <w:p>
       <w:pPr>
         <w:pStyle w:val="Bibliography"/>
@@ -18834,7 +18556,7 @@
       <w:r>
         <w:t xml:space="preserve"> </w:t>
       </w:r>
-      <w:hyperlink r:id="rId103">
+      <w:hyperlink r:id="rId104">
         <w:r>
           <w:rPr>
             <w:rStyle w:val="Hyperlink"/>
@@ -18846,8 +18568,8 @@
         <w:t xml:space="preserve">.</w:t>
       </w:r>
     </w:p>
-    <w:bookmarkEnd w:id="104"/>
-    <w:bookmarkStart w:id="106" w:name="ref-R"/>
+    <w:bookmarkEnd w:id="105"/>
+    <w:bookmarkStart w:id="107" w:name="ref-R"/>
     <w:p>
       <w:pPr>
         <w:pStyle w:val="Bibliography"/>
@@ -18871,7 +18593,7 @@
       <w:r>
         <w:t xml:space="preserve"> </w:t>
       </w:r>
-      <w:hyperlink r:id="rId105">
+      <w:hyperlink r:id="rId106">
         <w:r>
           <w:rPr>
             <w:rStyle w:val="Hyperlink"/>
@@ -18883,8 +18605,8 @@
         <w:t xml:space="preserve">.</w:t>
       </w:r>
     </w:p>
-    <w:bookmarkEnd w:id="106"/>
-    <w:bookmarkStart w:id="107" w:name="ref-reby2005"/>
+    <w:bookmarkEnd w:id="107"/>
+    <w:bookmarkStart w:id="108" w:name="ref-reby2005"/>
     <w:p>
       <w:pPr>
         <w:pStyle w:val="Bibliography"/>
@@ -18915,8 +18637,8 @@
         <w:t xml:space="preserve">272 (1566): 941–47.</w:t>
       </w:r>
     </w:p>
-    <w:bookmarkEnd w:id="107"/>
-    <w:bookmarkStart w:id="109" w:name="ref-richter2017"/>
+    <w:bookmarkEnd w:id="108"/>
+    <w:bookmarkStart w:id="110" w:name="ref-richter2017"/>
     <w:p>
       <w:pPr>
         <w:pStyle w:val="Bibliography"/>
@@ -18949,7 +18671,7 @@
       <w:r>
         <w:t xml:space="preserve"> </w:t>
       </w:r>
-      <w:hyperlink r:id="rId108">
+      <w:hyperlink r:id="rId109">
         <w:r>
           <w:rPr>
             <w:rStyle w:val="Hyperlink"/>
@@ -18961,8 +18683,8 @@
         <w:t xml:space="preserve">.</w:t>
       </w:r>
     </w:p>
-    <w:bookmarkEnd w:id="109"/>
-    <w:bookmarkStart w:id="111" w:name="ref-RStudio"/>
+    <w:bookmarkEnd w:id="110"/>
+    <w:bookmarkStart w:id="112" w:name="ref-RStudio"/>
     <w:p>
       <w:pPr>
         <w:pStyle w:val="Bibliography"/>
@@ -18986,7 +18708,7 @@
       <w:r>
         <w:t xml:space="preserve"> </w:t>
       </w:r>
-      <w:hyperlink r:id="rId110">
+      <w:hyperlink r:id="rId111">
         <w:r>
           <w:rPr>
             <w:rStyle w:val="Hyperlink"/>
@@ -18998,8 +18720,8 @@
         <w:t xml:space="preserve">.</w:t>
       </w:r>
     </w:p>
-    <w:bookmarkEnd w:id="111"/>
-    <w:bookmarkStart w:id="112" w:name="ref-sumner2011"/>
+    <w:bookmarkEnd w:id="112"/>
+    <w:bookmarkStart w:id="113" w:name="ref-sumner2011"/>
     <w:p>
       <w:pPr>
         <w:pStyle w:val="Bibliography"/>
@@ -19030,8 +18752,8 @@
         <w:t xml:space="preserve">119 (1): 131–36.</w:t>
       </w:r>
     </w:p>
-    <w:bookmarkEnd w:id="112"/>
-    <w:bookmarkStart w:id="113" w:name="ref-taylor2010"/>
+    <w:bookmarkEnd w:id="113"/>
+    <w:bookmarkStart w:id="114" w:name="ref-taylor2010"/>
     <w:p>
       <w:pPr>
         <w:pStyle w:val="Bibliography"/>
@@ -19062,8 +18784,8 @@
         <w:t xml:space="preserve">79 (1): 205–10.</w:t>
       </w:r>
     </w:p>
-    <w:bookmarkEnd w:id="113"/>
-    <w:bookmarkStart w:id="114" w:name="ref-xie2023"/>
+    <w:bookmarkEnd w:id="114"/>
+    <w:bookmarkStart w:id="115" w:name="ref-xie2023"/>
     <w:p>
       <w:pPr>
         <w:pStyle w:val="Bibliography"/>
@@ -19094,9 +18816,9 @@
         <w:t xml:space="preserve">166: 377–424.</w:t>
       </w:r>
     </w:p>
-    <w:bookmarkEnd w:id="114"/>
     <w:bookmarkEnd w:id="115"/>
     <w:bookmarkEnd w:id="116"/>
+    <w:bookmarkEnd w:id="117"/>
     <w:sectPr/>
   </w:body>
 </w:document>
@@ -19219,7 +18941,7 @@
       </w:r>
     </w:p>
   </w:footnote>
-  <w:footnote w:id="63">
+  <w:footnote w:id="59">
     <w:p>
       <w:pPr>
         <w:pStyle w:val="FootnoteText"/>
@@ -19247,7 +18969,7 @@
       </w:r>
     </w:p>
   </w:footnote>
-  <w:footnote w:id="64">
+  <w:footnote w:id="60">
     <w:p>
       <w:pPr>
         <w:pStyle w:val="FootnoteText"/>
@@ -19725,9 +19447,6 @@
     <w:abstractNumId w:val="991"/>
   </w:num>
   <w:num w:numId="1007">
-    <w:abstractNumId w:val="991"/>
-  </w:num>
-  <w:num w:numId="1008">
     <w:abstractNumId w:val="991"/>
   </w:num>
 </w:numbering>

</xml_diff>

<commit_message>
removed BSTM from paper + substantive word-smitting/cutting
</commit_message>
<xml_diff>
--- a/Re_introducing_the_PSTM.docx
+++ b/Re_introducing_the_PSTM.docx
@@ -878,55 +878,7 @@
         <w:t xml:space="preserve"> </w:t>
       </w:r>
       <w:r>
-        <w:t xml:space="preserve">data</w:t>
-      </w:r>
-      <w:r>
-        <w:t xml:space="preserve"> </w:t>
-      </w:r>
-      <w:r>
-        <w:t xml:space="preserve">using</w:t>
-      </w:r>
-      <w:r>
-        <w:t xml:space="preserve"> </w:t>
-      </w:r>
-      <w:r>
-        <w:t xml:space="preserve">only</w:t>
-      </w:r>
-      <w:r>
-        <w:t xml:space="preserve"> </w:t>
-      </w:r>
-      <w:r>
-        <w:t xml:space="preserve">a</w:t>
-      </w:r>
-      <w:r>
-        <w:t xml:space="preserve"> </w:t>
-      </w:r>
-      <w:r>
-        <w:t xml:space="preserve">few</w:t>
-      </w:r>
-      <w:r>
-        <w:t xml:space="preserve"> </w:t>
-      </w:r>
-      <w:r>
-        <w:t xml:space="preserve">lines</w:t>
-      </w:r>
-      <w:r>
-        <w:t xml:space="preserve"> </w:t>
-      </w:r>
-      <w:r>
-        <w:t xml:space="preserve">of</w:t>
-      </w:r>
-      <w:r>
-        <w:t xml:space="preserve"> </w:t>
-      </w:r>
-      <w:r>
-        <w:t xml:space="preserve">R</w:t>
-      </w:r>
-      <w:r>
-        <w:t xml:space="preserve"> </w:t>
-      </w:r>
-      <w:r>
-        <w:t xml:space="preserve">code.</w:t>
+        <w:t xml:space="preserve">data.</w:t>
       </w:r>
       <w:r>
         <w:t xml:space="preserve"> </w:t>
@@ -1287,16 +1239,16 @@
         <w:pStyle w:val="BodyText"/>
       </w:pPr>
       <w:r>
-        <w:t xml:space="preserve">The incremental inference mechanism described by the PSTM stands out even when compared to the type of modern models of automatic speech recognition (ASR; e.g., HuBERT, Wav2vec, Whipser). These models have made tremendous progress in understanding human speech, including when faced with inter-talker variability</w:t>
-      </w:r>
-      <w:r>
-        <w:t xml:space="preserve"> </w:t>
-      </w:r>
-      <w:r>
-        <w:t xml:space="preserve">(e.g., Kim et al. 2024)</w:t>
-      </w:r>
-      <w:r>
-        <w:t xml:space="preserve">. Recent work further suggests that the latent perceptual representations learned by these ASR models capture some aspects of human speech perception, such as the ability to generalize to unfamiliar accents</w:t>
+        <w:t xml:space="preserve">The incremental inference mechanism described by the PSTM stands out even when compared to modern models of automatic speech recognition (ASR; e.g., HuBERT, Wav2vec, Whipser). These models have made tremendous progress in understanding human speech even under challenging conditions</w:t>
+      </w:r>
+      <w:r>
+        <w:t xml:space="preserve"> </w:t>
+      </w:r>
+      <w:r>
+        <w:t xml:space="preserve">(Kim et al. 2024)</w:t>
+      </w:r>
+      <w:r>
+        <w:t xml:space="preserve">. Recent work further suggests that the perceptual representations learned by these ASR models capture some aspects of human speech perception</w:t>
       </w:r>
       <w:r>
         <w:t xml:space="preserve"> </w:t>
@@ -1305,7 +1257,7 @@
         <w:t xml:space="preserve">(Chernyak et al. 2024; Jin, Zhu, and Jaeger 2025)</w:t>
       </w:r>
       <w:r>
-        <w:t xml:space="preserve">. Unlike the PSTM, none of these models exhibits the incremental changes in perception that have been shown to occur in human listeners when exposed to different talkers of familiar accents</w:t>
+        <w:t xml:space="preserve">. Unlike the PSTM, however, none of these models exhibits the rapid, exposure-driven, incremental changes in perception that human listeners exhibit</w:t>
       </w:r>
       <w:r>
         <w:t xml:space="preserve"> </w:t>
@@ -1343,22 +1295,7 @@
         <w:t xml:space="preserve"> </w:t>
       </w:r>
       <w:r>
-        <w:t xml:space="preserve">is one of the most ground-breaking papers in speech perception that</w:t>
-      </w:r>
-      <w:r>
-        <w:t xml:space="preserve"> </w:t>
-      </w:r>
-      <w:r>
-        <w:t xml:space="preserve">‘</w:t>
-      </w:r>
-      <w:r>
-        <w:t xml:space="preserve">nobody has ever read</w:t>
-      </w:r>
-      <w:r>
-        <w:t xml:space="preserve">’</w:t>
-      </w:r>
-      <w:r>
-        <w:t xml:space="preserve">. As of the writing of this article, it had been cited less than 40 times over 17 years. During the same time, there have been 314,000 research articles on vowels.</w:t>
+        <w:t xml:space="preserve">is one of the most under-appreciated papers in speech perception. It has been cited less than 40 times over 17 years. During the same time, there have been over 17,000 research articles on vowel identification and formant normalization.</w:t>
       </w:r>
       <w:r>
         <w:t xml:space="preserve"> </w:t>
@@ -1379,31 +1316,16 @@
         <w:t xml:space="preserve"> </w:t>
       </w:r>
       <w:r>
-        <w:t xml:space="preserve">is cited three- to four-times as often as Nearey’s STM or</w:t>
-      </w:r>
-      <w:r>
-        <w:t xml:space="preserve"> </w:t>
-      </w:r>
-      <w:r>
-        <w:t xml:space="preserve">“</w:t>
-      </w:r>
-      <w:r>
-        <w:t xml:space="preserve">uniform scaling</w:t>
-      </w:r>
-      <w:r>
-        <w:t xml:space="preserve">”</w:t>
-      </w:r>
-      <w:r>
-        <w:t xml:space="preserve"> </w:t>
-      </w:r>
-      <w:r>
-        <w:t xml:space="preserve">(Nearey 1978)</w:t>
-      </w:r>
-      <w:r>
-        <w:t xml:space="preserve"> </w:t>
-      </w:r>
-      <w:r>
-        <w:t xml:space="preserve">and about 100-times more often than the PSTM</w:t>
+        <w:t xml:space="preserve">is cited</w:t>
+      </w:r>
+      <w:r>
+        <w:t xml:space="preserve"> </w:t>
+      </w:r>
+      <w:r>
+        <w:t xml:space="preserve"> </w:t>
+      </w:r>
+      <w:r>
+        <w:t xml:space="preserve">about 100-times more often than the PSTM</w:t>
       </w:r>
       <w:r>
         <w:t xml:space="preserve"> </w:t>
@@ -1412,23 +1334,7 @@
         <w:t xml:space="preserve">(Nearey and Assmann 2007)</w:t>
       </w:r>
       <w:r>
-        <w:t xml:space="preserve">—despite the fact that the latter is the only the only published article that describes</w:t>
-      </w:r>
-      <w:r>
-        <w:t xml:space="preserve"> </w:t>
-      </w:r>
-      <w:r>
-        <w:rPr>
-          <w:i/>
-          <w:iCs/>
-        </w:rPr>
-        <w:t xml:space="preserve">any</w:t>
-      </w:r>
-      <w:r>
-        <w:t xml:space="preserve"> </w:t>
-      </w:r>
-      <w:r>
-        <w:t xml:space="preserve">incremental inference model for vowel perception. So, here is a ground-breaking idea and promising candidate model of formant/spectral talker-normalization, with far-reaching consequences for research from typology to sociolinguistics to speech perception, … and few seem to know of it.</w:t>
+        <w:t xml:space="preserve">—despite the fact that the latter is the only published model of the incremental inferences underlying vowel perception. So, here is a ground-breaking idea and promising candidate model of how humans perceive spectral information, with far-reaching consequences for research from typology to sociolinguistics to speech perception, … and few seem to know of it.</w:t>
       </w:r>
     </w:p>
     <w:p>
@@ -1436,7 +1342,7 @@
         <w:pStyle w:val="BodyText"/>
       </w:pPr>
       <w:r>
-        <w:t xml:space="preserve">We see two reasons for this. First,</w:t>
+        <w:t xml:space="preserve">We see two reasons for this. First, the PSTM has not previously been tested against human perception.</w:t>
       </w:r>
       <w:r>
         <w:t xml:space="preserve"> </w:t>
@@ -1448,67 +1354,39 @@
         <w:t xml:space="preserve"> </w:t>
       </w:r>
       <w:r>
-        <w:t xml:space="preserve">is a technical paper, written by experts for experts.</w:t>
-      </w:r>
-      <w:r>
-        <w:t xml:space="preserve"> </w:t>
-      </w:r>
-      <w:r>
-        <w:t xml:space="preserve"> </w:t>
-      </w:r>
-      <w:r>
-        <w:t xml:space="preserve">Here we walk through the logic behind the PSTM step by step and provide visualizations of core concepts. Our supplementary information (SI) contains detailed derivations for the most relevant variants of the PSTM. To further facilitate adoption of the model by other researchers, we have implemented all models describe here in the R package</w:t>
+        <w:t xml:space="preserve">evaluated the PSTM in terms of its ability to recognize the vowel</w:t>
       </w:r>
       <w:r>
         <w:t xml:space="preserve"> </w:t>
       </w:r>
       <w:r>
         <w:rPr>
-          <w:rStyle w:val="VerbatimChar"/>
+          <w:i/>
+          <w:iCs/>
         </w:rPr>
-        <w:t xml:space="preserve">STM</w:t>
-      </w:r>
-      <w:r>
-        <w:t xml:space="preserve">.</w:t>
+        <w:t xml:space="preserve">intended by the talker</w:t>
+      </w:r>
+      <w:r>
+        <w:t xml:space="preserve">. However, models of human speech perception should be evaluated in terms of their ability to predict</w:t>
       </w:r>
       <w:r>
         <w:t xml:space="preserve"> </w:t>
       </w:r>
       <w:r>
         <w:rPr>
-          <w:rStyle w:val="VerbatimChar"/>
+          <w:i/>
+          <w:iCs/>
         </w:rPr>
-        <w:t xml:space="preserve">STM</w:t>
-      </w:r>
-      <w:r>
-        <w:t xml:space="preserve"> </w:t>
-      </w:r>
-      <w:r>
-        <w:t xml:space="preserve">is designed to be user-friendly and flexible (constructive user feedback is welcome). The present article uses the</w:t>
-      </w:r>
-      <w:r>
-        <w:t xml:space="preserve"> </w:t>
-      </w:r>
-      <w:r>
-        <w:rPr>
-          <w:rStyle w:val="VerbatimChar"/>
-        </w:rPr>
-        <w:t xml:space="preserve">STM</w:t>
-      </w:r>
-      <w:r>
-        <w:t xml:space="preserve"> </w:t>
-      </w:r>
-      <w:r>
-        <w:t xml:space="preserve">package and is written in Quarto markdown. This markdown document, and all R code it sources, are available as part of the OSF repository at https://osf.io/tpwmv/. This allows interested researchers to re-create all of our analyses with the press of a button in RStudio</w:t>
-      </w:r>
-      <w:r>
-        <w:t xml:space="preserve"> </w:t>
-      </w:r>
-      <w:r>
-        <w:t xml:space="preserve">(R Core Team 2023; RStudio Team 2024)</w:t>
-      </w:r>
-      <w:r>
-        <w:t xml:space="preserve">, and to apply similar analyses to their own data.</w:t>
+        <w:t xml:space="preserve">what listeners perceive</w:t>
+      </w:r>
+      <w:r>
+        <w:t xml:space="preserve"> </w:t>
+      </w:r>
+      <w:r>
+        <w:t xml:space="preserve">(see also Barreda 2020; Persson, Barreda, and Jaeger 2025)</w:t>
+      </w:r>
+      <w:r>
+        <w:t xml:space="preserve">. We provide such a test below, and demonstrate that the PSTM is a by far superior model of human formant perception than the most-cited normalization account.</w:t>
       </w:r>
     </w:p>
     <w:p>
@@ -1516,56 +1394,43 @@
         <w:pStyle w:val="BodyText"/>
       </w:pPr>
       <w:r>
-        <w:t xml:space="preserve">Second, the PSTM has not previously been tested against human perception.</w:t>
-      </w:r>
-      <w:r>
-        <w:t xml:space="preserve"> </w:t>
-      </w:r>
-      <w:r>
-        <w:t xml:space="preserve">Nearey and Assmann (2007)</w:t>
-      </w:r>
-      <w:r>
-        <w:t xml:space="preserve"> </w:t>
-      </w:r>
-      <w:r>
-        <w:t xml:space="preserve">evaluated the PSTM in terms of its ability to recognize the vowel intended by the talker. However, models of human speech perception should be evaluated in terms of its ability to predict</w:t>
+        <w:t xml:space="preserve">Second, in an effort to make the PSTM more accessible, we re-introduce it along with helpful visualizations. Our supplementary information (SI) provides step-by-step derivations of the PSTM. We have also implemented the PSTM in the R package</w:t>
       </w:r>
       <w:r>
         <w:t xml:space="preserve"> </w:t>
       </w:r>
       <w:r>
         <w:rPr>
-          <w:i/>
-          <w:iCs/>
+          <w:rStyle w:val="VerbatimChar"/>
         </w:rPr>
-        <w:t xml:space="preserve">listeners’ perception</w:t>
-      </w:r>
-      <w:r>
-        <w:t xml:space="preserve">, not talkers’ intentions</w:t>
-      </w:r>
-      <w:r>
-        <w:t xml:space="preserve"> </w:t>
-      </w:r>
-      <w:r>
-        <w:t xml:space="preserve">(see also Barreda 2020; Persson, Barreda, and Jaeger 2025)</w:t>
-      </w:r>
-      <w:r>
-        <w:t xml:space="preserve">. While</w:t>
-      </w:r>
-      <w:r>
-        <w:t xml:space="preserve"> </w:t>
-      </w:r>
-      <w:r>
-        <w:t xml:space="preserve">Nearey and Assmann (2007)</w:t>
-      </w:r>
-      <w:r>
-        <w:t xml:space="preserve"> </w:t>
-      </w:r>
-      <w:r>
-        <w:t xml:space="preserve">presented initial qualitative comparisons of PSTM’s predictions and listeners’ perception, those comparisons leave open how good a model the PSTM is of human perception. Here, we address this question.</w:t>
-      </w:r>
-      <w:r>
-        <w:t xml:space="preserve"> </w:t>
+        <w:t xml:space="preserve">STM</w:t>
+      </w:r>
+      <w:r>
+        <w:t xml:space="preserve">, which is designed to be user-friendly. The present article serves as a demonstration: it is written in Quarto markdown and uses the</w:t>
+      </w:r>
+      <w:r>
+        <w:t xml:space="preserve"> </w:t>
+      </w:r>
+      <w:r>
+        <w:rPr>
+          <w:rStyle w:val="VerbatimChar"/>
+        </w:rPr>
+        <w:t xml:space="preserve">STM</w:t>
+      </w:r>
+      <w:r>
+        <w:t xml:space="preserve"> </w:t>
+      </w:r>
+      <w:r>
+        <w:t xml:space="preserve">package. Other researcher can download this markdown at https://osf.io/tpwmv/, and re-run our analyses with the press of a button in RStudio</w:t>
+      </w:r>
+      <w:r>
+        <w:t xml:space="preserve"> </w:t>
+      </w:r>
+      <w:r>
+        <w:t xml:space="preserve">(R Core Team 2023; RStudio Team 2024)</w:t>
+      </w:r>
+      <w:r>
+        <w:t xml:space="preserve">, or apply similar analyses to their own data.</w:t>
       </w:r>
     </w:p>
     <w:bookmarkEnd w:id="20"/>
@@ -1600,7 +1465,7 @@
         <w:t xml:space="preserve"> </w:t>
       </w:r>
       <w:r>
-        <w:t xml:space="preserve">formant space. We start by motivating and describing the normalized formant space assumed by the models we present below.</w:t>
+        <w:t xml:space="preserve">formant space. We start by motivating the normalized formant space assumed by the (P)STM.</w:t>
       </w:r>
     </w:p>
     <w:p>
@@ -1614,10 +1479,10 @@
         <w:t xml:space="preserve"> </w:t>
       </w:r>
       <w:r>
-        <w:t xml:space="preserve">(for a review, see Barreda 2020)</w:t>
-      </w:r>
-      <w:r>
-        <w:t xml:space="preserve">. For example, in order to preserve phonetic similarity, a speaker who produces an F1 that is 10% higher for /a/ than another should also produce F2 and F3 that are 10% higher for that vowel—i.e., all formants are</w:t>
+        <w:t xml:space="preserve">(for review, see Barreda 2020)</w:t>
+      </w:r>
+      <w:r>
+        <w:t xml:space="preserve">. For example, in order to preserve phonetic similarity, a speaker who produces an F1 that is 10% higher for /a/ than another should also produce F2 and F3 that are 10% higher—i.e., all formants are</w:t>
       </w:r>
       <w:r>
         <w:t xml:space="preserve"> </w:t>
@@ -3904,13 +3769,26 @@
         <w:pStyle w:val="FirstParagraph"/>
       </w:pPr>
       <w:r>
-        <w:t xml:space="preserve">Such uniform scaling provides a comparatively parsimonious approach, assuming that listeners infer and store a single parameter. To put this into perspective, the perhaps the most commonly used normalization method in speech research—Lobanov normalization—assumes that listeners infer and store two parameters per feature. For instance, to model the effects of the first three formants at two time points in the vowel (as we do below), listeners would need to estimate twelve independent parameters. This linearly scaling complexity of Lobanov normalization is one of the reasons it might not be an adequate model for human speech perception</w:t>
-      </w:r>
-      <w:r>
-        <w:t xml:space="preserve"> </w:t>
-      </w:r>
-      <w:r>
-        <w:t xml:space="preserve">(for related discussion, see Barreda 2020, 2021; Persson, Barreda, and Jaeger 2025)</w:t>
+        <w:t xml:space="preserve">Such uniform scaling provides a comparatively parsimonious approach, assuming that listeners infer and store a single parameter. To put this into perspective, the perhaps the most commonly used normalization method in speech research—Lobanov normalization—assumes that listeners infer and store two parameters</w:t>
+      </w:r>
+      <w:r>
+        <w:t xml:space="preserve"> </w:t>
+      </w:r>
+      <w:r>
+        <w:rPr>
+          <w:i/>
+          <w:iCs/>
+        </w:rPr>
+        <w:t xml:space="preserve">per feature</w:t>
+      </w:r>
+      <w:r>
+        <w:t xml:space="preserve">. For instances, to model normalization of F1-F3 at two time points in the vowel (as we do below), listeners would need to estimate twelve parameters. This additional complexity of Lobanov normalization is one of the reasons it might not be an adequate model for human speech perception</w:t>
+      </w:r>
+      <w:r>
+        <w:t xml:space="preserve"> </w:t>
+      </w:r>
+      <w:r>
+        <w:t xml:space="preserve">(see discussion in Barreda 2020, 2021; Persson, Barreda, and Jaeger 2025)</w:t>
       </w:r>
       <w:r>
         <w:t xml:space="preserve">.</w:t>
@@ -3931,28 +3809,6 @@
         <w:pStyle w:val="FirstParagraph"/>
       </w:pPr>
       <w:r>
-        <w:t xml:space="preserve">As anticipated above, listeners are assumed to learn dialect-specific vowel representations over the</w:t>
-      </w:r>
-      <w:r>
-        <w:t xml:space="preserve"> </w:t>
-      </w:r>
-      <w:r>
-        <w:rPr>
-          <w:i/>
-          <w:iCs/>
-        </w:rPr>
-        <w:t xml:space="preserve">normalized</w:t>
-      </w:r>
-      <w:r>
-        <w:t xml:space="preserve"> </w:t>
-      </w:r>
-      <w:r>
-        <w:t xml:space="preserve">vowel formants. These representations are assumed to capture the formant distributions that result for each vowel due to noise during the articulation and perception of formants.</w:t>
-      </w:r>
-      <w:r>
-        <w:t xml:space="preserve"> </w:t>
-      </w:r>
-      <w:r>
         <w:t xml:space="preserve">Nearey and Assmann (2007)</w:t>
       </w:r>
       <w:r>
@@ -3974,15 +3830,7 @@
         <w:t xml:space="preserve">”</w:t>
       </w:r>
       <w:r>
-        <w:t xml:space="preserve">.</w:t>
-      </w:r>
-    </w:p>
-    <w:p>
-      <w:pPr>
-        <w:pStyle w:val="BodyText"/>
-      </w:pPr>
-      <w:r>
-        <w:t xml:space="preserve">The probabilistic templates could be represented, for instance, as exemplar clouds</w:t>
+        <w:t xml:space="preserve">. These templates could be represented, for instance, as exemplar clouds</w:t>
       </w:r>
       <w:r>
         <w:t xml:space="preserve"> </w:t>
@@ -3994,7 +3842,7 @@
         <w:t xml:space="preserve"> </w:t>
       </w:r>
       <w:r>
-        <w:t xml:space="preserve">or, in a more compact form, as parametric distributions</w:t>
+        <w:t xml:space="preserve">or as parametric distributions</w:t>
       </w:r>
       <w:r>
         <w:t xml:space="preserve"> </w:t>
@@ -4623,10 +4471,7 @@
         <w:t xml:space="preserve"> </w:t>
       </w:r>
       <w:r>
-        <w:t xml:space="preserve">(where</w:t>
-      </w:r>
-      <w:r>
-        <w:t xml:space="preserve"> </w:t>
+        <w:t xml:space="preserve">(</w:t>
       </w:r>
       <m:oMath>
         <m:r>
@@ -4986,7 +4831,7 @@
         <w:t xml:space="preserve">(Nearey and Assmann 2007; Luce and Pisoni 1998; Norris and McQueen 2008; Xie, Jaeger, and Kurumada 2023)</w:t>
       </w:r>
       <w:r>
-        <w:t xml:space="preserve">—conceptually paralleling the gradient activation of categories in connectionist, neural network, or exemplar theories of speech perception. Categorization. Listeners’ responses in an</w:t>
+        <w:t xml:space="preserve">—conceptually paralleling the gradient activation of categories in connectionist or exemplar models. Listeners’ responses in an</w:t>
       </w:r>
       <w:r>
         <w:t xml:space="preserve"> </w:t>
@@ -5003,7 +4848,7 @@
         <w:t xml:space="preserve"> </w:t>
       </w:r>
       <w:r>
-        <w:t xml:space="preserve">(criterion choice rule, as assumed in Nearey and Assmann 2007)</w:t>
+        <w:t xml:space="preserve">(as assumed in Nearey and Assmann 2007)</w:t>
       </w:r>
       <w:r>
         <w:t xml:space="preserve"> </w:t>
@@ -5126,7 +4971,7 @@
       </w:r>
     </w:p>
     <w:bookmarkEnd w:id="32"/>
-    <w:bookmarkStart w:id="58" w:name="sec-methods"/>
+    <w:bookmarkStart w:id="59" w:name="sec-methods"/>
     <w:p>
       <w:pPr>
         <w:pStyle w:val="Heading1"/>
@@ -5976,7 +5821,7 @@
         <w:t xml:space="preserve">. By comparing how well these methods fit listeners’ behavior, one can therefore test hypotheses about the type of implicit knowledge listeners have. Before we turn to the differences between the three methods, we describe their shared characteristics.</w:t>
       </w:r>
     </w:p>
-    <w:bookmarkStart w:id="38" w:name="sec-shared"/>
+    <w:bookmarkStart w:id="39" w:name="sec-shared"/>
     <w:p>
       <w:pPr>
         <w:pStyle w:val="Heading2"/>
@@ -6137,12 +5982,18 @@
       <w:r>
         <w:t xml:space="preserve">and vowel categories:</w:t>
       </w:r>
+      <w:r>
+        <w:rPr>
+          <w:rStyle w:val="FootnoteReference"/>
+        </w:rPr>
+        <w:footnoteReference w:id="34"/>
+      </w:r>
     </w:p>
     <w:p>
       <w:pPr>
         <w:pStyle w:val="BodyText"/>
       </w:pPr>
-      <w:bookmarkStart w:id="34" w:name="eq-posterior-psi"/>
+      <w:bookmarkStart w:id="35" w:name="eq-posterior-psi"/>
       <m:oMathPara>
         <m:oMathParaPr>
           <m:jc m:val="center"/>
@@ -6531,7 +6382,7 @@
           </m:d>
         </m:oMath>
       </m:oMathPara>
-      <w:bookmarkEnd w:id="34"/>
+      <w:bookmarkEnd w:id="35"/>
     </w:p>
     <w:p>
       <w:pPr>
@@ -6900,7 +6751,7 @@
       <w:pPr>
         <w:pStyle w:val="BodyText"/>
       </w:pPr>
-      <w:bookmarkStart w:id="35" w:name="eq-MAP-vowel-specific"/>
+      <w:bookmarkStart w:id="36" w:name="eq-MAP-vowel-specific"/>
       <m:oMathPara>
         <m:oMathParaPr>
           <m:jc m:val="center"/>
@@ -7575,7 +7426,7 @@
           </m:d>
         </m:oMath>
       </m:oMathPara>
-      <w:bookmarkEnd w:id="35"/>
+      <w:bookmarkEnd w:id="36"/>
     </w:p>
     <w:p>
       <w:pPr>
@@ -7689,7 +7540,7 @@
       <w:pPr>
         <w:pStyle w:val="BodyText"/>
       </w:pPr>
-      <w:bookmarkStart w:id="36" w:name="eq-posterior-vowel"/>
+      <w:bookmarkStart w:id="37" w:name="eq-posterior-vowel"/>
       <m:oMathPara>
         <m:oMathParaPr>
           <m:jc m:val="center"/>
@@ -8259,7 +8110,7 @@
           </m:d>
         </m:oMath>
       </m:oMathPara>
-      <w:bookmarkEnd w:id="36"/>
+      <w:bookmarkEnd w:id="37"/>
     </w:p>
     <w:p>
       <w:pPr>
@@ -8409,7 +8260,7 @@
       <w:pPr>
         <w:pStyle w:val="BodyText"/>
       </w:pPr>
-      <w:bookmarkStart w:id="37" w:name="eq-criterion-psi-and-vowel"/>
+      <w:bookmarkStart w:id="38" w:name="eq-criterion-psi-and-vowel"/>
       <m:oMathPara>
         <m:oMathParaPr>
           <m:jc m:val="center"/>
@@ -8642,10 +8493,10 @@
           </m:d>
         </m:oMath>
       </m:oMathPara>
-      <w:bookmarkEnd w:id="37"/>
+      <w:bookmarkEnd w:id="38"/>
     </w:p>
-    <w:bookmarkEnd w:id="38"/>
-    <w:bookmarkStart w:id="44" w:name="X9b746e23ddc6016eff82a2e0684fd2b0ab151a7"/>
+    <w:bookmarkEnd w:id="39"/>
+    <w:bookmarkStart w:id="45" w:name="X9b746e23ddc6016eff82a2e0684fd2b0ab151a7"/>
     <w:p>
       <w:pPr>
         <w:pStyle w:val="Heading2"/>
@@ -8772,7 +8623,7 @@
       <w:pPr>
         <w:pStyle w:val="BodyText"/>
       </w:pPr>
-      <w:bookmarkStart w:id="39" w:name="eq-method2"/>
+      <w:bookmarkStart w:id="40" w:name="eq-method2"/>
       <m:oMathPara>
         <m:oMathParaPr>
           <m:jc m:val="center"/>
@@ -9195,7 +9046,7 @@
           </m:d>
         </m:oMath>
       </m:oMathPara>
-      <w:bookmarkEnd w:id="39"/>
+      <w:bookmarkEnd w:id="40"/>
     </w:p>
     <w:p>
       <w:pPr>
@@ -9515,7 +9366,7 @@
       <w:tr>
         <w:tc>
           <w:tcPr/>
-          <w:bookmarkStart w:id="43" w:name="fig-slidingtemplate2"/>
+          <w:bookmarkStart w:id="44" w:name="fig-slidingtemplate2"/>
           <w:p>
             <w:pPr>
               <w:pStyle w:val="Compact"/>
@@ -9526,18 +9377,18 @@
                 <wp:inline>
                   <wp:extent cx="5334000" cy="1778000"/>
                   <wp:effectExtent b="0" l="0" r="0" t="0"/>
-                  <wp:docPr descr="" title="" id="41" name="Picture"/>
+                  <wp:docPr descr="" title="" id="42" name="Picture"/>
                   <a:graphic>
                     <a:graphicData uri="http://schemas.openxmlformats.org/drawingml/2006/picture">
                       <pic:pic>
                         <pic:nvPicPr>
-                          <pic:cNvPr descr="Re_introducing_the_PSTM_files/figure-docx/fig-slidingtemplate2-1.png" id="42" name="Picture"/>
+                          <pic:cNvPr descr="Re_introducing_the_PSTM_files/figure-docx/fig-slidingtemplate2-1.png" id="43" name="Picture"/>
                           <pic:cNvPicPr>
                             <a:picLocks noChangeArrowheads="1" noChangeAspect="1"/>
                           </pic:cNvPicPr>
                         </pic:nvPicPr>
                         <pic:blipFill>
-                          <a:blip r:embed="rId40"/>
+                          <a:blip r:embed="rId41"/>
                           <a:stretch>
                             <a:fillRect/>
                           </a:stretch>
@@ -9634,7 +9485,7 @@
               <w:t xml:space="preserve"> </w:t>
             </w:r>
             <w:r>
-              <w:t xml:space="preserve">along lines parallel to</w:t>
+              <w:t xml:space="preserve">along</w:t>
             </w:r>
             <w:r>
               <w:t xml:space="preserve"> </w:t>
@@ -9660,7 +9511,10 @@
               </m:r>
             </m:oMath>
             <w:r>
-              <w:t xml:space="preserve">, indicated on the figure. (b) Alternatively, the vowel can be thought of</w:t>
+              <w:t xml:space="preserve"> </w:t>
+            </w:r>
+            <w:r>
+              <w:t xml:space="preserve">(black line). (b) Alternatively, the vowel can be thought of</w:t>
             </w:r>
             <w:r>
               <w:t xml:space="preserve"> </w:t>
@@ -9678,7 +9532,7 @@
               <w:t xml:space="preserve"> </w:t>
             </w:r>
             <w:r>
-              <w:t xml:space="preserve">across the normalized template. The line indicates the possible interpretations of the point in (a), ellipses enclose one standard deviation. Points indicate the best possible locations for /ɑ/ (1), /c/ (2), /o/ (3), and /ʌ/ (4), according to method 2. These interpretations correspond to the different vowel spaces in (a). (c) Posterior distributions of</w:t>
+              <w:t xml:space="preserve">across the normalized template. Black line indicates the possible interpretations of the point in (a), ellipses enclose one standard deviation. Points indicate the best possible locations for /ɑ/ (1), /c/ (2), /o/ (3), and /ʌ/ (4), according to method 2. These interpretations correspond to the different vowel spaces (colors) in (a). (c) Posterior distributions of</w:t>
             </w:r>
             <w:r>
               <w:t xml:space="preserve"> </w:t>
@@ -9701,7 +9555,7 @@
               <w:t xml:space="preserve"> </w:t>
             </w:r>
             <w:r>
-              <w:t xml:space="preserve">given different vowel categories. Because the prior in method 2 exerts no influence, these posteriors are proportional to the likelihood:</w:t>
+              <w:t xml:space="preserve">given different vowel categories. Because the prior exerts no influence in method 2 , these posteriors are proportional to the likelihood:</w:t>
             </w:r>
             <w:r>
               <w:t xml:space="preserve"> </w:t>
@@ -9788,7 +9642,7 @@
               </m:d>
             </m:oMath>
             <w:r>
-              <w:t xml:space="preserve">. Thus, these curves represent the values of the densities of the distributions in (b) along the line. These likelihoods highlight the relationship between categorization and</w:t>
+              <w:t xml:space="preserve">. Thus, these curves represent the values of the densities of the distributions in (b) along the line. This highlighta the relationship between categorization and</w:t>
             </w:r>
             <w:r>
               <w:t xml:space="preserve"> </w:t>
@@ -9814,12 +9668,12 @@
               <w:t xml:space="preserve">estimation.</w:t>
             </w:r>
           </w:p>
-          <w:bookmarkEnd w:id="43"/>
+          <w:bookmarkEnd w:id="44"/>
         </w:tc>
       </w:tr>
     </w:tbl>
-    <w:bookmarkEnd w:id="44"/>
-    <w:bookmarkStart w:id="51" w:name="Xdc2157e4d5b9d71dc91035c1cde956ca07baea9"/>
+    <w:bookmarkEnd w:id="45"/>
+    <w:bookmarkStart w:id="52" w:name="Xdc2157e4d5b9d71dc91035c1cde956ca07baea9"/>
     <w:p>
       <w:pPr>
         <w:pStyle w:val="Heading2"/>
@@ -10044,7 +9898,7 @@
       <w:pPr>
         <w:pStyle w:val="BodyText"/>
       </w:pPr>
-      <w:bookmarkStart w:id="45" w:name="eq-method3"/>
+      <w:bookmarkStart w:id="46" w:name="eq-method3"/>
       <m:oMathPara>
         <m:oMathParaPr>
           <m:jc m:val="center"/>
@@ -10535,7 +10389,7 @@
           </m:d>
         </m:oMath>
       </m:oMathPara>
-      <w:bookmarkEnd w:id="45"/>
+      <w:bookmarkEnd w:id="46"/>
     </w:p>
     <w:p>
       <w:pPr>
@@ -10729,7 +10583,7 @@
         <w:rPr>
           <w:rStyle w:val="FootnoteReference"/>
         </w:rPr>
-        <w:footnoteReference w:id="46"/>
+        <w:footnoteReference w:id="47"/>
       </w:r>
       <w:r>
         <w:t xml:space="preserve"> </w:t>
@@ -10889,7 +10743,7 @@
       <w:tr>
         <w:tc>
           <w:tcPr/>
-          <w:bookmarkStart w:id="50" w:name="fig-slidingtemplate3"/>
+          <w:bookmarkStart w:id="51" w:name="fig-slidingtemplate3"/>
           <w:p>
             <w:pPr>
               <w:pStyle w:val="Compact"/>
@@ -10900,18 +10754,18 @@
                 <wp:inline>
                   <wp:extent cx="5334000" cy="2667000"/>
                   <wp:effectExtent b="0" l="0" r="0" t="0"/>
-                  <wp:docPr descr="" title="" id="48" name="Picture"/>
+                  <wp:docPr descr="" title="" id="49" name="Picture"/>
                   <a:graphic>
                     <a:graphicData uri="http://schemas.openxmlformats.org/drawingml/2006/picture">
                       <pic:pic>
                         <pic:nvPicPr>
-                          <pic:cNvPr descr="Re_introducing_the_PSTM_files/figure-docx/fig-slidingtemplate3-1.png" id="49" name="Picture"/>
+                          <pic:cNvPr descr="Re_introducing_the_PSTM_files/figure-docx/fig-slidingtemplate3-1.png" id="50" name="Picture"/>
                           <pic:cNvPicPr>
                             <a:picLocks noChangeArrowheads="1" noChangeAspect="1"/>
                           </pic:cNvPicPr>
                         </pic:nvPicPr>
                         <pic:blipFill>
-                          <a:blip r:embed="rId47"/>
+                          <a:blip r:embed="rId48"/>
                           <a:stretch>
                             <a:fillRect/>
                           </a:stretch>
@@ -11048,7 +10902,7 @@
               <w:t xml:space="preserve"> </w:t>
             </w:r>
             <w:r>
-              <w:t xml:space="preserve">conditional on vowel category resulting from combining the likelihood and prior in each column. The most probable</w:t>
+              <w:t xml:space="preserve">conditional on vowel category (combining likelihood and prior in each column). The most probable</w:t>
             </w:r>
             <w:r>
               <w:t xml:space="preserve"> </w:t>
@@ -11078,7 +10932,7 @@
               <w:t xml:space="preserve"> </w:t>
             </w:r>
             <w:r>
-              <w:t xml:space="preserve">(location along x-axis of highest peak), and vowel category (color of curve with highest peak), changes as a function of the selected prior, and the vowel’s</w:t>
+              <w:t xml:space="preserve">(location on x-axis of highest peak), and vowel category (color of curve with highest peak), changes as a function of the selected prior, and the vowel token’s</w:t>
             </w:r>
             <w:r>
               <w:t xml:space="preserve"> </w:t>
@@ -11095,12 +10949,12 @@
               <w:t xml:space="preserve">.</w:t>
             </w:r>
           </w:p>
-          <w:bookmarkEnd w:id="50"/>
+          <w:bookmarkEnd w:id="51"/>
         </w:tc>
       </w:tr>
     </w:tbl>
-    <w:bookmarkEnd w:id="51"/>
-    <w:bookmarkStart w:id="55" w:name="X4fd97fcded3d44de1b0f0e26c486906b034e458"/>
+    <w:bookmarkEnd w:id="52"/>
+    <w:bookmarkStart w:id="56" w:name="X4fd97fcded3d44de1b0f0e26c486906b034e458"/>
     <w:p>
       <w:pPr>
         <w:pStyle w:val="Heading2"/>
@@ -11309,7 +11163,7 @@
       <w:pPr>
         <w:pStyle w:val="BodyText"/>
       </w:pPr>
-      <w:bookmarkStart w:id="52" w:name="eq-method6"/>
+      <w:bookmarkStart w:id="53" w:name="eq-method6"/>
       <m:oMathPara>
         <m:oMathParaPr>
           <m:jc m:val="center"/>
@@ -11572,7 +11426,7 @@
           </m:d>
         </m:oMath>
       </m:oMathPara>
-      <w:bookmarkEnd w:id="52"/>
+      <w:bookmarkEnd w:id="53"/>
     </w:p>
     <w:p>
       <w:pPr>
@@ -11793,7 +11647,7 @@
         <w:rPr>
           <w:rStyle w:val="FootnoteReference"/>
         </w:rPr>
-        <w:footnoteReference w:id="53"/>
+        <w:footnoteReference w:id="54"/>
       </w:r>
       <w:r>
         <w:t xml:space="preserve"> </w:t>
@@ -11975,7 +11829,7 @@
       <w:pPr>
         <w:pStyle w:val="BodyText"/>
       </w:pPr>
-      <w:bookmarkStart w:id="54" w:name="eq-posterior-g0"/>
+      <w:bookmarkStart w:id="55" w:name="eq-posterior-g0"/>
       <m:oMathPara>
         <m:oMathParaPr>
           <m:jc m:val="center"/>
@@ -12227,7 +12081,7 @@
           </m:d>
         </m:oMath>
       </m:oMathPara>
-      <w:bookmarkEnd w:id="54"/>
+      <w:bookmarkEnd w:id="55"/>
     </w:p>
     <w:p>
       <w:pPr>
@@ -12440,8 +12294,8 @@
         <w:t xml:space="preserve">and the posterior probabilities of different vowel categories.</w:t>
       </w:r>
     </w:p>
-    <w:bookmarkEnd w:id="55"/>
-    <w:bookmarkStart w:id="57" w:name="sec-implementation"/>
+    <w:bookmarkEnd w:id="56"/>
+    <w:bookmarkStart w:id="58" w:name="sec-implementation"/>
     <w:p>
       <w:pPr>
         <w:pStyle w:val="Heading2"/>
@@ -12461,7 +12315,7 @@
         <w:t xml:space="preserve"> </w:t>
       </w:r>
       <w:r>
-        <w:t xml:space="preserve">note that, for the models they provide,</w:t>
+        <w:t xml:space="preserve">note that</w:t>
       </w:r>
       <w:r>
         <w:t xml:space="preserve"> </w:t>
@@ -12470,7 +12324,7 @@
         <w:t xml:space="preserve">“</w:t>
       </w:r>
       <w:r>
-        <w:t xml:space="preserve">analytic solutions to the optimizations are available and no search is necessary</w:t>
+        <w:t xml:space="preserve">analytic solutions to the optimizations [for the different methods] are available and no search is necessary</w:t>
       </w:r>
       <w:r>
         <w:t xml:space="preserve">”</w:t>
@@ -12479,30 +12333,21 @@
         <w:t xml:space="preserve"> </w:t>
       </w:r>
       <w:r>
-        <w:t xml:space="preserve">(p. 252). However, they did not provide details regarding these analytic solutions. Here, we provide the general approach to finding analytic solutions to the maximization of the posterior density of</w:t>
-      </w:r>
-      <w:r>
-        <w:t xml:space="preserve"> </w:t>
-      </w:r>
-      <m:oMath>
-        <m:sSub>
-          <m:e>
-            <m:r>
-              <m:t>ψ</m:t>
-            </m:r>
-          </m:e>
-          <m:sub>
-            <m:r>
-              <m:t>s</m:t>
-            </m:r>
-          </m:sub>
-        </m:sSub>
-      </m:oMath>
-      <w:r>
-        <w:t xml:space="preserve"> </w:t>
-      </w:r>
-      <w:r>
-        <w:t xml:space="preserve">for each vowel category. We focus on the derivation for method 6, as methods 3 and 2 comprise a subset of the necessary calculations. To find the MAP estimates</w:t>
+        <w:t xml:space="preserve">(p. 252). However, they did not provide those analytic solutions. In</w:t>
+      </w:r>
+      <w:r>
+        <w:t xml:space="preserve"> </w:t>
+      </w:r>
+      <w:hyperlink w:anchor="eq-method6-solve">
+        <w:r>
+          <w:rPr>
+            <w:rStyle w:val="Hyperlink"/>
+          </w:rPr>
+          <w:t xml:space="preserve">Equation 15</w:t>
+        </w:r>
+      </w:hyperlink>
+      <w:r>
+        <w:t xml:space="preserve">, we state the analytic solutions for method 6, which contains all calculations required for methods 2 and 3. To find the MAP estimates</w:t>
       </w:r>
       <w:r>
         <w:t xml:space="preserve"> </w:t>
@@ -12562,14 +12407,14 @@
         <w:t xml:space="preserve"> </w:t>
       </w:r>
       <w:r>
-        <w:t xml:space="preserve">for each vowel and find the maximum. The complete derivation is provided in the supplemental materials.</w:t>
+        <w:t xml:space="preserve">for each vowel and find the maximum. The complete derivation is provided in the SI.</w:t>
       </w:r>
     </w:p>
     <w:p>
       <w:pPr>
         <w:pStyle w:val="BodyText"/>
       </w:pPr>
-      <w:bookmarkStart w:id="56" w:name="eq-method6-solve"/>
+      <w:bookmarkStart w:id="57" w:name="eq-method6-solve"/>
       <m:oMathPara>
         <m:oMathParaPr>
           <m:jc m:val="center"/>
@@ -13096,11 +12941,11 @@
           </m:d>
         </m:oMath>
       </m:oMathPara>
-      <w:bookmarkEnd w:id="56"/>
+      <w:bookmarkEnd w:id="57"/>
     </w:p>
-    <w:bookmarkEnd w:id="57"/>
     <w:bookmarkEnd w:id="58"/>
-    <w:bookmarkStart w:id="67" w:name="sec-bootstrap"/>
+    <w:bookmarkEnd w:id="59"/>
+    <w:bookmarkStart w:id="68" w:name="sec-bootstrap"/>
     <w:p>
       <w:pPr>
         <w:pStyle w:val="Heading1"/>
@@ -13123,7 +12968,7 @@
         <w:t xml:space="preserve">(Hillenbrand et al. 1995)</w:t>
       </w:r>
       <w:r>
-        <w:t xml:space="preserve">. A step-by-step walk-through of the analysis is available as an R Markdown vignette in the OSF repo for this article. As demonstrated in that vignette, the</w:t>
+        <w:t xml:space="preserve">. A walk-through of the analysis is available as an R markdown vignette in the OSF repo listed above. The</w:t>
       </w:r>
       <w:r>
         <w:t xml:space="preserve"> </w:t>
@@ -13138,7 +12983,7 @@
         <w:t xml:space="preserve"> </w:t>
       </w:r>
       <w:r>
-        <w:t xml:space="preserve">package allows researchers to conduct the type of analysis we present here on their own data, with just a handful of R commands.</w:t>
+        <w:t xml:space="preserve">package allows researchers to conduct the similar analyses on their own data, with just a handful of R commands.</w:t>
       </w:r>
     </w:p>
     <w:p>
@@ -13158,7 +13003,7 @@
         <w:t xml:space="preserve"> </w:t>
       </w:r>
       <w:r>
-        <w:t xml:space="preserve">data include acoustic measures from 139 speakers producing one instance of twelve vowels each, including formant measures at multiple time slices. We used formant measurements at 20% and 80% of the vowel duration. This meant each vowel token was represented by a vector of length six, two measurements for each of three formants. We used two time points to parallel the analyses presented in</w:t>
+        <w:t xml:space="preserve">data include acoustic measures from 139 speakers producing one instance of twelve vowels each, including formant measures at multiple time slices. We used formant measurements at 20% and 80% of the vowel duration. This meant each vowel token was represented by a vector of length six, two measurements for each of three formants. Following</w:t>
       </w:r>
       <w:r>
         <w:t xml:space="preserve"> </w:t>
@@ -13167,7 +13012,7 @@
         <w:t xml:space="preserve">Nearey and Assmann (2007)</w:t>
       </w:r>
       <w:r>
-        <w:t xml:space="preserve">, and because formant dynamics are known to affect vowel perception for the dialect recorded in the database</w:t>
+        <w:t xml:space="preserve">, we used two time points, capturing that formant dynamics affect vowel perception for the dialect in the database</w:t>
       </w:r>
       <w:r>
         <w:t xml:space="preserve"> </w:t>
@@ -13205,7 +13050,7 @@
         <w:rPr>
           <w:rStyle w:val="FootnoteReference"/>
         </w:rPr>
-        <w:footnoteReference w:id="59"/>
+        <w:footnoteReference w:id="60"/>
       </w:r>
       <w:r>
         <w:t xml:space="preserve"> </w:t>
@@ -13245,10 +13090,10 @@
         </w:r>
       </w:hyperlink>
       <w:r>
-        <w:t xml:space="preserve">) would yield utterly unreliable results for listeners (as we confirm below).</w:t>
+        <w:t xml:space="preserve">) is expected to yield unreliable results for listeners (confirmed below).</w:t>
       </w:r>
     </w:p>
-    <w:bookmarkStart w:id="61" w:name="approach"/>
+    <w:bookmarkStart w:id="62" w:name="approach"/>
     <w:p>
       <w:pPr>
         <w:pStyle w:val="Heading2"/>
@@ -13899,7 +13744,7 @@
         </w:numPr>
       </w:pPr>
       <w:r>
-        <w:t xml:space="preserve">Normalize the training data using log-mean uniform scaling normalization (the</w:t>
+        <w:t xml:space="preserve">Uniformly scale the training data (the</w:t>
       </w:r>
       <w:r>
         <w:t xml:space="preserve"> </w:t>
@@ -13914,7 +13759,7 @@
         <w:t xml:space="preserve"> </w:t>
       </w:r>
       <w:r>
-        <w:t xml:space="preserve">function). This means estimating</w:t>
+        <w:t xml:space="preserve">function), by estimating each speaker’s</w:t>
       </w:r>
       <w:r>
         <w:t xml:space="preserve"> </w:t>
@@ -13937,7 +13782,7 @@
         <w:t xml:space="preserve"> </w:t>
       </w:r>
       <w:r>
-        <w:t xml:space="preserve">for each speaker using their complete vowel system as in</w:t>
+        <w:t xml:space="preserve">using their complete vowel system as in</w:t>
       </w:r>
       <w:r>
         <w:t xml:space="preserve"> </w:t>
@@ -13951,7 +13796,7 @@
         </w:r>
       </w:hyperlink>
       <w:r>
-        <w:t xml:space="preserve">, and normalizing as in</w:t>
+        <w:t xml:space="preserve">, and normalizing it as in</w:t>
       </w:r>
       <w:r>
         <w:t xml:space="preserve"> </w:t>
@@ -13988,25 +13833,16 @@
         <w:t xml:space="preserve">create_template</w:t>
       </w:r>
       <w:r>
-        <w:t xml:space="preserve">). We follow</w:t>
-      </w:r>
-      <w:r>
-        <w:t xml:space="preserve"> </w:t>
-      </w:r>
-      <w:r>
-        <w:t xml:space="preserve">Nearey and Assmann (2007)</w:t>
-      </w:r>
-      <w:r>
-        <w:t xml:space="preserve"> </w:t>
-      </w:r>
-      <w:r>
-        <w:t xml:space="preserve">in estimating a single pooled covariance matrix across all vowel categories.</w:t>
+        <w:t xml:space="preserve">).</w:t>
+      </w:r>
+      <w:r>
+        <w:t xml:space="preserve"> </w:t>
       </w:r>
       <w:r>
         <w:rPr>
           <w:rStyle w:val="FootnoteReference"/>
         </w:rPr>
-        <w:footnoteReference w:id="60"/>
+        <w:footnoteReference w:id="61"/>
       </w:r>
       <w:r>
         <w:t xml:space="preserve"> </w:t>
@@ -14016,7 +13852,7 @@
           <w:b/>
           <w:bCs/>
         </w:rPr>
-        <w:t xml:space="preserve">Each iteration of the bootstrap thus simulates a</w:t>
+        <w:t xml:space="preserve">Each iteration of the bootstrap simulates a</w:t>
       </w:r>
       <w:r>
         <w:rPr>
@@ -14204,7 +14040,7 @@
         <w:pStyle w:val="FirstParagraph"/>
       </w:pPr>
       <w:r>
-        <w:t xml:space="preserve">We compare 11 different methods that differ in terms of how they estimate</w:t>
+        <w:t xml:space="preserve">We compare 11 different methods that differ in terms of whether and/or how they estimate</w:t>
       </w:r>
       <w:r>
         <w:t xml:space="preserve"> </w:t>
@@ -14224,30 +14060,7 @@
         </m:sSub>
       </m:oMath>
       <w:r>
-        <w:t xml:space="preserve">, and whether they estimate</w:t>
-      </w:r>
-      <w:r>
-        <w:t xml:space="preserve"> </w:t>
-      </w:r>
-      <m:oMath>
-        <m:sSub>
-          <m:e>
-            <m:r>
-              <m:t>ψ</m:t>
-            </m:r>
-          </m:e>
-          <m:sub>
-            <m:r>
-              <m:t>s</m:t>
-            </m:r>
-          </m:sub>
-        </m:sSub>
-      </m:oMath>
-      <w:r>
-        <w:t xml:space="preserve"> </w:t>
-      </w:r>
-      <w:r>
-        <w:t xml:space="preserve">at all:</w:t>
+        <w:t xml:space="preserve">:</w:t>
       </w:r>
     </w:p>
     <w:p>
@@ -14659,8 +14472,8 @@
         <w:t xml:space="preserve"> </w:t>
       </w:r>
     </w:p>
-    <w:bookmarkEnd w:id="61"/>
-    <w:bookmarkStart w:id="66" w:name="results"/>
+    <w:bookmarkEnd w:id="62"/>
+    <w:bookmarkStart w:id="67" w:name="results"/>
     <w:p>
       <w:pPr>
         <w:pStyle w:val="Heading2"/>
@@ -14796,7 +14609,7 @@
       <w:tr>
         <w:tc>
           <w:tcPr/>
-          <w:bookmarkStart w:id="65" w:name="fig-bootboxplot"/>
+          <w:bookmarkStart w:id="66" w:name="fig-bootboxplot"/>
           <w:p>
             <w:pPr>
               <w:pStyle w:val="Compact"/>
@@ -14807,18 +14620,18 @@
                 <wp:inline>
                   <wp:extent cx="5334000" cy="2667000"/>
                   <wp:effectExtent b="0" l="0" r="0" t="0"/>
-                  <wp:docPr descr="" title="" id="63" name="Picture"/>
+                  <wp:docPr descr="" title="" id="64" name="Picture"/>
                   <a:graphic>
                     <a:graphicData uri="http://schemas.openxmlformats.org/drawingml/2006/picture">
                       <pic:pic>
                         <pic:nvPicPr>
-                          <pic:cNvPr descr="Re_introducing_the_PSTM_files/figure-docx/fig-bootboxplot-1.png" id="64" name="Picture"/>
+                          <pic:cNvPr descr="Re_introducing_the_PSTM_files/figure-docx/fig-bootboxplot-1.png" id="65" name="Picture"/>
                           <pic:cNvPicPr>
                             <a:picLocks noChangeArrowheads="1" noChangeAspect="1"/>
                           </pic:cNvPicPr>
                         </pic:nvPicPr>
                         <pic:blipFill>
-                          <a:blip r:embed="rId62"/>
+                          <a:blip r:embed="rId63"/>
                           <a:stretch>
                             <a:fillRect/>
                           </a:stretch>
@@ -14898,47 +14711,10 @@
               </m:sSub>
             </m:oMath>
             <w:r>
-              <w:t xml:space="preserve">. This leaves open which approach best predicts</w:t>
-            </w:r>
-            <w:r>
               <w:t xml:space="preserve"> </w:t>
             </w:r>
             <w:r>
-              <w:rPr>
-                <w:i/>
-                <w:iCs/>
-              </w:rPr>
-              <w:t xml:space="preserve">listeners’</w:t>
-            </w:r>
-            <w:r>
-              <w:t xml:space="preserve"> </w:t>
-            </w:r>
-            <m:oMath>
-              <m:sSub>
-                <m:e>
-                  <m:acc>
-                    <m:accPr>
-                      <m:chr m:val="̂"/>
-                    </m:accPr>
-                    <m:e>
-                      <m:r>
-                        <m:t>ψ</m:t>
-                      </m:r>
-                    </m:e>
-                  </m:acc>
-                </m:e>
-                <m:sub>
-                  <m:r>
-                    <m:t>s</m:t>
-                  </m:r>
-                </m:sub>
-              </m:sSub>
-            </m:oMath>
-            <w:r>
-              <w:t xml:space="preserve"> </w:t>
-            </w:r>
-            <w:r>
-              <w:t xml:space="preserve">(to which we have no access here). Methods without normalization (Hz and log-Hz) are not shown since they do not provide estimates of</w:t>
+              <w:t xml:space="preserve">(only methods that provide estimates of</w:t>
             </w:r>
             <w:r>
               <w:t xml:space="preserve"> </w:t>
@@ -14958,10 +14734,13 @@
               </m:sSub>
             </m:oMath>
             <w:r>
-              <w:t xml:space="preserve">.</w:t>
+              <w:t xml:space="preserve"> </w:t>
+            </w:r>
+            <w:r>
+              <w:t xml:space="preserve">are shown).</w:t>
             </w:r>
           </w:p>
-          <w:bookmarkEnd w:id="65"/>
+          <w:bookmarkEnd w:id="66"/>
         </w:tc>
       </w:tr>
     </w:tbl>
@@ -15243,7 +15022,7 @@
         <w:t xml:space="preserve">’</w:t>
       </w:r>
       <w:r>
-        <w:t xml:space="preserve">, naturally tying together speech perception and the perception of speaker size. Here, we do not have access to listeners’ estimates of</w:t>
+        <w:t xml:space="preserve">, naturally tying together speech perception and the perception of speaker size. Since we do not known listeners’ estimates of</w:t>
       </w:r>
       <w:r>
         <w:t xml:space="preserve"> </w:t>
@@ -15263,7 +15042,7 @@
         </m:sSub>
       </m:oMath>
       <w:r>
-        <w:t xml:space="preserve">, and thus cannot directly compare the different methods against that ground truth. We can, however, compare how accurately the incremental PSTM methods estimate the</w:t>
+        <w:t xml:space="preserve">, we cannot directly compare the different methods against that ground truth. We can, however, compare how accurately the incremental PSTM methods estimate the</w:t>
       </w:r>
       <w:r>
         <w:t xml:space="preserve"> </w:t>
@@ -15309,7 +15088,7 @@
         <w:t xml:space="preserve"> </w:t>
       </w:r>
       <w:r>
-        <w:t xml:space="preserve">over the entire data from the talker (i.e., our best estimate of that</w:t>
+        <w:t xml:space="preserve">over the entire data from the talker (our best estimate of</w:t>
       </w:r>
       <w:r>
         <w:t xml:space="preserve"> </w:t>
@@ -15329,7 +15108,7 @@
         </m:sSub>
       </m:oMath>
       <w:r>
-        <w:t xml:space="preserve">). As shown in</w:t>
+        <w:t xml:space="preserve">).</w:t>
       </w:r>
       <w:r>
         <w:t xml:space="preserve"> </w:t>
@@ -15346,42 +15125,12 @@
         <w:t xml:space="preserve"> </w:t>
       </w:r>
       <w:r>
-        <w:t xml:space="preserve">(c), method 6 again performed best, and achieved the lowest RMS errors in</w:t>
-      </w:r>
-      <w:r>
-        <w:t xml:space="preserve"> </w:t>
-      </w:r>
-      <m:oMath>
-        <m:sSub>
-          <m:e>
-            <m:acc>
-              <m:accPr>
-                <m:chr m:val="̂"/>
-              </m:accPr>
-              <m:e>
-                <m:r>
-                  <m:t>ψ</m:t>
-                </m:r>
-              </m:e>
-            </m:acc>
-          </m:e>
-          <m:sub>
-            <m:r>
-              <m:t>s</m:t>
-            </m:r>
-          </m:sub>
-        </m:sSub>
-      </m:oMath>
-      <w:r>
-        <w:t xml:space="preserve"> </w:t>
-      </w:r>
-      <w:r>
-        <w:t xml:space="preserve">estimation compared to methods 2 and 3.</w:t>
+        <w:t xml:space="preserve">(c) shows that method 6 again performed best (lowest RMS errors).</w:t>
       </w:r>
     </w:p>
-    <w:bookmarkEnd w:id="66"/>
     <w:bookmarkEnd w:id="67"/>
-    <w:bookmarkStart w:id="68" w:name="conclusions-and-future-directions"/>
+    <w:bookmarkEnd w:id="68"/>
+    <w:bookmarkStart w:id="69" w:name="conclusions-and-future-directions"/>
     <w:p>
       <w:pPr>
         <w:pStyle w:val="Heading1"/>
@@ -15404,7 +15153,15 @@
         <w:t xml:space="preserve">(Barreda 2021; Persson, Barreda, and Jaeger 2025; Richter et al. 2017)</w:t>
       </w:r>
       <w:r>
-        <w:t xml:space="preserve">. Here, we show that the predictive power of the PSTM improves further, and in non-subtle ways, once the</w:t>
+        <w:t xml:space="preserve">.</w:t>
+      </w:r>
+    </w:p>
+    <w:p>
+      <w:pPr>
+        <w:pStyle w:val="BodyText"/>
+      </w:pPr>
+      <w:r>
+        <w:t xml:space="preserve">Here, we show that the predictive power of the PSTM improves further, and in non-subtle ways, once the</w:t>
       </w:r>
       <w:r>
         <w:t xml:space="preserve"> </w:t>
@@ -15420,7 +15177,36 @@
         <w:t xml:space="preserve"> </w:t>
       </w:r>
       <w:r>
-        <w:t xml:space="preserve">inferences listeners need to make are adequately modeled.</w:t>
+        <w:t xml:space="preserve">inferences listeners need to make are adequately modeled. Our bootstrap simulations confirm that method 6—which assumes that listeners consider both intrinsic and extrinsic information in guiding their prior expectations about</w:t>
+      </w:r>
+      <w:r>
+        <w:t xml:space="preserve"> </w:t>
+      </w:r>
+      <m:oMath>
+        <m:sSub>
+          <m:e>
+            <m:r>
+              <m:t>ψ</m:t>
+            </m:r>
+          </m:e>
+          <m:sub>
+            <m:r>
+              <m:t>s</m:t>
+            </m:r>
+          </m:sub>
+        </m:sSub>
+      </m:oMath>
+      <w:r>
+        <w:t xml:space="preserve">—best explains listeners’ behavior in the data from</w:t>
+      </w:r>
+      <w:r>
+        <w:t xml:space="preserve"> </w:t>
+      </w:r>
+      <w:r>
+        <w:t xml:space="preserve">Hillenbrand et al. (1995)</w:t>
+      </w:r>
+      <w:r>
+        <w:t xml:space="preserve">.</w:t>
       </w:r>
     </w:p>
     <w:p>
@@ -15428,2166 +15214,30 @@
         <w:pStyle w:val="BodyText"/>
       </w:pPr>
       <w:r>
-        <w:t xml:space="preserve">Our bootstrap simulations confirm that method 6—which assumes that listeners consider both intrinsic and extrinsic information in guiding their prior expectations about</w:t>
-      </w:r>
-      <w:r>
-        <w:t xml:space="preserve"> </w:t>
-      </w:r>
-      <m:oMath>
-        <m:sSub>
-          <m:e>
-            <m:r>
-              <m:t>ψ</m:t>
-            </m:r>
-          </m:e>
-          <m:sub>
-            <m:r>
-              <m:t>s</m:t>
-            </m:r>
-          </m:sub>
-        </m:sSub>
-      </m:oMath>
-      <w:r>
-        <w:t xml:space="preserve">—best explains listeners’ behavior in the data from</w:t>
-      </w:r>
-      <w:r>
-        <w:t xml:space="preserve"> </w:t>
-      </w:r>
-      <w:r>
-        <w:t xml:space="preserve">Hillenbrand et al. (1995)</w:t>
-      </w:r>
-      <w:r>
-        <w:t xml:space="preserve">. In the appendix, we present a more fully Bayesian extension of the PSTM, the BSTM. This model performs similarly to the original PSTM—both in terms of the ability to capture listeners’ perception of vowels, and in terms of estimating the uniform scaling parameter</w:t>
-      </w:r>
-      <w:r>
-        <w:t xml:space="preserve"> </w:t>
-      </w:r>
-      <m:oMath>
-        <m:sSub>
-          <m:e>
-            <m:r>
-              <m:t>ψ</m:t>
-            </m:r>
-          </m:e>
-          <m:sub>
-            <m:r>
-              <m:t>s</m:t>
-            </m:r>
-          </m:sub>
-        </m:sSub>
-      </m:oMath>
-      <w:r>
-        <w:t xml:space="preserve">. However, the BSTM has the advantage of providing the full posterior distribution over</w:t>
-      </w:r>
-      <w:r>
-        <w:t xml:space="preserve"> </w:t>
-      </w:r>
-      <m:oMath>
-        <m:sSub>
-          <m:e>
-            <m:r>
-              <m:t>ψ</m:t>
-            </m:r>
-          </m:e>
-          <m:sub>
-            <m:r>
-              <m:t>s</m:t>
-            </m:r>
-          </m:sub>
-        </m:sSub>
-      </m:oMath>
-      <w:r>
-        <w:t xml:space="preserve"> </w:t>
-      </w:r>
-      <w:r>
-        <w:t xml:space="preserve">and the vowel category, allowing ideal information integration across multiple observations from the same talker. This is a critical feature for a model of speech perception as it will allow for the investigation of process of adaptation to speakers across increasing amounts of information.</w:t>
+        <w:t xml:space="preserve">The general framework for incremental normalization presented here can be extended to a wide range of other normalization methods. This will allow comparisons between different approaches to incremental formant normalization and beyond. In particular, future work can investigate how incremental normalization can be integrated into modern ASR architectures, to improve the suitability of these architectures as a model of human speech perception. This will also researchers to move beyond normalization of formant point estimates (e.g., F1-F3 at the start and end of the vowel), addressing longstanding concerns that human listeners use a much broader sets of acoustic features when identifying vowels</w:t>
+      </w:r>
+      <w:r>
+        <w:t xml:space="preserve"> </w:t>
+      </w:r>
+      <w:r>
+        <w:t xml:space="preserve">Barreda and Nearey (2012)</w:t>
+      </w:r>
+      <w:r>
+        <w:t xml:space="preserve">.</w:t>
       </w:r>
     </w:p>
-    <w:p>
-      <w:pPr>
-        <w:pStyle w:val="BodyText"/>
-      </w:pPr>
-      <w:r>
-        <w:t xml:space="preserve">The general framework for incremental normalization presented here can be extended to a wide range of other normalization methods. This will allow comparisons between different approaches to incremental formant normalization and beyond. In particular, future work can investigate how incremental normalization can be integrated into modern ASR architectures, to improve the suitability of these architectures as a model of human speech perception. This will also researchers to move beyond normalization of formant point estimates (e.g., F1-F3 at the start and end of the vowel), addressing longstanding concerns that human listeners use a much broader sets of acoustic features when identifying vowels</w:t>
-      </w:r>
-      <w:r>
-        <w:t xml:space="preserve"> </w:t>
-      </w:r>
-      <w:r>
-        <w:t xml:space="preserve">Barreda and Nearey (2012)</w:t>
-      </w:r>
-      <w:r>
-        <w:t xml:space="preserve">.</w:t>
-      </w:r>
-    </w:p>
-    <w:bookmarkEnd w:id="68"/>
-    <w:bookmarkStart w:id="74" w:name="appendix"/>
+    <w:bookmarkEnd w:id="69"/>
+    <w:bookmarkStart w:id="107" w:name="references"/>
     <w:p>
       <w:pPr>
         <w:pStyle w:val="Heading1"/>
       </w:pPr>
       <w:r>
-        <w:t xml:space="preserve">7. Appendix</w:t>
+        <w:t xml:space="preserve">7. References</w:t>
       </w:r>
     </w:p>
-    <w:bookmarkStart w:id="73" w:name="the-bayesian-sliding-template-model"/>
-    <w:p>
-      <w:pPr>
-        <w:pStyle w:val="Heading2"/>
-      </w:pPr>
-      <w:r>
-        <w:t xml:space="preserve">7.1 The Bayesian Sliding Template Model</w:t>
-      </w:r>
-    </w:p>
-    <w:p>
-      <w:pPr>
-        <w:pStyle w:val="FirstParagraph"/>
-      </w:pPr>
-      <w:r>
-        <w:t xml:space="preserve">The PSTM calculates MAP values of</w:t>
-      </w:r>
-      <w:r>
-        <w:t xml:space="preserve"> </w:t>
-      </w:r>
-      <m:oMath>
-        <m:sSub>
-          <m:e>
-            <m:acc>
-              <m:accPr>
-                <m:chr m:val="̂"/>
-              </m:accPr>
-              <m:e>
-                <m:r>
-                  <m:t>ψ</m:t>
-                </m:r>
-              </m:e>
-            </m:acc>
-          </m:e>
-          <m:sub>
-            <m:r>
-              <m:t>s</m:t>
-            </m:r>
-          </m:sub>
-        </m:sSub>
-      </m:oMath>
-      <w:r>
-        <w:t xml:space="preserve"> </w:t>
-      </w:r>
-      <w:r>
-        <w:t xml:space="preserve">for each vowel, and then uses the largest of these point estimates to categorize the observed formant input (</w:t>
-      </w:r>
-      <w:hyperlink w:anchor="eq-criterion-psi-and-vowel">
-        <w:r>
-          <w:rPr>
-            <w:rStyle w:val="Hyperlink"/>
-          </w:rPr>
-          <w:t xml:space="preserve">Equation 10</w:t>
-        </w:r>
-      </w:hyperlink>
-      <w:r>
-        <w:t xml:space="preserve">).</w:t>
-      </w:r>
-      <w:r>
-        <w:t xml:space="preserve"> </w:t>
-      </w:r>
-      <w:r>
-        <w:t xml:space="preserve">Nearey and Assmann (2007)</w:t>
-      </w:r>
-      <w:r>
-        <w:t xml:space="preserve"> </w:t>
-      </w:r>
-      <w:r>
-        <w:t xml:space="preserve">noted that</w:t>
-      </w:r>
-      <w:r>
-        <w:t xml:space="preserve"> </w:t>
-      </w:r>
-      <w:r>
-        <w:t xml:space="preserve">“</w:t>
-      </w:r>
-      <w:r>
-        <w:t xml:space="preserve">[i]t would also be possible […] to use a fuller Bayesian approach by integrating over the values of</w:t>
-      </w:r>
-      <w:r>
-        <w:t xml:space="preserve"> </w:t>
-      </w:r>
-      <m:oMath>
-        <m:sSub>
-          <m:e>
-            <m:r>
-              <m:t>ψ</m:t>
-            </m:r>
-          </m:e>
-          <m:sub>
-            <m:r>
-              <m:t>s</m:t>
-            </m:r>
-          </m:sub>
-        </m:sSub>
-      </m:oMath>
-      <w:r>
-        <w:t xml:space="preserve">, rather than selecting the maximum. We leave that possibility for future research</w:t>
-      </w:r>
-      <w:r>
-        <w:t xml:space="preserve">”</w:t>
-      </w:r>
-      <w:r>
-        <w:t xml:space="preserve"> </w:t>
-      </w:r>
-      <w:r>
-        <w:t xml:space="preserve">(p. 254). In order to make the methods outlined above more fully Bayesian, we can instead focus on the joint posterior distribution of</w:t>
-      </w:r>
-      <w:r>
-        <w:t xml:space="preserve"> </w:t>
-      </w:r>
-      <m:oMath>
-        <m:sSub>
-          <m:e>
-            <m:r>
-              <m:t>ψ</m:t>
-            </m:r>
-          </m:e>
-          <m:sub>
-            <m:r>
-              <m:t>s</m:t>
-            </m:r>
-          </m:sub>
-        </m:sSub>
-      </m:oMath>
-      <w:r>
-        <w:t xml:space="preserve"> </w:t>
-      </w:r>
-      <w:r>
-        <w:t xml:space="preserve">and the vowel category v:</w:t>
-      </w:r>
-    </w:p>
-    <w:p>
-      <w:pPr>
-        <w:pStyle w:val="BodyText"/>
-      </w:pPr>
-      <w:bookmarkStart w:id="69" w:name="eq-BSTM-posterior-joint-psi-and-vowel"/>
-      <m:oMathPara>
-        <m:oMathParaPr>
-          <m:jc m:val="center"/>
-        </m:oMathParaPr>
-        <m:oMath>
-          <m:r>
-            <m:t>P</m:t>
-          </m:r>
-          <m:d>
-            <m:dPr>
-              <m:begChr m:val="("/>
-              <m:endChr m:val=")"/>
-              <m:sepChr m:val=""/>
-              <m:grow/>
-            </m:dPr>
-            <m:e>
-              <m:r>
-                <m:rPr>
-                  <m:nor/>
-                  <m:sty m:val="p"/>
-                </m:rPr>
-                <m:t>v</m:t>
-              </m:r>
-              <m:r>
-                <m:rPr>
-                  <m:sty m:val="p"/>
-                </m:rPr>
-                <m:t>,</m:t>
-              </m:r>
-              <m:sSub>
-                <m:e>
-                  <m:r>
-                    <m:t>ψ</m:t>
-                  </m:r>
-                </m:e>
-                <m:sub>
-                  <m:r>
-                    <m:t>s</m:t>
-                  </m:r>
-                </m:sub>
-              </m:sSub>
-              <m:r>
-                <m:rPr>
-                  <m:sty m:val="p"/>
-                </m:rPr>
-                <m:t>|</m:t>
-              </m:r>
-              <m:acc>
-                <m:accPr>
-                  <m:chr m:val="⃗"/>
-                </m:accPr>
-                <m:e>
-                  <m:r>
-                    <m:t>G</m:t>
-                  </m:r>
-                </m:e>
-              </m:acc>
-            </m:e>
-          </m:d>
-          <m:r>
-            <m:rPr>
-              <m:sty m:val="p"/>
-            </m:rPr>
-            <m:t>=</m:t>
-          </m:r>
-          <m:f>
-            <m:fPr>
-              <m:type m:val="bar"/>
-            </m:fPr>
-            <m:num>
-              <m:r>
-                <m:t>P</m:t>
-              </m:r>
-              <m:d>
-                <m:dPr>
-                  <m:begChr m:val="("/>
-                  <m:endChr m:val=")"/>
-                  <m:sepChr m:val=""/>
-                  <m:grow/>
-                </m:dPr>
-                <m:e>
-                  <m:acc>
-                    <m:accPr>
-                      <m:chr m:val="⃗"/>
-                    </m:accPr>
-                    <m:e>
-                      <m:r>
-                        <m:t>G</m:t>
-                      </m:r>
-                    </m:e>
-                  </m:acc>
-                  <m:r>
-                    <m:rPr>
-                      <m:sty m:val="p"/>
-                    </m:rPr>
-                    <m:t>|</m:t>
-                  </m:r>
-                  <m:r>
-                    <m:rPr>
-                      <m:nor/>
-                      <m:sty m:val="p"/>
-                    </m:rPr>
-                    <m:t>v</m:t>
-                  </m:r>
-                  <m:r>
-                    <m:rPr>
-                      <m:sty m:val="p"/>
-                    </m:rPr>
-                    <m:t>,</m:t>
-                  </m:r>
-                  <m:sSub>
-                    <m:e>
-                      <m:r>
-                        <m:t>ψ</m:t>
-                      </m:r>
-                    </m:e>
-                    <m:sub>
-                      <m:r>
-                        <m:t>s</m:t>
-                      </m:r>
-                    </m:sub>
-                  </m:sSub>
-                </m:e>
-              </m:d>
-              <m:r>
-                <m:rPr>
-                  <m:sty m:val="p"/>
-                </m:rPr>
-                <m:t>⋅</m:t>
-              </m:r>
-              <m:r>
-                <m:t>P</m:t>
-              </m:r>
-              <m:d>
-                <m:dPr>
-                  <m:begChr m:val="("/>
-                  <m:endChr m:val=")"/>
-                  <m:sepChr m:val=""/>
-                  <m:grow/>
-                </m:dPr>
-                <m:e>
-                  <m:sSub>
-                    <m:e>
-                      <m:r>
-                        <m:t>ψ</m:t>
-                      </m:r>
-                    </m:e>
-                    <m:sub>
-                      <m:r>
-                        <m:t>s</m:t>
-                      </m:r>
-                    </m:sub>
-                  </m:sSub>
-                </m:e>
-              </m:d>
-              <m:r>
-                <m:rPr>
-                  <m:sty m:val="p"/>
-                </m:rPr>
-                <m:t>⋅</m:t>
-              </m:r>
-              <m:r>
-                <m:t>P</m:t>
-              </m:r>
-              <m:d>
-                <m:dPr>
-                  <m:begChr m:val="("/>
-                  <m:endChr m:val=")"/>
-                  <m:sepChr m:val=""/>
-                  <m:grow/>
-                </m:dPr>
-                <m:e>
-                  <m:r>
-                    <m:rPr>
-                      <m:nor/>
-                      <m:sty m:val="p"/>
-                    </m:rPr>
-                    <m:t>v</m:t>
-                  </m:r>
-                </m:e>
-              </m:d>
-            </m:num>
-            <m:den>
-              <m:nary>
-                <m:naryPr>
-                  <m:chr m:val="∑"/>
-                  <m:limLoc m:val="undOvr"/>
-                  <m:subHide m:val="off"/>
-                  <m:supHide m:val="off"/>
-                </m:naryPr>
-                <m:sub>
-                  <m:r>
-                    <m:t>i</m:t>
-                  </m:r>
-                  <m:r>
-                    <m:rPr>
-                      <m:sty m:val="p"/>
-                    </m:rPr>
-                    <m:t>=</m:t>
-                  </m:r>
-                  <m:r>
-                    <m:t>i</m:t>
-                  </m:r>
-                </m:sub>
-                <m:sup>
-                  <m:r>
-                    <m:t>V</m:t>
-                  </m:r>
-                </m:sup>
-                <m:e>
-                  <m:r>
-                    <m:rPr>
-                      <m:sty m:val="p"/>
-                    </m:rPr>
-                    <m:t>∫</m:t>
-                  </m:r>
-                </m:e>
-              </m:nary>
-              <m:r>
-                <m:t>P</m:t>
-              </m:r>
-              <m:d>
-                <m:dPr>
-                  <m:begChr m:val="("/>
-                  <m:endChr m:val=")"/>
-                  <m:sepChr m:val=""/>
-                  <m:grow/>
-                </m:dPr>
-                <m:e>
-                  <m:acc>
-                    <m:accPr>
-                      <m:chr m:val="⃗"/>
-                    </m:accPr>
-                    <m:e>
-                      <m:r>
-                        <m:t>G</m:t>
-                      </m:r>
-                    </m:e>
-                  </m:acc>
-                  <m:r>
-                    <m:rPr>
-                      <m:sty m:val="p"/>
-                    </m:rPr>
-                    <m:t>|</m:t>
-                  </m:r>
-                  <m:sSub>
-                    <m:e>
-                      <m:r>
-                        <m:rPr>
-                          <m:nor/>
-                          <m:sty m:val="p"/>
-                        </m:rPr>
-                        <m:t>v</m:t>
-                      </m:r>
-                    </m:e>
-                    <m:sub>
-                      <m:r>
-                        <m:t>i</m:t>
-                      </m:r>
-                    </m:sub>
-                  </m:sSub>
-                  <m:r>
-                    <m:rPr>
-                      <m:sty m:val="p"/>
-                    </m:rPr>
-                    <m:t>,</m:t>
-                  </m:r>
-                  <m:sSub>
-                    <m:e>
-                      <m:r>
-                        <m:t>ψ</m:t>
-                      </m:r>
-                    </m:e>
-                    <m:sub>
-                      <m:r>
-                        <m:t>s</m:t>
-                      </m:r>
-                    </m:sub>
-                  </m:sSub>
-                </m:e>
-              </m:d>
-              <m:r>
-                <m:rPr>
-                  <m:sty m:val="p"/>
-                </m:rPr>
-                <m:t>⋅</m:t>
-              </m:r>
-              <m:r>
-                <m:t>P</m:t>
-              </m:r>
-              <m:d>
-                <m:dPr>
-                  <m:begChr m:val="("/>
-                  <m:endChr m:val=")"/>
-                  <m:sepChr m:val=""/>
-                  <m:grow/>
-                </m:dPr>
-                <m:e>
-                  <m:sSub>
-                    <m:e>
-                      <m:r>
-                        <m:t>ψ</m:t>
-                      </m:r>
-                    </m:e>
-                    <m:sub>
-                      <m:r>
-                        <m:t>s</m:t>
-                      </m:r>
-                    </m:sub>
-                  </m:sSub>
-                </m:e>
-              </m:d>
-              <m:r>
-                <m:rPr>
-                  <m:sty m:val="p"/>
-                </m:rPr>
-                <m:t>⋅</m:t>
-              </m:r>
-              <m:r>
-                <m:t>P</m:t>
-              </m:r>
-              <m:d>
-                <m:dPr>
-                  <m:begChr m:val="("/>
-                  <m:endChr m:val=")"/>
-                  <m:sepChr m:val=""/>
-                  <m:grow/>
-                </m:dPr>
-                <m:e>
-                  <m:sSub>
-                    <m:e>
-                      <m:r>
-                        <m:rPr>
-                          <m:nor/>
-                          <m:sty m:val="p"/>
-                        </m:rPr>
-                        <m:t>v</m:t>
-                      </m:r>
-                    </m:e>
-                    <m:sub>
-                      <m:r>
-                        <m:t>i</m:t>
-                      </m:r>
-                    </m:sub>
-                  </m:sSub>
-                </m:e>
-              </m:d>
-              <m:r>
-                <m:t> </m:t>
-              </m:r>
-              <m:r>
-                <m:t>d</m:t>
-              </m:r>
-              <m:r>
-                <m:t>ψ</m:t>
-              </m:r>
-            </m:den>
-          </m:f>
-          <m:r>
-            <m:t>  </m:t>
-          </m:r>
-          <m:d>
-            <m:dPr>
-              <m:begChr m:val="("/>
-              <m:endChr m:val=")"/>
-              <m:sepChr m:val=""/>
-              <m:grow/>
-            </m:dPr>
-            <m:e>
-              <m:r>
-                <m:t>16</m:t>
-              </m:r>
-            </m:e>
-          </m:d>
-        </m:oMath>
-      </m:oMathPara>
-      <w:bookmarkEnd w:id="69"/>
-    </w:p>
-    <w:p>
-      <w:pPr>
-        <w:pStyle w:val="FirstParagraph"/>
-      </w:pPr>
-      <w:r>
-        <w:t xml:space="preserve">To find the posterior distribution of</w:t>
-      </w:r>
-      <w:r>
-        <w:t xml:space="preserve"> </w:t>
-      </w:r>
-      <m:oMath>
-        <m:sSub>
-          <m:e>
-            <m:r>
-              <m:t>ψ</m:t>
-            </m:r>
-          </m:e>
-          <m:sub>
-            <m:r>
-              <m:t>s</m:t>
-            </m:r>
-          </m:sub>
-        </m:sSub>
-      </m:oMath>
-      <w:r>
-        <w:t xml:space="preserve">, we marginalize over</w:t>
-      </w:r>
-      <w:r>
-        <w:t xml:space="preserve"> </w:t>
-      </w:r>
-      <m:oMath>
-        <m:r>
-          <m:rPr>
-            <m:nor/>
-            <m:sty m:val="p"/>
-          </m:rPr>
-          <m:t>v</m:t>
-        </m:r>
-      </m:oMath>
-      <w:r>
-        <w:t xml:space="preserve">:</w:t>
-      </w:r>
-    </w:p>
-    <w:p>
-      <w:pPr>
-        <w:pStyle w:val="BodyText"/>
-      </w:pPr>
-      <w:bookmarkStart w:id="70" w:name="eq-e20bb"/>
-      <m:oMathPara>
-        <m:oMathParaPr>
-          <m:jc m:val="center"/>
-        </m:oMathParaPr>
-        <m:oMath>
-          <m:r>
-            <m:t>P</m:t>
-          </m:r>
-          <m:d>
-            <m:dPr>
-              <m:begChr m:val="("/>
-              <m:endChr m:val=")"/>
-              <m:sepChr m:val=""/>
-              <m:grow/>
-            </m:dPr>
-            <m:e>
-              <m:sSub>
-                <m:e>
-                  <m:r>
-                    <m:t>ψ</m:t>
-                  </m:r>
-                </m:e>
-                <m:sub>
-                  <m:r>
-                    <m:t>s</m:t>
-                  </m:r>
-                </m:sub>
-              </m:sSub>
-              <m:r>
-                <m:rPr>
-                  <m:sty m:val="p"/>
-                </m:rPr>
-                <m:t>|</m:t>
-              </m:r>
-              <m:acc>
-                <m:accPr>
-                  <m:chr m:val="⃗"/>
-                </m:accPr>
-                <m:e>
-                  <m:r>
-                    <m:t>G</m:t>
-                  </m:r>
-                </m:e>
-              </m:acc>
-            </m:e>
-          </m:d>
-          <m:r>
-            <m:rPr>
-              <m:sty m:val="p"/>
-            </m:rPr>
-            <m:t>=</m:t>
-          </m:r>
-          <m:f>
-            <m:fPr>
-              <m:type m:val="bar"/>
-            </m:fPr>
-            <m:num>
-              <m:nary>
-                <m:naryPr>
-                  <m:chr m:val="∑"/>
-                  <m:limLoc m:val="undOvr"/>
-                  <m:subHide m:val="off"/>
-                  <m:supHide m:val="off"/>
-                </m:naryPr>
-                <m:sub>
-                  <m:r>
-                    <m:t>i</m:t>
-                  </m:r>
-                  <m:r>
-                    <m:rPr>
-                      <m:sty m:val="p"/>
-                    </m:rPr>
-                    <m:t>=</m:t>
-                  </m:r>
-                  <m:r>
-                    <m:t>1</m:t>
-                  </m:r>
-                </m:sub>
-                <m:sup>
-                  <m:r>
-                    <m:t>V</m:t>
-                  </m:r>
-                </m:sup>
-                <m:e>
-                  <m:r>
-                    <m:t>P</m:t>
-                  </m:r>
-                </m:e>
-              </m:nary>
-              <m:d>
-                <m:dPr>
-                  <m:begChr m:val="("/>
-                  <m:endChr m:val=")"/>
-                  <m:sepChr m:val=""/>
-                  <m:grow/>
-                </m:dPr>
-                <m:e>
-                  <m:acc>
-                    <m:accPr>
-                      <m:chr m:val="⃗"/>
-                    </m:accPr>
-                    <m:e>
-                      <m:r>
-                        <m:t>G</m:t>
-                      </m:r>
-                    </m:e>
-                  </m:acc>
-                  <m:r>
-                    <m:rPr>
-                      <m:sty m:val="p"/>
-                    </m:rPr>
-                    <m:t>|</m:t>
-                  </m:r>
-                  <m:sSub>
-                    <m:e>
-                      <m:r>
-                        <m:rPr>
-                          <m:nor/>
-                          <m:sty m:val="p"/>
-                        </m:rPr>
-                        <m:t>v</m:t>
-                      </m:r>
-                    </m:e>
-                    <m:sub>
-                      <m:r>
-                        <m:t>i</m:t>
-                      </m:r>
-                    </m:sub>
-                  </m:sSub>
-                  <m:r>
-                    <m:rPr>
-                      <m:sty m:val="p"/>
-                    </m:rPr>
-                    <m:t>,</m:t>
-                  </m:r>
-                  <m:sSub>
-                    <m:e>
-                      <m:r>
-                        <m:t>ψ</m:t>
-                      </m:r>
-                    </m:e>
-                    <m:sub>
-                      <m:r>
-                        <m:t>s</m:t>
-                      </m:r>
-                    </m:sub>
-                  </m:sSub>
-                </m:e>
-              </m:d>
-              <m:r>
-                <m:rPr>
-                  <m:sty m:val="p"/>
-                </m:rPr>
-                <m:t>⋅</m:t>
-              </m:r>
-              <m:r>
-                <m:t>P</m:t>
-              </m:r>
-              <m:d>
-                <m:dPr>
-                  <m:begChr m:val="("/>
-                  <m:endChr m:val=")"/>
-                  <m:sepChr m:val=""/>
-                  <m:grow/>
-                </m:dPr>
-                <m:e>
-                  <m:sSub>
-                    <m:e>
-                      <m:r>
-                        <m:rPr>
-                          <m:nor/>
-                          <m:sty m:val="p"/>
-                        </m:rPr>
-                        <m:t>v</m:t>
-                      </m:r>
-                    </m:e>
-                    <m:sub>
-                      <m:r>
-                        <m:t>i</m:t>
-                      </m:r>
-                    </m:sub>
-                  </m:sSub>
-                </m:e>
-              </m:d>
-              <m:r>
-                <m:rPr>
-                  <m:sty m:val="p"/>
-                </m:rPr>
-                <m:t>⋅</m:t>
-              </m:r>
-              <m:r>
-                <m:t>P</m:t>
-              </m:r>
-              <m:d>
-                <m:dPr>
-                  <m:begChr m:val="("/>
-                  <m:endChr m:val=")"/>
-                  <m:sepChr m:val=""/>
-                  <m:grow/>
-                </m:dPr>
-                <m:e>
-                  <m:sSub>
-                    <m:e>
-                      <m:r>
-                        <m:t>ψ</m:t>
-                      </m:r>
-                    </m:e>
-                    <m:sub>
-                      <m:r>
-                        <m:t>s</m:t>
-                      </m:r>
-                    </m:sub>
-                  </m:sSub>
-                </m:e>
-              </m:d>
-            </m:num>
-            <m:den>
-              <m:nary>
-                <m:naryPr>
-                  <m:chr m:val="∑"/>
-                  <m:limLoc m:val="undOvr"/>
-                  <m:subHide m:val="off"/>
-                  <m:supHide m:val="off"/>
-                </m:naryPr>
-                <m:sub>
-                  <m:r>
-                    <m:t>i</m:t>
-                  </m:r>
-                  <m:r>
-                    <m:rPr>
-                      <m:sty m:val="p"/>
-                    </m:rPr>
-                    <m:t>=</m:t>
-                  </m:r>
-                  <m:r>
-                    <m:t>1</m:t>
-                  </m:r>
-                </m:sub>
-                <m:sup>
-                  <m:r>
-                    <m:t>V</m:t>
-                  </m:r>
-                </m:sup>
-                <m:e>
-                  <m:r>
-                    <m:rPr>
-                      <m:sty m:val="p"/>
-                    </m:rPr>
-                    <m:t>∫</m:t>
-                  </m:r>
-                </m:e>
-              </m:nary>
-              <m:r>
-                <m:t>P</m:t>
-              </m:r>
-              <m:d>
-                <m:dPr>
-                  <m:begChr m:val="("/>
-                  <m:endChr m:val=")"/>
-                  <m:sepChr m:val=""/>
-                  <m:grow/>
-                </m:dPr>
-                <m:e>
-                  <m:acc>
-                    <m:accPr>
-                      <m:chr m:val="⃗"/>
-                    </m:accPr>
-                    <m:e>
-                      <m:r>
-                        <m:t>G</m:t>
-                      </m:r>
-                    </m:e>
-                  </m:acc>
-                  <m:r>
-                    <m:rPr>
-                      <m:sty m:val="p"/>
-                    </m:rPr>
-                    <m:t>|</m:t>
-                  </m:r>
-                  <m:sSub>
-                    <m:e>
-                      <m:r>
-                        <m:rPr>
-                          <m:nor/>
-                          <m:sty m:val="p"/>
-                        </m:rPr>
-                        <m:t>v</m:t>
-                      </m:r>
-                    </m:e>
-                    <m:sub>
-                      <m:r>
-                        <m:t>i</m:t>
-                      </m:r>
-                    </m:sub>
-                  </m:sSub>
-                  <m:r>
-                    <m:rPr>
-                      <m:sty m:val="p"/>
-                    </m:rPr>
-                    <m:t>,</m:t>
-                  </m:r>
-                  <m:sSub>
-                    <m:e>
-                      <m:r>
-                        <m:t>ψ</m:t>
-                      </m:r>
-                    </m:e>
-                    <m:sub>
-                      <m:r>
-                        <m:t>s</m:t>
-                      </m:r>
-                    </m:sub>
-                  </m:sSub>
-                </m:e>
-              </m:d>
-              <m:r>
-                <m:rPr>
-                  <m:sty m:val="p"/>
-                </m:rPr>
-                <m:t>⋅</m:t>
-              </m:r>
-              <m:r>
-                <m:t>P</m:t>
-              </m:r>
-              <m:d>
-                <m:dPr>
-                  <m:begChr m:val="("/>
-                  <m:endChr m:val=")"/>
-                  <m:sepChr m:val=""/>
-                  <m:grow/>
-                </m:dPr>
-                <m:e>
-                  <m:sSub>
-                    <m:e>
-                      <m:r>
-                        <m:t>ψ</m:t>
-                      </m:r>
-                    </m:e>
-                    <m:sub>
-                      <m:r>
-                        <m:t>s</m:t>
-                      </m:r>
-                    </m:sub>
-                  </m:sSub>
-                </m:e>
-              </m:d>
-              <m:r>
-                <m:rPr>
-                  <m:sty m:val="p"/>
-                </m:rPr>
-                <m:t>⋅</m:t>
-              </m:r>
-              <m:r>
-                <m:t>P</m:t>
-              </m:r>
-              <m:d>
-                <m:dPr>
-                  <m:begChr m:val="("/>
-                  <m:endChr m:val=")"/>
-                  <m:sepChr m:val=""/>
-                  <m:grow/>
-                </m:dPr>
-                <m:e>
-                  <m:sSub>
-                    <m:e>
-                      <m:r>
-                        <m:rPr>
-                          <m:nor/>
-                          <m:sty m:val="p"/>
-                        </m:rPr>
-                        <m:t>v</m:t>
-                      </m:r>
-                    </m:e>
-                    <m:sub>
-                      <m:r>
-                        <m:t>i</m:t>
-                      </m:r>
-                    </m:sub>
-                  </m:sSub>
-                </m:e>
-              </m:d>
-              <m:r>
-                <m:t> </m:t>
-              </m:r>
-              <m:r>
-                <m:t>d</m:t>
-              </m:r>
-              <m:r>
-                <m:t>ψ</m:t>
-              </m:r>
-            </m:den>
-          </m:f>
-          <m:r>
-            <m:t>  </m:t>
-          </m:r>
-          <m:d>
-            <m:dPr>
-              <m:begChr m:val="("/>
-              <m:endChr m:val=")"/>
-              <m:sepChr m:val=""/>
-              <m:grow/>
-            </m:dPr>
-            <m:e>
-              <m:r>
-                <m:t>17</m:t>
-              </m:r>
-            </m:e>
-          </m:d>
-        </m:oMath>
-      </m:oMathPara>
-      <w:bookmarkEnd w:id="70"/>
-    </w:p>
-    <w:p>
-      <w:pPr>
-        <w:pStyle w:val="FirstParagraph"/>
-      </w:pPr>
-      <w:r>
-        <w:t xml:space="preserve">To find the posterior probabilities of different vowel categories, we marginalize over</w:t>
-      </w:r>
-      <w:r>
-        <w:t xml:space="preserve"> </w:t>
-      </w:r>
-      <m:oMath>
-        <m:sSub>
-          <m:e>
-            <m:r>
-              <m:t>ψ</m:t>
-            </m:r>
-          </m:e>
-          <m:sub>
-            <m:r>
-              <m:t>s</m:t>
-            </m:r>
-          </m:sub>
-        </m:sSub>
-      </m:oMath>
-      <w:r>
-        <w:t xml:space="preserve">:</w:t>
-      </w:r>
-    </w:p>
-    <w:p>
-      <w:pPr>
-        <w:pStyle w:val="BodyText"/>
-      </w:pPr>
-      <w:bookmarkStart w:id="71" w:name="eq-BSTM-posterior-psi-and-vowel"/>
-      <m:oMathPara>
-        <m:oMathParaPr>
-          <m:jc m:val="center"/>
-        </m:oMathParaPr>
-        <m:oMath>
-          <m:r>
-            <m:t>P</m:t>
-          </m:r>
-          <m:d>
-            <m:dPr>
-              <m:begChr m:val="("/>
-              <m:endChr m:val=")"/>
-              <m:sepChr m:val=""/>
-              <m:grow/>
-            </m:dPr>
-            <m:e>
-              <m:sSub>
-                <m:e>
-                  <m:r>
-                    <m:rPr>
-                      <m:nor/>
-                      <m:sty m:val="p"/>
-                    </m:rPr>
-                    <m:t>v</m:t>
-                  </m:r>
-                </m:e>
-                <m:sub>
-                  <m:r>
-                    <m:t>j</m:t>
-                  </m:r>
-                </m:sub>
-              </m:sSub>
-              <m:r>
-                <m:rPr>
-                  <m:sty m:val="p"/>
-                </m:rPr>
-                <m:t>|</m:t>
-              </m:r>
-              <m:acc>
-                <m:accPr>
-                  <m:chr m:val="⃗"/>
-                </m:accPr>
-                <m:e>
-                  <m:r>
-                    <m:t>G</m:t>
-                  </m:r>
-                </m:e>
-              </m:acc>
-            </m:e>
-          </m:d>
-          <m:r>
-            <m:rPr>
-              <m:sty m:val="p"/>
-            </m:rPr>
-            <m:t>=</m:t>
-          </m:r>
-          <m:f>
-            <m:fPr>
-              <m:type m:val="bar"/>
-            </m:fPr>
-            <m:num>
-              <m:r>
-                <m:rPr>
-                  <m:sty m:val="p"/>
-                </m:rPr>
-                <m:t>∫</m:t>
-              </m:r>
-              <m:r>
-                <m:t>P</m:t>
-              </m:r>
-              <m:d>
-                <m:dPr>
-                  <m:begChr m:val="("/>
-                  <m:endChr m:val=")"/>
-                  <m:sepChr m:val=""/>
-                  <m:grow/>
-                </m:dPr>
-                <m:e>
-                  <m:acc>
-                    <m:accPr>
-                      <m:chr m:val="⃗"/>
-                    </m:accPr>
-                    <m:e>
-                      <m:r>
-                        <m:t>G</m:t>
-                      </m:r>
-                    </m:e>
-                  </m:acc>
-                  <m:r>
-                    <m:rPr>
-                      <m:sty m:val="p"/>
-                    </m:rPr>
-                    <m:t>|</m:t>
-                  </m:r>
-                  <m:sSub>
-                    <m:e>
-                      <m:r>
-                        <m:rPr>
-                          <m:nor/>
-                          <m:sty m:val="p"/>
-                        </m:rPr>
-                        <m:t>v</m:t>
-                      </m:r>
-                    </m:e>
-                    <m:sub>
-                      <m:r>
-                        <m:t>j</m:t>
-                      </m:r>
-                    </m:sub>
-                  </m:sSub>
-                  <m:r>
-                    <m:rPr>
-                      <m:sty m:val="p"/>
-                    </m:rPr>
-                    <m:t>,</m:t>
-                  </m:r>
-                  <m:sSub>
-                    <m:e>
-                      <m:r>
-                        <m:t>ψ</m:t>
-                      </m:r>
-                    </m:e>
-                    <m:sub>
-                      <m:r>
-                        <m:t>s</m:t>
-                      </m:r>
-                    </m:sub>
-                  </m:sSub>
-                </m:e>
-              </m:d>
-              <m:r>
-                <m:rPr>
-                  <m:sty m:val="p"/>
-                </m:rPr>
-                <m:t>⋅</m:t>
-              </m:r>
-              <m:r>
-                <m:t>P</m:t>
-              </m:r>
-              <m:d>
-                <m:dPr>
-                  <m:begChr m:val="("/>
-                  <m:endChr m:val=")"/>
-                  <m:sepChr m:val=""/>
-                  <m:grow/>
-                </m:dPr>
-                <m:e>
-                  <m:sSub>
-                    <m:e>
-                      <m:r>
-                        <m:t>ψ</m:t>
-                      </m:r>
-                    </m:e>
-                    <m:sub>
-                      <m:r>
-                        <m:t>s</m:t>
-                      </m:r>
-                    </m:sub>
-                  </m:sSub>
-                </m:e>
-              </m:d>
-              <m:r>
-                <m:rPr>
-                  <m:sty m:val="p"/>
-                </m:rPr>
-                <m:t>⋅</m:t>
-              </m:r>
-              <m:r>
-                <m:t>P</m:t>
-              </m:r>
-              <m:d>
-                <m:dPr>
-                  <m:begChr m:val="("/>
-                  <m:endChr m:val=")"/>
-                  <m:sepChr m:val=""/>
-                  <m:grow/>
-                </m:dPr>
-                <m:e>
-                  <m:sSub>
-                    <m:e>
-                      <m:r>
-                        <m:rPr>
-                          <m:nor/>
-                          <m:sty m:val="p"/>
-                        </m:rPr>
-                        <m:t>v</m:t>
-                      </m:r>
-                    </m:e>
-                    <m:sub>
-                      <m:r>
-                        <m:t>j</m:t>
-                      </m:r>
-                    </m:sub>
-                  </m:sSub>
-                </m:e>
-              </m:d>
-              <m:r>
-                <m:t> </m:t>
-              </m:r>
-              <m:r>
-                <m:t>d</m:t>
-              </m:r>
-              <m:r>
-                <m:t>ψ</m:t>
-              </m:r>
-            </m:num>
-            <m:den>
-              <m:nary>
-                <m:naryPr>
-                  <m:chr m:val="∑"/>
-                  <m:limLoc m:val="undOvr"/>
-                  <m:subHide m:val="off"/>
-                  <m:supHide m:val="off"/>
-                </m:naryPr>
-                <m:sub>
-                  <m:r>
-                    <m:t>i</m:t>
-                  </m:r>
-                  <m:r>
-                    <m:rPr>
-                      <m:sty m:val="p"/>
-                    </m:rPr>
-                    <m:t>=</m:t>
-                  </m:r>
-                  <m:r>
-                    <m:t>1</m:t>
-                  </m:r>
-                </m:sub>
-                <m:sup>
-                  <m:r>
-                    <m:t>V</m:t>
-                  </m:r>
-                </m:sup>
-                <m:e>
-                  <m:r>
-                    <m:rPr>
-                      <m:sty m:val="p"/>
-                    </m:rPr>
-                    <m:t>∫</m:t>
-                  </m:r>
-                </m:e>
-              </m:nary>
-              <m:r>
-                <m:t>P</m:t>
-              </m:r>
-              <m:d>
-                <m:dPr>
-                  <m:begChr m:val="("/>
-                  <m:endChr m:val=")"/>
-                  <m:sepChr m:val=""/>
-                  <m:grow/>
-                </m:dPr>
-                <m:e>
-                  <m:acc>
-                    <m:accPr>
-                      <m:chr m:val="⃗"/>
-                    </m:accPr>
-                    <m:e>
-                      <m:r>
-                        <m:t>G</m:t>
-                      </m:r>
-                    </m:e>
-                  </m:acc>
-                  <m:r>
-                    <m:rPr>
-                      <m:sty m:val="p"/>
-                    </m:rPr>
-                    <m:t>|</m:t>
-                  </m:r>
-                  <m:sSub>
-                    <m:e>
-                      <m:r>
-                        <m:rPr>
-                          <m:nor/>
-                          <m:sty m:val="p"/>
-                        </m:rPr>
-                        <m:t>v</m:t>
-                      </m:r>
-                    </m:e>
-                    <m:sub>
-                      <m:r>
-                        <m:t>i</m:t>
-                      </m:r>
-                    </m:sub>
-                  </m:sSub>
-                  <m:r>
-                    <m:rPr>
-                      <m:sty m:val="p"/>
-                    </m:rPr>
-                    <m:t>,</m:t>
-                  </m:r>
-                  <m:sSub>
-                    <m:e>
-                      <m:r>
-                        <m:t>ψ</m:t>
-                      </m:r>
-                    </m:e>
-                    <m:sub>
-                      <m:r>
-                        <m:t>s</m:t>
-                      </m:r>
-                    </m:sub>
-                  </m:sSub>
-                </m:e>
-              </m:d>
-              <m:r>
-                <m:rPr>
-                  <m:sty m:val="p"/>
-                </m:rPr>
-                <m:t>⋅</m:t>
-              </m:r>
-              <m:r>
-                <m:t>P</m:t>
-              </m:r>
-              <m:d>
-                <m:dPr>
-                  <m:begChr m:val="("/>
-                  <m:endChr m:val=")"/>
-                  <m:sepChr m:val=""/>
-                  <m:grow/>
-                </m:dPr>
-                <m:e>
-                  <m:sSub>
-                    <m:e>
-                      <m:r>
-                        <m:t>ψ</m:t>
-                      </m:r>
-                    </m:e>
-                    <m:sub>
-                      <m:r>
-                        <m:t>s</m:t>
-                      </m:r>
-                    </m:sub>
-                  </m:sSub>
-                </m:e>
-              </m:d>
-              <m:r>
-                <m:rPr>
-                  <m:sty m:val="p"/>
-                </m:rPr>
-                <m:t>⋅</m:t>
-              </m:r>
-              <m:r>
-                <m:t>P</m:t>
-              </m:r>
-              <m:d>
-                <m:dPr>
-                  <m:begChr m:val="("/>
-                  <m:endChr m:val=")"/>
-                  <m:sepChr m:val=""/>
-                  <m:grow/>
-                </m:dPr>
-                <m:e>
-                  <m:sSub>
-                    <m:e>
-                      <m:r>
-                        <m:rPr>
-                          <m:nor/>
-                          <m:sty m:val="p"/>
-                        </m:rPr>
-                        <m:t>v</m:t>
-                      </m:r>
-                    </m:e>
-                    <m:sub>
-                      <m:r>
-                        <m:t>i</m:t>
-                      </m:r>
-                    </m:sub>
-                  </m:sSub>
-                </m:e>
-              </m:d>
-              <m:r>
-                <m:t> </m:t>
-              </m:r>
-              <m:r>
-                <m:t>d</m:t>
-              </m:r>
-              <m:r>
-                <m:t>ψ</m:t>
-              </m:r>
-            </m:den>
-          </m:f>
-          <m:r>
-            <m:t>  </m:t>
-          </m:r>
-          <m:d>
-            <m:dPr>
-              <m:begChr m:val="("/>
-              <m:endChr m:val=")"/>
-              <m:sepChr m:val=""/>
-              <m:grow/>
-            </m:dPr>
-            <m:e>
-              <m:r>
-                <m:t>18</m:t>
-              </m:r>
-            </m:e>
-          </m:d>
-        </m:oMath>
-      </m:oMathPara>
-      <w:bookmarkEnd w:id="71"/>
-    </w:p>
-    <w:p>
-      <w:pPr>
-        <w:pStyle w:val="FirstParagraph"/>
-      </w:pPr>
-      <w:r>
-        <w:t xml:space="preserve">Compared to focusing on MAP estimates of</w:t>
-      </w:r>
-      <w:r>
-        <w:t xml:space="preserve"> </w:t>
-      </w:r>
-      <m:oMath>
-        <m:sSub>
-          <m:e>
-            <m:r>
-              <m:t>ψ</m:t>
-            </m:r>
-          </m:e>
-          <m:sub>
-            <m:r>
-              <m:t>s</m:t>
-            </m:r>
-          </m:sub>
-        </m:sSub>
-      </m:oMath>
-      <w:r>
-        <w:t xml:space="preserve">, consideration of the posterior distribution in</w:t>
-      </w:r>
-      <w:r>
-        <w:t xml:space="preserve"> </w:t>
-      </w:r>
-      <w:hyperlink w:anchor="eq-BSTM-posterior-joint-psi-and-vowel">
-        <w:r>
-          <w:rPr>
-            <w:rStyle w:val="Hyperlink"/>
-          </w:rPr>
-          <w:t xml:space="preserve">Equation 16</w:t>
-        </w:r>
-      </w:hyperlink>
-      <w:r>
-        <w:t xml:space="preserve"> </w:t>
-      </w:r>
-      <w:r>
-        <w:t xml:space="preserve">takes into account the uncertainty about the</w:t>
-      </w:r>
-      <w:r>
-        <w:t xml:space="preserve"> </w:t>
-      </w:r>
-      <m:oMath>
-        <m:sSub>
-          <m:e>
-            <m:acc>
-              <m:accPr>
-                <m:chr m:val="̂"/>
-              </m:accPr>
-              <m:e>
-                <m:r>
-                  <m:t>ψ</m:t>
-                </m:r>
-              </m:e>
-            </m:acc>
-          </m:e>
-          <m:sub>
-            <m:r>
-              <m:t>s</m:t>
-            </m:r>
-            <m:r>
-              <m:rPr>
-                <m:sty m:val="p"/>
-              </m:rPr>
-              <m:t>,</m:t>
-            </m:r>
-            <m:r>
-              <m:rPr>
-                <m:nor/>
-                <m:sty m:val="p"/>
-              </m:rPr>
-              <m:t>v</m:t>
-            </m:r>
-          </m:sub>
-        </m:sSub>
-      </m:oMath>
-      <w:r>
-        <w:t xml:space="preserve"> </w:t>
-      </w:r>
-      <w:r>
-        <w:t xml:space="preserve">for different vowel categories. This results in a model of vowel perception that is more in line with Bayesian principles, suggesting the name Bayesian Sliding Template Model (BSTM) for this version of the PSTM. By calculating the full posterior distribution of</w:t>
-      </w:r>
-      <w:r>
-        <w:t xml:space="preserve"> </w:t>
-      </w:r>
-      <m:oMath>
-        <m:sSub>
-          <m:e>
-            <m:acc>
-              <m:accPr>
-                <m:chr m:val="̂"/>
-              </m:accPr>
-              <m:e>
-                <m:r>
-                  <m:t>ψ</m:t>
-                </m:r>
-              </m:e>
-            </m:acc>
-          </m:e>
-          <m:sub>
-            <m:r>
-              <m:t>s</m:t>
-            </m:r>
-          </m:sub>
-        </m:sSub>
-      </m:oMath>
-      <w:r>
-        <w:t xml:space="preserve"> </w:t>
-      </w:r>
-      <w:r>
-        <w:t xml:space="preserve">rather than just MAP estimates, the BSTM allows optimal information integration across multiple vowel tokens. This will allow future work to model the iterative estimation and refinement of</w:t>
-      </w:r>
-      <w:r>
-        <w:t xml:space="preserve"> </w:t>
-      </w:r>
-      <m:oMath>
-        <m:sSub>
-          <m:e>
-            <m:acc>
-              <m:accPr>
-                <m:chr m:val="̂"/>
-              </m:accPr>
-              <m:e>
-                <m:r>
-                  <m:t>ψ</m:t>
-                </m:r>
-              </m:e>
-            </m:acc>
-          </m:e>
-          <m:sub>
-            <m:r>
-              <m:t>s</m:t>
-            </m:r>
-          </m:sub>
-        </m:sSub>
-      </m:oMath>
-      <w:r>
-        <w:t xml:space="preserve"> </w:t>
-      </w:r>
-      <w:r>
-        <w:t xml:space="preserve">across vowel observations, something which is not possible with the original PSTM.</w:t>
-      </w:r>
-    </w:p>
-    <w:p>
-      <w:pPr>
-        <w:pStyle w:val="BodyText"/>
-      </w:pPr>
-      <w:r>
-        <w:t xml:space="preserve">It is, of course, an empirical question whether</w:t>
-      </w:r>
-      <w:r>
-        <w:t xml:space="preserve"> </w:t>
-      </w:r>
-      <w:r>
-        <w:rPr>
-          <w:i/>
-          <w:iCs/>
-        </w:rPr>
-        <w:t xml:space="preserve">listeners’ behavior</w:t>
-      </w:r>
-      <w:r>
-        <w:t xml:space="preserve"> </w:t>
-      </w:r>
-      <w:r>
-        <w:t xml:space="preserve">is better explained by this more fully Bayesian model. For the</w:t>
-      </w:r>
-      <w:r>
-        <w:t xml:space="preserve"> </w:t>
-      </w:r>
-      <w:r>
-        <w:t xml:space="preserve">Hillenbrand et al. (1995)</w:t>
-      </w:r>
-      <w:r>
-        <w:t xml:space="preserve"> </w:t>
-      </w:r>
-      <w:r>
-        <w:t xml:space="preserve">data, the BSTM performs identical to the PSTM.</w:t>
-      </w:r>
-    </w:p>
-    <w:p>
-      <w:pPr>
-        <w:pStyle w:val="BodyText"/>
-      </w:pPr>
-      <w:r>
-        <w:t xml:space="preserve">In future work we plan to expand evaluation of the BSTM in two ways. First, here we evaluated</w:t>
-      </w:r>
-      <w:r>
-        <w:t xml:space="preserve"> </w:t>
-      </w:r>
-      <w:r>
-        <w:t xml:space="preserve">‘</w:t>
-      </w:r>
-      <w:r>
-        <w:t xml:space="preserve">single-shot</w:t>
-      </w:r>
-      <w:r>
-        <w:t xml:space="preserve">’</w:t>
-      </w:r>
-      <w:r>
-        <w:t xml:space="preserve"> </w:t>
-      </w:r>
-      <w:r>
-        <w:t xml:space="preserve">implementations of methods 2, 3, and 6. That is, we did not incrementally accumulate information about</w:t>
-      </w:r>
-      <w:r>
-        <w:t xml:space="preserve"> </w:t>
-      </w:r>
-      <m:oMath>
-        <m:sSub>
-          <m:e>
-            <m:r>
-              <m:t>ψ</m:t>
-            </m:r>
-          </m:e>
-          <m:sub>
-            <m:r>
-              <m:t>s</m:t>
-            </m:r>
-          </m:sub>
-        </m:sSub>
-      </m:oMath>
-      <w:r>
-        <w:t xml:space="preserve"> </w:t>
-      </w:r>
-      <w:r>
-        <w:t xml:space="preserve">across trials. For data like those in</w:t>
-      </w:r>
-      <w:r>
-        <w:t xml:space="preserve"> </w:t>
-      </w:r>
-      <w:r>
-        <w:t xml:space="preserve">Hillenbrand et al. (1995)</w:t>
-      </w:r>
-      <w:r>
-        <w:t xml:space="preserve">, where listeners rarely hear speech from the same talker for multiple trials in a row, this is likely an acceptable simplifying assumption. However, the single-shot implementations considered here might well underestimate listeners’ ability to integrate information across observations from the same talker. In future work, we thus plan to extend these methods to incrementally update the prior based on observations from the same talker</w:t>
-      </w:r>
-      <w:r>
-        <w:t xml:space="preserve"> </w:t>
-      </w:r>
-      <w:r>
-        <w:t xml:space="preserve">(see discussion in Xie, Jaeger, and Kurumada 2023)</w:t>
-      </w:r>
-      <w:r>
-        <w:t xml:space="preserve">. The Bayesian approach inherent in the P/BSTM is ideally suited for this purpose.</w:t>
-      </w:r>
-    </w:p>
-    <w:p>
-      <w:pPr>
-        <w:pStyle w:val="BodyText"/>
-      </w:pPr>
-      <w:r>
-        <w:t xml:space="preserve">Second, the BSTM can naturally integrate the perception of indexical speaker characteristics such as age</w:t>
-      </w:r>
-      <w:r>
-        <w:t xml:space="preserve"> </w:t>
-      </w:r>
-      <w:r>
-        <w:t xml:space="preserve">(Barreda and Assmann 2018)</w:t>
-      </w:r>
-      <w:r>
-        <w:t xml:space="preserve">, height</w:t>
-      </w:r>
-      <w:r>
-        <w:t xml:space="preserve"> </w:t>
-      </w:r>
-      <w:r>
-        <w:t xml:space="preserve">(Barreda 2017)</w:t>
-      </w:r>
-      <w:r>
-        <w:t xml:space="preserve">, or gender</w:t>
-      </w:r>
-      <w:r>
-        <w:t xml:space="preserve"> </w:t>
-      </w:r>
-      <w:r>
-        <w:t xml:space="preserve">(Barreda and Assmann 2021)</w:t>
-      </w:r>
-      <w:r>
-        <w:t xml:space="preserve">, via their shared reliance on</w:t>
-      </w:r>
-      <w:r>
-        <w:t xml:space="preserve"> </w:t>
-      </w:r>
-      <m:oMath>
-        <m:sSub>
-          <m:e>
-            <m:r>
-              <m:t>ψ</m:t>
-            </m:r>
-          </m:e>
-          <m:sub>
-            <m:r>
-              <m:t>s</m:t>
-            </m:r>
-          </m:sub>
-        </m:sSub>
-      </m:oMath>
-      <w:r>
-        <w:t xml:space="preserve"> </w:t>
-      </w:r>
-      <w:r>
-        <w:t xml:space="preserve">(see also Kleinschmidt, Weatherholtz, and Jaeger 2018)</w:t>
-      </w:r>
-      <w:r>
-        <w:t xml:space="preserve">. For example, consider the perception of some speaker characteristic</w:t>
-      </w:r>
-      <w:r>
-        <w:t xml:space="preserve"> </w:t>
-      </w:r>
-      <m:oMath>
-        <m:r>
-          <m:t>θ</m:t>
-        </m:r>
-      </m:oMath>
-      <w:r>
-        <w:t xml:space="preserve">. To simultaneously estimate vowel category,</w:t>
-      </w:r>
-      <w:r>
-        <w:t xml:space="preserve"> </w:t>
-      </w:r>
-      <m:oMath>
-        <m:sSub>
-          <m:e>
-            <m:r>
-              <m:t>ψ</m:t>
-            </m:r>
-          </m:e>
-          <m:sub>
-            <m:r>
-              <m:t>s</m:t>
-            </m:r>
-          </m:sub>
-        </m:sSub>
-      </m:oMath>
-      <w:r>
-        <w:t xml:space="preserve">,</w:t>
-      </w:r>
-      <w:r>
-        <w:t xml:space="preserve"> </w:t>
-      </w:r>
-      <w:r>
-        <w:rPr>
-          <w:i/>
-          <w:iCs/>
-        </w:rPr>
-        <w:t xml:space="preserve">and</w:t>
-      </w:r>
-      <w:r>
-        <w:t xml:space="preserve"> </w:t>
-      </w:r>
-      <w:r>
-        <w:t xml:space="preserve">this new characteristic, we would add it to our model as in</w:t>
-      </w:r>
-      <w:r>
-        <w:t xml:space="preserve"> </w:t>
-      </w:r>
-      <w:hyperlink w:anchor="X16094044cb604ec2c675a2bf21df4946880f006">
-        <w:r>
-          <w:rPr>
-            <w:rStyle w:val="Hyperlink"/>
-          </w:rPr>
-          <w:t xml:space="preserve">Equation 19</w:t>
-        </w:r>
-      </w:hyperlink>
-      <w:r>
-        <w:t xml:space="preserve">. This requires adding</w:t>
-      </w:r>
-      <w:r>
-        <w:t xml:space="preserve"> </w:t>
-      </w:r>
-      <m:oMath>
-        <m:r>
-          <m:t>θ</m:t>
-        </m:r>
-      </m:oMath>
-      <w:r>
-        <w:t xml:space="preserve"> </w:t>
-      </w:r>
-      <w:r>
-        <w:t xml:space="preserve">to the likelihood and considering joint prior of</w:t>
-      </w:r>
-      <w:r>
-        <w:t xml:space="preserve"> </w:t>
-      </w:r>
-      <m:oMath>
-        <m:r>
-          <m:t>θ</m:t>
-        </m:r>
-      </m:oMath>
-      <w:r>
-        <w:t xml:space="preserve">,</w:t>
-      </w:r>
-      <w:r>
-        <w:t xml:space="preserve"> </w:t>
-      </w:r>
-      <m:oMath>
-        <m:sSub>
-          <m:e>
-            <m:r>
-              <m:t>ψ</m:t>
-            </m:r>
-          </m:e>
-          <m:sub>
-            <m:r>
-              <m:t>s</m:t>
-            </m:r>
-          </m:sub>
-        </m:sSub>
-      </m:oMath>
-      <w:r>
-        <w:t xml:space="preserve"> </w:t>
-      </w:r>
-      <w:r>
-        <w:t xml:space="preserve">and vowel category. Such an approach would allow for a direct empirical comparison of different models regarding the perceptual integration of speech and social perception with relatively modest extensions of the models described here.</w:t>
-      </w:r>
-    </w:p>
-    <w:p>
-      <w:pPr>
-        <w:pStyle w:val="BodyText"/>
-      </w:pPr>
-      <w:bookmarkStart w:id="72" w:name="X16094044cb604ec2c675a2bf21df4946880f006"/>
-      <m:oMathPara>
-        <m:oMathParaPr>
-          <m:jc m:val="center"/>
-        </m:oMathParaPr>
-        <m:oMath>
-          <m:r>
-            <m:t>P</m:t>
-          </m:r>
-          <m:d>
-            <m:dPr>
-              <m:begChr m:val="("/>
-              <m:endChr m:val=")"/>
-              <m:sepChr m:val=""/>
-              <m:grow/>
-            </m:dPr>
-            <m:e>
-              <m:r>
-                <m:rPr>
-                  <m:nor/>
-                  <m:sty m:val="p"/>
-                </m:rPr>
-                <m:t>v</m:t>
-              </m:r>
-              <m:r>
-                <m:rPr>
-                  <m:sty m:val="p"/>
-                </m:rPr>
-                <m:t>,</m:t>
-              </m:r>
-              <m:sSub>
-                <m:e>
-                  <m:r>
-                    <m:t>ψ</m:t>
-                  </m:r>
-                </m:e>
-                <m:sub>
-                  <m:r>
-                    <m:t>s</m:t>
-                  </m:r>
-                </m:sub>
-              </m:sSub>
-              <m:r>
-                <m:rPr>
-                  <m:sty m:val="p"/>
-                </m:rPr>
-                <m:t>,</m:t>
-              </m:r>
-              <m:r>
-                <m:t>θ</m:t>
-              </m:r>
-              <m:r>
-                <m:rPr>
-                  <m:sty m:val="p"/>
-                </m:rPr>
-                <m:t>|</m:t>
-              </m:r>
-              <m:acc>
-                <m:accPr>
-                  <m:chr m:val="⃗"/>
-                </m:accPr>
-                <m:e>
-                  <m:r>
-                    <m:t>G</m:t>
-                  </m:r>
-                </m:e>
-              </m:acc>
-            </m:e>
-          </m:d>
-          <m:r>
-            <m:rPr>
-              <m:sty m:val="p"/>
-            </m:rPr>
-            <m:t>∝</m:t>
-          </m:r>
-          <m:r>
-            <m:t>P</m:t>
-          </m:r>
-          <m:d>
-            <m:dPr>
-              <m:begChr m:val="("/>
-              <m:endChr m:val=")"/>
-              <m:sepChr m:val=""/>
-              <m:grow/>
-            </m:dPr>
-            <m:e>
-              <m:acc>
-                <m:accPr>
-                  <m:chr m:val="⃗"/>
-                </m:accPr>
-                <m:e>
-                  <m:r>
-                    <m:t>G</m:t>
-                  </m:r>
-                </m:e>
-              </m:acc>
-              <m:r>
-                <m:rPr>
-                  <m:sty m:val="p"/>
-                </m:rPr>
-                <m:t>|</m:t>
-              </m:r>
-              <m:r>
-                <m:rPr>
-                  <m:nor/>
-                  <m:sty m:val="p"/>
-                </m:rPr>
-                <m:t>v</m:t>
-              </m:r>
-              <m:r>
-                <m:rPr>
-                  <m:sty m:val="p"/>
-                </m:rPr>
-                <m:t>,</m:t>
-              </m:r>
-              <m:sSub>
-                <m:e>
-                  <m:r>
-                    <m:t>ψ</m:t>
-                  </m:r>
-                </m:e>
-                <m:sub>
-                  <m:r>
-                    <m:t>s</m:t>
-                  </m:r>
-                </m:sub>
-              </m:sSub>
-              <m:r>
-                <m:rPr>
-                  <m:sty m:val="p"/>
-                </m:rPr>
-                <m:t>,</m:t>
-              </m:r>
-              <m:r>
-                <m:t>θ</m:t>
-              </m:r>
-            </m:e>
-          </m:d>
-          <m:r>
-            <m:rPr>
-              <m:sty m:val="p"/>
-            </m:rPr>
-            <m:t>⋅</m:t>
-          </m:r>
-          <m:r>
-            <m:t>P</m:t>
-          </m:r>
-          <m:d>
-            <m:dPr>
-              <m:begChr m:val="("/>
-              <m:endChr m:val=")"/>
-              <m:sepChr m:val=""/>
-              <m:grow/>
-            </m:dPr>
-            <m:e>
-              <m:r>
-                <m:rPr>
-                  <m:nor/>
-                  <m:sty m:val="p"/>
-                </m:rPr>
-                <m:t>v</m:t>
-              </m:r>
-              <m:r>
-                <m:rPr>
-                  <m:sty m:val="p"/>
-                </m:rPr>
-                <m:t>,</m:t>
-              </m:r>
-              <m:sSub>
-                <m:e>
-                  <m:r>
-                    <m:t>ψ</m:t>
-                  </m:r>
-                </m:e>
-                <m:sub>
-                  <m:r>
-                    <m:t>s</m:t>
-                  </m:r>
-                </m:sub>
-              </m:sSub>
-              <m:r>
-                <m:rPr>
-                  <m:sty m:val="p"/>
-                </m:rPr>
-                <m:t>,</m:t>
-              </m:r>
-              <m:r>
-                <m:t>θ</m:t>
-              </m:r>
-            </m:e>
-          </m:d>
-          <m:r>
-            <m:t>  </m:t>
-          </m:r>
-          <m:d>
-            <m:dPr>
-              <m:begChr m:val="("/>
-              <m:endChr m:val=")"/>
-              <m:sepChr m:val=""/>
-              <m:grow/>
-            </m:dPr>
-            <m:e>
-              <m:r>
-                <m:t>19</m:t>
-              </m:r>
-            </m:e>
-          </m:d>
-        </m:oMath>
-      </m:oMathPara>
-      <w:bookmarkEnd w:id="72"/>
-    </w:p>
-    <w:bookmarkEnd w:id="73"/>
-    <w:bookmarkEnd w:id="74"/>
-    <w:bookmarkStart w:id="117" w:name="references"/>
-    <w:p>
-      <w:pPr>
-        <w:pStyle w:val="Heading1"/>
-      </w:pPr>
-      <w:r>
-        <w:t xml:space="preserve">8. References</w:t>
-      </w:r>
-    </w:p>
-    <w:bookmarkStart w:id="116" w:name="refs"/>
-    <w:bookmarkStart w:id="75" w:name="ref-ak00"/>
+    <w:bookmarkStart w:id="106" w:name="refs"/>
+    <w:bookmarkStart w:id="70" w:name="ref-ak00"/>
     <w:p>
       <w:pPr>
         <w:pStyle w:val="Bibliography"/>
@@ -17618,8 +15268,8 @@
         <w:t xml:space="preserve">108 (4): 1856–66.</w:t>
       </w:r>
     </w:p>
-    <w:bookmarkEnd w:id="75"/>
-    <w:bookmarkStart w:id="76" w:name="ref-barreda2012"/>
+    <w:bookmarkEnd w:id="70"/>
+    <w:bookmarkStart w:id="71" w:name="ref-barreda2012"/>
     <w:p>
       <w:pPr>
         <w:pStyle w:val="Bibliography"/>
@@ -17650,20 +15300,81 @@
         <w:t xml:space="preserve">132 (5): 3453–64.</w:t>
       </w:r>
     </w:p>
-    <w:bookmarkEnd w:id="76"/>
-    <w:bookmarkStart w:id="77" w:name="ref-b_height_2017"/>
+    <w:bookmarkEnd w:id="71"/>
+    <w:bookmarkStart w:id="72" w:name="ref-b20"/>
     <w:p>
       <w:pPr>
         <w:pStyle w:val="Bibliography"/>
       </w:pPr>
       <w:r>
-        <w:t xml:space="preserve">———. 2017.</w:t>
-      </w:r>
-      <w:r>
-        <w:t xml:space="preserve"> </w:t>
-      </w:r>
-      <w:r>
-        <w:t xml:space="preserve">“An Investigation of the Systematic Use of Spectral Information in the Determination of Apparent-Talker Height.”</w:t>
+        <w:t xml:space="preserve">———. 2020.</w:t>
+      </w:r>
+      <w:r>
+        <w:t xml:space="preserve"> </w:t>
+      </w:r>
+      <w:r>
+        <w:t xml:space="preserve">“Vowel Normalization as Perceptual Constancy.”</w:t>
+      </w:r>
+      <w:r>
+        <w:t xml:space="preserve"> </w:t>
+      </w:r>
+      <w:r>
+        <w:rPr>
+          <w:i/>
+          <w:iCs/>
+        </w:rPr>
+        <w:t xml:space="preserve">Language</w:t>
+      </w:r>
+      <w:r>
+        <w:t xml:space="preserve"> </w:t>
+      </w:r>
+      <w:r>
+        <w:t xml:space="preserve">96 (2).</w:t>
+      </w:r>
+    </w:p>
+    <w:bookmarkEnd w:id="72"/>
+    <w:bookmarkStart w:id="73" w:name="ref-b21"/>
+    <w:p>
+      <w:pPr>
+        <w:pStyle w:val="Bibliography"/>
+      </w:pPr>
+      <w:r>
+        <w:t xml:space="preserve">———. 2021.</w:t>
+      </w:r>
+      <w:r>
+        <w:t xml:space="preserve"> </w:t>
+      </w:r>
+      <w:r>
+        <w:t xml:space="preserve">“Perceptual Validation of Vowel Normalization Methods for Variationist Research.”</w:t>
+      </w:r>
+      <w:r>
+        <w:t xml:space="preserve"> </w:t>
+      </w:r>
+      <w:r>
+        <w:rPr>
+          <w:i/>
+          <w:iCs/>
+        </w:rPr>
+        <w:t xml:space="preserve">Language Variation and Change</w:t>
+      </w:r>
+      <w:r>
+        <w:t xml:space="preserve">, 1–27.</w:t>
+      </w:r>
+    </w:p>
+    <w:bookmarkEnd w:id="73"/>
+    <w:bookmarkStart w:id="74" w:name="ref-bn2012"/>
+    <w:p>
+      <w:pPr>
+        <w:pStyle w:val="Bibliography"/>
+      </w:pPr>
+      <w:r>
+        <w:t xml:space="preserve">Barreda, Santiago, and Terrance M Nearey. 2012.</w:t>
+      </w:r>
+      <w:r>
+        <w:t xml:space="preserve"> </w:t>
+      </w:r>
+      <w:r>
+        <w:t xml:space="preserve">“The Direct and Indirect Roles of Fundamental Frequency in Vowel Perception.”</w:t>
       </w:r>
       <w:r>
         <w:t xml:space="preserve"> </w:t>
@@ -17679,84 +15390,23 @@
         <w:t xml:space="preserve"> </w:t>
       </w:r>
       <w:r>
-        <w:t xml:space="preserve">141 (6): 4781–92.</w:t>
+        <w:t xml:space="preserve">131 (1): 466–77.</w:t>
       </w:r>
     </w:p>
-    <w:bookmarkEnd w:id="77"/>
-    <w:bookmarkStart w:id="78" w:name="ref-b20"/>
+    <w:bookmarkEnd w:id="74"/>
+    <w:bookmarkStart w:id="75" w:name="ref-barreda-nearey2018"/>
     <w:p>
       <w:pPr>
         <w:pStyle w:val="Bibliography"/>
       </w:pPr>
       <w:r>
-        <w:t xml:space="preserve">———. 2020.</w:t>
-      </w:r>
-      <w:r>
-        <w:t xml:space="preserve"> </w:t>
-      </w:r>
-      <w:r>
-        <w:t xml:space="preserve">“Vowel Normalization as Perceptual Constancy.”</w:t>
-      </w:r>
-      <w:r>
-        <w:t xml:space="preserve"> </w:t>
-      </w:r>
-      <w:r>
-        <w:rPr>
-          <w:i/>
-          <w:iCs/>
-        </w:rPr>
-        <w:t xml:space="preserve">Language</w:t>
-      </w:r>
-      <w:r>
-        <w:t xml:space="preserve"> </w:t>
-      </w:r>
-      <w:r>
-        <w:t xml:space="preserve">96 (2).</w:t>
-      </w:r>
-    </w:p>
-    <w:bookmarkEnd w:id="78"/>
-    <w:bookmarkStart w:id="79" w:name="ref-b21"/>
-    <w:p>
-      <w:pPr>
-        <w:pStyle w:val="Bibliography"/>
-      </w:pPr>
-      <w:r>
-        <w:t xml:space="preserve">———. 2021.</w:t>
-      </w:r>
-      <w:r>
-        <w:t xml:space="preserve"> </w:t>
-      </w:r>
-      <w:r>
-        <w:t xml:space="preserve">“Perceptual Validation of Vowel Normalization Methods for Variationist Research.”</w:t>
-      </w:r>
-      <w:r>
-        <w:t xml:space="preserve"> </w:t>
-      </w:r>
-      <w:r>
-        <w:rPr>
-          <w:i/>
-          <w:iCs/>
-        </w:rPr>
-        <w:t xml:space="preserve">Language Variation and Change</w:t>
-      </w:r>
-      <w:r>
-        <w:t xml:space="preserve">, 1–27.</w:t>
-      </w:r>
-    </w:p>
-    <w:bookmarkEnd w:id="79"/>
-    <w:bookmarkStart w:id="80" w:name="ref-b_gender_21"/>
-    <w:p>
-      <w:pPr>
-        <w:pStyle w:val="Bibliography"/>
-      </w:pPr>
-      <w:r>
-        <w:t xml:space="preserve">Barreda, Santiago, and Peter F Assmann. 2021.</w:t>
-      </w:r>
-      <w:r>
-        <w:t xml:space="preserve"> </w:t>
-      </w:r>
-      <w:r>
-        <w:t xml:space="preserve">“Perception of Gender in Children’s Voices.”</w:t>
+        <w:t xml:space="preserve">———. 2018.</w:t>
+      </w:r>
+      <w:r>
+        <w:t xml:space="preserve"> </w:t>
+      </w:r>
+      <w:r>
+        <w:t xml:space="preserve">“A Regression Approach to Vowel Normalization for Missing and Unbalanced Data.”</w:t>
       </w:r>
       <w:r>
         <w:t xml:space="preserve"> </w:t>
@@ -17772,23 +15422,87 @@
         <w:t xml:space="preserve"> </w:t>
       </w:r>
       <w:r>
-        <w:t xml:space="preserve">150 (5): 3949–63.</w:t>
+        <w:t xml:space="preserve">144 (1): 500–520.</w:t>
       </w:r>
     </w:p>
-    <w:bookmarkEnd w:id="80"/>
-    <w:bookmarkStart w:id="82" w:name="ref-b_age_2018"/>
+    <w:bookmarkEnd w:id="75"/>
+    <w:bookmarkStart w:id="76" w:name="ref-charlton2012"/>
     <w:p>
       <w:pPr>
         <w:pStyle w:val="Bibliography"/>
       </w:pPr>
       <w:r>
-        <w:t xml:space="preserve">Barreda, Santiago, and Peter F. Assmann. 2018.</w:t>
-      </w:r>
-      <w:r>
-        <w:t xml:space="preserve"> </w:t>
-      </w:r>
-      <w:r>
-        <w:t xml:space="preserve">“Modeling the Perception of Children’s Age from Speech Acoustics.”</w:t>
+        <w:t xml:space="preserve">Charlton, Benjamin D, William AH Ellis, Rebecca Larkin, and W Tecumseh Fitch. 2012.</w:t>
+      </w:r>
+      <w:r>
+        <w:t xml:space="preserve"> </w:t>
+      </w:r>
+      <w:r>
+        <w:t xml:space="preserve">“Perception of Size-Related Formant Information in Male Koalas (Phascolarctos Cinereus).”</w:t>
+      </w:r>
+      <w:r>
+        <w:t xml:space="preserve"> </w:t>
+      </w:r>
+      <w:r>
+        <w:rPr>
+          <w:i/>
+          <w:iCs/>
+        </w:rPr>
+        <w:t xml:space="preserve">Animal Cognition</w:t>
+      </w:r>
+      <w:r>
+        <w:t xml:space="preserve"> </w:t>
+      </w:r>
+      <w:r>
+        <w:t xml:space="preserve">15: 999–1006.</w:t>
+      </w:r>
+    </w:p>
+    <w:bookmarkEnd w:id="76"/>
+    <w:bookmarkStart w:id="77" w:name="ref-chernyak2024"/>
+    <w:p>
+      <w:pPr>
+        <w:pStyle w:val="Bibliography"/>
+      </w:pPr>
+      <w:r>
+        <w:t xml:space="preserve">Chernyak, Bronya R., Ann R. Bradlow, Joseph Keshet, and Matthew Goldrick. 2024.</w:t>
+      </w:r>
+      <w:r>
+        <w:t xml:space="preserve"> </w:t>
+      </w:r>
+      <w:r>
+        <w:t xml:space="preserve">“A Perceptual Similarity Space for Speech Based on Self-Supervised Speech Representations.”</w:t>
+      </w:r>
+      <w:r>
+        <w:t xml:space="preserve"> </w:t>
+      </w:r>
+      <w:r>
+        <w:rPr>
+          <w:i/>
+          <w:iCs/>
+        </w:rPr>
+        <w:t xml:space="preserve">JASA</w:t>
+      </w:r>
+      <w:r>
+        <w:t xml:space="preserve"> </w:t>
+      </w:r>
+      <w:r>
+        <w:t xml:space="preserve">155 (6): 3915–29.</w:t>
+      </w:r>
+    </w:p>
+    <w:bookmarkEnd w:id="77"/>
+    <w:bookmarkStart w:id="78" w:name="ref-h2000"/>
+    <w:p>
+      <w:pPr>
+        <w:pStyle w:val="Bibliography"/>
+      </w:pPr>
+      <w:r>
+        <w:t xml:space="preserve">Hillenbrand, James M, Michael J Clark, and Robert A Houde. 2000.</w:t>
+      </w:r>
+      <w:r>
+        <w:t xml:space="preserve"> </w:t>
+      </w:r>
+      <w:r>
+        <w:t xml:space="preserve">“Some Effects of Duration on Vowel Recognition.”</w:t>
       </w:r>
       <w:r>
         <w:t xml:space="preserve"> </w:t>
@@ -17804,37 +15518,41 @@
         <w:t xml:space="preserve"> </w:t>
       </w:r>
       <w:r>
-        <w:t xml:space="preserve">143 (5): EL361.</w:t>
-      </w:r>
-      <w:r>
-        <w:t xml:space="preserve"> </w:t>
-      </w:r>
-      <w:hyperlink r:id="rId81">
-        <w:r>
-          <w:rPr>
-            <w:rStyle w:val="Hyperlink"/>
-          </w:rPr>
-          <w:t xml:space="preserve">https://doi.org/10.1121/1.5037614</w:t>
-        </w:r>
-      </w:hyperlink>
-      <w:r>
-        <w:t xml:space="preserve">.</w:t>
+        <w:t xml:space="preserve">108 (6): 3013–22.</w:t>
       </w:r>
     </w:p>
-    <w:bookmarkEnd w:id="82"/>
-    <w:bookmarkStart w:id="83" w:name="ref-bn2012"/>
+    <w:bookmarkEnd w:id="78"/>
+    <w:bookmarkStart w:id="80" w:name="ref-h95"/>
     <w:p>
       <w:pPr>
         <w:pStyle w:val="Bibliography"/>
       </w:pPr>
       <w:r>
-        <w:t xml:space="preserve">Barreda, Santiago, and Terrance M Nearey. 2012.</w:t>
-      </w:r>
-      <w:r>
-        <w:t xml:space="preserve"> </w:t>
-      </w:r>
-      <w:r>
-        <w:t xml:space="preserve">“The Direct and Indirect Roles of Fundamental Frequency in Vowel Perception.”</w:t>
+        <w:t xml:space="preserve">Hillenbrand, James M, Laura A Getty, Michael J Clark, and Kevin Wheeler. 1995.</w:t>
+      </w:r>
+      <w:r>
+        <w:t xml:space="preserve"> </w:t>
+      </w:r>
+      <w:r>
+        <w:t xml:space="preserve">“Acoustic Characteristics of</w:t>
+      </w:r>
+      <w:r>
+        <w:t xml:space="preserve"> </w:t>
+      </w:r>
+      <w:r>
+        <w:t xml:space="preserve">American</w:t>
+      </w:r>
+      <w:r>
+        <w:t xml:space="preserve"> </w:t>
+      </w:r>
+      <w:r>
+        <w:t xml:space="preserve">English</w:t>
+      </w:r>
+      <w:r>
+        <w:t xml:space="preserve"> </w:t>
+      </w:r>
+      <w:r>
+        <w:t xml:space="preserve">Vowels.”</w:t>
       </w:r>
       <w:r>
         <w:t xml:space="preserve"> </w:t>
@@ -17850,190 +15568,12 @@
         <w:t xml:space="preserve"> </w:t>
       </w:r>
       <w:r>
-        <w:t xml:space="preserve">131 (1): 466–77.</w:t>
-      </w:r>
-    </w:p>
-    <w:bookmarkEnd w:id="83"/>
-    <w:bookmarkStart w:id="84" w:name="ref-barreda-nearey2018"/>
-    <w:p>
-      <w:pPr>
-        <w:pStyle w:val="Bibliography"/>
-      </w:pPr>
-      <w:r>
-        <w:t xml:space="preserve">———. 2018.</w:t>
-      </w:r>
-      <w:r>
-        <w:t xml:space="preserve"> </w:t>
-      </w:r>
-      <w:r>
-        <w:t xml:space="preserve">“A Regression Approach to Vowel Normalization for Missing and Unbalanced Data.”</w:t>
-      </w:r>
-      <w:r>
-        <w:t xml:space="preserve"> </w:t>
-      </w:r>
-      <w:r>
-        <w:rPr>
-          <w:i/>
-          <w:iCs/>
-        </w:rPr>
-        <w:t xml:space="preserve">The Journal of the Acoustical Society of America</w:t>
-      </w:r>
-      <w:r>
-        <w:t xml:space="preserve"> </w:t>
-      </w:r>
-      <w:r>
-        <w:t xml:space="preserve">144 (1): 500–520.</w:t>
-      </w:r>
-    </w:p>
-    <w:bookmarkEnd w:id="84"/>
-    <w:bookmarkStart w:id="85" w:name="ref-charlton2012"/>
-    <w:p>
-      <w:pPr>
-        <w:pStyle w:val="Bibliography"/>
-      </w:pPr>
-      <w:r>
-        <w:t xml:space="preserve">Charlton, Benjamin D, William AH Ellis, Rebecca Larkin, and W Tecumseh Fitch. 2012.</w:t>
-      </w:r>
-      <w:r>
-        <w:t xml:space="preserve"> </w:t>
-      </w:r>
-      <w:r>
-        <w:t xml:space="preserve">“Perception of Size-Related Formant Information in Male Koalas (Phascolarctos Cinereus).”</w:t>
-      </w:r>
-      <w:r>
-        <w:t xml:space="preserve"> </w:t>
-      </w:r>
-      <w:r>
-        <w:rPr>
-          <w:i/>
-          <w:iCs/>
-        </w:rPr>
-        <w:t xml:space="preserve">Animal Cognition</w:t>
-      </w:r>
-      <w:r>
-        <w:t xml:space="preserve"> </w:t>
-      </w:r>
-      <w:r>
-        <w:t xml:space="preserve">15: 999–1006.</w:t>
-      </w:r>
-    </w:p>
-    <w:bookmarkEnd w:id="85"/>
-    <w:bookmarkStart w:id="86" w:name="ref-chernyak2024"/>
-    <w:p>
-      <w:pPr>
-        <w:pStyle w:val="Bibliography"/>
-      </w:pPr>
-      <w:r>
-        <w:t xml:space="preserve">Chernyak, Bronya R., Ann R. Bradlow, Joseph Keshet, and Matthew Goldrick. 2024.</w:t>
-      </w:r>
-      <w:r>
-        <w:t xml:space="preserve"> </w:t>
-      </w:r>
-      <w:r>
-        <w:t xml:space="preserve">“A Perceptual Similarity Space for Speech Based on Self-Supervised Speech Representations.”</w:t>
-      </w:r>
-      <w:r>
-        <w:t xml:space="preserve"> </w:t>
-      </w:r>
-      <w:r>
-        <w:rPr>
-          <w:i/>
-          <w:iCs/>
-        </w:rPr>
-        <w:t xml:space="preserve">JASA</w:t>
-      </w:r>
-      <w:r>
-        <w:t xml:space="preserve"> </w:t>
-      </w:r>
-      <w:r>
-        <w:t xml:space="preserve">155 (6): 3915–29.</w:t>
-      </w:r>
-    </w:p>
-    <w:bookmarkEnd w:id="86"/>
-    <w:bookmarkStart w:id="87" w:name="ref-h2000"/>
-    <w:p>
-      <w:pPr>
-        <w:pStyle w:val="Bibliography"/>
-      </w:pPr>
-      <w:r>
-        <w:t xml:space="preserve">Hillenbrand, James M, Michael J Clark, and Robert A Houde. 2000.</w:t>
-      </w:r>
-      <w:r>
-        <w:t xml:space="preserve"> </w:t>
-      </w:r>
-      <w:r>
-        <w:t xml:space="preserve">“Some Effects of Duration on Vowel Recognition.”</w:t>
-      </w:r>
-      <w:r>
-        <w:t xml:space="preserve"> </w:t>
-      </w:r>
-      <w:r>
-        <w:rPr>
-          <w:i/>
-          <w:iCs/>
-        </w:rPr>
-        <w:t xml:space="preserve">The Journal of the Acoustical Society of America</w:t>
-      </w:r>
-      <w:r>
-        <w:t xml:space="preserve"> </w:t>
-      </w:r>
-      <w:r>
-        <w:t xml:space="preserve">108 (6): 3013–22.</w:t>
-      </w:r>
-    </w:p>
-    <w:bookmarkEnd w:id="87"/>
-    <w:bookmarkStart w:id="89" w:name="ref-h95"/>
-    <w:p>
-      <w:pPr>
-        <w:pStyle w:val="Bibliography"/>
-      </w:pPr>
-      <w:r>
-        <w:t xml:space="preserve">Hillenbrand, James M, Laura A Getty, Michael J Clark, and Kevin Wheeler. 1995.</w:t>
-      </w:r>
-      <w:r>
-        <w:t xml:space="preserve"> </w:t>
-      </w:r>
-      <w:r>
-        <w:t xml:space="preserve">“Acoustic Characteristics of</w:t>
-      </w:r>
-      <w:r>
-        <w:t xml:space="preserve"> </w:t>
-      </w:r>
-      <w:r>
-        <w:t xml:space="preserve">American</w:t>
-      </w:r>
-      <w:r>
-        <w:t xml:space="preserve"> </w:t>
-      </w:r>
-      <w:r>
-        <w:t xml:space="preserve">English</w:t>
-      </w:r>
-      <w:r>
-        <w:t xml:space="preserve"> </w:t>
-      </w:r>
-      <w:r>
-        <w:t xml:space="preserve">Vowels.”</w:t>
-      </w:r>
-      <w:r>
-        <w:t xml:space="preserve"> </w:t>
-      </w:r>
-      <w:r>
-        <w:rPr>
-          <w:i/>
-          <w:iCs/>
-        </w:rPr>
-        <w:t xml:space="preserve">The Journal of the Acoustical Society of America</w:t>
-      </w:r>
-      <w:r>
-        <w:t xml:space="preserve"> </w:t>
-      </w:r>
-      <w:r>
         <w:t xml:space="preserve">97 (5): 3099.</w:t>
       </w:r>
       <w:r>
         <w:t xml:space="preserve"> </w:t>
       </w:r>
-      <w:hyperlink r:id="rId88">
+      <w:hyperlink r:id="rId79">
         <w:r>
           <w:rPr>
             <w:rStyle w:val="Hyperlink"/>
@@ -18045,8 +15585,8 @@
         <w:t xml:space="preserve">.</w:t>
       </w:r>
     </w:p>
-    <w:bookmarkEnd w:id="89"/>
-    <w:bookmarkStart w:id="90" w:name="ref-hn99"/>
+    <w:bookmarkEnd w:id="80"/>
+    <w:bookmarkStart w:id="81" w:name="ref-hn99"/>
     <w:p>
       <w:pPr>
         <w:pStyle w:val="Bibliography"/>
@@ -18077,8 +15617,8 @@
         <w:t xml:space="preserve">105 (6): 3509–23.</w:t>
       </w:r>
     </w:p>
-    <w:bookmarkEnd w:id="90"/>
-    <w:bookmarkStart w:id="91" w:name="ref-jin2025"/>
+    <w:bookmarkEnd w:id="81"/>
+    <w:bookmarkStart w:id="82" w:name="ref-jin2025"/>
     <w:p>
       <w:pPr>
         <w:pStyle w:val="Bibliography"/>
@@ -18093,8 +15633,8 @@
         <w:t xml:space="preserve">“Latent Speech Representations Learned Through Self-Supervised Learning Predict Listeners’ Generalization of Adaptation Across Talkers.”</w:t>
       </w:r>
     </w:p>
-    <w:bookmarkEnd w:id="91"/>
-    <w:bookmarkStart w:id="92" w:name="ref-johnson1997"/>
+    <w:bookmarkEnd w:id="82"/>
+    <w:bookmarkStart w:id="83" w:name="ref-johnson1997"/>
     <w:p>
       <w:pPr>
         <w:pStyle w:val="Bibliography"/>
@@ -18128,8 +15668,8 @@
         <w:t xml:space="preserve">, edited by K Johnson and J W Mullennix, 145–46. San Diego: Academic Press.</w:t>
       </w:r>
     </w:p>
-    <w:bookmarkEnd w:id="92"/>
-    <w:bookmarkStart w:id="93" w:name="ref-kim2024"/>
+    <w:bookmarkEnd w:id="83"/>
+    <w:bookmarkStart w:id="84" w:name="ref-kim2024"/>
     <w:p>
       <w:pPr>
         <w:pStyle w:val="Bibliography"/>
@@ -18160,8 +15700,8 @@
         <w:t xml:space="preserve">4 (2).</w:t>
       </w:r>
     </w:p>
-    <w:bookmarkEnd w:id="93"/>
-    <w:bookmarkStart w:id="94" w:name="ref-kleinschmidt-jaeger2015"/>
+    <w:bookmarkEnd w:id="84"/>
+    <w:bookmarkStart w:id="85" w:name="ref-kleinschmidt-jaeger2015"/>
     <w:p>
       <w:pPr>
         <w:pStyle w:val="Bibliography"/>
@@ -18192,8 +15732,8 @@
         <w:t xml:space="preserve">122 (2): 148.</w:t>
       </w:r>
     </w:p>
-    <w:bookmarkEnd w:id="94"/>
-    <w:bookmarkStart w:id="95" w:name="ref-kleinschmidt2018"/>
+    <w:bookmarkEnd w:id="85"/>
+    <w:bookmarkStart w:id="86" w:name="ref-kleinschmidt2018"/>
     <w:p>
       <w:pPr>
         <w:pStyle w:val="Bibliography"/>
@@ -18224,8 +15764,8 @@
         <w:t xml:space="preserve">10 (4): 818–34.</w:t>
       </w:r>
     </w:p>
-    <w:bookmarkEnd w:id="95"/>
-    <w:bookmarkStart w:id="96" w:name="ref-lobanov1971"/>
+    <w:bookmarkEnd w:id="86"/>
+    <w:bookmarkStart w:id="87" w:name="ref-lobanov1971"/>
     <w:p>
       <w:pPr>
         <w:pStyle w:val="Bibliography"/>
@@ -18256,8 +15796,8 @@
         <w:t xml:space="preserve">49 (2B): 606–8.</w:t>
       </w:r>
     </w:p>
-    <w:bookmarkEnd w:id="96"/>
-    <w:bookmarkStart w:id="97" w:name="ref-luce-pisoni1998"/>
+    <w:bookmarkEnd w:id="87"/>
+    <w:bookmarkStart w:id="88" w:name="ref-luce-pisoni1998"/>
     <w:p>
       <w:pPr>
         <w:pStyle w:val="Bibliography"/>
@@ -18288,8 +15828,8 @@
         <w:t xml:space="preserve">19 (1): 1–36.</w:t>
       </w:r>
     </w:p>
-    <w:bookmarkEnd w:id="97"/>
-    <w:bookmarkStart w:id="98" w:name="ref-magnuson-nusbaum2007"/>
+    <w:bookmarkEnd w:id="88"/>
+    <w:bookmarkStart w:id="89" w:name="ref-magnuson-nusbaum2007"/>
     <w:p>
       <w:pPr>
         <w:pStyle w:val="Bibliography"/>
@@ -18320,8 +15860,8 @@
         <w:t xml:space="preserve">33 (2): 391.</w:t>
       </w:r>
     </w:p>
-    <w:bookmarkEnd w:id="98"/>
-    <w:bookmarkStart w:id="99" w:name="ref-massaro-friedman1990"/>
+    <w:bookmarkEnd w:id="89"/>
+    <w:bookmarkStart w:id="90" w:name="ref-massaro-friedman1990"/>
     <w:p>
       <w:pPr>
         <w:pStyle w:val="Bibliography"/>
@@ -18352,31 +15892,8 @@
         <w:t xml:space="preserve">97 (2): 225.</w:t>
       </w:r>
     </w:p>
-    <w:bookmarkEnd w:id="99"/>
-    <w:bookmarkStart w:id="100" w:name="ref-n78"/>
-    <w:p>
-      <w:pPr>
-        <w:pStyle w:val="Bibliography"/>
-      </w:pPr>
-      <w:r>
-        <w:t xml:space="preserve">Nearey, T M. 1978.</w:t>
-      </w:r>
-      <w:r>
-        <w:t xml:space="preserve"> </w:t>
-      </w:r>
-      <w:r>
-        <w:rPr>
-          <w:i/>
-          <w:iCs/>
-        </w:rPr>
-        <w:t xml:space="preserve">Phonetic Feature Systems for Vowels</w:t>
-      </w:r>
-      <w:r>
-        <w:t xml:space="preserve">. 177. Indiana University Linguistics Club.</w:t>
-      </w:r>
-    </w:p>
-    <w:bookmarkEnd w:id="100"/>
-    <w:bookmarkStart w:id="101" w:name="ref-NA07"/>
+    <w:bookmarkEnd w:id="90"/>
+    <w:bookmarkStart w:id="91" w:name="ref-NA07"/>
     <w:p>
       <w:pPr>
         <w:pStyle w:val="Bibliography"/>
@@ -18419,8 +15936,8 @@
         <w:t xml:space="preserve">246.</w:t>
       </w:r>
     </w:p>
-    <w:bookmarkEnd w:id="101"/>
-    <w:bookmarkStart w:id="102" w:name="ref-norris-mcqueen2008"/>
+    <w:bookmarkEnd w:id="91"/>
+    <w:bookmarkStart w:id="92" w:name="ref-norris-mcqueen2008"/>
     <w:p>
       <w:pPr>
         <w:pStyle w:val="Bibliography"/>
@@ -18451,8 +15968,8 @@
         <w:t xml:space="preserve">115 (2): 357.</w:t>
       </w:r>
     </w:p>
-    <w:bookmarkEnd w:id="102"/>
-    <w:bookmarkStart w:id="103" w:name="ref-persson2025"/>
+    <w:bookmarkEnd w:id="92"/>
+    <w:bookmarkStart w:id="93" w:name="ref-persson2025"/>
     <w:p>
       <w:pPr>
         <w:pStyle w:val="Bibliography"/>
@@ -18483,8 +16000,8 @@
         <w:t xml:space="preserve">157: 1458–82.</w:t>
       </w:r>
     </w:p>
-    <w:bookmarkEnd w:id="103"/>
-    <w:bookmarkStart w:id="105" w:name="ref-pb52"/>
+    <w:bookmarkEnd w:id="93"/>
+    <w:bookmarkStart w:id="95" w:name="ref-pb52"/>
     <w:p>
       <w:pPr>
         <w:pStyle w:val="Bibliography"/>
@@ -18556,7 +16073,7 @@
       <w:r>
         <w:t xml:space="preserve"> </w:t>
       </w:r>
-      <w:hyperlink r:id="rId104">
+      <w:hyperlink r:id="rId94">
         <w:r>
           <w:rPr>
             <w:rStyle w:val="Hyperlink"/>
@@ -18568,8 +16085,8 @@
         <w:t xml:space="preserve">.</w:t>
       </w:r>
     </w:p>
-    <w:bookmarkEnd w:id="105"/>
-    <w:bookmarkStart w:id="107" w:name="ref-R"/>
+    <w:bookmarkEnd w:id="95"/>
+    <w:bookmarkStart w:id="97" w:name="ref-R"/>
     <w:p>
       <w:pPr>
         <w:pStyle w:val="Bibliography"/>
@@ -18593,7 +16110,7 @@
       <w:r>
         <w:t xml:space="preserve"> </w:t>
       </w:r>
-      <w:hyperlink r:id="rId106">
+      <w:hyperlink r:id="rId96">
         <w:r>
           <w:rPr>
             <w:rStyle w:val="Hyperlink"/>
@@ -18605,8 +16122,8 @@
         <w:t xml:space="preserve">.</w:t>
       </w:r>
     </w:p>
-    <w:bookmarkEnd w:id="107"/>
-    <w:bookmarkStart w:id="108" w:name="ref-reby2005"/>
+    <w:bookmarkEnd w:id="97"/>
+    <w:bookmarkStart w:id="98" w:name="ref-reby2005"/>
     <w:p>
       <w:pPr>
         <w:pStyle w:val="Bibliography"/>
@@ -18637,8 +16154,8 @@
         <w:t xml:space="preserve">272 (1566): 941–47.</w:t>
       </w:r>
     </w:p>
-    <w:bookmarkEnd w:id="108"/>
-    <w:bookmarkStart w:id="110" w:name="ref-richter2017"/>
+    <w:bookmarkEnd w:id="98"/>
+    <w:bookmarkStart w:id="100" w:name="ref-richter2017"/>
     <w:p>
       <w:pPr>
         <w:pStyle w:val="Bibliography"/>
@@ -18671,7 +16188,7 @@
       <w:r>
         <w:t xml:space="preserve"> </w:t>
       </w:r>
-      <w:hyperlink r:id="rId109">
+      <w:hyperlink r:id="rId99">
         <w:r>
           <w:rPr>
             <w:rStyle w:val="Hyperlink"/>
@@ -18683,8 +16200,8 @@
         <w:t xml:space="preserve">.</w:t>
       </w:r>
     </w:p>
-    <w:bookmarkEnd w:id="110"/>
-    <w:bookmarkStart w:id="112" w:name="ref-RStudio"/>
+    <w:bookmarkEnd w:id="100"/>
+    <w:bookmarkStart w:id="102" w:name="ref-RStudio"/>
     <w:p>
       <w:pPr>
         <w:pStyle w:val="Bibliography"/>
@@ -18708,7 +16225,7 @@
       <w:r>
         <w:t xml:space="preserve"> </w:t>
       </w:r>
-      <w:hyperlink r:id="rId111">
+      <w:hyperlink r:id="rId101">
         <w:r>
           <w:rPr>
             <w:rStyle w:val="Hyperlink"/>
@@ -18720,8 +16237,8 @@
         <w:t xml:space="preserve">.</w:t>
       </w:r>
     </w:p>
-    <w:bookmarkEnd w:id="112"/>
-    <w:bookmarkStart w:id="113" w:name="ref-sumner2011"/>
+    <w:bookmarkEnd w:id="102"/>
+    <w:bookmarkStart w:id="103" w:name="ref-sumner2011"/>
     <w:p>
       <w:pPr>
         <w:pStyle w:val="Bibliography"/>
@@ -18752,8 +16269,8 @@
         <w:t xml:space="preserve">119 (1): 131–36.</w:t>
       </w:r>
     </w:p>
-    <w:bookmarkEnd w:id="113"/>
-    <w:bookmarkStart w:id="114" w:name="ref-taylor2010"/>
+    <w:bookmarkEnd w:id="103"/>
+    <w:bookmarkStart w:id="104" w:name="ref-taylor2010"/>
     <w:p>
       <w:pPr>
         <w:pStyle w:val="Bibliography"/>
@@ -18784,8 +16301,8 @@
         <w:t xml:space="preserve">79 (1): 205–10.</w:t>
       </w:r>
     </w:p>
-    <w:bookmarkEnd w:id="114"/>
-    <w:bookmarkStart w:id="115" w:name="ref-xie2023"/>
+    <w:bookmarkEnd w:id="104"/>
+    <w:bookmarkStart w:id="105" w:name="ref-xie2023"/>
     <w:p>
       <w:pPr>
         <w:pStyle w:val="Bibliography"/>
@@ -18816,9 +16333,9 @@
         <w:t xml:space="preserve">166: 377–424.</w:t>
       </w:r>
     </w:p>
-    <w:bookmarkEnd w:id="115"/>
-    <w:bookmarkEnd w:id="116"/>
-    <w:bookmarkEnd w:id="117"/>
+    <w:bookmarkEnd w:id="105"/>
+    <w:bookmarkEnd w:id="106"/>
+    <w:bookmarkEnd w:id="107"/>
     <w:sectPr/>
   </w:body>
 </w:document>
@@ -18844,7 +16361,7 @@
       </w:r>
     </w:p>
   </w:footnote>
-  <w:footnote w:id="46">
+  <w:footnote w:id="34">
     <w:p>
       <w:pPr>
         <w:pStyle w:val="FootnoteText"/>
@@ -18859,6 +16376,130 @@
         <w:t xml:space="preserve"> </w:t>
       </w:r>
       <w:r>
+        <w:t xml:space="preserve">We assume independence of</w:t>
+      </w:r>
+      <w:r>
+        <w:t xml:space="preserve"> </w:t>
+      </w:r>
+      <m:oMath>
+        <m:r>
+          <m:t>P</m:t>
+        </m:r>
+        <m:d>
+          <m:dPr>
+            <m:begChr m:val="("/>
+            <m:endChr m:val=")"/>
+            <m:sepChr m:val=""/>
+            <m:grow/>
+          </m:dPr>
+          <m:e>
+            <m:sSub>
+              <m:e>
+                <m:r>
+                  <m:t>ψ</m:t>
+                </m:r>
+              </m:e>
+              <m:sub>
+                <m:r>
+                  <m:t>s</m:t>
+                </m:r>
+              </m:sub>
+            </m:sSub>
+          </m:e>
+        </m:d>
+      </m:oMath>
+      <w:r>
+        <w:t xml:space="preserve"> </w:t>
+      </w:r>
+      <w:r>
+        <w:t xml:space="preserve">and</w:t>
+      </w:r>
+      <w:r>
+        <w:t xml:space="preserve"> </w:t>
+      </w:r>
+      <m:oMath>
+        <m:r>
+          <m:t>P</m:t>
+        </m:r>
+        <m:sSub>
+          <m:e>
+            <m:d>
+              <m:dPr>
+                <m:begChr m:val="("/>
+                <m:endChr m:val=")"/>
+                <m:sepChr m:val=""/>
+                <m:grow/>
+              </m:dPr>
+              <m:e>
+                <m:r>
+                  <m:rPr>
+                    <m:nor/>
+                    <m:sty m:val="p"/>
+                  </m:rPr>
+                  <m:t>v</m:t>
+                </m:r>
+              </m:e>
+            </m:d>
+          </m:e>
+          <m:sub>
+            <m:r>
+              <m:t>j</m:t>
+            </m:r>
+          </m:sub>
+        </m:sSub>
+      </m:oMath>
+      <w:r>
+        <w:t xml:space="preserve"> </w:t>
+      </w:r>
+      <w:r>
+        <w:t xml:space="preserve">since the prior distribution over</w:t>
+      </w:r>
+      <w:r>
+        <w:t xml:space="preserve"> </w:t>
+      </w:r>
+      <m:oMath>
+        <m:r>
+          <m:t>p</m:t>
+        </m:r>
+        <m:r>
+          <m:t>s</m:t>
+        </m:r>
+        <m:sSub>
+          <m:e>
+            <m:r>
+              <m:t>i</m:t>
+            </m:r>
+          </m:e>
+          <m:sub>
+            <m:r>
+              <m:t>s</m:t>
+            </m:r>
+          </m:sub>
+        </m:sSub>
+      </m:oMath>
+      <w:r>
+        <w:t xml:space="preserve"> </w:t>
+      </w:r>
+      <w:r>
+        <w:t xml:space="preserve">is unlikely to depend on the prior probability of the different vowels in the current context.</w:t>
+      </w:r>
+    </w:p>
+  </w:footnote>
+  <w:footnote w:id="47">
+    <w:p>
+      <w:pPr>
+        <w:pStyle w:val="FootnoteText"/>
+      </w:pPr>
+      <w:r>
+        <w:rPr>
+          <w:rStyle w:val="FootnoteReference"/>
+        </w:rPr>
+        <w:footnoteRef/>
+      </w:r>
+      <w:r>
+        <w:t xml:space="preserve"> </w:t>
+      </w:r>
+      <w:r>
         <w:t xml:space="preserve">The</w:t>
       </w:r>
       <w:r>
@@ -18878,7 +16519,7 @@
       </w:r>
     </w:p>
   </w:footnote>
-  <w:footnote w:id="53">
+  <w:footnote w:id="54">
     <w:p>
       <w:pPr>
         <w:pStyle w:val="FootnoteText"/>
@@ -18941,34 +16582,6 @@
       </w:r>
     </w:p>
   </w:footnote>
-  <w:footnote w:id="59">
-    <w:p>
-      <w:pPr>
-        <w:pStyle w:val="FootnoteText"/>
-      </w:pPr>
-      <w:r>
-        <w:rPr>
-          <w:rStyle w:val="FootnoteReference"/>
-        </w:rPr>
-        <w:footnoteRef/>
-      </w:r>
-      <w:r>
-        <w:t xml:space="preserve"> </w:t>
-      </w:r>
-      <w:r>
-        <w:t xml:space="preserve">The data used to estimate vowel templates should be carefully chosen to reflect the sort of listener of interest to the researcher. For example, a template trained on a database of Canadian English will not be suitable to model the perception of an Irish English listener</w:t>
-      </w:r>
-      <w:r>
-        <w:t xml:space="preserve"> </w:t>
-      </w:r>
-      <w:r>
-        <w:t xml:space="preserve">(cf. discussion in Persson, Barreda, and Jaeger 2025)</w:t>
-      </w:r>
-      <w:r>
-        <w:t xml:space="preserve">.</w:t>
-      </w:r>
-    </w:p>
-  </w:footnote>
   <w:footnote w:id="60">
     <w:p>
       <w:pPr>
@@ -18984,7 +16597,47 @@
         <w:t xml:space="preserve"> </w:t>
       </w:r>
       <w:r>
-        <w:t xml:space="preserve">It is an interesting questions whether category-specific covariance matrices, as in</w:t>
+        <w:t xml:space="preserve">The data used to estimate vowel templates should reflect the sort of listener that the researcher aims to model. E.g., a template trained on a database of Canadian English will not be suitable to model the perception of an Irish English listener</w:t>
+      </w:r>
+      <w:r>
+        <w:t xml:space="preserve"> </w:t>
+      </w:r>
+      <w:r>
+        <w:t xml:space="preserve">(see discussion in Persson, Barreda, and Jaeger 2025)</w:t>
+      </w:r>
+      <w:r>
+        <w:t xml:space="preserve">.</w:t>
+      </w:r>
+    </w:p>
+  </w:footnote>
+  <w:footnote w:id="61">
+    <w:p>
+      <w:pPr>
+        <w:pStyle w:val="FootnoteText"/>
+      </w:pPr>
+      <w:r>
+        <w:rPr>
+          <w:rStyle w:val="FootnoteReference"/>
+        </w:rPr>
+        <w:footnoteRef/>
+      </w:r>
+      <w:r>
+        <w:t xml:space="preserve"> </w:t>
+      </w:r>
+      <w:r>
+        <w:t xml:space="preserve">We follow</w:t>
+      </w:r>
+      <w:r>
+        <w:t xml:space="preserve"> </w:t>
+      </w:r>
+      <w:r>
+        <w:t xml:space="preserve">Nearey and Assmann (2007)</w:t>
+      </w:r>
+      <w:r>
+        <w:t xml:space="preserve"> </w:t>
+      </w:r>
+      <w:r>
+        <w:t xml:space="preserve">in estimating a single pooled covariance matrix across all vowel categories. It is an open questions whether category-specific covariance matrices, as in</w:t>
       </w:r>
       <w:r>
         <w:t xml:space="preserve"> </w:t>

</xml_diff>

<commit_message>
Small edits to caption
</commit_message>
<xml_diff>
--- a/Re_introducing_the_PSTM.docx
+++ b/Re_introducing_the_PSTM.docx
@@ -1079,7 +1079,7 @@
         <w:pStyle w:val="FirstParagraph"/>
       </w:pPr>
       <w:r>
-        <w:t xml:space="preserve">Cross-talker variability poses a computational challenge for speech perception: since different talkers can realize the same phonetic information with different acoustics, robust perception across talkers can only be achieved by somehow adjusting to these differences. At the same time, cross-talker differences in pronunciation provide information about the language background and social identity of speakers. One way to approach these issues has been to describe both linguistic and social perception as inference over the joint distribution of auditory percepts (e.g., in the form of phonetic cues), linguistic, and social categories. This can be conceptualized as similarity-based inferences over exemplars</w:t>
+        <w:t xml:space="preserve">Cross-talker variability poses a computational challenge for speech perception: since different talkers can realize the same phonetic information with different acoustics, robust perception across talkers can only be achieved by adjusting to these differences. However, cross-talker differences in pronunciation also provide information about the language background and social identity of speakers. One way to approach these issues is to consider both linguistic and social perception as inference over the joint distribution of auditory percepts (e.g., in the form of phonetic cues), linguistic, and social categories. This can be conceptualized as similarity-based inferences over exemplars</w:t>
       </w:r>
       <w:r>
         <w:t xml:space="preserve"> </w:t>
@@ -1143,7 +1143,7 @@
         <w:t xml:space="preserve">vowel normalization</w:t>
       </w:r>
       <w:r>
-        <w:t xml:space="preserve">, the perceptual mapping from the acoustics of the speech signal to linguistic representation. The model is rooted in principled considerations about the biology of auditory perception in the mammalian brain, validated by cross-species comparisons. The formant normalization procedure proposed by (P)STM—</w:t>
+        <w:t xml:space="preserve">, the perceptual mapping from speech acoustic to a linguistic representation. The model is rooted in principled considerations about the biology of auditory perception in the mammalian brain, validated by cross-species comparisons. The formant normalization procedure proposed by (P)STM—</w:t>
       </w:r>
       <w:r>
         <w:rPr>
@@ -1231,7 +1231,7 @@
         <w:t xml:space="preserve"> </w:t>
       </w:r>
       <w:r>
-        <w:t xml:space="preserve">problem of speech normalization: listeners must know some speaker characteristics in order to normalize (and identify) speech but must accurately identify speech in order to accurately estimate the speaker characteristics required to normalize. Speaker characteristics and speech acoustics enter into the same many-to-many mapping relationship as the linguistic signal and speech acoustics. Consequently, determining both simultaneously from the speech signal is difficult, and the PSTM is one of the few models that addresses this problem in an empirically testable manner.</w:t>
+        <w:t xml:space="preserve">problem of speech normalization: listeners must know some speaker characteristics in order to normalize (and identify) speech but must also identify speech in order to accurately estimate these same characteristics. Speaker characteristics and speech acoustics enter into the same many-to-many mapping relationship as the linguistic signal and speech acoustics. Consequently, determining both simultaneously from the speech signal is difficult, and the PSTM is one of the few models that addresses this problem in an empirically testable manner.</w:t>
       </w:r>
     </w:p>
     <w:p>
@@ -1295,7 +1295,7 @@
         <w:t xml:space="preserve"> </w:t>
       </w:r>
       <w:r>
-        <w:t xml:space="preserve">is one of the most under-appreciated papers in speech perception. It has been cited less than 40 times over 17 years. During the same time, there have been over 17,000 research articles on vowel identification and formant normalization.</w:t>
+        <w:t xml:space="preserve">is one of the most under-appreciated papers on speech perception. It has been cited less than 40 times over 17 years. During the same time, there have been over 17,000 research articles on vowel identification and formant normalization.</w:t>
       </w:r>
       <w:r>
         <w:t xml:space="preserve"> </w:t>
@@ -1383,10 +1383,10 @@
         <w:t xml:space="preserve"> </w:t>
       </w:r>
       <w:r>
-        <w:t xml:space="preserve">(see also Barreda 2020; Persson, Barreda, and Jaeger 2025)</w:t>
-      </w:r>
-      <w:r>
-        <w:t xml:space="preserve">. We provide such a test below, and demonstrate that the PSTM is a by far superior model of human formant perception than the most-cited normalization account.</w:t>
+        <w:t xml:space="preserve">(see also Barreda 2021; Persson, Barreda, and Jaeger 2025)</w:t>
+      </w:r>
+      <w:r>
+        <w:t xml:space="preserve">. We provide such a test below, and demonstrate that the PSTM is a far superior model of human formant perception than the most-cited normalization account.</w:t>
       </w:r>
     </w:p>
     <w:p>
@@ -1421,7 +1421,7 @@
         <w:t xml:space="preserve"> </w:t>
       </w:r>
       <w:r>
-        <w:t xml:space="preserve">package. Other researcher can download this markdown at https://osf.io/tpwmv/, and re-run our analyses with the press of a button in RStudio</w:t>
+        <w:t xml:space="preserve">package. Other researchers can download this markdown at https://osf.io/tpwmv/, and re-run our analyses with the press of a button in RStudio</w:t>
       </w:r>
       <w:r>
         <w:t xml:space="preserve"> </w:t>
@@ -3108,7 +3108,7 @@
               <w:pStyle w:val="ImageCaption"/>
             </w:pPr>
             <w:r>
-              <w:t xml:space="preserve">Figure 1: (a) A comparison of two vowel spaces (based on data in Hillenbrand et al., 1995) differing according to a single multiplicative scaling parameter (</w:t>
+              <w:t xml:space="preserve">Figure 1: (a) Comparison of vowel spaces differing according to a single multiplicative scaling parameter (</w:t>
             </w:r>
             <m:oMath>
               <m:sSub>
@@ -3125,7 +3125,7 @@
               </m:sSub>
             </m:oMath>
             <w:r>
-              <w:t xml:space="preserve">). Each IPA symbols shows a speaker’s vowel target</w:t>
+              <w:t xml:space="preserve">). Symbols indicate speaker’s vowel targets</w:t>
             </w:r>
             <w:r>
               <w:t xml:space="preserve"> </w:t>
@@ -3187,7 +3187,7 @@
               <w:t xml:space="preserve"> </w:t>
             </w:r>
             <w:r>
-              <w:t xml:space="preserve">marks an ambiguous vowel token whose interpretations depends on the assumed vowel space. (b) The outline of the same vowel spaces presented as polygons. Uniform scaling expands or shrinks the polygons but preserves their shape. (c) The same comparison expressed in log-transformed Hz. Each IPA symbols shows a speaker’s vowel target</w:t>
+              <w:t xml:space="preserve">marks an ambiguous token whose interpretation depends on the assumed vowel space. (b) The outline of the same vowel spaces presented as polygons. Uniform scaling expands or shrinks the polygons but preserves their shape. (c) The same comparison expressed in log-transformed Hz, with targets</w:t>
             </w:r>
             <w:r>
               <w:t xml:space="preserve"> </w:t>
@@ -3231,7 +3231,7 @@
               <w:t xml:space="preserve"> </w:t>
             </w:r>
             <w:r>
-              <w:t xml:space="preserve">in a log-F1-F2 space. The two vowel systems now differ in</w:t>
+              <w:t xml:space="preserve">shown in a log-F1-F2 space. The vowel systems now differ in</w:t>
             </w:r>
             <w:r>
               <w:t xml:space="preserve"> </w:t>
@@ -3251,7 +3251,7 @@
               </m:sSub>
             </m:oMath>
             <w:r>
-              <w:t xml:space="preserve">. (d) When expressed in log-Hz, uniform scaling results in shifts of the polygons without changing their shape and size.</w:t>
+              <w:t xml:space="preserve">. (d) When expressed in log-Hz, uniform scaling results in shifts of the polygons without changes in their shape or size.</w:t>
             </w:r>
           </w:p>
           <w:bookmarkEnd w:id="27"/>
@@ -3916,7 +3916,21 @@
         </m:sSub>
       </m:oMath>
       <w:r>
-        <w:t xml:space="preserve">. We may then use the multivariate normal density (MVN) of each vowel to calculate the likelihood of any observed log-transformed formant input</w:t>
+        <w:t xml:space="preserve">. We may then use the multivariate normal density (</w:t>
+      </w:r>
+      <m:oMath>
+        <m:r>
+          <m:t>M</m:t>
+        </m:r>
+        <m:r>
+          <m:t>V</m:t>
+        </m:r>
+        <m:r>
+          <m:t>N</m:t>
+        </m:r>
+      </m:oMath>
+      <w:r>
+        <w:t xml:space="preserve">) of each vowel to calculate the likelihood of any observed log-transformed formant input</w:t>
       </w:r>
       <w:r>
         <w:t xml:space="preserve"> </w:t>
@@ -3971,7 +3985,7 @@
         </w:r>
       </w:hyperlink>
       <w:r>
-        <w:t xml:space="preserve">(d) above or, equivalently, by scaling the formants into the normalized template space:</w:t>
+        <w:t xml:space="preserve">(d) or, equivalently, by scaling the formants into the normalized template space:</w:t>
       </w:r>
     </w:p>
     <w:p>
@@ -4848,7 +4862,7 @@
         <w:t xml:space="preserve"> </w:t>
       </w:r>
       <w:r>
-        <w:t xml:space="preserve">(as assumed in Nearey and Assmann 2007)</w:t>
+        <w:t xml:space="preserve">(as in Nearey and Assmann 2007)</w:t>
       </w:r>
       <w:r>
         <w:t xml:space="preserve"> </w:t>
@@ -4971,7 +4985,7 @@
       </w:r>
     </w:p>
     <w:bookmarkEnd w:id="32"/>
-    <w:bookmarkStart w:id="59" w:name="sec-methods"/>
+    <w:bookmarkStart w:id="60" w:name="sec-methods"/>
     <w:p>
       <w:pPr>
         <w:pStyle w:val="Heading1"/>
@@ -5481,7 +5495,7 @@
         <w:t xml:space="preserve"> </w:t>
       </w:r>
       <w:r>
-        <w:t xml:space="preserve">will yield systematically different estimates</w:t>
+        <w:t xml:space="preserve">will yield systematically different estimates of</w:t>
       </w:r>
       <w:r>
         <w:t xml:space="preserve"> </w:t>
@@ -5589,7 +5603,7 @@
         <w:t xml:space="preserve">listeners</w:t>
       </w:r>
       <w:r>
-        <w:t xml:space="preserve">. And, unlike researchers, listeners who encounter an unfamiliar talker do not have the luxury of waiting until they have observed a large amount of formant inputs from that talker: if normalization via uniform scaling is to aid robust speech perception, listeners must quickly arrive at adequate estimates of</w:t>
+        <w:t xml:space="preserve">. And, unlike researchers, listeners who encounter an unfamiliar talker do not have the luxury of waiting until they have observed a large amount of formant inputs from that talker: if normalization via uniform scaling underlies robust speech perception, listeners must quickly arrive at adequate estimates of</w:t>
       </w:r>
       <w:r>
         <w:t xml:space="preserve"> </w:t>
@@ -5609,7 +5623,7 @@
         </m:sSub>
       </m:oMath>
       <w:r>
-        <w:t xml:space="preserve">—ideally within the very first instance of a vowel that they heard from the unfamiliar talker. If listeners were using something like</w:t>
+        <w:t xml:space="preserve">—ideally given a single instance of a vowel that they hear from the unfamiliar talker. If listeners were using something like</w:t>
       </w:r>
       <w:r>
         <w:t xml:space="preserve"> </w:t>
@@ -5778,7 +5792,7 @@
         <w:t xml:space="preserve"> </w:t>
       </w:r>
       <w:r>
-        <w:t xml:space="preserve">depending on the acoustic and indexical characteristics of the talker. Here, we focus on three of the methods proposed by Nearey and Assmann (methods 2, 3, and 6). These methods differ only in their assumptions about listeners’ prior expectations about</w:t>
+        <w:t xml:space="preserve">depending on the acoustic and indexical characteristics of the talker. Here, we focus on three of the methods proposed by Nearey and Assmann (methods 2, 3, and 6), differing only in their assumptions about listeners’ prior expectations about</w:t>
       </w:r>
       <w:r>
         <w:t xml:space="preserve"> </w:t>
@@ -5821,7 +5835,7 @@
         <w:t xml:space="preserve">. By comparing how well these methods fit listeners’ behavior, one can therefore test hypotheses about the type of implicit knowledge listeners have. Before we turn to the differences between the three methods, we describe their shared characteristics.</w:t>
       </w:r>
     </w:p>
-    <w:bookmarkStart w:id="39" w:name="sec-shared"/>
+    <w:bookmarkStart w:id="40" w:name="sec-shared"/>
     <w:p>
       <w:pPr>
         <w:pStyle w:val="Heading2"/>
@@ -6176,15 +6190,15 @@
               <m:r>
                 <m:t>P</m:t>
               </m:r>
-              <m:sSub>
+              <m:d>
+                <m:dPr>
+                  <m:begChr m:val="("/>
+                  <m:endChr m:val=")"/>
+                  <m:sepChr m:val=""/>
+                  <m:grow/>
+                </m:dPr>
                 <m:e>
-                  <m:d>
-                    <m:dPr>
-                      <m:begChr m:val="("/>
-                      <m:endChr m:val=")"/>
-                      <m:sepChr m:val=""/>
-                      <m:grow/>
-                    </m:dPr>
+                  <m:sSub>
                     <m:e>
                       <m:r>
                         <m:rPr>
@@ -6194,14 +6208,14 @@
                         <m:t>v</m:t>
                       </m:r>
                     </m:e>
-                  </m:d>
+                    <m:sub>
+                      <m:r>
+                        <m:t>j</m:t>
+                      </m:r>
+                    </m:sub>
+                  </m:sSub>
                 </m:e>
-                <m:sub>
-                  <m:r>
-                    <m:t>j</m:t>
-                  </m:r>
-                </m:sub>
-              </m:sSub>
+              </m:d>
             </m:num>
             <m:den>
               <m:nary>
@@ -6551,16 +6565,7 @@
         <w:t xml:space="preserve"> </w:t>
       </w:r>
       <w:r>
-        <w:t xml:space="preserve">for each vowel category based on any reasonably sized database of vowel formants from the dialect(s) that the listener is assumed to have learned their template(s) from.</w:t>
-      </w:r>
-      <w:r>
-        <w:t xml:space="preserve"> </w:t>
-      </w:r>
-      <w:r>
-        <w:t xml:space="preserve"> </w:t>
-      </w:r>
-      <w:r>
-        <w:t xml:space="preserve">Similarly,</w:t>
+        <w:t xml:space="preserve">for each vowel category based on any reasonably sized database of normalized vowel formants from the dialect(s) that the listener is assumed to have learned their template(s) from. Similarly,</w:t>
       </w:r>
       <w:r>
         <w:t xml:space="preserve"> </w:t>
@@ -8281,6 +8286,356 @@
             </m:mPr>
             <m:mr>
               <m:e>
+                <m:r>
+                  <m:t>c</m:t>
+                </m:r>
+                <m:box>
+                  <m:boxPr>
+                    <m:opEmu m:val="on"/>
+                  </m:boxPr>
+                  <m:e>
+                    <m:r>
+                      <m:rPr>
+                        <m:sty m:val="p"/>
+                      </m:rPr>
+                      <m:t>:=</m:t>
+                    </m:r>
+                  </m:e>
+                </m:box>
+                <m:limLow>
+                  <m:e>
+                    <m:r>
+                      <m:rPr>
+                        <m:sty m:val="p"/>
+                      </m:rPr>
+                      <m:t>arg</m:t>
+                    </m:r>
+                    <m:r>
+                      <m:rPr>
+                        <m:sty m:val="p"/>
+                      </m:rPr>
+                      <m:t>max</m:t>
+                    </m:r>
+                  </m:e>
+                  <m:lim>
+                    <m:r>
+                      <m:rPr>
+                        <m:nor/>
+                        <m:sty m:val="p"/>
+                      </m:rPr>
+                      <m:t>v</m:t>
+                    </m:r>
+                  </m:lim>
+                </m:limLow>
+                <m:d>
+                  <m:dPr>
+                    <m:begChr m:val="["/>
+                    <m:endChr m:val="]"/>
+                    <m:sepChr m:val=""/>
+                    <m:grow/>
+                  </m:dPr>
+                  <m:e>
+                    <m:r>
+                      <m:t>P</m:t>
+                    </m:r>
+                    <m:d>
+                      <m:dPr>
+                        <m:begChr m:val="("/>
+                        <m:endChr m:val=")"/>
+                        <m:sepChr m:val=""/>
+                        <m:grow/>
+                      </m:dPr>
+                      <m:e>
+                        <m:r>
+                          <m:rPr>
+                            <m:nor/>
+                            <m:sty m:val="p"/>
+                          </m:rPr>
+                          <m:t>v</m:t>
+                        </m:r>
+                        <m:r>
+                          <m:rPr>
+                            <m:sty m:val="p"/>
+                          </m:rPr>
+                          <m:t>|</m:t>
+                        </m:r>
+                        <m:acc>
+                          <m:accPr>
+                            <m:chr m:val="⃗"/>
+                          </m:accPr>
+                          <m:e>
+                            <m:r>
+                              <m:t>G</m:t>
+                            </m:r>
+                          </m:e>
+                        </m:acc>
+                        <m:r>
+                          <m:rPr>
+                            <m:sty m:val="p"/>
+                          </m:rPr>
+                          <m:t>,</m:t>
+                        </m:r>
+                        <m:sSub>
+                          <m:e>
+                            <m:acc>
+                              <m:accPr>
+                                <m:chr m:val="̂"/>
+                              </m:accPr>
+                              <m:e>
+                                <m:r>
+                                  <m:t>ψ</m:t>
+                                </m:r>
+                              </m:e>
+                            </m:acc>
+                          </m:e>
+                          <m:sub>
+                            <m:r>
+                              <m:t>s</m:t>
+                            </m:r>
+                            <m:r>
+                              <m:rPr>
+                                <m:sty m:val="p"/>
+                              </m:rPr>
+                              <m:t>,</m:t>
+                            </m:r>
+                            <m:r>
+                              <m:rPr>
+                                <m:nor/>
+                                <m:sty m:val="p"/>
+                              </m:rPr>
+                              <m:t>v</m:t>
+                            </m:r>
+                          </m:sub>
+                        </m:sSub>
+                      </m:e>
+                    </m:d>
+                  </m:e>
+                </m:d>
+              </m:e>
+            </m:mr>
+            <m:mr>
+              <m:e>
+                <m:sSub>
+                  <m:e>
+                    <m:acc>
+                      <m:accPr>
+                        <m:chr m:val="̂"/>
+                      </m:accPr>
+                      <m:e>
+                        <m:r>
+                          <m:t>ψ</m:t>
+                        </m:r>
+                      </m:e>
+                    </m:acc>
+                  </m:e>
+                  <m:sub>
+                    <m:r>
+                      <m:t>s</m:t>
+                    </m:r>
+                  </m:sub>
+                </m:sSub>
+                <m:box>
+                  <m:boxPr>
+                    <m:opEmu m:val="on"/>
+                  </m:boxPr>
+                  <m:e>
+                    <m:r>
+                      <m:rPr>
+                        <m:sty m:val="p"/>
+                      </m:rPr>
+                      <m:t>:=</m:t>
+                    </m:r>
+                  </m:e>
+                </m:box>
+                <m:limLow>
+                  <m:e>
+                    <m:r>
+                      <m:rPr>
+                        <m:sty m:val="p"/>
+                      </m:rPr>
+                      <m:t>arg</m:t>
+                    </m:r>
+                    <m:r>
+                      <m:rPr>
+                        <m:sty m:val="p"/>
+                      </m:rPr>
+                      <m:t>max</m:t>
+                    </m:r>
+                  </m:e>
+                  <m:lim>
+                    <m:sSub>
+                      <m:e>
+                        <m:r>
+                          <m:t>ψ</m:t>
+                        </m:r>
+                      </m:e>
+                      <m:sub>
+                        <m:r>
+                          <m:t>s</m:t>
+                        </m:r>
+                      </m:sub>
+                    </m:sSub>
+                  </m:lim>
+                </m:limLow>
+                <m:d>
+                  <m:dPr>
+                    <m:begChr m:val="["/>
+                    <m:endChr m:val="]"/>
+                    <m:sepChr m:val=""/>
+                    <m:grow/>
+                  </m:dPr>
+                  <m:e>
+                    <m:r>
+                      <m:t>P</m:t>
+                    </m:r>
+                    <m:d>
+                      <m:dPr>
+                        <m:begChr m:val="("/>
+                        <m:endChr m:val=")"/>
+                        <m:sepChr m:val=""/>
+                        <m:grow/>
+                      </m:dPr>
+                      <m:e>
+                        <m:sSub>
+                          <m:e>
+                            <m:r>
+                              <m:t>ψ</m:t>
+                            </m:r>
+                          </m:e>
+                          <m:sub>
+                            <m:r>
+                              <m:t>s</m:t>
+                            </m:r>
+                          </m:sub>
+                        </m:sSub>
+                        <m:r>
+                          <m:rPr>
+                            <m:sty m:val="p"/>
+                          </m:rPr>
+                          <m:t>|</m:t>
+                        </m:r>
+                        <m:acc>
+                          <m:accPr>
+                            <m:chr m:val="⃗"/>
+                          </m:accPr>
+                          <m:e>
+                            <m:r>
+                              <m:t>G</m:t>
+                            </m:r>
+                          </m:e>
+                        </m:acc>
+                        <m:r>
+                          <m:rPr>
+                            <m:sty m:val="p"/>
+                          </m:rPr>
+                          <m:t>,</m:t>
+                        </m:r>
+                        <m:r>
+                          <m:rPr>
+                            <m:nor/>
+                            <m:sty m:val="p"/>
+                          </m:rPr>
+                          <m:t>v</m:t>
+                        </m:r>
+                        <m:r>
+                          <m:rPr>
+                            <m:sty m:val="p"/>
+                          </m:rPr>
+                          <m:t>=</m:t>
+                        </m:r>
+                        <m:r>
+                          <m:t>c</m:t>
+                        </m:r>
+                      </m:e>
+                    </m:d>
+                  </m:e>
+                </m:d>
+                <m:r>
+                  <m:rPr>
+                    <m:sty m:val="p"/>
+                  </m:rPr>
+                  <m:t>=</m:t>
+                </m:r>
+                <m:sSub>
+                  <m:e>
+                    <m:acc>
+                      <m:accPr>
+                        <m:chr m:val="̂"/>
+                      </m:accPr>
+                      <m:e>
+                        <m:r>
+                          <m:t>ψ</m:t>
+                        </m:r>
+                      </m:e>
+                    </m:acc>
+                  </m:e>
+                  <m:sub>
+                    <m:r>
+                      <m:t>s</m:t>
+                    </m:r>
+                    <m:r>
+                      <m:rPr>
+                        <m:sty m:val="p"/>
+                      </m:rPr>
+                      <m:t>,</m:t>
+                    </m:r>
+                    <m:r>
+                      <m:rPr>
+                        <m:nor/>
+                        <m:sty m:val="p"/>
+                      </m:rPr>
+                      <m:t>v=c</m:t>
+                    </m:r>
+                  </m:sub>
+                </m:sSub>
+              </m:e>
+            </m:mr>
+          </m:m>
+          <m:r>
+            <m:t>  </m:t>
+          </m:r>
+          <m:d>
+            <m:dPr>
+              <m:begChr m:val="("/>
+              <m:endChr m:val=")"/>
+              <m:sepChr m:val=""/>
+              <m:grow/>
+            </m:dPr>
+            <m:e>
+              <m:r>
+                <m:t>10</m:t>
+              </m:r>
+            </m:e>
+          </m:d>
+        </m:oMath>
+      </m:oMathPara>
+      <w:bookmarkEnd w:id="38"/>
+    </w:p>
+    <w:p>
+      <w:pPr>
+        <w:pStyle w:val="FirstParagraph"/>
+      </w:pPr>
+      <w:bookmarkStart w:id="39" w:name="eq-criterion-psi-and-vowel-original"/>
+      <m:oMathPara>
+        <m:oMathParaPr>
+          <m:jc m:val="center"/>
+        </m:oMathParaPr>
+        <m:oMath>
+          <m:m>
+            <m:mPr>
+              <m:baseJc m:val="center"/>
+              <m:plcHide m:val="on"/>
+              <m:mcs>
+                <m:mc>
+                  <m:mcPr>
+                    <m:mcJc m:val="right"/>
+                    <m:count m:val="1"/>
+                  </m:mcPr>
+                </m:mc>
+              </m:mcs>
+            </m:mPr>
+            <m:mr>
+              <m:e>
                 <m:sSub>
                   <m:e>
                     <m:acc>
@@ -8487,16 +8842,16 @@
             </m:dPr>
             <m:e>
               <m:r>
-                <m:t>10</m:t>
+                <m:t>11</m:t>
               </m:r>
             </m:e>
           </m:d>
         </m:oMath>
       </m:oMathPara>
-      <w:bookmarkEnd w:id="38"/>
+      <w:bookmarkEnd w:id="39"/>
     </w:p>
-    <w:bookmarkEnd w:id="39"/>
-    <w:bookmarkStart w:id="45" w:name="X9b746e23ddc6016eff82a2e0684fd2b0ab151a7"/>
+    <w:bookmarkEnd w:id="40"/>
+    <w:bookmarkStart w:id="46" w:name="X9b746e23ddc6016eff82a2e0684fd2b0ab151a7"/>
     <w:p>
       <w:pPr>
         <w:pStyle w:val="Heading2"/>
@@ -8554,7 +8909,7 @@
           <w:rPr>
             <w:rStyle w:val="Hyperlink"/>
           </w:rPr>
-          <w:t xml:space="preserve">Equation 11</w:t>
+          <w:t xml:space="preserve">Equation 12</w:t>
         </w:r>
       </w:hyperlink>
       <w:r>
@@ -8616,14 +8971,14 @@
         <w:t xml:space="preserve"> </w:t>
       </w:r>
       <w:r>
-        <w:t xml:space="preserve">is equally plausible.</w:t>
+        <w:t xml:space="preserve">is equally plausible a priori.</w:t>
       </w:r>
     </w:p>
     <w:p>
       <w:pPr>
         <w:pStyle w:val="BodyText"/>
       </w:pPr>
-      <w:bookmarkStart w:id="40" w:name="eq-method2"/>
+      <w:bookmarkStart w:id="41" w:name="eq-method2"/>
       <m:oMathPara>
         <m:oMathParaPr>
           <m:jc m:val="center"/>
@@ -9040,13 +9395,13 @@
             </m:dPr>
             <m:e>
               <m:r>
-                <m:t>11</m:t>
+                <m:t>12</m:t>
               </m:r>
             </m:e>
           </m:d>
         </m:oMath>
       </m:oMathPara>
-      <w:bookmarkEnd w:id="40"/>
+      <w:bookmarkEnd w:id="41"/>
     </w:p>
     <w:p>
       <w:pPr>
@@ -9234,14 +9589,14 @@
           <w:rPr>
             <w:rStyle w:val="Hyperlink"/>
           </w:rPr>
-          <w:t xml:space="preserve">Equation 11</w:t>
+          <w:t xml:space="preserve">Equation 12</w:t>
         </w:r>
       </w:hyperlink>
       <w:r>
         <w:t xml:space="preserve"> </w:t>
       </w:r>
       <w:r>
-        <w:t xml:space="preserve">for four vowel hypotheses, along with different interpretations of an ambiguous vowel according the MAP estimates</w:t>
+        <w:t xml:space="preserve">for four vowel hypotheses, along with different interpretations of an ambiguous vowel according MAP estimates</w:t>
       </w:r>
       <w:r>
         <w:t xml:space="preserve"> </w:t>
@@ -9298,7 +9653,7 @@
         <w:t xml:space="preserve"> </w:t>
       </w:r>
       <w:r>
-        <w:t xml:space="preserve">that are</w:t>
+        <w:t xml:space="preserve">that are, as we will see,</w:t>
       </w:r>
       <w:r>
         <w:t xml:space="preserve"> </w:t>
@@ -9366,7 +9721,7 @@
       <w:tr>
         <w:tc>
           <w:tcPr/>
-          <w:bookmarkStart w:id="44" w:name="fig-slidingtemplate2"/>
+          <w:bookmarkStart w:id="45" w:name="fig-slidingtemplate2"/>
           <w:p>
             <w:pPr>
               <w:pStyle w:val="Compact"/>
@@ -9377,18 +9732,18 @@
                 <wp:inline>
                   <wp:extent cx="5334000" cy="1778000"/>
                   <wp:effectExtent b="0" l="0" r="0" t="0"/>
-                  <wp:docPr descr="" title="" id="42" name="Picture"/>
+                  <wp:docPr descr="" title="" id="43" name="Picture"/>
                   <a:graphic>
                     <a:graphicData uri="http://schemas.openxmlformats.org/drawingml/2006/picture">
                       <pic:pic>
                         <pic:nvPicPr>
-                          <pic:cNvPr descr="Re_introducing_the_PSTM_files/figure-docx/fig-slidingtemplate2-1.png" id="43" name="Picture"/>
+                          <pic:cNvPr descr="Re_introducing_the_PSTM_files/figure-docx/fig-slidingtemplate2-1.png" id="44" name="Picture"/>
                           <pic:cNvPicPr>
                             <a:picLocks noChangeArrowheads="1" noChangeAspect="1"/>
                           </pic:cNvPicPr>
                         </pic:nvPicPr>
                         <pic:blipFill>
-                          <a:blip r:embed="rId41"/>
+                          <a:blip r:embed="rId42"/>
                           <a:stretch>
                             <a:fillRect/>
                           </a:stretch>
@@ -9440,7 +9795,7 @@
               <w:t xml:space="preserve">”</w:t>
             </w:r>
             <w:r>
-              <w:t xml:space="preserve">, relative to four possible ways of sliding the dialect template, corresponding to four different values of</w:t>
+              <w:t xml:space="preserve">, relative to four possible positions of the dialect template, corresponding to four different values of</w:t>
             </w:r>
             <w:r>
               <w:t xml:space="preserve"> </w:t>
@@ -9532,7 +9887,7 @@
               <w:t xml:space="preserve"> </w:t>
             </w:r>
             <w:r>
-              <w:t xml:space="preserve">across the normalized template. Black line indicates the possible interpretations of the point in (a), ellipses enclose one standard deviation. Points indicate the best possible locations for /ɑ/ (1), /c/ (2), /o/ (3), and /ʌ/ (4), according to method 2. These interpretations correspond to the different vowel spaces (colors) in (a). (c) Posterior distributions of</w:t>
+              <w:t xml:space="preserve">across the normalized template. Black line indicates possible interpretations of the point in (a), ellipses enclose one standard deviation. Points indicate the best possible locations for /ɑ/ (1), /c/ (2), /o/ (3), and /ʌ/ (4), according to method 2. These interpretations correspond to the different vowel spaces (colors) in (a). (c) Posterior distributions of</w:t>
             </w:r>
             <w:r>
               <w:t xml:space="preserve"> </w:t>
@@ -9555,7 +9910,34 @@
               <w:t xml:space="preserve"> </w:t>
             </w:r>
             <w:r>
-              <w:t xml:space="preserve">given different vowel categories. Because the prior exerts no influence in method 2 , these posteriors are proportional to the likelihood:</w:t>
+              <w:t xml:space="preserve">given different vowel categories. Because method 2 uses a uniform prior, these posteriors are proportional to the likelihood. Thus, curves in (c) represent the vowel-specific densities of</w:t>
+            </w:r>
+            <w:r>
+              <w:t xml:space="preserve"> </w:t>
+            </w:r>
+            <m:oMath>
+              <m:sSub>
+                <m:e>
+                  <m:acc>
+                    <m:accPr>
+                      <m:chr m:val="⃗"/>
+                    </m:accPr>
+                    <m:e>
+                      <m:r>
+                        <m:t>G</m:t>
+                      </m:r>
+                    </m:e>
+                  </m:acc>
+                </m:e>
+                <m:sub>
+                  <m:r>
+                    <m:t>x</m:t>
+                  </m:r>
+                </m:sub>
+              </m:sSub>
+            </m:oMath>
+            <w:r>
+              <w:t xml:space="preserve">,</w:t>
             </w:r>
             <w:r>
               <w:t xml:space="preserve"> </w:t>
@@ -9642,7 +10024,7 @@
               </m:d>
             </m:oMath>
             <w:r>
-              <w:t xml:space="preserve">. Thus, these curves represent the values of the densities of the distributions in (b) along the line. This highlighta the relationship between categorization and</w:t>
+              <w:t xml:space="preserve">, along the black line in (b). This highlights the relationship between categorization and</w:t>
             </w:r>
             <w:r>
               <w:t xml:space="preserve"> </w:t>
@@ -9668,12 +10050,12 @@
               <w:t xml:space="preserve">estimation.</w:t>
             </w:r>
           </w:p>
-          <w:bookmarkEnd w:id="44"/>
+          <w:bookmarkEnd w:id="45"/>
         </w:tc>
       </w:tr>
     </w:tbl>
-    <w:bookmarkEnd w:id="45"/>
-    <w:bookmarkStart w:id="52" w:name="Xdc2157e4d5b9d71dc91035c1cde956ca07baea9"/>
+    <w:bookmarkEnd w:id="46"/>
+    <w:bookmarkStart w:id="53" w:name="Xdc2157e4d5b9d71dc91035c1cde956ca07baea9"/>
     <w:p>
       <w:pPr>
         <w:pStyle w:val="Heading2"/>
@@ -9711,7 +10093,7 @@
           <w:rPr>
             <w:rStyle w:val="Hyperlink"/>
           </w:rPr>
-          <w:t xml:space="preserve">Equation 12</w:t>
+          <w:t xml:space="preserve">Equation 13</w:t>
         </w:r>
       </w:hyperlink>
       <w:r>
@@ -9825,30 +10207,7 @@
         <w:t xml:space="preserve"> </w:t>
       </w:r>
       <w:r>
-        <w:t xml:space="preserve">based on the</w:t>
-      </w:r>
-      <w:r>
-        <w:t xml:space="preserve"> </w:t>
-      </w:r>
-      <m:oMath>
-        <m:sSub>
-          <m:e>
-            <m:r>
-              <m:t>ψ</m:t>
-            </m:r>
-          </m:e>
-          <m:sub>
-            <m:r>
-              <m:t>s</m:t>
-            </m:r>
-          </m:sub>
-        </m:sSub>
-      </m:oMath>
-      <w:r>
-        <w:t xml:space="preserve"> </w:t>
-      </w:r>
-      <w:r>
-        <w:t xml:space="preserve">that the listener previously observed across speakers. This means that values of</w:t>
+        <w:t xml:space="preserve">based on values the listener previously observed across speakers. This means that values of</w:t>
       </w:r>
       <w:r>
         <w:t xml:space="preserve"> </w:t>
@@ -9898,7 +10257,7 @@
       <w:pPr>
         <w:pStyle w:val="BodyText"/>
       </w:pPr>
-      <w:bookmarkStart w:id="46" w:name="eq-method3"/>
+      <w:bookmarkStart w:id="47" w:name="eq-method3"/>
       <m:oMathPara>
         <m:oMathParaPr>
           <m:jc m:val="center"/>
@@ -10383,13 +10742,13 @@
             </m:dPr>
             <m:e>
               <m:r>
-                <m:t>12</m:t>
+                <m:t>13</m:t>
               </m:r>
             </m:e>
           </m:d>
         </m:oMath>
       </m:oMathPara>
-      <w:bookmarkEnd w:id="46"/>
+      <w:bookmarkEnd w:id="47"/>
     </w:p>
     <w:p>
       <w:pPr>
@@ -10568,7 +10927,7 @@
         <w:t xml:space="preserve"> </w:t>
       </w:r>
       <w:r>
-        <w:t xml:space="preserve">based a database of 265 speakers of US English (86 adult females, 88 adult males, 91 children) from three dialect regions</w:t>
+        <w:t xml:space="preserve">based on a database of 265 speakers of US English (86 adult females, 88 adult males, 91 children) from three dialect regions</w:t>
       </w:r>
       <w:r>
         <w:t xml:space="preserve"> </w:t>
@@ -10583,7 +10942,7 @@
         <w:rPr>
           <w:rStyle w:val="FootnoteReference"/>
         </w:rPr>
-        <w:footnoteReference w:id="47"/>
+        <w:footnoteReference w:id="48"/>
       </w:r>
       <w:r>
         <w:t xml:space="preserve"> </w:t>
@@ -10743,7 +11102,7 @@
       <w:tr>
         <w:tc>
           <w:tcPr/>
-          <w:bookmarkStart w:id="51" w:name="fig-slidingtemplate3"/>
+          <w:bookmarkStart w:id="52" w:name="fig-slidingtemplate3"/>
           <w:p>
             <w:pPr>
               <w:pStyle w:val="Compact"/>
@@ -10754,18 +11113,18 @@
                 <wp:inline>
                   <wp:extent cx="5334000" cy="2667000"/>
                   <wp:effectExtent b="0" l="0" r="0" t="0"/>
-                  <wp:docPr descr="" title="" id="49" name="Picture"/>
+                  <wp:docPr descr="" title="" id="50" name="Picture"/>
                   <a:graphic>
                     <a:graphicData uri="http://schemas.openxmlformats.org/drawingml/2006/picture">
                       <pic:pic>
                         <pic:nvPicPr>
-                          <pic:cNvPr descr="Re_introducing_the_PSTM_files/figure-docx/fig-slidingtemplate3-1.png" id="50" name="Picture"/>
+                          <pic:cNvPr descr="Re_introducing_the_PSTM_files/figure-docx/fig-slidingtemplate3-1.png" id="51" name="Picture"/>
                           <pic:cNvPicPr>
                             <a:picLocks noChangeArrowheads="1" noChangeAspect="1"/>
                           </pic:cNvPicPr>
                         </pic:nvPicPr>
                         <pic:blipFill>
-                          <a:blip r:embed="rId48"/>
+                          <a:blip r:embed="rId49"/>
                           <a:stretch>
                             <a:fillRect/>
                           </a:stretch>
@@ -10802,7 +11161,7 @@
               <w:pStyle w:val="ImageCaption"/>
             </w:pPr>
             <w:r>
-              <w:t xml:space="preserve">Figure 3: Comparison of different methods (columns) to estimating the prior probability of</w:t>
+              <w:t xml:space="preserve">Figure 3: Comparison of different approaches (columns) to estimating prior probability of</w:t>
             </w:r>
             <w:r>
               <w:t xml:space="preserve"> </w:t>
@@ -10932,7 +11291,7 @@
               <w:t xml:space="preserve"> </w:t>
             </w:r>
             <w:r>
-              <w:t xml:space="preserve">(location on x-axis of highest peak), and vowel category (color of curve with highest peak), changes as a function of the selected prior, and the vowel token’s</w:t>
+              <w:t xml:space="preserve">(location on x-axis of highest peak), and vowel category (color of curve with highest peak), changes as a function of selected prior, and vowel token’s</w:t>
             </w:r>
             <w:r>
               <w:t xml:space="preserve"> </w:t>
@@ -10949,12 +11308,12 @@
               <w:t xml:space="preserve">.</w:t>
             </w:r>
           </w:p>
-          <w:bookmarkEnd w:id="51"/>
+          <w:bookmarkEnd w:id="52"/>
         </w:tc>
       </w:tr>
     </w:tbl>
-    <w:bookmarkEnd w:id="52"/>
-    <w:bookmarkStart w:id="56" w:name="X4fd97fcded3d44de1b0f0e26c486906b034e458"/>
+    <w:bookmarkEnd w:id="53"/>
+    <w:bookmarkStart w:id="57" w:name="X4fd97fcded3d44de1b0f0e26c486906b034e458"/>
     <w:p>
       <w:pPr>
         <w:pStyle w:val="Heading2"/>
@@ -11152,7 +11511,7 @@
           <w:rPr>
             <w:rStyle w:val="Hyperlink"/>
           </w:rPr>
-          <w:t xml:space="preserve">Equation 13</w:t>
+          <w:t xml:space="preserve">Equation 14</w:t>
         </w:r>
       </w:hyperlink>
       <w:r>
@@ -11163,7 +11522,7 @@
       <w:pPr>
         <w:pStyle w:val="BodyText"/>
       </w:pPr>
-      <w:bookmarkStart w:id="53" w:name="eq-method6"/>
+      <w:bookmarkStart w:id="54" w:name="eq-method6"/>
       <m:oMathPara>
         <m:oMathParaPr>
           <m:jc m:val="center"/>
@@ -11420,13 +11779,13 @@
             </m:dPr>
             <m:e>
               <m:r>
-                <m:t>13</m:t>
+                <m:t>14</m:t>
               </m:r>
             </m:e>
           </m:d>
         </m:oMath>
       </m:oMathPara>
-      <w:bookmarkEnd w:id="53"/>
+      <w:bookmarkEnd w:id="54"/>
     </w:p>
     <w:p>
       <w:pPr>
@@ -11491,7 +11850,7 @@
           <w:rPr>
             <w:rStyle w:val="Hyperlink"/>
           </w:rPr>
-          <w:t xml:space="preserve">Equation 13</w:t>
+          <w:t xml:space="preserve">Equation 14</w:t>
         </w:r>
       </w:hyperlink>
       <w:r>
@@ -11575,7 +11934,10 @@
         </m:sSub>
       </m:oMath>
       <w:r>
-        <w:t xml:space="preserve">s from estimates of</w:t>
+        <w:t xml:space="preserve"> </w:t>
+      </w:r>
+      <w:r>
+        <w:t xml:space="preserve">from estimates of</w:t>
       </w:r>
       <w:r>
         <w:t xml:space="preserve"> </w:t>
@@ -11647,7 +12009,7 @@
         <w:rPr>
           <w:rStyle w:val="FootnoteReference"/>
         </w:rPr>
-        <w:footnoteReference w:id="54"/>
+        <w:footnoteReference w:id="55"/>
       </w:r>
       <w:r>
         <w:t xml:space="preserve"> </w:t>
@@ -11829,7 +12191,7 @@
       <w:pPr>
         <w:pStyle w:val="BodyText"/>
       </w:pPr>
-      <w:bookmarkStart w:id="55" w:name="eq-posterior-g0"/>
+      <w:bookmarkStart w:id="56" w:name="eq-posterior-g0"/>
       <m:oMathPara>
         <m:oMathParaPr>
           <m:jc m:val="center"/>
@@ -12075,13 +12437,13 @@
             </m:dPr>
             <m:e>
               <m:r>
-                <m:t>14</m:t>
+                <m:t>15</m:t>
               </m:r>
             </m:e>
           </m:d>
         </m:oMath>
       </m:oMathPara>
-      <w:bookmarkEnd w:id="55"/>
+      <w:bookmarkEnd w:id="56"/>
     </w:p>
     <w:p>
       <w:pPr>
@@ -12294,8 +12656,8 @@
         <w:t xml:space="preserve">and the posterior probabilities of different vowel categories.</w:t>
       </w:r>
     </w:p>
-    <w:bookmarkEnd w:id="56"/>
-    <w:bookmarkStart w:id="58" w:name="sec-implementation"/>
+    <w:bookmarkEnd w:id="57"/>
+    <w:bookmarkStart w:id="59" w:name="sec-implementation"/>
     <w:p>
       <w:pPr>
         <w:pStyle w:val="Heading2"/>
@@ -12343,7 +12705,7 @@
           <w:rPr>
             <w:rStyle w:val="Hyperlink"/>
           </w:rPr>
-          <w:t xml:space="preserve">Equation 15</w:t>
+          <w:t xml:space="preserve">Equation 16</w:t>
         </w:r>
       </w:hyperlink>
       <w:r>
@@ -12400,7 +12762,7 @@
           <w:rPr>
             <w:rStyle w:val="Hyperlink"/>
           </w:rPr>
-          <w:t xml:space="preserve">Equation 15</w:t>
+          <w:t xml:space="preserve">Equation 16</w:t>
         </w:r>
       </w:hyperlink>
       <w:r>
@@ -12414,7 +12776,7 @@
       <w:pPr>
         <w:pStyle w:val="BodyText"/>
       </w:pPr>
-      <w:bookmarkStart w:id="57" w:name="eq-method6-solve"/>
+      <w:bookmarkStart w:id="58" w:name="eq-method6-solve"/>
       <m:oMathPara>
         <m:oMathParaPr>
           <m:jc m:val="center"/>
@@ -12935,17 +13297,17 @@
             </m:dPr>
             <m:e>
               <m:r>
-                <m:t>15</m:t>
+                <m:t>16</m:t>
               </m:r>
             </m:e>
           </m:d>
         </m:oMath>
       </m:oMathPara>
-      <w:bookmarkEnd w:id="57"/>
+      <w:bookmarkEnd w:id="58"/>
     </w:p>
-    <w:bookmarkEnd w:id="58"/>
     <w:bookmarkEnd w:id="59"/>
-    <w:bookmarkStart w:id="68" w:name="sec-bootstrap"/>
+    <w:bookmarkEnd w:id="60"/>
+    <w:bookmarkStart w:id="66" w:name="sec-bootstrap"/>
     <w:p>
       <w:pPr>
         <w:pStyle w:val="Heading1"/>
@@ -12983,131 +13345,7 @@
         <w:t xml:space="preserve"> </w:t>
       </w:r>
       <w:r>
-        <w:t xml:space="preserve">package allows researchers to conduct the similar analyses on their own data, with just a handful of R commands.</w:t>
-      </w:r>
-    </w:p>
-    <w:p>
-      <w:pPr>
-        <w:pStyle w:val="BodyText"/>
-      </w:pPr>
-      <w:r>
-        <w:t xml:space="preserve">The</w:t>
-      </w:r>
-      <w:r>
-        <w:t xml:space="preserve"> </w:t>
-      </w:r>
-      <w:r>
-        <w:t xml:space="preserve">Hillenbrand et al. (1995)</w:t>
-      </w:r>
-      <w:r>
-        <w:t xml:space="preserve"> </w:t>
-      </w:r>
-      <w:r>
-        <w:t xml:space="preserve">data include acoustic measures from 139 speakers producing one instance of twelve vowels each, including formant measures at multiple time slices. We used formant measurements at 20% and 80% of the vowel duration. This meant each vowel token was represented by a vector of length six, two measurements for each of three formants. Following</w:t>
-      </w:r>
-      <w:r>
-        <w:t xml:space="preserve"> </w:t>
-      </w:r>
-      <w:r>
-        <w:t xml:space="preserve">Nearey and Assmann (2007)</w:t>
-      </w:r>
-      <w:r>
-        <w:t xml:space="preserve">, we used two time points, capturing that formant dynamics affect vowel perception for the dialect in the database</w:t>
-      </w:r>
-      <w:r>
-        <w:t xml:space="preserve"> </w:t>
-      </w:r>
-      <w:r>
-        <w:t xml:space="preserve">(Hillenbrand and Nearey 1999)</w:t>
-      </w:r>
-      <w:r>
-        <w:t xml:space="preserve">. By fitting multivariate normal distributions in this six-dimensional space, we assume that listeners have learned expectations about the (co)variance between formants within and across time points.</w:t>
-      </w:r>
-      <w:r>
-        <w:t xml:space="preserve"> </w:t>
-      </w:r>
-    </w:p>
-    <w:p>
-      <w:pPr>
-        <w:pStyle w:val="BodyText"/>
-      </w:pPr>
-      <w:r>
-        <w:t xml:space="preserve">The</w:t>
-      </w:r>
-      <w:r>
-        <w:t xml:space="preserve"> </w:t>
-      </w:r>
-      <w:r>
-        <w:t xml:space="preserve">Hillenbrand et al. (1995)</w:t>
-      </w:r>
-      <w:r>
-        <w:t xml:space="preserve"> </w:t>
-      </w:r>
-      <w:r>
-        <w:t xml:space="preserve">data also contain 12-alternative forced-choice categorization responses for each vowel token, aggregated across 20 listeners of the same dialect as the speakers (average accuracy = 95%).</w:t>
-      </w:r>
-      <w:r>
-        <w:rPr>
-          <w:rStyle w:val="FootnoteReference"/>
-        </w:rPr>
-        <w:footnoteReference w:id="60"/>
-      </w:r>
-      <w:r>
-        <w:t xml:space="preserve"> </w:t>
-      </w:r>
-      <w:r>
-        <w:t xml:space="preserve">Crucially, these responses were elicited over stimuli from the different speakers in the database, presented in randomized order—i.e., precisely the type of input for which the naive estimation of</w:t>
-      </w:r>
-      <w:r>
-        <w:t xml:space="preserve"> </w:t>
-      </w:r>
-      <m:oMath>
-        <m:sSub>
-          <m:e>
-            <m:r>
-              <m:t>ψ</m:t>
-            </m:r>
-          </m:e>
-          <m:sub>
-            <m:r>
-              <m:t>s</m:t>
-            </m:r>
-          </m:sub>
-        </m:sSub>
-      </m:oMath>
-      <w:r>
-        <w:t xml:space="preserve"> </w:t>
-      </w:r>
-      <w:r>
-        <w:t xml:space="preserve">(</w:t>
-      </w:r>
-      <w:hyperlink w:anchor="eq-method-naive">
-        <w:r>
-          <w:rPr>
-            <w:rStyle w:val="Hyperlink"/>
-          </w:rPr>
-          <w:t xml:space="preserve">Equation 6</w:t>
-        </w:r>
-      </w:hyperlink>
-      <w:r>
-        <w:t xml:space="preserve">) is expected to yield unreliable results for listeners (confirmed below).</w:t>
-      </w:r>
-    </w:p>
-    <w:bookmarkStart w:id="62" w:name="approach"/>
-    <w:p>
-      <w:pPr>
-        <w:pStyle w:val="Heading2"/>
-      </w:pPr>
-      <w:r>
-        <w:t xml:space="preserve">5.1 Approach</w:t>
-      </w:r>
-    </w:p>
-    <w:p>
-      <w:pPr>
-        <w:pStyle w:val="FirstParagraph"/>
-      </w:pPr>
-      <w:r>
-        <w:t xml:space="preserve">For each bootstrap data set, we compare approaches based on three performance metrics:</w:t>
+        <w:t xml:space="preserve">package allows researchers to conduct similar analyses on their own data, with just a handful of R commands. Details regarding the bootstrap evaluation are found in the Appendix. For each bootstrap data set, we compare approaches based on three performance metrics:</w:t>
       </w:r>
     </w:p>
     <w:p>
@@ -13659,7 +13897,7 @@
         <w:t xml:space="preserve">Nearey and Assmann (2007)</w:t>
       </w:r>
       <w:r>
-        <w:t xml:space="preserve">. Nearey and Assman instead used the accuracy (under the criterion choice rule) of predicting the intended category label for B) and, critically, did not evaluate against listeners’ perception. The use of accuracy as a metric is now understood to be problematic, as it does not capture how well a model predicts the</w:t>
+        <w:t xml:space="preserve">. Nearey and Assmann used the accuracy (under the criterion choice rule) of predicting the intended category label for B) and, critically, did not evaluate against listeners’ perception. The use of accuracy as a metric is now understood to be problematic, as it does not capture how well a model predicts the</w:t>
       </w:r>
       <w:r>
         <w:t xml:space="preserve"> </w:t>
@@ -13687,799 +13925,13 @@
         <w:t xml:space="preserve">.</w:t>
       </w:r>
     </w:p>
-    <w:p>
-      <w:pPr>
-        <w:pStyle w:val="BodyText"/>
-      </w:pPr>
-      <w:r>
-        <w:t xml:space="preserve">We bootstrapped the following process over 1000 iterations for each method (all functions referred to are from the</w:t>
-      </w:r>
-      <w:r>
-        <w:t xml:space="preserve"> </w:t>
-      </w:r>
-      <w:r>
-        <w:rPr>
-          <w:rStyle w:val="VerbatimChar"/>
-        </w:rPr>
-        <w:t xml:space="preserve">STM</w:t>
-      </w:r>
-      <w:r>
-        <w:t xml:space="preserve"> </w:t>
-      </w:r>
-      <w:r>
-        <w:t xml:space="preserve">package):</w:t>
-      </w:r>
-    </w:p>
-    <w:p>
-      <w:pPr>
-        <w:numPr>
-          <w:ilvl w:val="0"/>
-          <w:numId w:val="1002"/>
-        </w:numPr>
-      </w:pPr>
-      <w:r>
-        <w:t xml:space="preserve">Randomly divide the data into a 79-speaker training set and a 60-speaker testing set. Resample the training data (with replacement) at the speaker level. Sixty-three vowel tokens (4%) had one or two missing formant measurements (out of 6), representing 0.09% of the total formant measurements in the data. The missing values were imputed using stochastic regression imputation, independently for each iteration (using the</w:t>
-      </w:r>
-      <w:r>
-        <w:t xml:space="preserve"> </w:t>
-      </w:r>
-      <w:r>
-        <w:rPr>
-          <w:rStyle w:val="VerbatimChar"/>
-        </w:rPr>
-        <w:t xml:space="preserve">impute_NA</w:t>
-      </w:r>
-      <w:r>
-        <w:t xml:space="preserve"> </w:t>
-      </w:r>
-      <w:r>
-        <w:t xml:space="preserve">function).</w:t>
-      </w:r>
-    </w:p>
-    <w:p>
-      <w:pPr>
-        <w:numPr>
-          <w:ilvl w:val="0"/>
-          <w:numId w:val="1002"/>
-        </w:numPr>
-      </w:pPr>
-      <w:r>
-        <w:t xml:space="preserve">Uniformly scale the training data (the</w:t>
-      </w:r>
-      <w:r>
-        <w:t xml:space="preserve"> </w:t>
-      </w:r>
-      <w:r>
-        <w:rPr>
-          <w:rStyle w:val="VerbatimChar"/>
-        </w:rPr>
-        <w:t xml:space="preserve">normalize</w:t>
-      </w:r>
-      <w:r>
-        <w:t xml:space="preserve"> </w:t>
-      </w:r>
-      <w:r>
-        <w:t xml:space="preserve">function), by estimating each speaker’s</w:t>
-      </w:r>
-      <w:r>
-        <w:t xml:space="preserve"> </w:t>
-      </w:r>
-      <m:oMath>
-        <m:sSub>
-          <m:e>
-            <m:r>
-              <m:t>ψ</m:t>
-            </m:r>
-          </m:e>
-          <m:sub>
-            <m:r>
-              <m:t>s</m:t>
-            </m:r>
-          </m:sub>
-        </m:sSub>
-      </m:oMath>
-      <w:r>
-        <w:t xml:space="preserve"> </w:t>
-      </w:r>
-      <w:r>
-        <w:t xml:space="preserve">using their complete vowel system as in</w:t>
-      </w:r>
-      <w:r>
-        <w:t xml:space="preserve"> </w:t>
-      </w:r>
-      <w:hyperlink w:anchor="eq-method-naive">
-        <w:r>
-          <w:rPr>
-            <w:rStyle w:val="Hyperlink"/>
-          </w:rPr>
-          <w:t xml:space="preserve">Equation 6</w:t>
-        </w:r>
-      </w:hyperlink>
-      <w:r>
-        <w:t xml:space="preserve">, and normalizing it as in</w:t>
-      </w:r>
-      <w:r>
-        <w:t xml:space="preserve"> </w:t>
-      </w:r>
-      <w:hyperlink w:anchor="eq-define-N">
-        <w:r>
-          <w:rPr>
-            <w:rStyle w:val="Hyperlink"/>
-          </w:rPr>
-          <w:t xml:space="preserve">Equation 3</w:t>
-        </w:r>
-      </w:hyperlink>
-      <w:r>
-        <w:t xml:space="preserve">.</w:t>
-      </w:r>
-    </w:p>
-    <w:p>
-      <w:pPr>
-        <w:numPr>
-          <w:ilvl w:val="0"/>
-          <w:numId w:val="1002"/>
-        </w:numPr>
-      </w:pPr>
-      <w:r>
-        <w:t xml:space="preserve">Estimate the dialect-specific category means and covariance matrices of all vowels using the normalized training data (with</w:t>
-      </w:r>
-      <w:r>
-        <w:t xml:space="preserve"> </w:t>
-      </w:r>
-      <w:r>
-        <w:rPr>
-          <w:rStyle w:val="VerbatimChar"/>
-        </w:rPr>
-        <w:t xml:space="preserve">create_template</w:t>
-      </w:r>
-      <w:r>
-        <w:t xml:space="preserve">).</w:t>
-      </w:r>
-      <w:r>
-        <w:t xml:space="preserve"> </w:t>
-      </w:r>
-      <w:r>
-        <w:rPr>
-          <w:rStyle w:val="FootnoteReference"/>
-        </w:rPr>
-        <w:footnoteReference w:id="61"/>
-      </w:r>
-      <w:r>
-        <w:t xml:space="preserve"> </w:t>
-      </w:r>
-      <w:r>
-        <w:rPr>
-          <w:b/>
-          <w:bCs/>
-        </w:rPr>
-        <w:t xml:space="preserve">Each iteration of the bootstrap simulates a</w:t>
-      </w:r>
-      <w:r>
-        <w:rPr>
-          <w:b/>
-          <w:bCs/>
-        </w:rPr>
-        <w:t xml:space="preserve"> </w:t>
-      </w:r>
-      <w:r>
-        <w:rPr>
-          <w:b/>
-          <w:bCs/>
-        </w:rPr>
-        <w:t xml:space="preserve">‘</w:t>
-      </w:r>
-      <w:r>
-        <w:rPr>
-          <w:b/>
-          <w:bCs/>
-        </w:rPr>
-        <w:t xml:space="preserve">listener</w:t>
-      </w:r>
-      <w:r>
-        <w:rPr>
-          <w:b/>
-          <w:bCs/>
-        </w:rPr>
-        <w:t xml:space="preserve">’</w:t>
-      </w:r>
-      <w:r>
-        <w:rPr>
-          <w:b/>
-          <w:bCs/>
-        </w:rPr>
-        <w:t xml:space="preserve"> </w:t>
-      </w:r>
-      <w:r>
-        <w:rPr>
-          <w:b/>
-          <w:bCs/>
-        </w:rPr>
-        <w:t xml:space="preserve">of the dialect with slightly different speech experience.</w:t>
-      </w:r>
-    </w:p>
-    <w:p>
-      <w:pPr>
-        <w:numPr>
-          <w:ilvl w:val="0"/>
-          <w:numId w:val="1002"/>
-        </w:numPr>
-      </w:pPr>
-      <w:r>
-        <w:t xml:space="preserve">For each token in the testing data, estimate</w:t>
-      </w:r>
-      <w:r>
-        <w:t xml:space="preserve"> </w:t>
-      </w:r>
-      <m:oMath>
-        <m:sSub>
-          <m:e>
-            <m:acc>
-              <m:accPr>
-                <m:chr m:val="̂"/>
-              </m:accPr>
-              <m:e>
-                <m:r>
-                  <m:t>ψ</m:t>
-                </m:r>
-              </m:e>
-            </m:acc>
-          </m:e>
-          <m:sub>
-            <m:r>
-              <m:t>s</m:t>
-            </m:r>
-            <m:r>
-              <m:rPr>
-                <m:sty m:val="p"/>
-              </m:rPr>
-              <m:t>,</m:t>
-            </m:r>
-            <m:r>
-              <m:rPr>
-                <m:nor/>
-                <m:sty m:val="p"/>
-              </m:rPr>
-              <m:t>v</m:t>
-            </m:r>
-          </m:sub>
-        </m:sSub>
-      </m:oMath>
-      <w:r>
-        <w:t xml:space="preserve"> </w:t>
-      </w:r>
-      <w:r>
-        <w:t xml:space="preserve">for each vowel category using each method. Use these values of</w:t>
-      </w:r>
-      <w:r>
-        <w:t xml:space="preserve"> </w:t>
-      </w:r>
-      <m:oMath>
-        <m:sSub>
-          <m:e>
-            <m:acc>
-              <m:accPr>
-                <m:chr m:val="̂"/>
-              </m:accPr>
-              <m:e>
-                <m:r>
-                  <m:t>ψ</m:t>
-                </m:r>
-              </m:e>
-            </m:acc>
-          </m:e>
-          <m:sub>
-            <m:r>
-              <m:t>s</m:t>
-            </m:r>
-            <m:r>
-              <m:rPr>
-                <m:sty m:val="p"/>
-              </m:rPr>
-              <m:t>,</m:t>
-            </m:r>
-            <m:r>
-              <m:rPr>
-                <m:nor/>
-                <m:sty m:val="p"/>
-              </m:rPr>
-              <m:t>v</m:t>
-            </m:r>
-          </m:sub>
-        </m:sSub>
-      </m:oMath>
-      <w:r>
-        <w:t xml:space="preserve"> </w:t>
-      </w:r>
-      <w:r>
-        <w:t xml:space="preserve">to obtain the winning estimate</w:t>
-      </w:r>
-      <w:r>
-        <w:t xml:space="preserve"> </w:t>
-      </w:r>
-      <m:oMath>
-        <m:sSub>
-          <m:e>
-            <m:acc>
-              <m:accPr>
-                <m:chr m:val="̂"/>
-              </m:accPr>
-              <m:e>
-                <m:r>
-                  <m:t>ψ</m:t>
-                </m:r>
-              </m:e>
-            </m:acc>
-          </m:e>
-          <m:sub>
-            <m:r>
-              <m:t>s</m:t>
-            </m:r>
-          </m:sub>
-        </m:sSub>
-      </m:oMath>
-      <w:r>
-        <w:t xml:space="preserve"> </w:t>
-      </w:r>
-      <w:r>
-        <w:t xml:space="preserve">and calculate the posterior probability of each vowel category.</w:t>
-      </w:r>
-    </w:p>
-    <w:p>
-      <w:pPr>
-        <w:numPr>
-          <w:ilvl w:val="0"/>
-          <w:numId w:val="1002"/>
-        </w:numPr>
-      </w:pPr>
-      <w:r>
-        <w:t xml:space="preserve">Calculate performance metrics A)-C) described above.</w:t>
-      </w:r>
-    </w:p>
-    <w:p>
-      <w:pPr>
-        <w:pStyle w:val="FirstParagraph"/>
-      </w:pPr>
-      <w:r>
-        <w:t xml:space="preserve">We compare eight different methods that differ in terms of whether and/or how they estimate</w:t>
-      </w:r>
-      <w:r>
-        <w:t xml:space="preserve"> </w:t>
-      </w:r>
-      <m:oMath>
-        <m:sSub>
-          <m:e>
-            <m:r>
-              <m:t>ψ</m:t>
-            </m:r>
-          </m:e>
-          <m:sub>
-            <m:r>
-              <m:t>s</m:t>
-            </m:r>
-          </m:sub>
-        </m:sSub>
-      </m:oMath>
-      <w:r>
-        <w:t xml:space="preserve">:</w:t>
-      </w:r>
-    </w:p>
-    <w:p>
-      <w:pPr>
-        <w:pStyle w:val="Compact"/>
-        <w:numPr>
-          <w:ilvl w:val="0"/>
-          <w:numId w:val="1003"/>
-        </w:numPr>
-      </w:pPr>
-      <w:r>
-        <w:rPr>
-          <w:b/>
-          <w:bCs/>
-        </w:rPr>
-        <w:t xml:space="preserve">No normalization</w:t>
-      </w:r>
-    </w:p>
-    <w:p>
-      <w:pPr>
-        <w:pStyle w:val="Compact"/>
-        <w:numPr>
-          <w:ilvl w:val="1"/>
-          <w:numId w:val="1004"/>
-        </w:numPr>
-      </w:pPr>
-      <w:r>
-        <w:t xml:space="preserve">input is</w:t>
-      </w:r>
-      <w:r>
-        <w:t xml:space="preserve"> </w:t>
-      </w:r>
-      <m:oMath>
-        <m:acc>
-          <m:accPr>
-            <m:chr m:val="⃗"/>
-          </m:accPr>
-          <m:e>
-            <m:r>
-              <m:t>F</m:t>
-            </m:r>
-          </m:e>
-        </m:acc>
-      </m:oMath>
-      <w:r>
-        <w:t xml:space="preserve"> </w:t>
-      </w:r>
-      <w:r>
-        <w:t xml:space="preserve">(Hz)</w:t>
-      </w:r>
-    </w:p>
-    <w:p>
-      <w:pPr>
-        <w:pStyle w:val="Compact"/>
-        <w:numPr>
-          <w:ilvl w:val="1"/>
-          <w:numId w:val="1004"/>
-        </w:numPr>
-      </w:pPr>
-      <w:r>
-        <w:t xml:space="preserve">input is</w:t>
-      </w:r>
-      <w:r>
-        <w:t xml:space="preserve"> </w:t>
-      </w:r>
-      <m:oMath>
-        <m:acc>
-          <m:accPr>
-            <m:chr m:val="⃗"/>
-          </m:accPr>
-          <m:e>
-            <m:r>
-              <m:t>G</m:t>
-            </m:r>
-          </m:e>
-        </m:acc>
-      </m:oMath>
-      <w:r>
-        <w:t xml:space="preserve"> </w:t>
-      </w:r>
-      <w:r>
-        <w:t xml:space="preserve">(log Hz), allowing an assessment of whether log-transformation in and off itself helps.</w:t>
-      </w:r>
-    </w:p>
-    <w:p>
-      <w:pPr>
-        <w:pStyle w:val="Compact"/>
-        <w:numPr>
-          <w:ilvl w:val="0"/>
-          <w:numId w:val="1003"/>
-        </w:numPr>
-      </w:pPr>
-      <w:r>
-        <w:rPr>
-          <w:b/>
-          <w:bCs/>
-        </w:rPr>
-        <w:t xml:space="preserve">Normalization with</w:t>
-      </w:r>
-      <w:r>
-        <w:rPr>
-          <w:b/>
-          <w:bCs/>
-        </w:rPr>
-        <w:t xml:space="preserve"> </w:t>
-      </w:r>
-      <m:oMath>
-        <m:sSub>
-          <m:e>
-            <m:acc>
-              <m:accPr>
-                <m:chr m:val="̂"/>
-              </m:accPr>
-              <m:e>
-                <m:r>
-                  <m:t>ψ</m:t>
-                </m:r>
-              </m:e>
-            </m:acc>
-          </m:e>
-          <m:sub>
-            <m:r>
-              <m:t>s</m:t>
-            </m:r>
-          </m:sub>
-        </m:sSub>
-      </m:oMath>
-      <w:r>
-        <w:rPr>
-          <w:b/>
-          <w:bCs/>
-        </w:rPr>
-        <w:t xml:space="preserve"> </w:t>
-      </w:r>
-      <w:r>
-        <w:rPr>
-          <w:b/>
-          <w:bCs/>
-        </w:rPr>
-        <w:t xml:space="preserve">estimated using the</w:t>
-      </w:r>
-      <w:r>
-        <w:rPr>
-          <w:b/>
-          <w:bCs/>
-        </w:rPr>
-        <w:t xml:space="preserve"> </w:t>
-      </w:r>
-      <w:r>
-        <w:rPr>
-          <w:b/>
-          <w:bCs/>
-        </w:rPr>
-        <w:t xml:space="preserve">‘</w:t>
-      </w:r>
-      <w:r>
-        <w:rPr>
-          <w:b/>
-          <w:bCs/>
-        </w:rPr>
-        <w:t xml:space="preserve">classic approach</w:t>
-      </w:r>
-      <w:r>
-        <w:rPr>
-          <w:b/>
-          <w:bCs/>
-        </w:rPr>
-        <w:t xml:space="preserve">’</w:t>
-      </w:r>
-      <w:r>
-        <w:t xml:space="preserve"> </w:t>
-      </w:r>
-      <w:r>
-        <w:t xml:space="preserve">in</w:t>
-      </w:r>
-      <w:r>
-        <w:t xml:space="preserve"> </w:t>
-      </w:r>
-      <w:hyperlink w:anchor="eq-method-naive">
-        <w:r>
-          <w:rPr>
-            <w:rStyle w:val="Hyperlink"/>
-          </w:rPr>
-          <w:t xml:space="preserve">Equation 6</w:t>
-        </w:r>
-      </w:hyperlink>
-    </w:p>
-    <w:p>
-      <w:pPr>
-        <w:pStyle w:val="Compact"/>
-        <w:numPr>
-          <w:ilvl w:val="1"/>
-          <w:numId w:val="1005"/>
-        </w:numPr>
-      </w:pPr>
-      <w:r>
-        <w:t xml:space="preserve">over the entire training data (</w:t>
-      </w:r>
-      <w:r>
-        <w:rPr>
-          <w:i/>
-          <w:iCs/>
-        </w:rPr>
-        <w:t xml:space="preserve">PSTM1 (balanced data)</w:t>
-      </w:r>
-      <w:r>
-        <w:t xml:space="preserve">)</w:t>
-      </w:r>
-    </w:p>
-    <w:p>
-      <w:pPr>
-        <w:pStyle w:val="Compact"/>
-        <w:numPr>
-          <w:ilvl w:val="1"/>
-          <w:numId w:val="1005"/>
-        </w:numPr>
-      </w:pPr>
-      <w:r>
-        <w:t xml:space="preserve">based on the individual token (</w:t>
-      </w:r>
-      <w:r>
-        <w:rPr>
-          <w:i/>
-          <w:iCs/>
-        </w:rPr>
-        <w:t xml:space="preserve">PSTM1 (single trial)</w:t>
-      </w:r>
-      <w:r>
-        <w:t xml:space="preserve">), as a more direct baseline for the remaining methods (all of which are based on individual tokens)</w:t>
-      </w:r>
-    </w:p>
-    <w:p>
-      <w:pPr>
-        <w:pStyle w:val="Compact"/>
-        <w:numPr>
-          <w:ilvl w:val="0"/>
-          <w:numId w:val="1003"/>
-        </w:numPr>
-      </w:pPr>
-      <w:r>
-        <w:rPr>
-          <w:b/>
-          <w:bCs/>
-        </w:rPr>
-        <w:t xml:space="preserve">Normalization using the most commonly used normalization method</w:t>
-      </w:r>
-      <w:r>
-        <w:rPr>
-          <w:b/>
-          <w:bCs/>
-        </w:rPr>
-        <w:t xml:space="preserve"> </w:t>
-      </w:r>
-      <w:r>
-        <w:rPr>
-          <w:b/>
-          <w:bCs/>
-        </w:rPr>
-        <w:t xml:space="preserve">(Lobanov 1971)</w:t>
-      </w:r>
-      <w:r>
-        <w:rPr>
-          <w:b/>
-          <w:bCs/>
-        </w:rPr>
-        <w:t xml:space="preserve"> </w:t>
-      </w:r>
-    </w:p>
-    <w:p>
-      <w:pPr>
-        <w:pStyle w:val="Compact"/>
-        <w:numPr>
-          <w:ilvl w:val="1"/>
-          <w:numId w:val="1006"/>
-        </w:numPr>
-      </w:pPr>
-      <w:r>
-        <w:t xml:space="preserve">using the entire training data (Hz). This method involves standardization of each speaker’s formants by subtracting the mean and dividing by the standard deviation of each formant, independently for each time point.</w:t>
-      </w:r>
-    </w:p>
-    <w:p>
-      <w:pPr>
-        <w:pStyle w:val="Compact"/>
-        <w:numPr>
-          <w:ilvl w:val="0"/>
-          <w:numId w:val="1003"/>
-        </w:numPr>
-      </w:pPr>
-      <w:r>
-        <w:rPr>
-          <w:b/>
-          <w:bCs/>
-        </w:rPr>
-        <w:t xml:space="preserve">Normalization with</w:t>
-      </w:r>
-      <w:r>
-        <w:rPr>
-          <w:b/>
-          <w:bCs/>
-        </w:rPr>
-        <w:t xml:space="preserve"> </w:t>
-      </w:r>
-      <m:oMath>
-        <m:sSub>
-          <m:e>
-            <m:acc>
-              <m:accPr>
-                <m:chr m:val="̂"/>
-              </m:accPr>
-              <m:e>
-                <m:r>
-                  <m:t>ψ</m:t>
-                </m:r>
-              </m:e>
-            </m:acc>
-          </m:e>
-          <m:sub>
-            <m:r>
-              <m:t>s</m:t>
-            </m:r>
-          </m:sub>
-        </m:sSub>
-      </m:oMath>
-      <w:r>
-        <w:rPr>
-          <w:b/>
-          <w:bCs/>
-        </w:rPr>
-        <w:t xml:space="preserve"> </w:t>
-      </w:r>
-      <w:r>
-        <w:rPr>
-          <w:b/>
-          <w:bCs/>
-        </w:rPr>
-        <w:t xml:space="preserve">estimated using</w:t>
-      </w:r>
-      <w:r>
-        <w:rPr>
-          <w:b/>
-          <w:bCs/>
-        </w:rPr>
-        <w:t xml:space="preserve"> </w:t>
-      </w:r>
-      <w:r>
-        <w:rPr>
-          <w:b/>
-          <w:bCs/>
-          <w:i/>
-          <w:iCs/>
-        </w:rPr>
-        <w:t xml:space="preserve">PSTM</w:t>
-      </w:r>
-      <w:r>
-        <w:rPr>
-          <w:b/>
-          <w:bCs/>
-        </w:rPr>
-        <w:t xml:space="preserve"> </w:t>
-      </w:r>
-    </w:p>
-    <w:p>
-      <w:pPr>
-        <w:pStyle w:val="Compact"/>
-        <w:numPr>
-          <w:ilvl w:val="1"/>
-          <w:numId w:val="1007"/>
-        </w:numPr>
-      </w:pPr>
-      <w:r>
-        <w:t xml:space="preserve">method 2</w:t>
-      </w:r>
-    </w:p>
-    <w:p>
-      <w:pPr>
-        <w:pStyle w:val="Compact"/>
-        <w:numPr>
-          <w:ilvl w:val="1"/>
-          <w:numId w:val="1007"/>
-        </w:numPr>
-      </w:pPr>
-      <w:r>
-        <w:t xml:space="preserve">method 3</w:t>
-      </w:r>
-    </w:p>
-    <w:p>
-      <w:pPr>
-        <w:pStyle w:val="Compact"/>
-        <w:numPr>
-          <w:ilvl w:val="1"/>
-          <w:numId w:val="1007"/>
-        </w:numPr>
-      </w:pPr>
-      <w:r>
-        <w:t xml:space="preserve">method 6</w:t>
-      </w:r>
-    </w:p>
-    <w:p>
-      <w:pPr>
-        <w:pStyle w:val="FirstParagraph"/>
-      </w:pPr>
-      <w:r>
-        <w:t xml:space="preserve"> </w:t>
-      </w:r>
-      <w:r>
-        <w:t xml:space="preserve"> </w:t>
-      </w:r>
-      <w:r>
-        <w:t xml:space="preserve"> </w:t>
-      </w:r>
-    </w:p>
-    <w:bookmarkEnd w:id="62"/>
-    <w:bookmarkStart w:id="67" w:name="results"/>
+    <w:bookmarkStart w:id="65" w:name="results"/>
     <w:p>
       <w:pPr>
         <w:pStyle w:val="Heading2"/>
       </w:pPr>
       <w:r>
-        <w:t xml:space="preserve">5.2 Results</w:t>
+        <w:t xml:space="preserve">5.1 Results</w:t>
       </w:r>
     </w:p>
     <w:p>
@@ -14609,7 +14061,7 @@
       <w:tr>
         <w:tc>
           <w:tcPr/>
-          <w:bookmarkStart w:id="66" w:name="fig-bootboxplot"/>
+          <w:bookmarkStart w:id="64" w:name="fig-bootboxplot"/>
           <w:p>
             <w:pPr>
               <w:pStyle w:val="Compact"/>
@@ -14618,20 +14070,20 @@
             <w:r>
               <w:drawing>
                 <wp:inline>
-                  <wp:extent cx="5334000" cy="2667000"/>
+                  <wp:extent cx="5334000" cy="2133600"/>
                   <wp:effectExtent b="0" l="0" r="0" t="0"/>
-                  <wp:docPr descr="" title="" id="64" name="Picture"/>
+                  <wp:docPr descr="" title="" id="62" name="Picture"/>
                   <a:graphic>
                     <a:graphicData uri="http://schemas.openxmlformats.org/drawingml/2006/picture">
                       <pic:pic>
                         <pic:nvPicPr>
-                          <pic:cNvPr descr="Re_introducing_the_PSTM_files/figure-docx/fig-bootboxplot-1.png" id="65" name="Picture"/>
+                          <pic:cNvPr descr="Re_introducing_the_PSTM_files/figure-docx/fig-bootboxplot-1.png" id="63" name="Picture"/>
                           <pic:cNvPicPr>
                             <a:picLocks noChangeArrowheads="1" noChangeAspect="1"/>
                           </pic:cNvPicPr>
                         </pic:nvPicPr>
                         <pic:blipFill>
-                          <a:blip r:embed="rId63"/>
+                          <a:blip r:embed="rId61"/>
                           <a:stretch>
                             <a:fillRect/>
                           </a:stretch>
@@ -14639,7 +14091,7 @@
                         <pic:spPr bwMode="auto">
                           <a:xfrm>
                             <a:off x="0" y="0"/>
-                            <a:ext cx="5334000" cy="2667000"/>
+                            <a:ext cx="5334000" cy="2133600"/>
                           </a:xfrm>
                           <a:prstGeom prst="rect">
                             <a:avLst/>
@@ -14668,7 +14120,7 @@
               <w:pStyle w:val="ImageCaption"/>
             </w:pPr>
             <w:r>
-              <w:t xml:space="preserve">Figure 4: (a) Difference in model log-likelihoods of listeners’ responses between each model and PSTM method 6 across bootstrap iterations. Points indicate bootstrap means; intervals indicate lower 95% quantiles. Arrows indicate the direction of log-likelihoods for the single-trial application of balanced-data method 1. These were more than an order of magnitude lower than all other log-likelihoods and thus do appear on the plot. (b) Same as (a) but for the vowel category that the talker intended to produce, rather than what listeners responded. (c) Root-mean-squared (RMS) error for</w:t>
+              <w:t xml:space="preserve">Figure 4: (a) Difference in model log-likelihoods of listeners’ responses between each model and PSTM method 6 across bootstrap iterations. Pointranges show bootstrap means and lower 95% quantiles. Left-arrows indicate very low log-likelihoods for single-trial application of method 1 (more than one order of magnitude lower than all other likelihoods). (b) Same as (a) but for the vowel category that the talker intended to produce, rather than what listeners responded. (c) Root-mean-squared (RMS) error for</w:t>
             </w:r>
             <w:r>
               <w:t xml:space="preserve"> </w:t>
@@ -14740,7 +14192,7 @@
               <w:t xml:space="preserve">are shown).</w:t>
             </w:r>
           </w:p>
-          <w:bookmarkEnd w:id="66"/>
+          <w:bookmarkEnd w:id="64"/>
         </w:tc>
       </w:tr>
     </w:tbl>
@@ -14799,7 +14251,7 @@
         <w:t xml:space="preserve"> </w:t>
       </w:r>
       <w:r>
-        <w:t xml:space="preserve">from the balanced and complete training data—has access to far more speaker-specific information than method 6. As a consequence, the classic approach achieves the best performance in predicting the vowel category that the</w:t>
+        <w:t xml:space="preserve">from the balanced and complete training data—has access to far more speaker-specific information than method 6. As a consequence, the classic approach achieves better performance in predicting the vowel category that the</w:t>
       </w:r>
       <w:r>
         <w:t xml:space="preserve"> </w:t>
@@ -14936,7 +14388,7 @@
         <w:pStyle w:val="BodyText"/>
       </w:pPr>
       <w:r>
-        <w:t xml:space="preserve">Method 6 also outperforms method 1 when the latter is applied trial-by-trial. We included this variant of method 1</w:t>
+        <w:t xml:space="preserve">Method 6 also outperforms method 1 when the latter is applied trial-by-trial (see appendix). We included this variant of method 1</w:t>
       </w:r>
       <w:r>
         <w:t xml:space="preserve"> </w:t>
@@ -15128,9 +14580,9 @@
         <w:t xml:space="preserve">(c) shows that method 6 again performed best (lowest RMS errors).</w:t>
       </w:r>
     </w:p>
-    <w:bookmarkEnd w:id="67"/>
-    <w:bookmarkEnd w:id="68"/>
-    <w:bookmarkStart w:id="69" w:name="conclusions-and-future-directions"/>
+    <w:bookmarkEnd w:id="65"/>
+    <w:bookmarkEnd w:id="66"/>
+    <w:bookmarkStart w:id="67" w:name="conclusions-and-future-directions"/>
     <w:p>
       <w:pPr>
         <w:pStyle w:val="Heading1"/>
@@ -15144,7 +14596,7 @@
         <w:pStyle w:val="FirstParagraph"/>
       </w:pPr>
       <w:r>
-        <w:t xml:space="preserve">Almost two decades after its introduction, the PSTM remains the only published fully spelled-out model of incremental formant normalization and vowel perception. By making available the code for this model in the form of an R package, we hope to make the advantages of the PSTM and its extensions more accessible to other researchers. The PSTM’s approach to normalization, uniform scaling, has been consistently found to provide a better fit against listeners’ perception than other influential methods, such as Lobanov normalization</w:t>
+        <w:t xml:space="preserve">Almost two decades after its introduction, the PSTM remains the only published, fully spelled-out model of incremental formant normalization and vowel perception. By making the code for this model available in the form of an R package, we hope to make the advantages of the PSTM and its extensions more accessible to other researchers. The PSTM’s approach to normalization, uniform scaling, has been consistently found to provide a better fit against listeners’ perception than other influential methods, such as Lobanov normalization</w:t>
       </w:r>
       <w:r>
         <w:t xml:space="preserve"> </w:t>
@@ -15214,7 +14666,7 @@
         <w:pStyle w:val="BodyText"/>
       </w:pPr>
       <w:r>
-        <w:t xml:space="preserve">The general framework for incremental normalization presented here can be extended to a wide range of other normalization methods. This will allow comparisons between different approaches to incremental formant normalization and beyond. In particular, future work can investigate how incremental normalization can be integrated into modern ASR architectures, to improve the suitability of these architectures as a model of human speech perception. This will also researchers to move beyond normalization of formant point estimates (e.g., F1-F3 at the start and end of the vowel), addressing longstanding concerns that human listeners use a much broader sets of acoustic features when identifying vowels</w:t>
+        <w:t xml:space="preserve">The general framework for incremental normalization presented here can be extended to a wide range of other normalization methods. This will allow comparisons between different approaches to incremental formant normalization and beyond. In particular, future work can investigate how incremental normalization can be integrated into modern ASR architectures, to improve the suitability of these architectures as a model of human speech perception. This will also help researchers move beyond normalization of formant point estimates (e.g., F1-F3 at the start and end of the vowel), addressing longstanding concerns that human listeners use a much broader sets of acoustic features when identifying vowels</w:t>
       </w:r>
       <w:r>
         <w:t xml:space="preserve"> </w:t>
@@ -15226,18 +14678,931 @@
         <w:t xml:space="preserve">.</w:t>
       </w:r>
     </w:p>
-    <w:bookmarkEnd w:id="69"/>
-    <w:bookmarkStart w:id="107" w:name="references"/>
+    <w:bookmarkEnd w:id="67"/>
+    <w:bookmarkStart w:id="70" w:name="appendix-bootstrap-details"/>
     <w:p>
       <w:pPr>
         <w:pStyle w:val="Heading1"/>
       </w:pPr>
       <w:r>
-        <w:t xml:space="preserve">7. References</w:t>
+        <w:t xml:space="preserve">7. Appendix: Bootstrap details</w:t>
       </w:r>
     </w:p>
-    <w:bookmarkStart w:id="106" w:name="refs"/>
-    <w:bookmarkStart w:id="70" w:name="ref-ak00"/>
+    <w:p>
+      <w:pPr>
+        <w:pStyle w:val="FirstParagraph"/>
+      </w:pPr>
+      <w:r>
+        <w:t xml:space="preserve">The</w:t>
+      </w:r>
+      <w:r>
+        <w:t xml:space="preserve"> </w:t>
+      </w:r>
+      <w:r>
+        <w:t xml:space="preserve">Hillenbrand et al. (1995)</w:t>
+      </w:r>
+      <w:r>
+        <w:t xml:space="preserve"> </w:t>
+      </w:r>
+      <w:r>
+        <w:t xml:space="preserve">data include acoustic measures from 139 speakers producing one instance of twelve vowels each, including formant measures at multiple time slices. We used formant measurements at 20% and 80% of the vowel duration. This meant each vowel token was represented by a vector of length six, two measurements for each of three formants. Following</w:t>
+      </w:r>
+      <w:r>
+        <w:t xml:space="preserve"> </w:t>
+      </w:r>
+      <w:r>
+        <w:t xml:space="preserve">Nearey and Assmann (2007)</w:t>
+      </w:r>
+      <w:r>
+        <w:t xml:space="preserve">, we used two time points, capturing that formant dynamics affect vowel perception for the dialect in the database</w:t>
+      </w:r>
+      <w:r>
+        <w:t xml:space="preserve"> </w:t>
+      </w:r>
+      <w:r>
+        <w:t xml:space="preserve">(Hillenbrand and Nearey 1999)</w:t>
+      </w:r>
+      <w:r>
+        <w:t xml:space="preserve">. By fitting multivariate normal distributions in this six-dimensional space, we assume that listeners have learned expectations about the (co)variance between formants within and across time points.</w:t>
+      </w:r>
+    </w:p>
+    <w:p>
+      <w:pPr>
+        <w:pStyle w:val="BodyText"/>
+      </w:pPr>
+      <w:r>
+        <w:t xml:space="preserve">The</w:t>
+      </w:r>
+      <w:r>
+        <w:t xml:space="preserve"> </w:t>
+      </w:r>
+      <w:r>
+        <w:t xml:space="preserve">Hillenbrand et al. (1995)</w:t>
+      </w:r>
+      <w:r>
+        <w:t xml:space="preserve"> </w:t>
+      </w:r>
+      <w:r>
+        <w:t xml:space="preserve">data also contain 12-alternative forced-choice categorization responses for each vowel token, aggregated across 20 listeners of the same dialect as the speakers (average accuracy = 95%).</w:t>
+      </w:r>
+      <w:r>
+        <w:rPr>
+          <w:rStyle w:val="FootnoteReference"/>
+        </w:rPr>
+        <w:footnoteReference w:id="68"/>
+      </w:r>
+      <w:r>
+        <w:t xml:space="preserve"> </w:t>
+      </w:r>
+      <w:r>
+        <w:t xml:space="preserve">Crucially, these responses were elicited over stimuli from the different speakers in the database, presented in randomized order—i.e., precisely the type of input for which the naive estimation of</w:t>
+      </w:r>
+      <w:r>
+        <w:t xml:space="preserve"> </w:t>
+      </w:r>
+      <m:oMath>
+        <m:sSub>
+          <m:e>
+            <m:r>
+              <m:t>ψ</m:t>
+            </m:r>
+          </m:e>
+          <m:sub>
+            <m:r>
+              <m:t>s</m:t>
+            </m:r>
+          </m:sub>
+        </m:sSub>
+      </m:oMath>
+      <w:r>
+        <w:t xml:space="preserve"> </w:t>
+      </w:r>
+      <w:r>
+        <w:t xml:space="preserve">(</w:t>
+      </w:r>
+      <w:hyperlink w:anchor="eq-method-naive">
+        <w:r>
+          <w:rPr>
+            <w:rStyle w:val="Hyperlink"/>
+          </w:rPr>
+          <w:t xml:space="preserve">Equation 6</w:t>
+        </w:r>
+      </w:hyperlink>
+      <w:r>
+        <w:t xml:space="preserve">) is expected to yield unreliable results for listeners (confirmed below).</w:t>
+      </w:r>
+    </w:p>
+    <w:p>
+      <w:pPr>
+        <w:pStyle w:val="BodyText"/>
+      </w:pPr>
+      <w:r>
+        <w:t xml:space="preserve">We bootstrapped the following process over 1000 iterations for each method (all functions referred to are from the</w:t>
+      </w:r>
+      <w:r>
+        <w:t xml:space="preserve"> </w:t>
+      </w:r>
+      <w:r>
+        <w:rPr>
+          <w:rStyle w:val="VerbatimChar"/>
+        </w:rPr>
+        <w:t xml:space="preserve">STM</w:t>
+      </w:r>
+      <w:r>
+        <w:t xml:space="preserve"> </w:t>
+      </w:r>
+      <w:r>
+        <w:t xml:space="preserve">package):</w:t>
+      </w:r>
+    </w:p>
+    <w:p>
+      <w:pPr>
+        <w:numPr>
+          <w:ilvl w:val="0"/>
+          <w:numId w:val="1002"/>
+        </w:numPr>
+      </w:pPr>
+      <w:r>
+        <w:t xml:space="preserve">Randomly divide the data into a 79-speaker training set and a 60-speaker testing set. Resample the training data (with replacement) at the speaker level. Sixty-three vowel tokens (4%) had one or two missing formant measurements (out of 6), representing 0.09% of the total formant measurements in the data. The missing values were imputed using stochastic regression imputation, independently for each iteration (using the</w:t>
+      </w:r>
+      <w:r>
+        <w:t xml:space="preserve"> </w:t>
+      </w:r>
+      <w:r>
+        <w:rPr>
+          <w:rStyle w:val="VerbatimChar"/>
+        </w:rPr>
+        <w:t xml:space="preserve">impute_NA</w:t>
+      </w:r>
+      <w:r>
+        <w:t xml:space="preserve"> </w:t>
+      </w:r>
+      <w:r>
+        <w:t xml:space="preserve">function).</w:t>
+      </w:r>
+    </w:p>
+    <w:p>
+      <w:pPr>
+        <w:numPr>
+          <w:ilvl w:val="0"/>
+          <w:numId w:val="1002"/>
+        </w:numPr>
+      </w:pPr>
+      <w:r>
+        <w:t xml:space="preserve">Uniformly scale the training data (the</w:t>
+      </w:r>
+      <w:r>
+        <w:t xml:space="preserve"> </w:t>
+      </w:r>
+      <w:r>
+        <w:rPr>
+          <w:rStyle w:val="VerbatimChar"/>
+        </w:rPr>
+        <w:t xml:space="preserve">normalize</w:t>
+      </w:r>
+      <w:r>
+        <w:t xml:space="preserve"> </w:t>
+      </w:r>
+      <w:r>
+        <w:t xml:space="preserve">function), by estimating each speaker’s</w:t>
+      </w:r>
+      <w:r>
+        <w:t xml:space="preserve"> </w:t>
+      </w:r>
+      <m:oMath>
+        <m:sSub>
+          <m:e>
+            <m:r>
+              <m:t>ψ</m:t>
+            </m:r>
+          </m:e>
+          <m:sub>
+            <m:r>
+              <m:t>s</m:t>
+            </m:r>
+          </m:sub>
+        </m:sSub>
+      </m:oMath>
+      <w:r>
+        <w:t xml:space="preserve"> </w:t>
+      </w:r>
+      <w:r>
+        <w:t xml:space="preserve">using their complete vowel system as in</w:t>
+      </w:r>
+      <w:r>
+        <w:t xml:space="preserve"> </w:t>
+      </w:r>
+      <w:hyperlink w:anchor="eq-method-naive">
+        <w:r>
+          <w:rPr>
+            <w:rStyle w:val="Hyperlink"/>
+          </w:rPr>
+          <w:t xml:space="preserve">Equation 6</w:t>
+        </w:r>
+      </w:hyperlink>
+      <w:r>
+        <w:t xml:space="preserve">, and normalizing it as in</w:t>
+      </w:r>
+      <w:r>
+        <w:t xml:space="preserve"> </w:t>
+      </w:r>
+      <w:hyperlink w:anchor="eq-define-N">
+        <w:r>
+          <w:rPr>
+            <w:rStyle w:val="Hyperlink"/>
+          </w:rPr>
+          <w:t xml:space="preserve">Equation 3</w:t>
+        </w:r>
+      </w:hyperlink>
+      <w:r>
+        <w:t xml:space="preserve">.</w:t>
+      </w:r>
+    </w:p>
+    <w:p>
+      <w:pPr>
+        <w:numPr>
+          <w:ilvl w:val="0"/>
+          <w:numId w:val="1002"/>
+        </w:numPr>
+      </w:pPr>
+      <w:r>
+        <w:t xml:space="preserve">Estimate the dialect-specific category means and covariance matrices of all vowels using the normalized training data (with</w:t>
+      </w:r>
+      <w:r>
+        <w:t xml:space="preserve"> </w:t>
+      </w:r>
+      <w:r>
+        <w:rPr>
+          <w:rStyle w:val="VerbatimChar"/>
+        </w:rPr>
+        <w:t xml:space="preserve">create_template</w:t>
+      </w:r>
+      <w:r>
+        <w:t xml:space="preserve">).</w:t>
+      </w:r>
+      <w:r>
+        <w:t xml:space="preserve"> </w:t>
+      </w:r>
+      <w:r>
+        <w:rPr>
+          <w:rStyle w:val="FootnoteReference"/>
+        </w:rPr>
+        <w:footnoteReference w:id="69"/>
+      </w:r>
+      <w:r>
+        <w:t xml:space="preserve"> </w:t>
+      </w:r>
+      <w:r>
+        <w:rPr>
+          <w:b/>
+          <w:bCs/>
+        </w:rPr>
+        <w:t xml:space="preserve">Each iteration of the bootstrap simulates a</w:t>
+      </w:r>
+      <w:r>
+        <w:rPr>
+          <w:b/>
+          <w:bCs/>
+        </w:rPr>
+        <w:t xml:space="preserve"> </w:t>
+      </w:r>
+      <w:r>
+        <w:rPr>
+          <w:b/>
+          <w:bCs/>
+        </w:rPr>
+        <w:t xml:space="preserve">‘</w:t>
+      </w:r>
+      <w:r>
+        <w:rPr>
+          <w:b/>
+          <w:bCs/>
+        </w:rPr>
+        <w:t xml:space="preserve">listener</w:t>
+      </w:r>
+      <w:r>
+        <w:rPr>
+          <w:b/>
+          <w:bCs/>
+        </w:rPr>
+        <w:t xml:space="preserve">’</w:t>
+      </w:r>
+      <w:r>
+        <w:rPr>
+          <w:b/>
+          <w:bCs/>
+        </w:rPr>
+        <w:t xml:space="preserve"> </w:t>
+      </w:r>
+      <w:r>
+        <w:rPr>
+          <w:b/>
+          <w:bCs/>
+        </w:rPr>
+        <w:t xml:space="preserve">of the dialect with slightly different speech experience.</w:t>
+      </w:r>
+    </w:p>
+    <w:p>
+      <w:pPr>
+        <w:numPr>
+          <w:ilvl w:val="0"/>
+          <w:numId w:val="1002"/>
+        </w:numPr>
+      </w:pPr>
+      <w:r>
+        <w:t xml:space="preserve">For each token in the testing data, estimate</w:t>
+      </w:r>
+      <w:r>
+        <w:t xml:space="preserve"> </w:t>
+      </w:r>
+      <m:oMath>
+        <m:sSub>
+          <m:e>
+            <m:acc>
+              <m:accPr>
+                <m:chr m:val="̂"/>
+              </m:accPr>
+              <m:e>
+                <m:r>
+                  <m:t>ψ</m:t>
+                </m:r>
+              </m:e>
+            </m:acc>
+          </m:e>
+          <m:sub>
+            <m:r>
+              <m:t>s</m:t>
+            </m:r>
+            <m:r>
+              <m:rPr>
+                <m:sty m:val="p"/>
+              </m:rPr>
+              <m:t>,</m:t>
+            </m:r>
+            <m:r>
+              <m:rPr>
+                <m:nor/>
+                <m:sty m:val="p"/>
+              </m:rPr>
+              <m:t>v</m:t>
+            </m:r>
+          </m:sub>
+        </m:sSub>
+      </m:oMath>
+      <w:r>
+        <w:t xml:space="preserve"> </w:t>
+      </w:r>
+      <w:r>
+        <w:t xml:space="preserve">for each vowel category using each method. Use these values of</w:t>
+      </w:r>
+      <w:r>
+        <w:t xml:space="preserve"> </w:t>
+      </w:r>
+      <m:oMath>
+        <m:sSub>
+          <m:e>
+            <m:acc>
+              <m:accPr>
+                <m:chr m:val="̂"/>
+              </m:accPr>
+              <m:e>
+                <m:r>
+                  <m:t>ψ</m:t>
+                </m:r>
+              </m:e>
+            </m:acc>
+          </m:e>
+          <m:sub>
+            <m:r>
+              <m:t>s</m:t>
+            </m:r>
+            <m:r>
+              <m:rPr>
+                <m:sty m:val="p"/>
+              </m:rPr>
+              <m:t>,</m:t>
+            </m:r>
+            <m:r>
+              <m:rPr>
+                <m:nor/>
+                <m:sty m:val="p"/>
+              </m:rPr>
+              <m:t>v</m:t>
+            </m:r>
+          </m:sub>
+        </m:sSub>
+      </m:oMath>
+      <w:r>
+        <w:t xml:space="preserve"> </w:t>
+      </w:r>
+      <w:r>
+        <w:t xml:space="preserve">to obtain the winning estimate</w:t>
+      </w:r>
+      <w:r>
+        <w:t xml:space="preserve"> </w:t>
+      </w:r>
+      <m:oMath>
+        <m:sSub>
+          <m:e>
+            <m:acc>
+              <m:accPr>
+                <m:chr m:val="̂"/>
+              </m:accPr>
+              <m:e>
+                <m:r>
+                  <m:t>ψ</m:t>
+                </m:r>
+              </m:e>
+            </m:acc>
+          </m:e>
+          <m:sub>
+            <m:r>
+              <m:t>s</m:t>
+            </m:r>
+          </m:sub>
+        </m:sSub>
+      </m:oMath>
+      <w:r>
+        <w:t xml:space="preserve"> </w:t>
+      </w:r>
+      <w:r>
+        <w:t xml:space="preserve">and calculate the posterior probability of each vowel category.</w:t>
+      </w:r>
+    </w:p>
+    <w:p>
+      <w:pPr>
+        <w:numPr>
+          <w:ilvl w:val="0"/>
+          <w:numId w:val="1002"/>
+        </w:numPr>
+      </w:pPr>
+      <w:r>
+        <w:t xml:space="preserve">Calculate performance metrics A)-C) described in</w:t>
+      </w:r>
+      <w:r>
+        <w:t xml:space="preserve"> </w:t>
+      </w:r>
+      <w:hyperlink w:anchor="sec-bootstrap">
+        <w:r>
+          <w:rPr>
+            <w:rStyle w:val="Hyperlink"/>
+          </w:rPr>
+          <w:t xml:space="preserve">Section 5</w:t>
+        </w:r>
+      </w:hyperlink>
+      <w:r>
+        <w:t xml:space="preserve">.</w:t>
+      </w:r>
+    </w:p>
+    <w:p>
+      <w:pPr>
+        <w:pStyle w:val="FirstParagraph"/>
+      </w:pPr>
+      <w:r>
+        <w:t xml:space="preserve">We compare eight different methods that differ in terms of whether and/or how they estimate</w:t>
+      </w:r>
+      <w:r>
+        <w:t xml:space="preserve"> </w:t>
+      </w:r>
+      <m:oMath>
+        <m:sSub>
+          <m:e>
+            <m:r>
+              <m:t>ψ</m:t>
+            </m:r>
+          </m:e>
+          <m:sub>
+            <m:r>
+              <m:t>s</m:t>
+            </m:r>
+          </m:sub>
+        </m:sSub>
+      </m:oMath>
+      <w:r>
+        <w:t xml:space="preserve">:</w:t>
+      </w:r>
+    </w:p>
+    <w:p>
+      <w:pPr>
+        <w:pStyle w:val="Compact"/>
+        <w:numPr>
+          <w:ilvl w:val="0"/>
+          <w:numId w:val="1003"/>
+        </w:numPr>
+      </w:pPr>
+      <w:r>
+        <w:rPr>
+          <w:b/>
+          <w:bCs/>
+        </w:rPr>
+        <w:t xml:space="preserve">No normalization</w:t>
+      </w:r>
+    </w:p>
+    <w:p>
+      <w:pPr>
+        <w:pStyle w:val="Compact"/>
+        <w:numPr>
+          <w:ilvl w:val="1"/>
+          <w:numId w:val="1004"/>
+        </w:numPr>
+      </w:pPr>
+      <w:r>
+        <w:t xml:space="preserve">input is</w:t>
+      </w:r>
+      <w:r>
+        <w:t xml:space="preserve"> </w:t>
+      </w:r>
+      <m:oMath>
+        <m:acc>
+          <m:accPr>
+            <m:chr m:val="⃗"/>
+          </m:accPr>
+          <m:e>
+            <m:r>
+              <m:t>F</m:t>
+            </m:r>
+          </m:e>
+        </m:acc>
+      </m:oMath>
+      <w:r>
+        <w:t xml:space="preserve"> </w:t>
+      </w:r>
+      <w:r>
+        <w:t xml:space="preserve">(Hz)</w:t>
+      </w:r>
+    </w:p>
+    <w:p>
+      <w:pPr>
+        <w:pStyle w:val="Compact"/>
+        <w:numPr>
+          <w:ilvl w:val="1"/>
+          <w:numId w:val="1004"/>
+        </w:numPr>
+      </w:pPr>
+      <w:r>
+        <w:t xml:space="preserve">input is</w:t>
+      </w:r>
+      <w:r>
+        <w:t xml:space="preserve"> </w:t>
+      </w:r>
+      <m:oMath>
+        <m:acc>
+          <m:accPr>
+            <m:chr m:val="⃗"/>
+          </m:accPr>
+          <m:e>
+            <m:r>
+              <m:t>G</m:t>
+            </m:r>
+          </m:e>
+        </m:acc>
+      </m:oMath>
+      <w:r>
+        <w:t xml:space="preserve"> </w:t>
+      </w:r>
+      <w:r>
+        <w:t xml:space="preserve">(log Hz), allowing an assessment of whether log-transformation in and off itself helps.</w:t>
+      </w:r>
+    </w:p>
+    <w:p>
+      <w:pPr>
+        <w:pStyle w:val="Compact"/>
+        <w:numPr>
+          <w:ilvl w:val="0"/>
+          <w:numId w:val="1003"/>
+        </w:numPr>
+      </w:pPr>
+      <w:r>
+        <w:rPr>
+          <w:b/>
+          <w:bCs/>
+        </w:rPr>
+        <w:t xml:space="preserve">Normalization with</w:t>
+      </w:r>
+      <w:r>
+        <w:rPr>
+          <w:b/>
+          <w:bCs/>
+        </w:rPr>
+        <w:t xml:space="preserve"> </w:t>
+      </w:r>
+      <m:oMath>
+        <m:sSub>
+          <m:e>
+            <m:acc>
+              <m:accPr>
+                <m:chr m:val="̂"/>
+              </m:accPr>
+              <m:e>
+                <m:r>
+                  <m:t>ψ</m:t>
+                </m:r>
+              </m:e>
+            </m:acc>
+          </m:e>
+          <m:sub>
+            <m:r>
+              <m:t>s</m:t>
+            </m:r>
+          </m:sub>
+        </m:sSub>
+      </m:oMath>
+      <w:r>
+        <w:rPr>
+          <w:b/>
+          <w:bCs/>
+        </w:rPr>
+        <w:t xml:space="preserve"> </w:t>
+      </w:r>
+      <w:r>
+        <w:rPr>
+          <w:b/>
+          <w:bCs/>
+        </w:rPr>
+        <w:t xml:space="preserve">estimated using the</w:t>
+      </w:r>
+      <w:r>
+        <w:rPr>
+          <w:b/>
+          <w:bCs/>
+        </w:rPr>
+        <w:t xml:space="preserve"> </w:t>
+      </w:r>
+      <w:r>
+        <w:rPr>
+          <w:b/>
+          <w:bCs/>
+        </w:rPr>
+        <w:t xml:space="preserve">‘</w:t>
+      </w:r>
+      <w:r>
+        <w:rPr>
+          <w:b/>
+          <w:bCs/>
+        </w:rPr>
+        <w:t xml:space="preserve">classic approach</w:t>
+      </w:r>
+      <w:r>
+        <w:rPr>
+          <w:b/>
+          <w:bCs/>
+        </w:rPr>
+        <w:t xml:space="preserve">’</w:t>
+      </w:r>
+      <w:r>
+        <w:t xml:space="preserve"> </w:t>
+      </w:r>
+      <w:r>
+        <w:t xml:space="preserve">in</w:t>
+      </w:r>
+      <w:r>
+        <w:t xml:space="preserve"> </w:t>
+      </w:r>
+      <w:hyperlink w:anchor="eq-method-naive">
+        <w:r>
+          <w:rPr>
+            <w:rStyle w:val="Hyperlink"/>
+          </w:rPr>
+          <w:t xml:space="preserve">Equation 6</w:t>
+        </w:r>
+      </w:hyperlink>
+    </w:p>
+    <w:p>
+      <w:pPr>
+        <w:pStyle w:val="Compact"/>
+        <w:numPr>
+          <w:ilvl w:val="1"/>
+          <w:numId w:val="1005"/>
+        </w:numPr>
+      </w:pPr>
+      <w:r>
+        <w:t xml:space="preserve">over the entire training data (</w:t>
+      </w:r>
+      <w:r>
+        <w:rPr>
+          <w:i/>
+          <w:iCs/>
+        </w:rPr>
+        <w:t xml:space="preserve">PSTM1 (balanced data)</w:t>
+      </w:r>
+      <w:r>
+        <w:t xml:space="preserve">)</w:t>
+      </w:r>
+    </w:p>
+    <w:p>
+      <w:pPr>
+        <w:pStyle w:val="Compact"/>
+        <w:numPr>
+          <w:ilvl w:val="1"/>
+          <w:numId w:val="1005"/>
+        </w:numPr>
+      </w:pPr>
+      <w:r>
+        <w:t xml:space="preserve">based on the individual token (</w:t>
+      </w:r>
+      <w:r>
+        <w:rPr>
+          <w:i/>
+          <w:iCs/>
+        </w:rPr>
+        <w:t xml:space="preserve">PSTM1 (single trial)</w:t>
+      </w:r>
+      <w:r>
+        <w:t xml:space="preserve">), as a more direct baseline for the remaining methods (all of which are based on individual tokens)</w:t>
+      </w:r>
+    </w:p>
+    <w:p>
+      <w:pPr>
+        <w:pStyle w:val="Compact"/>
+        <w:numPr>
+          <w:ilvl w:val="0"/>
+          <w:numId w:val="1003"/>
+        </w:numPr>
+      </w:pPr>
+      <w:r>
+        <w:rPr>
+          <w:b/>
+          <w:bCs/>
+        </w:rPr>
+        <w:t xml:space="preserve">Normalization using the most commonly used normalization method</w:t>
+      </w:r>
+      <w:r>
+        <w:rPr>
+          <w:b/>
+          <w:bCs/>
+        </w:rPr>
+        <w:t xml:space="preserve"> </w:t>
+      </w:r>
+      <w:r>
+        <w:rPr>
+          <w:b/>
+          <w:bCs/>
+        </w:rPr>
+        <w:t xml:space="preserve">(Lobanov 1971)</w:t>
+      </w:r>
+      <w:r>
+        <w:rPr>
+          <w:b/>
+          <w:bCs/>
+        </w:rPr>
+        <w:t xml:space="preserve"> </w:t>
+      </w:r>
+    </w:p>
+    <w:p>
+      <w:pPr>
+        <w:pStyle w:val="Compact"/>
+        <w:numPr>
+          <w:ilvl w:val="1"/>
+          <w:numId w:val="1006"/>
+        </w:numPr>
+      </w:pPr>
+      <w:r>
+        <w:t xml:space="preserve">using the entire training data (Hz). This method involves standardization of each speaker’s formants by subtracting the mean and dividing by the standard deviation of each formant, independently for each time point.</w:t>
+      </w:r>
+    </w:p>
+    <w:p>
+      <w:pPr>
+        <w:pStyle w:val="Compact"/>
+        <w:numPr>
+          <w:ilvl w:val="0"/>
+          <w:numId w:val="1003"/>
+        </w:numPr>
+      </w:pPr>
+      <w:r>
+        <w:rPr>
+          <w:b/>
+          <w:bCs/>
+        </w:rPr>
+        <w:t xml:space="preserve">Normalization with</w:t>
+      </w:r>
+      <w:r>
+        <w:rPr>
+          <w:b/>
+          <w:bCs/>
+        </w:rPr>
+        <w:t xml:space="preserve"> </w:t>
+      </w:r>
+      <m:oMath>
+        <m:sSub>
+          <m:e>
+            <m:acc>
+              <m:accPr>
+                <m:chr m:val="̂"/>
+              </m:accPr>
+              <m:e>
+                <m:r>
+                  <m:t>ψ</m:t>
+                </m:r>
+              </m:e>
+            </m:acc>
+          </m:e>
+          <m:sub>
+            <m:r>
+              <m:t>s</m:t>
+            </m:r>
+          </m:sub>
+        </m:sSub>
+      </m:oMath>
+      <w:r>
+        <w:rPr>
+          <w:b/>
+          <w:bCs/>
+        </w:rPr>
+        <w:t xml:space="preserve"> </w:t>
+      </w:r>
+      <w:r>
+        <w:rPr>
+          <w:b/>
+          <w:bCs/>
+        </w:rPr>
+        <w:t xml:space="preserve">estimated using</w:t>
+      </w:r>
+      <w:r>
+        <w:rPr>
+          <w:b/>
+          <w:bCs/>
+        </w:rPr>
+        <w:t xml:space="preserve"> </w:t>
+      </w:r>
+      <w:r>
+        <w:rPr>
+          <w:b/>
+          <w:bCs/>
+          <w:i/>
+          <w:iCs/>
+        </w:rPr>
+        <w:t xml:space="preserve">PSTM</w:t>
+      </w:r>
+      <w:r>
+        <w:rPr>
+          <w:b/>
+          <w:bCs/>
+        </w:rPr>
+        <w:t xml:space="preserve"> </w:t>
+      </w:r>
+    </w:p>
+    <w:p>
+      <w:pPr>
+        <w:pStyle w:val="Compact"/>
+        <w:numPr>
+          <w:ilvl w:val="1"/>
+          <w:numId w:val="1007"/>
+        </w:numPr>
+      </w:pPr>
+      <w:r>
+        <w:t xml:space="preserve">method 2</w:t>
+      </w:r>
+    </w:p>
+    <w:p>
+      <w:pPr>
+        <w:pStyle w:val="Compact"/>
+        <w:numPr>
+          <w:ilvl w:val="1"/>
+          <w:numId w:val="1007"/>
+        </w:numPr>
+      </w:pPr>
+      <w:r>
+        <w:t xml:space="preserve">method 3</w:t>
+      </w:r>
+    </w:p>
+    <w:p>
+      <w:pPr>
+        <w:pStyle w:val="Compact"/>
+        <w:numPr>
+          <w:ilvl w:val="1"/>
+          <w:numId w:val="1007"/>
+        </w:numPr>
+      </w:pPr>
+      <w:r>
+        <w:t xml:space="preserve">method 6</w:t>
+      </w:r>
+    </w:p>
+    <w:p>
+      <w:pPr>
+        <w:pStyle w:val="FirstParagraph"/>
+      </w:pPr>
+      <w:r>
+        <w:t xml:space="preserve"> </w:t>
+      </w:r>
+      <w:r>
+        <w:t xml:space="preserve"> </w:t>
+      </w:r>
+      <w:r>
+        <w:t xml:space="preserve"> </w:t>
+      </w:r>
+    </w:p>
+    <w:bookmarkEnd w:id="70"/>
+    <w:bookmarkStart w:id="108" w:name="references"/>
+    <w:p>
+      <w:pPr>
+        <w:pStyle w:val="Heading1"/>
+      </w:pPr>
+      <w:r>
+        <w:t xml:space="preserve">8. References</w:t>
+      </w:r>
+    </w:p>
+    <w:bookmarkStart w:id="107" w:name="refs"/>
+    <w:bookmarkStart w:id="71" w:name="ref-ak00"/>
     <w:p>
       <w:pPr>
         <w:pStyle w:val="Bibliography"/>
@@ -15268,8 +15633,8 @@
         <w:t xml:space="preserve">108 (4): 1856–66.</w:t>
       </w:r>
     </w:p>
-    <w:bookmarkEnd w:id="70"/>
-    <w:bookmarkStart w:id="71" w:name="ref-barreda2012"/>
+    <w:bookmarkEnd w:id="71"/>
+    <w:bookmarkStart w:id="72" w:name="ref-barreda2012"/>
     <w:p>
       <w:pPr>
         <w:pStyle w:val="Bibliography"/>
@@ -15300,8 +15665,8 @@
         <w:t xml:space="preserve">132 (5): 3453–64.</w:t>
       </w:r>
     </w:p>
-    <w:bookmarkEnd w:id="71"/>
-    <w:bookmarkStart w:id="72" w:name="ref-b20"/>
+    <w:bookmarkEnd w:id="72"/>
+    <w:bookmarkStart w:id="73" w:name="ref-b20"/>
     <w:p>
       <w:pPr>
         <w:pStyle w:val="Bibliography"/>
@@ -15332,8 +15697,8 @@
         <w:t xml:space="preserve">96 (2).</w:t>
       </w:r>
     </w:p>
-    <w:bookmarkEnd w:id="72"/>
-    <w:bookmarkStart w:id="73" w:name="ref-b21"/>
+    <w:bookmarkEnd w:id="73"/>
+    <w:bookmarkStart w:id="74" w:name="ref-b21"/>
     <w:p>
       <w:pPr>
         <w:pStyle w:val="Bibliography"/>
@@ -15361,8 +15726,8 @@
         <w:t xml:space="preserve">, 1–27.</w:t>
       </w:r>
     </w:p>
-    <w:bookmarkEnd w:id="73"/>
-    <w:bookmarkStart w:id="74" w:name="ref-bn2012"/>
+    <w:bookmarkEnd w:id="74"/>
+    <w:bookmarkStart w:id="75" w:name="ref-bn2012"/>
     <w:p>
       <w:pPr>
         <w:pStyle w:val="Bibliography"/>
@@ -15393,8 +15758,8 @@
         <w:t xml:space="preserve">131 (1): 466–77.</w:t>
       </w:r>
     </w:p>
-    <w:bookmarkEnd w:id="74"/>
-    <w:bookmarkStart w:id="75" w:name="ref-barreda-nearey2018"/>
+    <w:bookmarkEnd w:id="75"/>
+    <w:bookmarkStart w:id="76" w:name="ref-barreda-nearey2018"/>
     <w:p>
       <w:pPr>
         <w:pStyle w:val="Bibliography"/>
@@ -15425,8 +15790,8 @@
         <w:t xml:space="preserve">144 (1): 500–520.</w:t>
       </w:r>
     </w:p>
-    <w:bookmarkEnd w:id="75"/>
-    <w:bookmarkStart w:id="76" w:name="ref-charlton2012"/>
+    <w:bookmarkEnd w:id="76"/>
+    <w:bookmarkStart w:id="77" w:name="ref-charlton2012"/>
     <w:p>
       <w:pPr>
         <w:pStyle w:val="Bibliography"/>
@@ -15457,8 +15822,8 @@
         <w:t xml:space="preserve">15: 999–1006.</w:t>
       </w:r>
     </w:p>
-    <w:bookmarkEnd w:id="76"/>
-    <w:bookmarkStart w:id="77" w:name="ref-chernyak2024"/>
+    <w:bookmarkEnd w:id="77"/>
+    <w:bookmarkStart w:id="78" w:name="ref-chernyak2024"/>
     <w:p>
       <w:pPr>
         <w:pStyle w:val="Bibliography"/>
@@ -15489,8 +15854,8 @@
         <w:t xml:space="preserve">155 (6): 3915–29.</w:t>
       </w:r>
     </w:p>
-    <w:bookmarkEnd w:id="77"/>
-    <w:bookmarkStart w:id="78" w:name="ref-h2000"/>
+    <w:bookmarkEnd w:id="78"/>
+    <w:bookmarkStart w:id="79" w:name="ref-h2000"/>
     <w:p>
       <w:pPr>
         <w:pStyle w:val="Bibliography"/>
@@ -15521,8 +15886,8 @@
         <w:t xml:space="preserve">108 (6): 3013–22.</w:t>
       </w:r>
     </w:p>
-    <w:bookmarkEnd w:id="78"/>
-    <w:bookmarkStart w:id="80" w:name="ref-h95"/>
+    <w:bookmarkEnd w:id="79"/>
+    <w:bookmarkStart w:id="81" w:name="ref-h95"/>
     <w:p>
       <w:pPr>
         <w:pStyle w:val="Bibliography"/>
@@ -15573,7 +15938,7 @@
       <w:r>
         <w:t xml:space="preserve"> </w:t>
       </w:r>
-      <w:hyperlink r:id="rId79">
+      <w:hyperlink r:id="rId80">
         <w:r>
           <w:rPr>
             <w:rStyle w:val="Hyperlink"/>
@@ -15585,8 +15950,8 @@
         <w:t xml:space="preserve">.</w:t>
       </w:r>
     </w:p>
-    <w:bookmarkEnd w:id="80"/>
-    <w:bookmarkStart w:id="81" w:name="ref-hn99"/>
+    <w:bookmarkEnd w:id="81"/>
+    <w:bookmarkStart w:id="82" w:name="ref-hn99"/>
     <w:p>
       <w:pPr>
         <w:pStyle w:val="Bibliography"/>
@@ -15617,8 +15982,8 @@
         <w:t xml:space="preserve">105 (6): 3509–23.</w:t>
       </w:r>
     </w:p>
-    <w:bookmarkEnd w:id="81"/>
-    <w:bookmarkStart w:id="82" w:name="ref-jin2025"/>
+    <w:bookmarkEnd w:id="82"/>
+    <w:bookmarkStart w:id="83" w:name="ref-jin2025"/>
     <w:p>
       <w:pPr>
         <w:pStyle w:val="Bibliography"/>
@@ -15633,8 +15998,8 @@
         <w:t xml:space="preserve">“Latent Speech Representations Learned Through Self-Supervised Learning Predict Listeners’ Generalization of Adaptation Across Talkers.”</w:t>
       </w:r>
     </w:p>
-    <w:bookmarkEnd w:id="82"/>
-    <w:bookmarkStart w:id="83" w:name="ref-johnson1997"/>
+    <w:bookmarkEnd w:id="83"/>
+    <w:bookmarkStart w:id="84" w:name="ref-johnson1997"/>
     <w:p>
       <w:pPr>
         <w:pStyle w:val="Bibliography"/>
@@ -15668,8 +16033,8 @@
         <w:t xml:space="preserve">, edited by K Johnson and J W Mullennix, 145–46. San Diego: Academic Press.</w:t>
       </w:r>
     </w:p>
-    <w:bookmarkEnd w:id="83"/>
-    <w:bookmarkStart w:id="84" w:name="ref-kim2024"/>
+    <w:bookmarkEnd w:id="84"/>
+    <w:bookmarkStart w:id="85" w:name="ref-kim2024"/>
     <w:p>
       <w:pPr>
         <w:pStyle w:val="Bibliography"/>
@@ -15700,8 +16065,8 @@
         <w:t xml:space="preserve">4 (2).</w:t>
       </w:r>
     </w:p>
-    <w:bookmarkEnd w:id="84"/>
-    <w:bookmarkStart w:id="85" w:name="ref-kleinschmidt-jaeger2015"/>
+    <w:bookmarkEnd w:id="85"/>
+    <w:bookmarkStart w:id="86" w:name="ref-kleinschmidt-jaeger2015"/>
     <w:p>
       <w:pPr>
         <w:pStyle w:val="Bibliography"/>
@@ -15732,8 +16097,8 @@
         <w:t xml:space="preserve">122 (2): 148.</w:t>
       </w:r>
     </w:p>
-    <w:bookmarkEnd w:id="85"/>
-    <w:bookmarkStart w:id="86" w:name="ref-kleinschmidt2018"/>
+    <w:bookmarkEnd w:id="86"/>
+    <w:bookmarkStart w:id="87" w:name="ref-kleinschmidt2018"/>
     <w:p>
       <w:pPr>
         <w:pStyle w:val="Bibliography"/>
@@ -15764,8 +16129,8 @@
         <w:t xml:space="preserve">10 (4): 818–34.</w:t>
       </w:r>
     </w:p>
-    <w:bookmarkEnd w:id="86"/>
-    <w:bookmarkStart w:id="87" w:name="ref-lobanov1971"/>
+    <w:bookmarkEnd w:id="87"/>
+    <w:bookmarkStart w:id="88" w:name="ref-lobanov1971"/>
     <w:p>
       <w:pPr>
         <w:pStyle w:val="Bibliography"/>
@@ -15796,8 +16161,8 @@
         <w:t xml:space="preserve">49 (2B): 606–8.</w:t>
       </w:r>
     </w:p>
-    <w:bookmarkEnd w:id="87"/>
-    <w:bookmarkStart w:id="88" w:name="ref-luce-pisoni1998"/>
+    <w:bookmarkEnd w:id="88"/>
+    <w:bookmarkStart w:id="89" w:name="ref-luce-pisoni1998"/>
     <w:p>
       <w:pPr>
         <w:pStyle w:val="Bibliography"/>
@@ -15828,8 +16193,8 @@
         <w:t xml:space="preserve">19 (1): 1–36.</w:t>
       </w:r>
     </w:p>
-    <w:bookmarkEnd w:id="88"/>
-    <w:bookmarkStart w:id="89" w:name="ref-magnuson-nusbaum2007"/>
+    <w:bookmarkEnd w:id="89"/>
+    <w:bookmarkStart w:id="90" w:name="ref-magnuson-nusbaum2007"/>
     <w:p>
       <w:pPr>
         <w:pStyle w:val="Bibliography"/>
@@ -15860,8 +16225,8 @@
         <w:t xml:space="preserve">33 (2): 391.</w:t>
       </w:r>
     </w:p>
-    <w:bookmarkEnd w:id="89"/>
-    <w:bookmarkStart w:id="90" w:name="ref-massaro-friedman1990"/>
+    <w:bookmarkEnd w:id="90"/>
+    <w:bookmarkStart w:id="91" w:name="ref-massaro-friedman1990"/>
     <w:p>
       <w:pPr>
         <w:pStyle w:val="Bibliography"/>
@@ -15892,8 +16257,8 @@
         <w:t xml:space="preserve">97 (2): 225.</w:t>
       </w:r>
     </w:p>
-    <w:bookmarkEnd w:id="90"/>
-    <w:bookmarkStart w:id="91" w:name="ref-NA07"/>
+    <w:bookmarkEnd w:id="91"/>
+    <w:bookmarkStart w:id="92" w:name="ref-NA07"/>
     <w:p>
       <w:pPr>
         <w:pStyle w:val="Bibliography"/>
@@ -15936,8 +16301,8 @@
         <w:t xml:space="preserve">246.</w:t>
       </w:r>
     </w:p>
-    <w:bookmarkEnd w:id="91"/>
-    <w:bookmarkStart w:id="92" w:name="ref-norris-mcqueen2008"/>
+    <w:bookmarkEnd w:id="92"/>
+    <w:bookmarkStart w:id="93" w:name="ref-norris-mcqueen2008"/>
     <w:p>
       <w:pPr>
         <w:pStyle w:val="Bibliography"/>
@@ -15968,8 +16333,8 @@
         <w:t xml:space="preserve">115 (2): 357.</w:t>
       </w:r>
     </w:p>
-    <w:bookmarkEnd w:id="92"/>
-    <w:bookmarkStart w:id="93" w:name="ref-persson2025"/>
+    <w:bookmarkEnd w:id="93"/>
+    <w:bookmarkStart w:id="94" w:name="ref-persson2025"/>
     <w:p>
       <w:pPr>
         <w:pStyle w:val="Bibliography"/>
@@ -16000,8 +16365,8 @@
         <w:t xml:space="preserve">157: 1458–82.</w:t>
       </w:r>
     </w:p>
-    <w:bookmarkEnd w:id="93"/>
-    <w:bookmarkStart w:id="95" w:name="ref-pb52"/>
+    <w:bookmarkEnd w:id="94"/>
+    <w:bookmarkStart w:id="96" w:name="ref-pb52"/>
     <w:p>
       <w:pPr>
         <w:pStyle w:val="Bibliography"/>
@@ -16073,7 +16438,7 @@
       <w:r>
         <w:t xml:space="preserve"> </w:t>
       </w:r>
-      <w:hyperlink r:id="rId94">
+      <w:hyperlink r:id="rId95">
         <w:r>
           <w:rPr>
             <w:rStyle w:val="Hyperlink"/>
@@ -16085,8 +16450,8 @@
         <w:t xml:space="preserve">.</w:t>
       </w:r>
     </w:p>
-    <w:bookmarkEnd w:id="95"/>
-    <w:bookmarkStart w:id="97" w:name="ref-R"/>
+    <w:bookmarkEnd w:id="96"/>
+    <w:bookmarkStart w:id="98" w:name="ref-R"/>
     <w:p>
       <w:pPr>
         <w:pStyle w:val="Bibliography"/>
@@ -16110,7 +16475,7 @@
       <w:r>
         <w:t xml:space="preserve"> </w:t>
       </w:r>
-      <w:hyperlink r:id="rId96">
+      <w:hyperlink r:id="rId97">
         <w:r>
           <w:rPr>
             <w:rStyle w:val="Hyperlink"/>
@@ -16122,8 +16487,8 @@
         <w:t xml:space="preserve">.</w:t>
       </w:r>
     </w:p>
-    <w:bookmarkEnd w:id="97"/>
-    <w:bookmarkStart w:id="98" w:name="ref-reby2005"/>
+    <w:bookmarkEnd w:id="98"/>
+    <w:bookmarkStart w:id="99" w:name="ref-reby2005"/>
     <w:p>
       <w:pPr>
         <w:pStyle w:val="Bibliography"/>
@@ -16154,8 +16519,8 @@
         <w:t xml:space="preserve">272 (1566): 941–47.</w:t>
       </w:r>
     </w:p>
-    <w:bookmarkEnd w:id="98"/>
-    <w:bookmarkStart w:id="100" w:name="ref-richter2017"/>
+    <w:bookmarkEnd w:id="99"/>
+    <w:bookmarkStart w:id="101" w:name="ref-richter2017"/>
     <w:p>
       <w:pPr>
         <w:pStyle w:val="Bibliography"/>
@@ -16188,7 +16553,7 @@
       <w:r>
         <w:t xml:space="preserve"> </w:t>
       </w:r>
-      <w:hyperlink r:id="rId99">
+      <w:hyperlink r:id="rId100">
         <w:r>
           <w:rPr>
             <w:rStyle w:val="Hyperlink"/>
@@ -16200,8 +16565,8 @@
         <w:t xml:space="preserve">.</w:t>
       </w:r>
     </w:p>
-    <w:bookmarkEnd w:id="100"/>
-    <w:bookmarkStart w:id="102" w:name="ref-RStudio"/>
+    <w:bookmarkEnd w:id="101"/>
+    <w:bookmarkStart w:id="103" w:name="ref-RStudio"/>
     <w:p>
       <w:pPr>
         <w:pStyle w:val="Bibliography"/>
@@ -16225,7 +16590,7 @@
       <w:r>
         <w:t xml:space="preserve"> </w:t>
       </w:r>
-      <w:hyperlink r:id="rId101">
+      <w:hyperlink r:id="rId102">
         <w:r>
           <w:rPr>
             <w:rStyle w:val="Hyperlink"/>
@@ -16237,8 +16602,8 @@
         <w:t xml:space="preserve">.</w:t>
       </w:r>
     </w:p>
-    <w:bookmarkEnd w:id="102"/>
-    <w:bookmarkStart w:id="103" w:name="ref-sumner2011"/>
+    <w:bookmarkEnd w:id="103"/>
+    <w:bookmarkStart w:id="104" w:name="ref-sumner2011"/>
     <w:p>
       <w:pPr>
         <w:pStyle w:val="Bibliography"/>
@@ -16269,8 +16634,8 @@
         <w:t xml:space="preserve">119 (1): 131–36.</w:t>
       </w:r>
     </w:p>
-    <w:bookmarkEnd w:id="103"/>
-    <w:bookmarkStart w:id="104" w:name="ref-taylor2010"/>
+    <w:bookmarkEnd w:id="104"/>
+    <w:bookmarkStart w:id="105" w:name="ref-taylor2010"/>
     <w:p>
       <w:pPr>
         <w:pStyle w:val="Bibliography"/>
@@ -16301,8 +16666,8 @@
         <w:t xml:space="preserve">79 (1): 205–10.</w:t>
       </w:r>
     </w:p>
-    <w:bookmarkEnd w:id="104"/>
-    <w:bookmarkStart w:id="105" w:name="ref-xie2023"/>
+    <w:bookmarkEnd w:id="105"/>
+    <w:bookmarkStart w:id="106" w:name="ref-xie2023"/>
     <w:p>
       <w:pPr>
         <w:pStyle w:val="Bibliography"/>
@@ -16333,9 +16698,9 @@
         <w:t xml:space="preserve">166: 377–424.</w:t>
       </w:r>
     </w:p>
-    <w:bookmarkEnd w:id="105"/>
     <w:bookmarkEnd w:id="106"/>
     <w:bookmarkEnd w:id="107"/>
+    <w:bookmarkEnd w:id="108"/>
     <w:sectPr/>
   </w:body>
 </w:document>
@@ -16485,7 +16850,7 @@
       </w:r>
     </w:p>
   </w:footnote>
-  <w:footnote w:id="47">
+  <w:footnote w:id="48">
     <w:p>
       <w:pPr>
         <w:pStyle w:val="FootnoteText"/>
@@ -16519,7 +16884,7 @@
       </w:r>
     </w:p>
   </w:footnote>
-  <w:footnote w:id="54">
+  <w:footnote w:id="55">
     <w:p>
       <w:pPr>
         <w:pStyle w:val="FootnoteText"/>
@@ -16578,11 +16943,23 @@
         </m:sSub>
       </m:oMath>
       <w:r>
-        <w:t xml:space="preserve">, will be systematically biased by differences in the distribution of vowel instances across talkers.</w:t>
+        <w:t xml:space="preserve">, will be systematically biased by differences in the distribution of vowel instances across talkers. See</w:t>
+      </w:r>
+      <w:r>
+        <w:t xml:space="preserve"> </w:t>
+      </w:r>
+      <w:r>
+        <w:t xml:space="preserve">Barreda and Nearey (2018)</w:t>
+      </w:r>
+      <w:r>
+        <w:t xml:space="preserve"> </w:t>
+      </w:r>
+      <w:r>
+        <w:t xml:space="preserve">for strategies when data is not balanced.</w:t>
       </w:r>
     </w:p>
   </w:footnote>
-  <w:footnote w:id="60">
+  <w:footnote w:id="68">
     <w:p>
       <w:pPr>
         <w:pStyle w:val="FootnoteText"/>
@@ -16610,7 +16987,7 @@
       </w:r>
     </w:p>
   </w:footnote>
-  <w:footnote w:id="61">
+  <w:footnote w:id="69">
     <w:p>
       <w:pPr>
         <w:pStyle w:val="FootnoteText"/>

</xml_diff>